<commit_message>
data: add the visuals of the pricing and product affinity
</commit_message>
<xml_diff>
--- a/Technical report.docx
+++ b/Technical report.docx
@@ -30852,11 +30852,2377 @@
         </w:rPr>
         <w:t xml:space="preserve"> ensures that our final segmentation is parsimonious enough for clear executive decision-making, yet granular enough to capture the nuanced differences between high-velocity 'Champions' and high-value 'At-Risk' accounts.</w:t>
       </w:r>
+    </w:p>
+    <w:p>
+      <w:pPr>
+        <w:pStyle w:val="Titolo2"/>
+        <w:rPr>
+          <w:b/>
+          <w:lang w:val="en-IN"/>
+        </w:rPr>
+      </w:pPr>
+      <w:r>
+        <w:rPr>
+          <w:b/>
+          <w:lang w:val="en-IN"/>
+        </w:rPr>
+        <w:t xml:space="preserve">5.6 </w:t>
+      </w:r>
+      <w:r>
+        <w:rPr>
+          <w:b/>
+          <w:lang w:val="en-IN"/>
+        </w:rPr>
+        <w:t>Cluster Profiling &amp; Behavioral Persona Mapping</w:t>
+      </w:r>
+    </w:p>
+    <w:p>
+      <w:pPr>
+        <w:pStyle w:val="NormaleWeb"/>
+        <w:spacing w:line="276" w:lineRule="auto"/>
+        <w:jc w:val="both"/>
+        <w:rPr>
+          <w:lang w:val="en-IN"/>
+        </w:rPr>
+      </w:pPr>
+      <w:r>
+        <w:rPr>
+          <w:lang w:val="en-IN"/>
+        </w:rPr>
+        <w:t xml:space="preserve">Following the mathematical validation of our K-Means model, we performed a </w:t>
+      </w:r>
+      <w:r>
+        <w:rPr>
+          <w:b/>
+          <w:bCs/>
+          <w:lang w:val="en-IN"/>
+        </w:rPr>
+        <w:t>centroid profile analysis</w:t>
+      </w:r>
+      <w:r>
+        <w:rPr>
+          <w:lang w:val="en-IN"/>
+        </w:rPr>
+        <w:t xml:space="preserve"> to translate abstract numerical clusters into strategic business personas. By aggregating the mean Recency, Frequency, and Monetary (RFM) metrics for each of the four identified clusters, we established a clear value hierarchy. This 'Bottom-Up' approach allows F. Schumacher &amp; Co. to identify exactly which account </w:t>
+      </w:r>
+      <w:r>
+        <w:rPr>
+          <w:lang w:val="en-IN"/>
+        </w:rPr>
+        <w:t>behaviours</w:t>
+      </w:r>
+      <w:r>
+        <w:rPr>
+          <w:lang w:val="en-IN"/>
+        </w:rPr>
+        <w:t xml:space="preserve"> drive the most significant revenue.</w:t>
+      </w:r>
+    </w:p>
+    <w:p>
+      <w:pPr>
+        <w:pStyle w:val="NormaleWeb"/>
+        <w:spacing w:line="276" w:lineRule="auto"/>
+        <w:jc w:val="both"/>
+        <w:rPr>
+          <w:lang w:val="en-IN"/>
+        </w:rPr>
+      </w:pPr>
+      <w:r>
+        <w:rPr>
+          <w:lang w:val="en-IN"/>
+        </w:rPr>
+        <w:t xml:space="preserve">This profiling step is critical for </w:t>
+      </w:r>
+      <w:r>
+        <w:rPr>
+          <w:b/>
+          <w:bCs/>
+          <w:lang w:val="en-IN"/>
+        </w:rPr>
+        <w:t>Resource Allocation</w:t>
+      </w:r>
+      <w:r>
+        <w:rPr>
+          <w:lang w:val="en-IN"/>
+        </w:rPr>
+        <w:t>: it distinguishes between high-volume/low-value accounts that can be managed through automation, and the high-value 'Champion' accounts that require high-touch human intervention from our sales and design teams.</w:t>
+      </w:r>
+    </w:p>
+    <w:p>
+      <w:pPr>
+        <w:shd w:val="clear" w:color="auto" w:fill="1E1E1E"/>
+        <w:spacing w:before="0" w:after="0" w:line="240" w:lineRule="auto"/>
+        <w:rPr>
+          <w:rFonts w:ascii="Consolas" w:eastAsia="Times New Roman" w:hAnsi="Consolas" w:cs="Times New Roman"/>
+          <w:color w:val="D4D4D4"/>
+          <w:sz w:val="18"/>
+          <w:szCs w:val="21"/>
+          <w:lang w:val="en-IN" w:eastAsia="it-IT"/>
+        </w:rPr>
+      </w:pPr>
+      <w:proofErr w:type="spellStart"/>
+      <w:r>
+        <w:rPr>
+          <w:rFonts w:ascii="Consolas" w:eastAsia="Times New Roman" w:hAnsi="Consolas" w:cs="Times New Roman"/>
+          <w:color w:val="9CDCFE"/>
+          <w:sz w:val="18"/>
+          <w:szCs w:val="21"/>
+          <w:lang w:val="en-IN" w:eastAsia="it-IT"/>
+        </w:rPr>
+        <w:t>kmeans</w:t>
+      </w:r>
+      <w:proofErr w:type="spellEnd"/>
+      <w:r>
+        <w:rPr>
+          <w:rFonts w:ascii="Consolas" w:eastAsia="Times New Roman" w:hAnsi="Consolas" w:cs="Times New Roman"/>
+          <w:color w:val="D4D4D4"/>
+          <w:sz w:val="18"/>
+          <w:szCs w:val="21"/>
+          <w:lang w:val="en-IN" w:eastAsia="it-IT"/>
+        </w:rPr>
+        <w:t xml:space="preserve"> = </w:t>
+      </w:r>
+      <w:proofErr w:type="spellStart"/>
+      <w:proofErr w:type="gramStart"/>
+      <w:r>
+        <w:rPr>
+          <w:rFonts w:ascii="Consolas" w:eastAsia="Times New Roman" w:hAnsi="Consolas" w:cs="Times New Roman"/>
+          <w:color w:val="4EC9B0"/>
+          <w:sz w:val="18"/>
+          <w:szCs w:val="21"/>
+          <w:lang w:val="en-IN" w:eastAsia="it-IT"/>
+        </w:rPr>
+        <w:t>KMeans</w:t>
+      </w:r>
+      <w:proofErr w:type="spellEnd"/>
+      <w:r>
+        <w:rPr>
+          <w:rFonts w:ascii="Consolas" w:eastAsia="Times New Roman" w:hAnsi="Consolas" w:cs="Times New Roman"/>
+          <w:color w:val="D4D4D4"/>
+          <w:sz w:val="18"/>
+          <w:szCs w:val="21"/>
+          <w:lang w:val="en-IN" w:eastAsia="it-IT"/>
+        </w:rPr>
+        <w:t>(</w:t>
+      </w:r>
+      <w:proofErr w:type="spellStart"/>
+      <w:proofErr w:type="gramEnd"/>
+      <w:r>
+        <w:rPr>
+          <w:rFonts w:ascii="Consolas" w:eastAsia="Times New Roman" w:hAnsi="Consolas" w:cs="Times New Roman"/>
+          <w:color w:val="9CDCFE"/>
+          <w:sz w:val="18"/>
+          <w:szCs w:val="21"/>
+          <w:lang w:val="en-IN" w:eastAsia="it-IT"/>
+        </w:rPr>
+        <w:t>n_clusters</w:t>
+      </w:r>
+      <w:proofErr w:type="spellEnd"/>
+      <w:r>
+        <w:rPr>
+          <w:rFonts w:ascii="Consolas" w:eastAsia="Times New Roman" w:hAnsi="Consolas" w:cs="Times New Roman"/>
+          <w:color w:val="D4D4D4"/>
+          <w:sz w:val="18"/>
+          <w:szCs w:val="21"/>
+          <w:lang w:val="en-IN" w:eastAsia="it-IT"/>
+        </w:rPr>
+        <w:t>=</w:t>
+      </w:r>
+      <w:r>
+        <w:rPr>
+          <w:rFonts w:ascii="Consolas" w:eastAsia="Times New Roman" w:hAnsi="Consolas" w:cs="Times New Roman"/>
+          <w:color w:val="B5CEA8"/>
+          <w:sz w:val="18"/>
+          <w:szCs w:val="21"/>
+          <w:lang w:val="en-IN" w:eastAsia="it-IT"/>
+        </w:rPr>
+        <w:t>4</w:t>
+      </w:r>
+      <w:r>
+        <w:rPr>
+          <w:rFonts w:ascii="Consolas" w:eastAsia="Times New Roman" w:hAnsi="Consolas" w:cs="Times New Roman"/>
+          <w:color w:val="D4D4D4"/>
+          <w:sz w:val="18"/>
+          <w:szCs w:val="21"/>
+          <w:lang w:val="en-IN" w:eastAsia="it-IT"/>
+        </w:rPr>
+        <w:t xml:space="preserve">, </w:t>
+      </w:r>
+      <w:proofErr w:type="spellStart"/>
+      <w:r>
+        <w:rPr>
+          <w:rFonts w:ascii="Consolas" w:eastAsia="Times New Roman" w:hAnsi="Consolas" w:cs="Times New Roman"/>
+          <w:color w:val="9CDCFE"/>
+          <w:sz w:val="18"/>
+          <w:szCs w:val="21"/>
+          <w:lang w:val="en-IN" w:eastAsia="it-IT"/>
+        </w:rPr>
+        <w:t>random_state</w:t>
+      </w:r>
+      <w:proofErr w:type="spellEnd"/>
+      <w:r>
+        <w:rPr>
+          <w:rFonts w:ascii="Consolas" w:eastAsia="Times New Roman" w:hAnsi="Consolas" w:cs="Times New Roman"/>
+          <w:color w:val="D4D4D4"/>
+          <w:sz w:val="18"/>
+          <w:szCs w:val="21"/>
+          <w:lang w:val="en-IN" w:eastAsia="it-IT"/>
+        </w:rPr>
+        <w:t>=</w:t>
+      </w:r>
+      <w:r>
+        <w:rPr>
+          <w:rFonts w:ascii="Consolas" w:eastAsia="Times New Roman" w:hAnsi="Consolas" w:cs="Times New Roman"/>
+          <w:color w:val="B5CEA8"/>
+          <w:sz w:val="18"/>
+          <w:szCs w:val="21"/>
+          <w:lang w:val="en-IN" w:eastAsia="it-IT"/>
+        </w:rPr>
+        <w:t>42</w:t>
+      </w:r>
+      <w:r>
+        <w:rPr>
+          <w:rFonts w:ascii="Consolas" w:eastAsia="Times New Roman" w:hAnsi="Consolas" w:cs="Times New Roman"/>
+          <w:color w:val="D4D4D4"/>
+          <w:sz w:val="18"/>
+          <w:szCs w:val="21"/>
+          <w:lang w:val="en-IN" w:eastAsia="it-IT"/>
+        </w:rPr>
+        <w:t xml:space="preserve">, </w:t>
+      </w:r>
+      <w:proofErr w:type="spellStart"/>
+      <w:r>
+        <w:rPr>
+          <w:rFonts w:ascii="Consolas" w:eastAsia="Times New Roman" w:hAnsi="Consolas" w:cs="Times New Roman"/>
+          <w:color w:val="9CDCFE"/>
+          <w:sz w:val="18"/>
+          <w:szCs w:val="21"/>
+          <w:lang w:val="en-IN" w:eastAsia="it-IT"/>
+        </w:rPr>
+        <w:t>n_init</w:t>
+      </w:r>
+      <w:proofErr w:type="spellEnd"/>
+      <w:r>
+        <w:rPr>
+          <w:rFonts w:ascii="Consolas" w:eastAsia="Times New Roman" w:hAnsi="Consolas" w:cs="Times New Roman"/>
+          <w:color w:val="D4D4D4"/>
+          <w:sz w:val="18"/>
+          <w:szCs w:val="21"/>
+          <w:lang w:val="en-IN" w:eastAsia="it-IT"/>
+        </w:rPr>
+        <w:t>=</w:t>
+      </w:r>
+      <w:r>
+        <w:rPr>
+          <w:rFonts w:ascii="Consolas" w:eastAsia="Times New Roman" w:hAnsi="Consolas" w:cs="Times New Roman"/>
+          <w:color w:val="B5CEA8"/>
+          <w:sz w:val="18"/>
+          <w:szCs w:val="21"/>
+          <w:lang w:val="en-IN" w:eastAsia="it-IT"/>
+        </w:rPr>
+        <w:t>10</w:t>
+      </w:r>
+      <w:r>
+        <w:rPr>
+          <w:rFonts w:ascii="Consolas" w:eastAsia="Times New Roman" w:hAnsi="Consolas" w:cs="Times New Roman"/>
+          <w:color w:val="D4D4D4"/>
+          <w:sz w:val="18"/>
+          <w:szCs w:val="21"/>
+          <w:lang w:val="en-IN" w:eastAsia="it-IT"/>
+        </w:rPr>
+        <w:t>)</w:t>
+      </w:r>
+    </w:p>
+    <w:p>
+      <w:pPr>
+        <w:shd w:val="clear" w:color="auto" w:fill="1E1E1E"/>
+        <w:spacing w:before="0" w:after="0" w:line="240" w:lineRule="auto"/>
+        <w:rPr>
+          <w:rFonts w:ascii="Consolas" w:eastAsia="Times New Roman" w:hAnsi="Consolas" w:cs="Times New Roman"/>
+          <w:color w:val="D4D4D4"/>
+          <w:sz w:val="18"/>
+          <w:szCs w:val="21"/>
+          <w:lang w:val="en-IN" w:eastAsia="it-IT"/>
+        </w:rPr>
+      </w:pPr>
+      <w:proofErr w:type="spellStart"/>
+      <w:r>
+        <w:rPr>
+          <w:rFonts w:ascii="Consolas" w:eastAsia="Times New Roman" w:hAnsi="Consolas" w:cs="Times New Roman"/>
+          <w:color w:val="9CDCFE"/>
+          <w:sz w:val="18"/>
+          <w:szCs w:val="21"/>
+          <w:lang w:val="en-IN" w:eastAsia="it-IT"/>
+        </w:rPr>
+        <w:t>rfm</w:t>
+      </w:r>
+      <w:proofErr w:type="spellEnd"/>
+      <w:r>
+        <w:rPr>
+          <w:rFonts w:ascii="Consolas" w:eastAsia="Times New Roman" w:hAnsi="Consolas" w:cs="Times New Roman"/>
+          <w:color w:val="D4D4D4"/>
+          <w:sz w:val="18"/>
+          <w:szCs w:val="21"/>
+          <w:lang w:val="en-IN" w:eastAsia="it-IT"/>
+        </w:rPr>
+        <w:t>[</w:t>
+      </w:r>
+      <w:r>
+        <w:rPr>
+          <w:rFonts w:ascii="Consolas" w:eastAsia="Times New Roman" w:hAnsi="Consolas" w:cs="Times New Roman"/>
+          <w:color w:val="CE9178"/>
+          <w:sz w:val="18"/>
+          <w:szCs w:val="21"/>
+          <w:lang w:val="en-IN" w:eastAsia="it-IT"/>
+        </w:rPr>
+        <w:t>'Cluster'</w:t>
+      </w:r>
+      <w:r>
+        <w:rPr>
+          <w:rFonts w:ascii="Consolas" w:eastAsia="Times New Roman" w:hAnsi="Consolas" w:cs="Times New Roman"/>
+          <w:color w:val="D4D4D4"/>
+          <w:sz w:val="18"/>
+          <w:szCs w:val="21"/>
+          <w:lang w:val="en-IN" w:eastAsia="it-IT"/>
+        </w:rPr>
+        <w:t xml:space="preserve">] = </w:t>
+      </w:r>
+      <w:proofErr w:type="spellStart"/>
+      <w:r>
+        <w:rPr>
+          <w:rFonts w:ascii="Consolas" w:eastAsia="Times New Roman" w:hAnsi="Consolas" w:cs="Times New Roman"/>
+          <w:color w:val="9CDCFE"/>
+          <w:sz w:val="18"/>
+          <w:szCs w:val="21"/>
+          <w:lang w:val="en-IN" w:eastAsia="it-IT"/>
+        </w:rPr>
+        <w:t>kmeans</w:t>
+      </w:r>
+      <w:r>
+        <w:rPr>
+          <w:rFonts w:ascii="Consolas" w:eastAsia="Times New Roman" w:hAnsi="Consolas" w:cs="Times New Roman"/>
+          <w:color w:val="D4D4D4"/>
+          <w:sz w:val="18"/>
+          <w:szCs w:val="21"/>
+          <w:lang w:val="en-IN" w:eastAsia="it-IT"/>
+        </w:rPr>
+        <w:t>.</w:t>
+      </w:r>
+      <w:r>
+        <w:rPr>
+          <w:rFonts w:ascii="Consolas" w:eastAsia="Times New Roman" w:hAnsi="Consolas" w:cs="Times New Roman"/>
+          <w:color w:val="DCDCAA"/>
+          <w:sz w:val="18"/>
+          <w:szCs w:val="21"/>
+          <w:lang w:val="en-IN" w:eastAsia="it-IT"/>
+        </w:rPr>
+        <w:t>fit_transform</w:t>
+      </w:r>
+      <w:proofErr w:type="spellEnd"/>
+      <w:r>
+        <w:rPr>
+          <w:rFonts w:ascii="Consolas" w:eastAsia="Times New Roman" w:hAnsi="Consolas" w:cs="Times New Roman"/>
+          <w:color w:val="D4D4D4"/>
+          <w:sz w:val="18"/>
+          <w:szCs w:val="21"/>
+          <w:lang w:val="en-IN" w:eastAsia="it-IT"/>
+        </w:rPr>
+        <w:t>(</w:t>
+      </w:r>
+      <w:proofErr w:type="spellStart"/>
+      <w:r>
+        <w:rPr>
+          <w:rFonts w:ascii="Consolas" w:eastAsia="Times New Roman" w:hAnsi="Consolas" w:cs="Times New Roman"/>
+          <w:color w:val="9CDCFE"/>
+          <w:sz w:val="18"/>
+          <w:szCs w:val="21"/>
+          <w:lang w:val="en-IN" w:eastAsia="it-IT"/>
+        </w:rPr>
+        <w:t>rfm_scaled</w:t>
+      </w:r>
+      <w:proofErr w:type="spellEnd"/>
+      <w:proofErr w:type="gramStart"/>
+      <w:r>
+        <w:rPr>
+          <w:rFonts w:ascii="Consolas" w:eastAsia="Times New Roman" w:hAnsi="Consolas" w:cs="Times New Roman"/>
+          <w:color w:val="D4D4D4"/>
+          <w:sz w:val="18"/>
+          <w:szCs w:val="21"/>
+          <w:lang w:val="en-IN" w:eastAsia="it-IT"/>
+        </w:rPr>
+        <w:t>).</w:t>
+      </w:r>
+      <w:r>
+        <w:rPr>
+          <w:rFonts w:ascii="Consolas" w:eastAsia="Times New Roman" w:hAnsi="Consolas" w:cs="Times New Roman"/>
+          <w:color w:val="DCDCAA"/>
+          <w:sz w:val="18"/>
+          <w:szCs w:val="21"/>
+          <w:lang w:val="en-IN" w:eastAsia="it-IT"/>
+        </w:rPr>
+        <w:t>argmax</w:t>
+      </w:r>
+      <w:proofErr w:type="gramEnd"/>
+      <w:r>
+        <w:rPr>
+          <w:rFonts w:ascii="Consolas" w:eastAsia="Times New Roman" w:hAnsi="Consolas" w:cs="Times New Roman"/>
+          <w:color w:val="D4D4D4"/>
+          <w:sz w:val="18"/>
+          <w:szCs w:val="21"/>
+          <w:lang w:val="en-IN" w:eastAsia="it-IT"/>
+        </w:rPr>
+        <w:t>(</w:t>
+      </w:r>
+      <w:r>
+        <w:rPr>
+          <w:rFonts w:ascii="Consolas" w:eastAsia="Times New Roman" w:hAnsi="Consolas" w:cs="Times New Roman"/>
+          <w:color w:val="9CDCFE"/>
+          <w:sz w:val="18"/>
+          <w:szCs w:val="21"/>
+          <w:lang w:val="en-IN" w:eastAsia="it-IT"/>
+        </w:rPr>
+        <w:t>axis</w:t>
+      </w:r>
+      <w:r>
+        <w:rPr>
+          <w:rFonts w:ascii="Consolas" w:eastAsia="Times New Roman" w:hAnsi="Consolas" w:cs="Times New Roman"/>
+          <w:color w:val="D4D4D4"/>
+          <w:sz w:val="18"/>
+          <w:szCs w:val="21"/>
+          <w:lang w:val="en-IN" w:eastAsia="it-IT"/>
+        </w:rPr>
+        <w:t>=</w:t>
+      </w:r>
+      <w:r>
+        <w:rPr>
+          <w:rFonts w:ascii="Consolas" w:eastAsia="Times New Roman" w:hAnsi="Consolas" w:cs="Times New Roman"/>
+          <w:color w:val="B5CEA8"/>
+          <w:sz w:val="18"/>
+          <w:szCs w:val="21"/>
+          <w:lang w:val="en-IN" w:eastAsia="it-IT"/>
+        </w:rPr>
+        <w:t>1</w:t>
+      </w:r>
+      <w:r>
+        <w:rPr>
+          <w:rFonts w:ascii="Consolas" w:eastAsia="Times New Roman" w:hAnsi="Consolas" w:cs="Times New Roman"/>
+          <w:color w:val="D4D4D4"/>
+          <w:sz w:val="18"/>
+          <w:szCs w:val="21"/>
+          <w:lang w:val="en-IN" w:eastAsia="it-IT"/>
+        </w:rPr>
+        <w:t xml:space="preserve">) </w:t>
+      </w:r>
+    </w:p>
+    <w:p>
+      <w:pPr>
+        <w:shd w:val="clear" w:color="auto" w:fill="1E1E1E"/>
+        <w:spacing w:before="0" w:after="0" w:line="240" w:lineRule="auto"/>
+        <w:rPr>
+          <w:rFonts w:ascii="Consolas" w:eastAsia="Times New Roman" w:hAnsi="Consolas" w:cs="Times New Roman"/>
+          <w:color w:val="D4D4D4"/>
+          <w:sz w:val="18"/>
+          <w:szCs w:val="21"/>
+          <w:lang w:val="en-IN" w:eastAsia="it-IT"/>
+        </w:rPr>
+      </w:pPr>
+    </w:p>
+    <w:p>
+      <w:pPr>
+        <w:shd w:val="clear" w:color="auto" w:fill="1E1E1E"/>
+        <w:spacing w:before="0" w:after="0" w:line="240" w:lineRule="auto"/>
+        <w:rPr>
+          <w:rFonts w:ascii="Consolas" w:eastAsia="Times New Roman" w:hAnsi="Consolas" w:cs="Times New Roman"/>
+          <w:color w:val="D4D4D4"/>
+          <w:sz w:val="18"/>
+          <w:szCs w:val="21"/>
+          <w:lang w:val="en-IN" w:eastAsia="it-IT"/>
+        </w:rPr>
+      </w:pPr>
+      <w:r>
+        <w:rPr>
+          <w:rFonts w:ascii="Consolas" w:eastAsia="Times New Roman" w:hAnsi="Consolas" w:cs="Times New Roman"/>
+          <w:color w:val="6A9955"/>
+          <w:sz w:val="18"/>
+          <w:szCs w:val="21"/>
+          <w:lang w:val="en-IN" w:eastAsia="it-IT"/>
+        </w:rPr>
+        <w:t># Calculating Cluster Profiles</w:t>
+      </w:r>
+    </w:p>
+    <w:p>
+      <w:pPr>
+        <w:shd w:val="clear" w:color="auto" w:fill="1E1E1E"/>
+        <w:spacing w:before="0" w:after="0" w:line="240" w:lineRule="auto"/>
+        <w:rPr>
+          <w:rFonts w:ascii="Consolas" w:eastAsia="Times New Roman" w:hAnsi="Consolas" w:cs="Times New Roman"/>
+          <w:color w:val="D4D4D4"/>
+          <w:sz w:val="18"/>
+          <w:szCs w:val="21"/>
+          <w:lang w:val="en-IN" w:eastAsia="it-IT"/>
+        </w:rPr>
+      </w:pPr>
+      <w:proofErr w:type="spellStart"/>
+      <w:r>
+        <w:rPr>
+          <w:rFonts w:ascii="Consolas" w:eastAsia="Times New Roman" w:hAnsi="Consolas" w:cs="Times New Roman"/>
+          <w:color w:val="9CDCFE"/>
+          <w:sz w:val="18"/>
+          <w:szCs w:val="21"/>
+          <w:lang w:val="en-IN" w:eastAsia="it-IT"/>
+        </w:rPr>
+        <w:t>cluster_profile</w:t>
+      </w:r>
+      <w:proofErr w:type="spellEnd"/>
+      <w:r>
+        <w:rPr>
+          <w:rFonts w:ascii="Consolas" w:eastAsia="Times New Roman" w:hAnsi="Consolas" w:cs="Times New Roman"/>
+          <w:color w:val="D4D4D4"/>
+          <w:sz w:val="18"/>
+          <w:szCs w:val="21"/>
+          <w:lang w:val="en-IN" w:eastAsia="it-IT"/>
+        </w:rPr>
+        <w:t xml:space="preserve"> = </w:t>
+      </w:r>
+      <w:proofErr w:type="spellStart"/>
+      <w:proofErr w:type="gramStart"/>
+      <w:r>
+        <w:rPr>
+          <w:rFonts w:ascii="Consolas" w:eastAsia="Times New Roman" w:hAnsi="Consolas" w:cs="Times New Roman"/>
+          <w:color w:val="9CDCFE"/>
+          <w:sz w:val="18"/>
+          <w:szCs w:val="21"/>
+          <w:lang w:val="en-IN" w:eastAsia="it-IT"/>
+        </w:rPr>
+        <w:t>rfm</w:t>
+      </w:r>
+      <w:r>
+        <w:rPr>
+          <w:rFonts w:ascii="Consolas" w:eastAsia="Times New Roman" w:hAnsi="Consolas" w:cs="Times New Roman"/>
+          <w:color w:val="D4D4D4"/>
+          <w:sz w:val="18"/>
+          <w:szCs w:val="21"/>
+          <w:lang w:val="en-IN" w:eastAsia="it-IT"/>
+        </w:rPr>
+        <w:t>.</w:t>
+      </w:r>
+      <w:r>
+        <w:rPr>
+          <w:rFonts w:ascii="Consolas" w:eastAsia="Times New Roman" w:hAnsi="Consolas" w:cs="Times New Roman"/>
+          <w:color w:val="DCDCAA"/>
+          <w:sz w:val="18"/>
+          <w:szCs w:val="21"/>
+          <w:lang w:val="en-IN" w:eastAsia="it-IT"/>
+        </w:rPr>
+        <w:t>groupby</w:t>
+      </w:r>
+      <w:proofErr w:type="spellEnd"/>
+      <w:proofErr w:type="gramEnd"/>
+      <w:r>
+        <w:rPr>
+          <w:rFonts w:ascii="Consolas" w:eastAsia="Times New Roman" w:hAnsi="Consolas" w:cs="Times New Roman"/>
+          <w:color w:val="D4D4D4"/>
+          <w:sz w:val="18"/>
+          <w:szCs w:val="21"/>
+          <w:lang w:val="en-IN" w:eastAsia="it-IT"/>
+        </w:rPr>
+        <w:t>(</w:t>
+      </w:r>
+      <w:r>
+        <w:rPr>
+          <w:rFonts w:ascii="Consolas" w:eastAsia="Times New Roman" w:hAnsi="Consolas" w:cs="Times New Roman"/>
+          <w:color w:val="CE9178"/>
+          <w:sz w:val="18"/>
+          <w:szCs w:val="21"/>
+          <w:lang w:val="en-IN" w:eastAsia="it-IT"/>
+        </w:rPr>
+        <w:t>'Cluster'</w:t>
+      </w:r>
+      <w:r>
+        <w:rPr>
+          <w:rFonts w:ascii="Consolas" w:eastAsia="Times New Roman" w:hAnsi="Consolas" w:cs="Times New Roman"/>
+          <w:color w:val="D4D4D4"/>
+          <w:sz w:val="18"/>
+          <w:szCs w:val="21"/>
+          <w:lang w:val="en-IN" w:eastAsia="it-IT"/>
+        </w:rPr>
+        <w:t>)[</w:t>
+      </w:r>
+      <w:r>
+        <w:rPr>
+          <w:rFonts w:ascii="Consolas" w:eastAsia="Times New Roman" w:hAnsi="Consolas" w:cs="Times New Roman"/>
+          <w:color w:val="9CDCFE"/>
+          <w:sz w:val="18"/>
+          <w:szCs w:val="21"/>
+          <w:lang w:val="en-IN" w:eastAsia="it-IT"/>
+        </w:rPr>
+        <w:t>features</w:t>
+      </w:r>
+      <w:r>
+        <w:rPr>
+          <w:rFonts w:ascii="Consolas" w:eastAsia="Times New Roman" w:hAnsi="Consolas" w:cs="Times New Roman"/>
+          <w:color w:val="D4D4D4"/>
+          <w:sz w:val="18"/>
+          <w:szCs w:val="21"/>
+          <w:lang w:val="en-IN" w:eastAsia="it-IT"/>
+        </w:rPr>
+        <w:t>].</w:t>
+      </w:r>
+      <w:r>
+        <w:rPr>
+          <w:rFonts w:ascii="Consolas" w:eastAsia="Times New Roman" w:hAnsi="Consolas" w:cs="Times New Roman"/>
+          <w:color w:val="DCDCAA"/>
+          <w:sz w:val="18"/>
+          <w:szCs w:val="21"/>
+          <w:lang w:val="en-IN" w:eastAsia="it-IT"/>
+        </w:rPr>
+        <w:t>mean</w:t>
+      </w:r>
+      <w:r>
+        <w:rPr>
+          <w:rFonts w:ascii="Consolas" w:eastAsia="Times New Roman" w:hAnsi="Consolas" w:cs="Times New Roman"/>
+          <w:color w:val="D4D4D4"/>
+          <w:sz w:val="18"/>
+          <w:szCs w:val="21"/>
+          <w:lang w:val="en-IN" w:eastAsia="it-IT"/>
+        </w:rPr>
+        <w:t>().</w:t>
+      </w:r>
+      <w:r>
+        <w:rPr>
+          <w:rFonts w:ascii="Consolas" w:eastAsia="Times New Roman" w:hAnsi="Consolas" w:cs="Times New Roman"/>
+          <w:color w:val="DCDCAA"/>
+          <w:sz w:val="18"/>
+          <w:szCs w:val="21"/>
+          <w:lang w:val="en-IN" w:eastAsia="it-IT"/>
+        </w:rPr>
+        <w:t>round</w:t>
+      </w:r>
+      <w:r>
+        <w:rPr>
+          <w:rFonts w:ascii="Consolas" w:eastAsia="Times New Roman" w:hAnsi="Consolas" w:cs="Times New Roman"/>
+          <w:color w:val="D4D4D4"/>
+          <w:sz w:val="18"/>
+          <w:szCs w:val="21"/>
+          <w:lang w:val="en-IN" w:eastAsia="it-IT"/>
+        </w:rPr>
+        <w:t>(</w:t>
+      </w:r>
+      <w:r>
+        <w:rPr>
+          <w:rFonts w:ascii="Consolas" w:eastAsia="Times New Roman" w:hAnsi="Consolas" w:cs="Times New Roman"/>
+          <w:color w:val="B5CEA8"/>
+          <w:sz w:val="18"/>
+          <w:szCs w:val="21"/>
+          <w:lang w:val="en-IN" w:eastAsia="it-IT"/>
+        </w:rPr>
+        <w:t>2</w:t>
+      </w:r>
+      <w:r>
+        <w:rPr>
+          <w:rFonts w:ascii="Consolas" w:eastAsia="Times New Roman" w:hAnsi="Consolas" w:cs="Times New Roman"/>
+          <w:color w:val="D4D4D4"/>
+          <w:sz w:val="18"/>
+          <w:szCs w:val="21"/>
+          <w:lang w:val="en-IN" w:eastAsia="it-IT"/>
+        </w:rPr>
+        <w:t>)</w:t>
+      </w:r>
+    </w:p>
+    <w:p>
+      <w:pPr>
+        <w:shd w:val="clear" w:color="auto" w:fill="1E1E1E"/>
+        <w:spacing w:before="0" w:after="0" w:line="240" w:lineRule="auto"/>
+        <w:rPr>
+          <w:rFonts w:ascii="Consolas" w:eastAsia="Times New Roman" w:hAnsi="Consolas" w:cs="Times New Roman"/>
+          <w:color w:val="D4D4D4"/>
+          <w:sz w:val="18"/>
+          <w:szCs w:val="21"/>
+          <w:lang w:val="en-IN" w:eastAsia="it-IT"/>
+        </w:rPr>
+      </w:pPr>
+      <w:proofErr w:type="spellStart"/>
+      <w:r>
+        <w:rPr>
+          <w:rFonts w:ascii="Consolas" w:eastAsia="Times New Roman" w:hAnsi="Consolas" w:cs="Times New Roman"/>
+          <w:color w:val="9CDCFE"/>
+          <w:sz w:val="18"/>
+          <w:szCs w:val="21"/>
+          <w:lang w:val="en-IN" w:eastAsia="it-IT"/>
+        </w:rPr>
+        <w:t>cluster_profile</w:t>
+      </w:r>
+      <w:proofErr w:type="spellEnd"/>
+      <w:r>
+        <w:rPr>
+          <w:rFonts w:ascii="Consolas" w:eastAsia="Times New Roman" w:hAnsi="Consolas" w:cs="Times New Roman"/>
+          <w:color w:val="D4D4D4"/>
+          <w:sz w:val="18"/>
+          <w:szCs w:val="21"/>
+          <w:lang w:val="en-IN" w:eastAsia="it-IT"/>
+        </w:rPr>
+        <w:t>[</w:t>
+      </w:r>
+      <w:r>
+        <w:rPr>
+          <w:rFonts w:ascii="Consolas" w:eastAsia="Times New Roman" w:hAnsi="Consolas" w:cs="Times New Roman"/>
+          <w:color w:val="CE9178"/>
+          <w:sz w:val="18"/>
+          <w:szCs w:val="21"/>
+          <w:lang w:val="en-IN" w:eastAsia="it-IT"/>
+        </w:rPr>
+        <w:t>'Count'</w:t>
+      </w:r>
+      <w:r>
+        <w:rPr>
+          <w:rFonts w:ascii="Consolas" w:eastAsia="Times New Roman" w:hAnsi="Consolas" w:cs="Times New Roman"/>
+          <w:color w:val="D4D4D4"/>
+          <w:sz w:val="18"/>
+          <w:szCs w:val="21"/>
+          <w:lang w:val="en-IN" w:eastAsia="it-IT"/>
+        </w:rPr>
+        <w:t xml:space="preserve">] = </w:t>
+      </w:r>
+      <w:proofErr w:type="spellStart"/>
+      <w:proofErr w:type="gramStart"/>
+      <w:r>
+        <w:rPr>
+          <w:rFonts w:ascii="Consolas" w:eastAsia="Times New Roman" w:hAnsi="Consolas" w:cs="Times New Roman"/>
+          <w:color w:val="9CDCFE"/>
+          <w:sz w:val="18"/>
+          <w:szCs w:val="21"/>
+          <w:lang w:val="en-IN" w:eastAsia="it-IT"/>
+        </w:rPr>
+        <w:t>rfm</w:t>
+      </w:r>
+      <w:r>
+        <w:rPr>
+          <w:rFonts w:ascii="Consolas" w:eastAsia="Times New Roman" w:hAnsi="Consolas" w:cs="Times New Roman"/>
+          <w:color w:val="D4D4D4"/>
+          <w:sz w:val="18"/>
+          <w:szCs w:val="21"/>
+          <w:lang w:val="en-IN" w:eastAsia="it-IT"/>
+        </w:rPr>
+        <w:t>.</w:t>
+      </w:r>
+      <w:r>
+        <w:rPr>
+          <w:rFonts w:ascii="Consolas" w:eastAsia="Times New Roman" w:hAnsi="Consolas" w:cs="Times New Roman"/>
+          <w:color w:val="DCDCAA"/>
+          <w:sz w:val="18"/>
+          <w:szCs w:val="21"/>
+          <w:lang w:val="en-IN" w:eastAsia="it-IT"/>
+        </w:rPr>
+        <w:t>groupby</w:t>
+      </w:r>
+      <w:proofErr w:type="spellEnd"/>
+      <w:proofErr w:type="gramEnd"/>
+      <w:r>
+        <w:rPr>
+          <w:rFonts w:ascii="Consolas" w:eastAsia="Times New Roman" w:hAnsi="Consolas" w:cs="Times New Roman"/>
+          <w:color w:val="D4D4D4"/>
+          <w:sz w:val="18"/>
+          <w:szCs w:val="21"/>
+          <w:lang w:val="en-IN" w:eastAsia="it-IT"/>
+        </w:rPr>
+        <w:t>(</w:t>
+      </w:r>
+      <w:r>
+        <w:rPr>
+          <w:rFonts w:ascii="Consolas" w:eastAsia="Times New Roman" w:hAnsi="Consolas" w:cs="Times New Roman"/>
+          <w:color w:val="CE9178"/>
+          <w:sz w:val="18"/>
+          <w:szCs w:val="21"/>
+          <w:lang w:val="en-IN" w:eastAsia="it-IT"/>
+        </w:rPr>
+        <w:t>'Cluster'</w:t>
+      </w:r>
+      <w:r>
+        <w:rPr>
+          <w:rFonts w:ascii="Consolas" w:eastAsia="Times New Roman" w:hAnsi="Consolas" w:cs="Times New Roman"/>
+          <w:color w:val="D4D4D4"/>
+          <w:sz w:val="18"/>
+          <w:szCs w:val="21"/>
+          <w:lang w:val="en-IN" w:eastAsia="it-IT"/>
+        </w:rPr>
+        <w:t>).</w:t>
+      </w:r>
+      <w:r>
+        <w:rPr>
+          <w:rFonts w:ascii="Consolas" w:eastAsia="Times New Roman" w:hAnsi="Consolas" w:cs="Times New Roman"/>
+          <w:color w:val="DCDCAA"/>
+          <w:sz w:val="18"/>
+          <w:szCs w:val="21"/>
+          <w:lang w:val="en-IN" w:eastAsia="it-IT"/>
+        </w:rPr>
+        <w:t>size</w:t>
+      </w:r>
+      <w:r>
+        <w:rPr>
+          <w:rFonts w:ascii="Consolas" w:eastAsia="Times New Roman" w:hAnsi="Consolas" w:cs="Times New Roman"/>
+          <w:color w:val="D4D4D4"/>
+          <w:sz w:val="18"/>
+          <w:szCs w:val="21"/>
+          <w:lang w:val="en-IN" w:eastAsia="it-IT"/>
+        </w:rPr>
+        <w:t>()</w:t>
+      </w:r>
+    </w:p>
+    <w:p>
+      <w:pPr>
+        <w:shd w:val="clear" w:color="auto" w:fill="1E1E1E"/>
+        <w:spacing w:before="0" w:after="0" w:line="240" w:lineRule="auto"/>
+        <w:rPr>
+          <w:rFonts w:ascii="Consolas" w:eastAsia="Times New Roman" w:hAnsi="Consolas" w:cs="Times New Roman"/>
+          <w:color w:val="D4D4D4"/>
+          <w:sz w:val="18"/>
+          <w:szCs w:val="21"/>
+          <w:lang w:val="en-IN" w:eastAsia="it-IT"/>
+        </w:rPr>
+      </w:pPr>
+      <w:proofErr w:type="gramStart"/>
+      <w:r>
+        <w:rPr>
+          <w:rFonts w:ascii="Consolas" w:eastAsia="Times New Roman" w:hAnsi="Consolas" w:cs="Times New Roman"/>
+          <w:color w:val="DCDCAA"/>
+          <w:sz w:val="18"/>
+          <w:szCs w:val="21"/>
+          <w:lang w:val="en-IN" w:eastAsia="it-IT"/>
+        </w:rPr>
+        <w:t>print</w:t>
+      </w:r>
+      <w:r>
+        <w:rPr>
+          <w:rFonts w:ascii="Consolas" w:eastAsia="Times New Roman" w:hAnsi="Consolas" w:cs="Times New Roman"/>
+          <w:color w:val="D4D4D4"/>
+          <w:sz w:val="18"/>
+          <w:szCs w:val="21"/>
+          <w:lang w:val="en-IN" w:eastAsia="it-IT"/>
+        </w:rPr>
+        <w:t>(</w:t>
+      </w:r>
+      <w:proofErr w:type="spellStart"/>
+      <w:proofErr w:type="gramEnd"/>
+      <w:r>
+        <w:rPr>
+          <w:rFonts w:ascii="Consolas" w:eastAsia="Times New Roman" w:hAnsi="Consolas" w:cs="Times New Roman"/>
+          <w:color w:val="9CDCFE"/>
+          <w:sz w:val="18"/>
+          <w:szCs w:val="21"/>
+          <w:lang w:val="en-IN" w:eastAsia="it-IT"/>
+        </w:rPr>
+        <w:t>cluster_profile</w:t>
+      </w:r>
+      <w:r>
+        <w:rPr>
+          <w:rFonts w:ascii="Consolas" w:eastAsia="Times New Roman" w:hAnsi="Consolas" w:cs="Times New Roman"/>
+          <w:color w:val="D4D4D4"/>
+          <w:sz w:val="18"/>
+          <w:szCs w:val="21"/>
+          <w:lang w:val="en-IN" w:eastAsia="it-IT"/>
+        </w:rPr>
+        <w:t>.</w:t>
+      </w:r>
+      <w:r>
+        <w:rPr>
+          <w:rFonts w:ascii="Consolas" w:eastAsia="Times New Roman" w:hAnsi="Consolas" w:cs="Times New Roman"/>
+          <w:color w:val="DCDCAA"/>
+          <w:sz w:val="18"/>
+          <w:szCs w:val="21"/>
+          <w:lang w:val="en-IN" w:eastAsia="it-IT"/>
+        </w:rPr>
+        <w:t>sort_values</w:t>
+      </w:r>
+      <w:proofErr w:type="spellEnd"/>
+      <w:r>
+        <w:rPr>
+          <w:rFonts w:ascii="Consolas" w:eastAsia="Times New Roman" w:hAnsi="Consolas" w:cs="Times New Roman"/>
+          <w:color w:val="D4D4D4"/>
+          <w:sz w:val="18"/>
+          <w:szCs w:val="21"/>
+          <w:lang w:val="en-IN" w:eastAsia="it-IT"/>
+        </w:rPr>
+        <w:t>(</w:t>
+      </w:r>
+      <w:r>
+        <w:rPr>
+          <w:rFonts w:ascii="Consolas" w:eastAsia="Times New Roman" w:hAnsi="Consolas" w:cs="Times New Roman"/>
+          <w:color w:val="CE9178"/>
+          <w:sz w:val="18"/>
+          <w:szCs w:val="21"/>
+          <w:lang w:val="en-IN" w:eastAsia="it-IT"/>
+        </w:rPr>
+        <w:t>'Monetary'</w:t>
+      </w:r>
+      <w:r>
+        <w:rPr>
+          <w:rFonts w:ascii="Consolas" w:eastAsia="Times New Roman" w:hAnsi="Consolas" w:cs="Times New Roman"/>
+          <w:color w:val="D4D4D4"/>
+          <w:sz w:val="18"/>
+          <w:szCs w:val="21"/>
+          <w:lang w:val="en-IN" w:eastAsia="it-IT"/>
+        </w:rPr>
+        <w:t xml:space="preserve">, </w:t>
+      </w:r>
+      <w:r>
+        <w:rPr>
+          <w:rFonts w:ascii="Consolas" w:eastAsia="Times New Roman" w:hAnsi="Consolas" w:cs="Times New Roman"/>
+          <w:color w:val="9CDCFE"/>
+          <w:sz w:val="18"/>
+          <w:szCs w:val="21"/>
+          <w:lang w:val="en-IN" w:eastAsia="it-IT"/>
+        </w:rPr>
+        <w:t>ascending</w:t>
+      </w:r>
+      <w:r>
+        <w:rPr>
+          <w:rFonts w:ascii="Consolas" w:eastAsia="Times New Roman" w:hAnsi="Consolas" w:cs="Times New Roman"/>
+          <w:color w:val="D4D4D4"/>
+          <w:sz w:val="18"/>
+          <w:szCs w:val="21"/>
+          <w:lang w:val="en-IN" w:eastAsia="it-IT"/>
+        </w:rPr>
+        <w:t>=</w:t>
+      </w:r>
+      <w:r>
+        <w:rPr>
+          <w:rFonts w:ascii="Consolas" w:eastAsia="Times New Roman" w:hAnsi="Consolas" w:cs="Times New Roman"/>
+          <w:color w:val="569CD6"/>
+          <w:sz w:val="18"/>
+          <w:szCs w:val="21"/>
+          <w:lang w:val="en-IN" w:eastAsia="it-IT"/>
+        </w:rPr>
+        <w:t>False</w:t>
+      </w:r>
+      <w:r>
+        <w:rPr>
+          <w:rFonts w:ascii="Consolas" w:eastAsia="Times New Roman" w:hAnsi="Consolas" w:cs="Times New Roman"/>
+          <w:color w:val="D4D4D4"/>
+          <w:sz w:val="18"/>
+          <w:szCs w:val="21"/>
+          <w:lang w:val="en-IN" w:eastAsia="it-IT"/>
+        </w:rPr>
+        <w:t>))</w:t>
+      </w:r>
+    </w:p>
+    <w:p>
+      <w:pPr>
+        <w:shd w:val="clear" w:color="auto" w:fill="1E1E1E"/>
+        <w:spacing w:before="0" w:after="0" w:line="240" w:lineRule="auto"/>
+        <w:rPr>
+          <w:rFonts w:ascii="Consolas" w:eastAsia="Times New Roman" w:hAnsi="Consolas" w:cs="Times New Roman"/>
+          <w:color w:val="D4D4D4"/>
+          <w:sz w:val="18"/>
+          <w:szCs w:val="21"/>
+          <w:lang w:val="en-IN" w:eastAsia="it-IT"/>
+        </w:rPr>
+      </w:pPr>
+      <w:r>
+        <w:rPr>
+          <w:rFonts w:ascii="Consolas" w:eastAsia="Times New Roman" w:hAnsi="Consolas" w:cs="Times New Roman"/>
+          <w:color w:val="D4D4D4"/>
+          <w:sz w:val="18"/>
+          <w:szCs w:val="21"/>
+          <w:lang w:val="en-IN" w:eastAsia="it-IT"/>
+        </w:rPr>
+        <w:t>[root/notebooks/</w:t>
+      </w:r>
+      <w:r>
+        <w:rPr>
+          <w:rFonts w:ascii="Consolas" w:eastAsia="Times New Roman" w:hAnsi="Consolas" w:cs="Times New Roman"/>
+          <w:color w:val="D4D4D4"/>
+          <w:sz w:val="18"/>
+          <w:szCs w:val="21"/>
+          <w:lang w:val="en-IN" w:eastAsia="it-IT"/>
+        </w:rPr>
+        <w:t>04_customer_segmentation_rfm</w:t>
+      </w:r>
+      <w:r>
+        <w:rPr>
+          <w:rFonts w:ascii="Consolas" w:eastAsia="Times New Roman" w:hAnsi="Consolas" w:cs="Times New Roman"/>
+          <w:color w:val="D4D4D4"/>
+          <w:sz w:val="18"/>
+          <w:szCs w:val="21"/>
+          <w:lang w:val="en-IN" w:eastAsia="it-IT"/>
+        </w:rPr>
+        <w:t>.ipynb]</w:t>
+      </w:r>
+    </w:p>
+    <w:p>
+      <w:pPr>
+        <w:numPr>
+          <w:ilvl w:val="0"/>
+          <w:numId w:val="12"/>
+        </w:numPr>
+        <w:spacing w:beforeAutospacing="1" w:after="100" w:afterAutospacing="1"/>
+        <w:rPr>
+          <w:rFonts w:ascii="Times New Roman" w:eastAsia="Times New Roman" w:hAnsi="Times New Roman" w:cs="Times New Roman"/>
+          <w:sz w:val="24"/>
+          <w:szCs w:val="24"/>
+          <w:lang w:val="en-IN" w:eastAsia="it-IT"/>
+        </w:rPr>
+      </w:pPr>
+      <w:proofErr w:type="spellStart"/>
+      <w:r>
+        <w:rPr>
+          <w:rFonts w:ascii="Times New Roman" w:eastAsia="Times New Roman" w:hAnsi="Times New Roman" w:cs="Times New Roman"/>
+          <w:b/>
+          <w:bCs/>
+          <w:highlight w:val="lightGray"/>
+          <w:lang w:val="en-IN" w:eastAsia="it-IT"/>
+        </w:rPr>
+        <w:t>kmeans.fit_transform</w:t>
+      </w:r>
+      <w:proofErr w:type="spellEnd"/>
+      <w:r>
+        <w:rPr>
+          <w:rFonts w:ascii="Times New Roman" w:eastAsia="Times New Roman" w:hAnsi="Times New Roman" w:cs="Times New Roman"/>
+          <w:b/>
+          <w:bCs/>
+          <w:highlight w:val="lightGray"/>
+          <w:lang w:val="en-IN" w:eastAsia="it-IT"/>
+        </w:rPr>
+        <w:t>(</w:t>
+      </w:r>
+      <w:proofErr w:type="spellStart"/>
+      <w:r>
+        <w:rPr>
+          <w:rFonts w:ascii="Times New Roman" w:eastAsia="Times New Roman" w:hAnsi="Times New Roman" w:cs="Times New Roman"/>
+          <w:b/>
+          <w:bCs/>
+          <w:highlight w:val="lightGray"/>
+          <w:lang w:val="en-IN" w:eastAsia="it-IT"/>
+        </w:rPr>
+        <w:t>rfm_scaled</w:t>
+      </w:r>
+      <w:proofErr w:type="spellEnd"/>
+      <w:proofErr w:type="gramStart"/>
+      <w:r>
+        <w:rPr>
+          <w:rFonts w:ascii="Times New Roman" w:eastAsia="Times New Roman" w:hAnsi="Times New Roman" w:cs="Times New Roman"/>
+          <w:b/>
+          <w:bCs/>
+          <w:highlight w:val="lightGray"/>
+          <w:lang w:val="en-IN" w:eastAsia="it-IT"/>
+        </w:rPr>
+        <w:t>).argmax</w:t>
+      </w:r>
+      <w:proofErr w:type="gramEnd"/>
+      <w:r>
+        <w:rPr>
+          <w:rFonts w:ascii="Times New Roman" w:eastAsia="Times New Roman" w:hAnsi="Times New Roman" w:cs="Times New Roman"/>
+          <w:b/>
+          <w:bCs/>
+          <w:highlight w:val="lightGray"/>
+          <w:lang w:val="en-IN" w:eastAsia="it-IT"/>
+        </w:rPr>
+        <w:t>(axis=1)</w:t>
+      </w:r>
+      <w:r>
+        <w:rPr>
+          <w:rFonts w:ascii="Times New Roman" w:eastAsia="Times New Roman" w:hAnsi="Times New Roman" w:cs="Times New Roman"/>
+          <w:sz w:val="24"/>
+          <w:szCs w:val="24"/>
+          <w:lang w:val="en-IN" w:eastAsia="it-IT"/>
+        </w:rPr>
+        <w:t xml:space="preserve">: </w:t>
+      </w:r>
+      <w:r>
+        <w:rPr>
+          <w:rFonts w:ascii="Times New Roman" w:eastAsia="Times New Roman" w:hAnsi="Times New Roman" w:cs="Times New Roman"/>
+          <w:sz w:val="24"/>
+          <w:szCs w:val="24"/>
+          <w:lang w:val="en-IN" w:eastAsia="it-IT"/>
+        </w:rPr>
+        <w:t>we</w:t>
+      </w:r>
+      <w:r>
+        <w:rPr>
+          <w:rFonts w:ascii="Times New Roman" w:eastAsia="Times New Roman" w:hAnsi="Times New Roman" w:cs="Times New Roman"/>
+          <w:sz w:val="24"/>
+          <w:szCs w:val="24"/>
+          <w:lang w:val="en-IN" w:eastAsia="it-IT"/>
+        </w:rPr>
+        <w:t xml:space="preserve"> used the distance to the centroids to assign each Trade Account to its most mathematically similar group. This ensures that every customer in a cluster shares a common 'DNA' in their purchasing </w:t>
+      </w:r>
+      <w:proofErr w:type="spellStart"/>
+      <w:r>
+        <w:rPr>
+          <w:rFonts w:ascii="Times New Roman" w:eastAsia="Times New Roman" w:hAnsi="Times New Roman" w:cs="Times New Roman"/>
+          <w:sz w:val="24"/>
+          <w:szCs w:val="24"/>
+          <w:lang w:val="en-IN" w:eastAsia="it-IT"/>
+        </w:rPr>
+        <w:t>behavior</w:t>
+      </w:r>
+      <w:proofErr w:type="spellEnd"/>
+      <w:r>
+        <w:rPr>
+          <w:rFonts w:ascii="Times New Roman" w:eastAsia="Times New Roman" w:hAnsi="Times New Roman" w:cs="Times New Roman"/>
+          <w:sz w:val="24"/>
+          <w:szCs w:val="24"/>
+          <w:lang w:val="en-IN" w:eastAsia="it-IT"/>
+        </w:rPr>
+        <w:t>.</w:t>
+      </w:r>
+    </w:p>
+    <w:p>
+      <w:pPr>
+        <w:numPr>
+          <w:ilvl w:val="0"/>
+          <w:numId w:val="12"/>
+        </w:numPr>
+        <w:spacing w:beforeAutospacing="1" w:after="100" w:afterAutospacing="1"/>
+        <w:rPr>
+          <w:rFonts w:ascii="Times New Roman" w:eastAsia="Times New Roman" w:hAnsi="Times New Roman" w:cs="Times New Roman"/>
+          <w:sz w:val="24"/>
+          <w:szCs w:val="24"/>
+          <w:lang w:val="en-IN" w:eastAsia="it-IT"/>
+        </w:rPr>
+      </w:pPr>
+      <w:proofErr w:type="gramStart"/>
+      <w:r>
+        <w:rPr>
+          <w:rFonts w:ascii="Times New Roman" w:eastAsia="Times New Roman" w:hAnsi="Times New Roman" w:cs="Times New Roman"/>
+          <w:b/>
+          <w:bCs/>
+          <w:highlight w:val="lightGray"/>
+          <w:lang w:val="en-IN" w:eastAsia="it-IT"/>
+        </w:rPr>
+        <w:t>.</w:t>
+      </w:r>
+      <w:proofErr w:type="spellStart"/>
+      <w:r>
+        <w:rPr>
+          <w:rFonts w:ascii="Times New Roman" w:eastAsia="Times New Roman" w:hAnsi="Times New Roman" w:cs="Times New Roman"/>
+          <w:b/>
+          <w:bCs/>
+          <w:highlight w:val="lightGray"/>
+          <w:lang w:val="en-IN" w:eastAsia="it-IT"/>
+        </w:rPr>
+        <w:t>groupby</w:t>
+      </w:r>
+      <w:proofErr w:type="spellEnd"/>
+      <w:proofErr w:type="gramEnd"/>
+      <w:r>
+        <w:rPr>
+          <w:rFonts w:ascii="Times New Roman" w:eastAsia="Times New Roman" w:hAnsi="Times New Roman" w:cs="Times New Roman"/>
+          <w:b/>
+          <w:bCs/>
+          <w:highlight w:val="lightGray"/>
+          <w:lang w:val="en-IN" w:eastAsia="it-IT"/>
+        </w:rPr>
+        <w:t>('Cluster')[features].mean()</w:t>
+      </w:r>
+      <w:r>
+        <w:rPr>
+          <w:rFonts w:ascii="Times New Roman" w:eastAsia="Times New Roman" w:hAnsi="Times New Roman" w:cs="Times New Roman"/>
+          <w:sz w:val="24"/>
+          <w:szCs w:val="24"/>
+          <w:lang w:val="en-IN" w:eastAsia="it-IT"/>
+        </w:rPr>
+        <w:t xml:space="preserve">: By calculating the average RFM values for each group, </w:t>
+      </w:r>
+      <w:r>
+        <w:rPr>
+          <w:rFonts w:ascii="Times New Roman" w:eastAsia="Times New Roman" w:hAnsi="Times New Roman" w:cs="Times New Roman"/>
+          <w:sz w:val="24"/>
+          <w:szCs w:val="24"/>
+          <w:lang w:val="en-IN" w:eastAsia="it-IT"/>
+        </w:rPr>
+        <w:t>we</w:t>
+      </w:r>
+      <w:r>
+        <w:rPr>
+          <w:rFonts w:ascii="Times New Roman" w:eastAsia="Times New Roman" w:hAnsi="Times New Roman" w:cs="Times New Roman"/>
+          <w:sz w:val="24"/>
+          <w:szCs w:val="24"/>
+          <w:lang w:val="en-IN" w:eastAsia="it-IT"/>
+        </w:rPr>
+        <w:t xml:space="preserve"> created a 'Representative Profile' for that cluster. This is what allows us to say, for example, that 'Cluster 0' represents designers who spend an average of $15k and haven't ordered in over 30 days."</w:t>
+      </w:r>
+    </w:p>
+    <w:p>
+      <w:pPr>
+        <w:numPr>
+          <w:ilvl w:val="0"/>
+          <w:numId w:val="12"/>
+        </w:numPr>
+        <w:spacing w:beforeAutospacing="1" w:after="100" w:afterAutospacing="1"/>
+        <w:rPr>
+          <w:rFonts w:ascii="Times New Roman" w:eastAsia="Times New Roman" w:hAnsi="Times New Roman" w:cs="Times New Roman"/>
+          <w:sz w:val="24"/>
+          <w:szCs w:val="24"/>
+          <w:lang w:val="en-IN" w:eastAsia="it-IT"/>
+        </w:rPr>
+      </w:pPr>
+      <w:proofErr w:type="gramStart"/>
+      <w:r>
+        <w:rPr>
+          <w:rFonts w:ascii="Times New Roman" w:eastAsia="Times New Roman" w:hAnsi="Times New Roman" w:cs="Times New Roman"/>
+          <w:b/>
+          <w:bCs/>
+          <w:highlight w:val="lightGray"/>
+          <w:lang w:val="en-IN" w:eastAsia="it-IT"/>
+        </w:rPr>
+        <w:t>.</w:t>
+      </w:r>
+      <w:proofErr w:type="spellStart"/>
+      <w:r>
+        <w:rPr>
+          <w:rFonts w:ascii="Times New Roman" w:eastAsia="Times New Roman" w:hAnsi="Times New Roman" w:cs="Times New Roman"/>
+          <w:b/>
+          <w:bCs/>
+          <w:highlight w:val="lightGray"/>
+          <w:lang w:val="en-IN" w:eastAsia="it-IT"/>
+        </w:rPr>
+        <w:t>sort</w:t>
+      </w:r>
+      <w:proofErr w:type="gramEnd"/>
+      <w:r>
+        <w:rPr>
+          <w:rFonts w:ascii="Times New Roman" w:eastAsia="Times New Roman" w:hAnsi="Times New Roman" w:cs="Times New Roman"/>
+          <w:b/>
+          <w:bCs/>
+          <w:highlight w:val="lightGray"/>
+          <w:lang w:val="en-IN" w:eastAsia="it-IT"/>
+        </w:rPr>
+        <w:t>_values</w:t>
+      </w:r>
+      <w:proofErr w:type="spellEnd"/>
+      <w:r>
+        <w:rPr>
+          <w:rFonts w:ascii="Times New Roman" w:eastAsia="Times New Roman" w:hAnsi="Times New Roman" w:cs="Times New Roman"/>
+          <w:b/>
+          <w:bCs/>
+          <w:highlight w:val="lightGray"/>
+          <w:lang w:val="en-IN" w:eastAsia="it-IT"/>
+        </w:rPr>
+        <w:t>('Monetary', ascending=False)</w:t>
+      </w:r>
+      <w:r>
+        <w:rPr>
+          <w:rFonts w:ascii="Times New Roman" w:eastAsia="Times New Roman" w:hAnsi="Times New Roman" w:cs="Times New Roman"/>
+          <w:sz w:val="24"/>
+          <w:szCs w:val="24"/>
+          <w:lang w:val="en-IN" w:eastAsia="it-IT"/>
+        </w:rPr>
+        <w:t xml:space="preserve">: </w:t>
+      </w:r>
+      <w:r>
+        <w:rPr>
+          <w:rFonts w:ascii="Times New Roman" w:eastAsia="Times New Roman" w:hAnsi="Times New Roman" w:cs="Times New Roman"/>
+          <w:sz w:val="24"/>
+          <w:szCs w:val="24"/>
+          <w:lang w:val="en-IN" w:eastAsia="it-IT"/>
+        </w:rPr>
+        <w:t>we</w:t>
+      </w:r>
+      <w:r>
+        <w:rPr>
+          <w:rFonts w:ascii="Times New Roman" w:eastAsia="Times New Roman" w:hAnsi="Times New Roman" w:cs="Times New Roman"/>
+          <w:sz w:val="24"/>
+          <w:szCs w:val="24"/>
+          <w:lang w:val="en-IN" w:eastAsia="it-IT"/>
+        </w:rPr>
+        <w:t xml:space="preserve"> sorted the final profile by Monetary value to immediately identify the 'Whale' accounts versus the 'Long-Tail' accounts. This provides an instant snapshot of where our revenue concentration lies.</w:t>
+      </w:r>
+    </w:p>
+    <w:p>
+      <w:pPr>
+        <w:pStyle w:val="NormaleWeb"/>
+        <w:spacing w:line="276" w:lineRule="auto"/>
+        <w:jc w:val="both"/>
+        <w:rPr>
+          <w:lang w:val="en-IN"/>
+        </w:rPr>
+      </w:pPr>
+      <w:r>
+        <w:rPr>
+          <w:lang w:val="en-IN"/>
+        </w:rPr>
+        <w:t xml:space="preserve">This visualization (the box plot) represents the </w:t>
+      </w:r>
+      <w:r>
+        <w:rPr>
+          <w:b/>
+          <w:bCs/>
+          <w:lang w:val="en-IN"/>
+        </w:rPr>
+        <w:t>Cluster Profiles</w:t>
+      </w:r>
+      <w:r>
+        <w:rPr>
+          <w:lang w:val="en-IN"/>
+        </w:rPr>
+        <w:t xml:space="preserve"> generated by K-Means algorithm. It is used to validate that clusters are distinct and to define the "personality" of each customer segment.</w:t>
+      </w:r>
+    </w:p>
+    <w:p>
+      <w:pPr>
+        <w:pStyle w:val="NormaleWeb"/>
+        <w:spacing w:line="276" w:lineRule="auto"/>
+        <w:jc w:val="both"/>
+        <w:rPr>
+          <w:lang w:val="en-IN"/>
+        </w:rPr>
+      </w:pPr>
+      <w:r>
+        <w:rPr>
+          <w:lang w:val="en-IN"/>
+        </w:rPr>
+        <w:t xml:space="preserve">Since the y-axis is on a </w:t>
+      </w:r>
+      <w:r>
+        <w:rPr>
+          <w:b/>
+          <w:bCs/>
+          <w:lang w:val="en-IN"/>
+        </w:rPr>
+        <w:t>Log Scale</w:t>
+      </w:r>
+      <w:r>
+        <w:rPr>
+          <w:lang w:val="en-IN"/>
+        </w:rPr>
+        <w:t>, it effectively compresses large variances in revenue and sample counts, allowing to compare "average" customers and "high-end" designers on the same chart.</w:t>
+      </w:r>
+    </w:p>
+    <w:p>
+      <w:pPr>
+        <w:pStyle w:val="NormaleWeb"/>
+        <w:spacing w:line="276" w:lineRule="auto"/>
+        <w:jc w:val="both"/>
+        <w:rPr>
+          <w:lang w:val="en-IN"/>
+        </w:rPr>
+      </w:pPr>
+      <w:r>
+        <w:rPr>
+          <w:noProof/>
+          <w:lang w:val="en-IN"/>
+        </w:rPr>
+        <w:lastRenderedPageBreak/>
+        <w:drawing>
+          <wp:inline distT="0" distB="0" distL="0" distR="0" wp14:anchorId="6039EBC5" wp14:editId="116E6FC4">
+            <wp:extent cx="6120130" cy="3478530"/>
+            <wp:effectExtent l="0" t="0" r="0" b="7620"/>
+            <wp:docPr id="45" name="Immagine 45"/>
+            <wp:cNvGraphicFramePr>
+              <a:graphicFrameLocks xmlns:a="http://schemas.openxmlformats.org/drawingml/2006/main" noChangeAspect="1"/>
+            </wp:cNvGraphicFramePr>
+            <a:graphic xmlns:a="http://schemas.openxmlformats.org/drawingml/2006/main">
+              <a:graphicData uri="http://schemas.openxmlformats.org/drawingml/2006/picture">
+                <pic:pic xmlns:pic="http://schemas.openxmlformats.org/drawingml/2006/picture">
+                  <pic:nvPicPr>
+                    <pic:cNvPr id="45" name="cluster profiles.png"/>
+                    <pic:cNvPicPr/>
+                  </pic:nvPicPr>
+                  <pic:blipFill>
+                    <a:blip r:embed="rId20">
+                      <a:extLst>
+                        <a:ext uri="{28A0092B-C50C-407E-A947-70E740481C1C}">
+                          <a14:useLocalDpi xmlns:a14="http://schemas.microsoft.com/office/drawing/2010/main" val="0"/>
+                        </a:ext>
+                      </a:extLst>
+                    </a:blip>
+                    <a:stretch>
+                      <a:fillRect/>
+                    </a:stretch>
+                  </pic:blipFill>
+                  <pic:spPr>
+                    <a:xfrm>
+                      <a:off x="0" y="0"/>
+                      <a:ext cx="6120130" cy="3478530"/>
+                    </a:xfrm>
+                    <a:prstGeom prst="rect">
+                      <a:avLst/>
+                    </a:prstGeom>
+                  </pic:spPr>
+                </pic:pic>
+              </a:graphicData>
+            </a:graphic>
+          </wp:inline>
+        </w:drawing>
+      </w:r>
+    </w:p>
+    <w:p>
+      <w:pPr>
+        <w:spacing w:beforeAutospacing="1" w:after="100" w:afterAutospacing="1" w:line="240" w:lineRule="auto"/>
+        <w:jc w:val="both"/>
+        <w:rPr>
+          <w:rFonts w:ascii="Times New Roman" w:eastAsia="Times New Roman" w:hAnsi="Times New Roman" w:cs="Times New Roman"/>
+          <w:sz w:val="24"/>
+          <w:szCs w:val="24"/>
+          <w:lang w:val="en-IN" w:eastAsia="it-IT"/>
+        </w:rPr>
+      </w:pPr>
+      <w:r>
+        <w:rPr>
+          <w:rFonts w:ascii="Times New Roman" w:eastAsia="Times New Roman" w:hAnsi="Times New Roman" w:cs="Times New Roman"/>
+          <w:b/>
+          <w:bCs/>
+          <w:sz w:val="24"/>
+          <w:szCs w:val="24"/>
+          <w:lang w:val="en-IN" w:eastAsia="it-IT"/>
+        </w:rPr>
+        <w:t>Statistical Observations:</w:t>
+      </w:r>
+      <w:r>
+        <w:rPr>
+          <w:rFonts w:ascii="Times New Roman" w:eastAsia="Times New Roman" w:hAnsi="Times New Roman" w:cs="Times New Roman"/>
+          <w:sz w:val="24"/>
+          <w:szCs w:val="24"/>
+          <w:lang w:val="en-IN" w:eastAsia="it-IT"/>
+        </w:rPr>
+        <w:t xml:space="preserve"> </w:t>
+      </w:r>
+    </w:p>
+    <w:p>
+      <w:pPr>
+        <w:pStyle w:val="Paragrafoelenco"/>
+        <w:numPr>
+          <w:ilvl w:val="0"/>
+          <w:numId w:val="14"/>
+        </w:numPr>
+        <w:spacing w:beforeAutospacing="1" w:after="100" w:afterAutospacing="1" w:line="240" w:lineRule="auto"/>
+        <w:jc w:val="both"/>
+        <w:rPr>
+          <w:rFonts w:ascii="Times New Roman" w:eastAsia="Times New Roman" w:hAnsi="Times New Roman" w:cs="Times New Roman"/>
+          <w:sz w:val="24"/>
+          <w:szCs w:val="24"/>
+          <w:lang w:val="en-IN" w:eastAsia="it-IT"/>
+        </w:rPr>
+      </w:pPr>
+      <w:r>
+        <w:rPr>
+          <w:rFonts w:ascii="Times New Roman" w:eastAsia="Times New Roman" w:hAnsi="Times New Roman" w:cs="Times New Roman"/>
+          <w:b/>
+          <w:bCs/>
+          <w:sz w:val="24"/>
+          <w:szCs w:val="24"/>
+          <w:lang w:val="en-IN" w:eastAsia="it-IT"/>
+        </w:rPr>
+        <w:t>Cluster 0 (Premier Trade):</w:t>
+      </w:r>
+      <w:r>
+        <w:rPr>
+          <w:rFonts w:ascii="Times New Roman" w:eastAsia="Times New Roman" w:hAnsi="Times New Roman" w:cs="Times New Roman"/>
+          <w:sz w:val="24"/>
+          <w:szCs w:val="24"/>
+          <w:lang w:val="en-IN" w:eastAsia="it-IT"/>
+        </w:rPr>
+        <w:t xml:space="preserve"> Exhibits the highest median Frequency and Monetary values. The tight interquartile range (IQR) in Recency indicates a consistent, high-velocity purchasing pattern.</w:t>
+      </w:r>
+    </w:p>
+    <w:p>
+      <w:pPr>
+        <w:numPr>
+          <w:ilvl w:val="0"/>
+          <w:numId w:val="14"/>
+        </w:numPr>
+        <w:spacing w:beforeAutospacing="1" w:after="100" w:afterAutospacing="1" w:line="240" w:lineRule="auto"/>
+        <w:jc w:val="both"/>
+        <w:rPr>
+          <w:rFonts w:ascii="Times New Roman" w:eastAsia="Times New Roman" w:hAnsi="Times New Roman" w:cs="Times New Roman"/>
+          <w:sz w:val="24"/>
+          <w:szCs w:val="24"/>
+          <w:lang w:val="en-IN" w:eastAsia="it-IT"/>
+        </w:rPr>
+      </w:pPr>
+      <w:r>
+        <w:rPr>
+          <w:rFonts w:ascii="Times New Roman" w:eastAsia="Times New Roman" w:hAnsi="Times New Roman" w:cs="Times New Roman"/>
+          <w:b/>
+          <w:bCs/>
+          <w:sz w:val="24"/>
+          <w:szCs w:val="24"/>
+          <w:lang w:val="en-IN" w:eastAsia="it-IT"/>
+        </w:rPr>
+        <w:t>Cluster 1 (Dormant/Low-Value):</w:t>
+      </w:r>
+      <w:r>
+        <w:rPr>
+          <w:rFonts w:ascii="Times New Roman" w:eastAsia="Times New Roman" w:hAnsi="Times New Roman" w:cs="Times New Roman"/>
+          <w:sz w:val="24"/>
+          <w:szCs w:val="24"/>
+          <w:lang w:val="en-IN" w:eastAsia="it-IT"/>
+        </w:rPr>
+        <w:t xml:space="preserve"> Characterized by a significantly higher median Recency and lower Monetary density, indicating churn risk or one-off residential purchasers.</w:t>
+      </w:r>
+    </w:p>
+    <w:p>
+      <w:pPr>
+        <w:numPr>
+          <w:ilvl w:val="0"/>
+          <w:numId w:val="14"/>
+        </w:numPr>
+        <w:spacing w:beforeAutospacing="1" w:after="100" w:afterAutospacing="1" w:line="240" w:lineRule="auto"/>
+        <w:jc w:val="both"/>
+        <w:rPr>
+          <w:rFonts w:ascii="Times New Roman" w:eastAsia="Times New Roman" w:hAnsi="Times New Roman" w:cs="Times New Roman"/>
+          <w:sz w:val="24"/>
+          <w:szCs w:val="24"/>
+          <w:lang w:val="en-IN" w:eastAsia="it-IT"/>
+        </w:rPr>
+      </w:pPr>
+      <w:r>
+        <w:rPr>
+          <w:rFonts w:ascii="Times New Roman" w:eastAsia="Times New Roman" w:hAnsi="Times New Roman" w:cs="Times New Roman"/>
+          <w:b/>
+          <w:bCs/>
+          <w:sz w:val="24"/>
+          <w:szCs w:val="24"/>
+          <w:lang w:val="en-IN" w:eastAsia="it-IT"/>
+        </w:rPr>
+        <w:t>Cluster 2 (High-Intent Samplers):</w:t>
+      </w:r>
+      <w:r>
+        <w:rPr>
+          <w:rFonts w:ascii="Times New Roman" w:eastAsia="Times New Roman" w:hAnsi="Times New Roman" w:cs="Times New Roman"/>
+          <w:sz w:val="24"/>
+          <w:szCs w:val="24"/>
+          <w:lang w:val="en-IN" w:eastAsia="it-IT"/>
+        </w:rPr>
+        <w:t xml:space="preserve"> Displays a disproportionately high </w:t>
+      </w:r>
+      <w:proofErr w:type="spellStart"/>
+      <w:r>
+        <w:rPr>
+          <w:rFonts w:ascii="Courier New" w:eastAsia="Times New Roman" w:hAnsi="Courier New" w:cs="Courier New"/>
+          <w:lang w:val="en-IN" w:eastAsia="it-IT"/>
+        </w:rPr>
+        <w:t>Sample_Count</w:t>
+      </w:r>
+      <w:proofErr w:type="spellEnd"/>
+      <w:r>
+        <w:rPr>
+          <w:rFonts w:ascii="Times New Roman" w:eastAsia="Times New Roman" w:hAnsi="Times New Roman" w:cs="Times New Roman"/>
+          <w:sz w:val="24"/>
+          <w:szCs w:val="24"/>
+          <w:lang w:val="en-IN" w:eastAsia="it-IT"/>
+        </w:rPr>
+        <w:t xml:space="preserve"> relative to current </w:t>
+      </w:r>
+      <w:r>
+        <w:rPr>
+          <w:rFonts w:ascii="Courier New" w:eastAsia="Times New Roman" w:hAnsi="Courier New" w:cs="Courier New"/>
+          <w:lang w:val="en-IN" w:eastAsia="it-IT"/>
+        </w:rPr>
+        <w:t>Monetary</w:t>
+      </w:r>
+      <w:r>
+        <w:rPr>
+          <w:rFonts w:ascii="Times New Roman" w:eastAsia="Times New Roman" w:hAnsi="Times New Roman" w:cs="Times New Roman"/>
+          <w:sz w:val="24"/>
+          <w:szCs w:val="24"/>
+          <w:lang w:val="en-IN" w:eastAsia="it-IT"/>
+        </w:rPr>
+        <w:t xml:space="preserve"> value. This represents a prime conversion opportunity for the sales team.</w:t>
+      </w:r>
+    </w:p>
+    <w:p>
+      <w:pPr>
+        <w:spacing w:beforeAutospacing="1" w:after="100" w:afterAutospacing="1" w:line="240" w:lineRule="auto"/>
+        <w:jc w:val="both"/>
+        <w:rPr>
+          <w:rFonts w:ascii="Times New Roman" w:eastAsia="Times New Roman" w:hAnsi="Times New Roman" w:cs="Times New Roman"/>
+          <w:sz w:val="24"/>
+          <w:szCs w:val="24"/>
+          <w:lang w:val="en-IN" w:eastAsia="it-IT"/>
+        </w:rPr>
+      </w:pPr>
+      <w:r>
+        <w:rPr>
+          <w:rFonts w:ascii="Times New Roman" w:eastAsia="Times New Roman" w:hAnsi="Times New Roman" w:cs="Times New Roman"/>
+          <w:b/>
+          <w:bCs/>
+          <w:sz w:val="24"/>
+          <w:szCs w:val="24"/>
+          <w:lang w:val="en-IN" w:eastAsia="it-IT"/>
+        </w:rPr>
+        <w:t>Technical Justification:</w:t>
+      </w:r>
+      <w:r>
+        <w:rPr>
+          <w:rFonts w:ascii="Times New Roman" w:eastAsia="Times New Roman" w:hAnsi="Times New Roman" w:cs="Times New Roman"/>
+          <w:sz w:val="24"/>
+          <w:szCs w:val="24"/>
+          <w:lang w:val="en-IN" w:eastAsia="it-IT"/>
+        </w:rPr>
+        <w:t xml:space="preserve"> Logarithmic transformation (y = log(x)) was applied to the y-axis to normalize the visualization of "Whale" accounts (extreme outliers) alongside the standard distribution, ensuring all segments remain interpretable.</w:t>
+      </w:r>
+    </w:p>
+    <w:p>
+      <w:pPr>
+        <w:pStyle w:val="Titolo2"/>
+        <w:rPr>
+          <w:b/>
+          <w:lang w:val="en-IN"/>
+        </w:rPr>
+      </w:pPr>
+      <w:r>
+        <w:rPr>
+          <w:b/>
+          <w:lang w:val="en-IN"/>
+        </w:rPr>
+        <w:t xml:space="preserve">5.7 </w:t>
+      </w:r>
+      <w:r>
+        <w:rPr>
+          <w:b/>
+          <w:lang w:val="en-IN"/>
+        </w:rPr>
+        <w:t>Multi-Dimensional Cluster Separation (Pairplot)</w:t>
+      </w:r>
+    </w:p>
+    <w:p>
+      <w:pPr>
+        <w:spacing w:beforeAutospacing="1" w:after="100" w:afterAutospacing="1"/>
+        <w:jc w:val="both"/>
+        <w:rPr>
+          <w:rFonts w:ascii="Times New Roman" w:eastAsia="Times New Roman" w:hAnsi="Times New Roman" w:cs="Times New Roman"/>
+          <w:sz w:val="24"/>
+          <w:szCs w:val="24"/>
+          <w:lang w:val="en-IN" w:eastAsia="it-IT"/>
+        </w:rPr>
+      </w:pPr>
+      <w:r>
+        <w:rPr>
+          <w:rFonts w:ascii="Times New Roman" w:eastAsia="Times New Roman" w:hAnsi="Times New Roman" w:cs="Times New Roman"/>
+          <w:sz w:val="24"/>
+          <w:szCs w:val="24"/>
+          <w:lang w:val="en-IN" w:eastAsia="it-IT"/>
+        </w:rPr>
+        <w:t xml:space="preserve">The </w:t>
+      </w:r>
+      <w:proofErr w:type="spellStart"/>
+      <w:r>
+        <w:rPr>
+          <w:rFonts w:ascii="Times New Roman" w:eastAsia="Times New Roman" w:hAnsi="Times New Roman" w:cs="Times New Roman"/>
+          <w:b/>
+          <w:bCs/>
+          <w:sz w:val="24"/>
+          <w:szCs w:val="24"/>
+          <w:lang w:val="en-IN" w:eastAsia="it-IT"/>
+        </w:rPr>
+        <w:t>Pairplot</w:t>
+      </w:r>
+      <w:proofErr w:type="spellEnd"/>
+      <w:r>
+        <w:rPr>
+          <w:rFonts w:ascii="Times New Roman" w:eastAsia="Times New Roman" w:hAnsi="Times New Roman" w:cs="Times New Roman"/>
+          <w:sz w:val="24"/>
+          <w:szCs w:val="24"/>
+          <w:lang w:val="en-IN" w:eastAsia="it-IT"/>
+        </w:rPr>
+        <w:t xml:space="preserve"> matrix serves as a diagnostic tool to evaluate the internal consistency and linear separability of the K-Means model. By </w:t>
+      </w:r>
+      <w:proofErr w:type="spellStart"/>
+      <w:r>
+        <w:rPr>
+          <w:rFonts w:ascii="Times New Roman" w:eastAsia="Times New Roman" w:hAnsi="Times New Roman" w:cs="Times New Roman"/>
+          <w:sz w:val="24"/>
+          <w:szCs w:val="24"/>
+          <w:lang w:val="en-IN" w:eastAsia="it-IT"/>
+        </w:rPr>
+        <w:t>analyzing</w:t>
+      </w:r>
+      <w:proofErr w:type="spellEnd"/>
+      <w:r>
+        <w:rPr>
+          <w:rFonts w:ascii="Times New Roman" w:eastAsia="Times New Roman" w:hAnsi="Times New Roman" w:cs="Times New Roman"/>
+          <w:sz w:val="24"/>
+          <w:szCs w:val="24"/>
+          <w:lang w:val="en-IN" w:eastAsia="it-IT"/>
+        </w:rPr>
+        <w:t xml:space="preserve"> a sampled subset of 5,000 observations, we can observe the relationships between Recency, Frequency, and Monetary value through a multi-dimensional lens.</w:t>
+      </w:r>
+    </w:p>
+    <w:p>
+      <w:pPr>
+        <w:numPr>
+          <w:ilvl w:val="0"/>
+          <w:numId w:val="16"/>
+        </w:numPr>
+        <w:spacing w:beforeAutospacing="1" w:after="100" w:afterAutospacing="1"/>
+        <w:jc w:val="both"/>
+        <w:rPr>
+          <w:rFonts w:ascii="Times New Roman" w:eastAsia="Times New Roman" w:hAnsi="Times New Roman" w:cs="Times New Roman"/>
+          <w:sz w:val="24"/>
+          <w:szCs w:val="24"/>
+          <w:lang w:val="en-IN" w:eastAsia="it-IT"/>
+        </w:rPr>
+      </w:pPr>
+      <w:r>
+        <w:rPr>
+          <w:rFonts w:ascii="Times New Roman" w:eastAsia="Times New Roman" w:hAnsi="Times New Roman" w:cs="Times New Roman"/>
+          <w:b/>
+          <w:bCs/>
+          <w:sz w:val="24"/>
+          <w:szCs w:val="24"/>
+          <w:lang w:val="en-IN" w:eastAsia="it-IT"/>
+        </w:rPr>
+        <w:t>Diagonal Density Analysis:</w:t>
+      </w:r>
+      <w:r>
+        <w:rPr>
+          <w:rFonts w:ascii="Times New Roman" w:eastAsia="Times New Roman" w:hAnsi="Times New Roman" w:cs="Times New Roman"/>
+          <w:sz w:val="24"/>
+          <w:szCs w:val="24"/>
+          <w:lang w:val="en-IN" w:eastAsia="it-IT"/>
+        </w:rPr>
+        <w:t xml:space="preserve"> The </w:t>
+      </w:r>
+      <w:r>
+        <w:rPr>
+          <w:rFonts w:ascii="Times New Roman" w:eastAsia="Times New Roman" w:hAnsi="Times New Roman" w:cs="Times New Roman"/>
+          <w:b/>
+          <w:bCs/>
+          <w:sz w:val="24"/>
+          <w:szCs w:val="24"/>
+          <w:lang w:val="en-IN" w:eastAsia="it-IT"/>
+        </w:rPr>
+        <w:t>Kernel Density Estimate (KDE)</w:t>
+      </w:r>
+      <w:r>
+        <w:rPr>
+          <w:rFonts w:ascii="Times New Roman" w:eastAsia="Times New Roman" w:hAnsi="Times New Roman" w:cs="Times New Roman"/>
+          <w:sz w:val="24"/>
+          <w:szCs w:val="24"/>
+          <w:lang w:val="en-IN" w:eastAsia="it-IT"/>
+        </w:rPr>
+        <w:t xml:space="preserve"> plots on the diagonal show the probability distribution for each feature. Clear multi-modal peaks, particularly in the Recency and Monetary dimensions, confirm that the clustering algorithm has successfully isolated distinct economic </w:t>
+      </w:r>
+      <w:proofErr w:type="spellStart"/>
+      <w:r>
+        <w:rPr>
+          <w:rFonts w:ascii="Times New Roman" w:eastAsia="Times New Roman" w:hAnsi="Times New Roman" w:cs="Times New Roman"/>
+          <w:sz w:val="24"/>
+          <w:szCs w:val="24"/>
+          <w:lang w:val="en-IN" w:eastAsia="it-IT"/>
+        </w:rPr>
+        <w:t>behaviors</w:t>
+      </w:r>
+      <w:proofErr w:type="spellEnd"/>
+      <w:r>
+        <w:rPr>
+          <w:rFonts w:ascii="Times New Roman" w:eastAsia="Times New Roman" w:hAnsi="Times New Roman" w:cs="Times New Roman"/>
+          <w:sz w:val="24"/>
+          <w:szCs w:val="24"/>
+          <w:lang w:val="en-IN" w:eastAsia="it-IT"/>
+        </w:rPr>
+        <w:t xml:space="preserve"> rather than over-segmenting a uniform population.</w:t>
+      </w:r>
+    </w:p>
+    <w:p>
+      <w:pPr>
+        <w:numPr>
+          <w:ilvl w:val="0"/>
+          <w:numId w:val="16"/>
+        </w:numPr>
+        <w:spacing w:beforeAutospacing="1" w:after="100" w:afterAutospacing="1"/>
+        <w:jc w:val="both"/>
+        <w:rPr>
+          <w:rFonts w:ascii="Times New Roman" w:eastAsia="Times New Roman" w:hAnsi="Times New Roman" w:cs="Times New Roman"/>
+          <w:sz w:val="24"/>
+          <w:szCs w:val="24"/>
+          <w:lang w:val="en-IN" w:eastAsia="it-IT"/>
+        </w:rPr>
+      </w:pPr>
+      <w:r>
+        <w:rPr>
+          <w:rFonts w:ascii="Times New Roman" w:eastAsia="Times New Roman" w:hAnsi="Times New Roman" w:cs="Times New Roman"/>
+          <w:b/>
+          <w:bCs/>
+          <w:sz w:val="24"/>
+          <w:szCs w:val="24"/>
+          <w:lang w:val="en-IN" w:eastAsia="it-IT"/>
+        </w:rPr>
+        <w:t>Feature Correlation &amp; Cluster Overlap:</w:t>
+      </w:r>
+      <w:r>
+        <w:rPr>
+          <w:rFonts w:ascii="Times New Roman" w:eastAsia="Times New Roman" w:hAnsi="Times New Roman" w:cs="Times New Roman"/>
+          <w:sz w:val="24"/>
+          <w:szCs w:val="24"/>
+          <w:lang w:val="en-IN" w:eastAsia="it-IT"/>
+        </w:rPr>
+        <w:t xml:space="preserve"> The scatter plots reveal a strong positive correlation between Frequency and Monetary value, validating that customer loyalty (repeat </w:t>
+      </w:r>
+      <w:r>
+        <w:rPr>
+          <w:rFonts w:ascii="Times New Roman" w:eastAsia="Times New Roman" w:hAnsi="Times New Roman" w:cs="Times New Roman"/>
+          <w:sz w:val="24"/>
+          <w:szCs w:val="24"/>
+          <w:lang w:val="en-IN" w:eastAsia="it-IT"/>
+        </w:rPr>
+        <w:lastRenderedPageBreak/>
+        <w:t>purchases) is the primary driver of Lifetime Value (LTV). The visual separation of the "</w:t>
+      </w:r>
+      <w:proofErr w:type="spellStart"/>
+      <w:r>
+        <w:rPr>
+          <w:rFonts w:ascii="Times New Roman" w:eastAsia="Times New Roman" w:hAnsi="Times New Roman" w:cs="Times New Roman"/>
+          <w:sz w:val="24"/>
+          <w:szCs w:val="24"/>
+          <w:lang w:val="en-IN" w:eastAsia="it-IT"/>
+        </w:rPr>
+        <w:t>viridis</w:t>
+      </w:r>
+      <w:proofErr w:type="spellEnd"/>
+      <w:r>
+        <w:rPr>
+          <w:rFonts w:ascii="Times New Roman" w:eastAsia="Times New Roman" w:hAnsi="Times New Roman" w:cs="Times New Roman"/>
+          <w:sz w:val="24"/>
+          <w:szCs w:val="24"/>
+          <w:lang w:val="en-IN" w:eastAsia="it-IT"/>
+        </w:rPr>
+        <w:t xml:space="preserve">" </w:t>
+      </w:r>
+      <w:proofErr w:type="spellStart"/>
+      <w:r>
+        <w:rPr>
+          <w:rFonts w:ascii="Times New Roman" w:eastAsia="Times New Roman" w:hAnsi="Times New Roman" w:cs="Times New Roman"/>
+          <w:sz w:val="24"/>
+          <w:szCs w:val="24"/>
+          <w:lang w:val="en-IN" w:eastAsia="it-IT"/>
+        </w:rPr>
+        <w:t>color</w:t>
+      </w:r>
+      <w:proofErr w:type="spellEnd"/>
+      <w:r>
+        <w:rPr>
+          <w:rFonts w:ascii="Times New Roman" w:eastAsia="Times New Roman" w:hAnsi="Times New Roman" w:cs="Times New Roman"/>
+          <w:sz w:val="24"/>
+          <w:szCs w:val="24"/>
+          <w:lang w:val="en-IN" w:eastAsia="it-IT"/>
+        </w:rPr>
+        <w:t xml:space="preserve"> palette across the plots demonstrates minimal overlap, confirming high </w:t>
+      </w:r>
+      <w:r>
+        <w:rPr>
+          <w:rFonts w:ascii="Times New Roman" w:eastAsia="Times New Roman" w:hAnsi="Times New Roman" w:cs="Times New Roman"/>
+          <w:b/>
+          <w:bCs/>
+          <w:sz w:val="24"/>
+          <w:szCs w:val="24"/>
+          <w:lang w:val="en-IN" w:eastAsia="it-IT"/>
+        </w:rPr>
+        <w:t>inter-cluster distance</w:t>
+      </w:r>
+      <w:r>
+        <w:rPr>
+          <w:rFonts w:ascii="Times New Roman" w:eastAsia="Times New Roman" w:hAnsi="Times New Roman" w:cs="Times New Roman"/>
+          <w:sz w:val="24"/>
+          <w:szCs w:val="24"/>
+          <w:lang w:val="en-IN" w:eastAsia="it-IT"/>
+        </w:rPr>
+        <w:t xml:space="preserve"> and robust model stability.</w:t>
+      </w:r>
+    </w:p>
+    <w:p>
+      <w:pPr>
+        <w:numPr>
+          <w:ilvl w:val="0"/>
+          <w:numId w:val="16"/>
+        </w:numPr>
+        <w:spacing w:beforeAutospacing="1" w:after="100" w:afterAutospacing="1"/>
+        <w:jc w:val="both"/>
+        <w:rPr>
+          <w:rFonts w:ascii="Times New Roman" w:eastAsia="Times New Roman" w:hAnsi="Times New Roman" w:cs="Times New Roman"/>
+          <w:sz w:val="24"/>
+          <w:szCs w:val="24"/>
+          <w:lang w:val="en-IN" w:eastAsia="it-IT"/>
+        </w:rPr>
+      </w:pPr>
+      <w:r>
+        <w:rPr>
+          <w:rFonts w:ascii="Times New Roman" w:eastAsia="Times New Roman" w:hAnsi="Times New Roman" w:cs="Times New Roman"/>
+          <w:b/>
+          <w:bCs/>
+          <w:sz w:val="24"/>
+          <w:szCs w:val="24"/>
+          <w:lang w:val="en-IN" w:eastAsia="it-IT"/>
+        </w:rPr>
+        <w:t>Implementation Note:</w:t>
+      </w:r>
+      <w:r>
+        <w:rPr>
+          <w:rFonts w:ascii="Times New Roman" w:eastAsia="Times New Roman" w:hAnsi="Times New Roman" w:cs="Times New Roman"/>
+          <w:sz w:val="24"/>
+          <w:szCs w:val="24"/>
+          <w:lang w:val="en-IN" w:eastAsia="it-IT"/>
+        </w:rPr>
+        <w:t xml:space="preserve"> The use of </w:t>
+      </w:r>
+      <w:r>
+        <w:rPr>
+          <w:rFonts w:ascii="Courier New" w:eastAsia="Times New Roman" w:hAnsi="Courier New" w:cs="Courier New"/>
+          <w:lang w:val="en-IN" w:eastAsia="it-IT"/>
+        </w:rPr>
+        <w:t>alpha=0.5</w:t>
+      </w:r>
+      <w:r>
+        <w:rPr>
+          <w:rFonts w:ascii="Times New Roman" w:eastAsia="Times New Roman" w:hAnsi="Times New Roman" w:cs="Times New Roman"/>
+          <w:sz w:val="24"/>
+          <w:szCs w:val="24"/>
+          <w:lang w:val="en-IN" w:eastAsia="it-IT"/>
+        </w:rPr>
+        <w:t xml:space="preserve"> transparency in the scatter plots was intentional to mitigate </w:t>
+      </w:r>
+      <w:proofErr w:type="spellStart"/>
+      <w:r>
+        <w:rPr>
+          <w:rFonts w:ascii="Times New Roman" w:eastAsia="Times New Roman" w:hAnsi="Times New Roman" w:cs="Times New Roman"/>
+          <w:sz w:val="24"/>
+          <w:szCs w:val="24"/>
+          <w:lang w:val="en-IN" w:eastAsia="it-IT"/>
+        </w:rPr>
+        <w:t>overplotting</w:t>
+      </w:r>
+      <w:proofErr w:type="spellEnd"/>
+      <w:r>
+        <w:rPr>
+          <w:rFonts w:ascii="Times New Roman" w:eastAsia="Times New Roman" w:hAnsi="Times New Roman" w:cs="Times New Roman"/>
+          <w:sz w:val="24"/>
+          <w:szCs w:val="24"/>
+          <w:lang w:val="en-IN" w:eastAsia="it-IT"/>
+        </w:rPr>
+        <w:t>, allowing for the identification of high-density "clusters within clusters" that may warrant further micro-segmentation.</w:t>
+      </w:r>
+    </w:p>
+    <w:p>
+      <w:pPr>
+        <w:pStyle w:val="NormaleWeb"/>
+        <w:spacing w:line="276" w:lineRule="auto"/>
+        <w:jc w:val="both"/>
+        <w:rPr>
+          <w:lang w:val="en-IN"/>
+        </w:rPr>
+      </w:pPr>
+      <w:r>
+        <w:rPr>
+          <w:noProof/>
+          <w:lang w:val="en-IN"/>
+        </w:rPr>
+        <w:drawing>
+          <wp:inline distT="0" distB="0" distL="0" distR="0" wp14:anchorId="37189C3B" wp14:editId="3A04F485">
+            <wp:extent cx="6120130" cy="5832475"/>
+            <wp:effectExtent l="0" t="0" r="0" b="0"/>
+            <wp:docPr id="46" name="Immagine 46"/>
+            <wp:cNvGraphicFramePr>
+              <a:graphicFrameLocks xmlns:a="http://schemas.openxmlformats.org/drawingml/2006/main" noChangeAspect="1"/>
+            </wp:cNvGraphicFramePr>
+            <a:graphic xmlns:a="http://schemas.openxmlformats.org/drawingml/2006/main">
+              <a:graphicData uri="http://schemas.openxmlformats.org/drawingml/2006/picture">
+                <pic:pic xmlns:pic="http://schemas.openxmlformats.org/drawingml/2006/picture">
+                  <pic:nvPicPr>
+                    <pic:cNvPr id="46" name="pair wise cluster separation.png"/>
+                    <pic:cNvPicPr/>
+                  </pic:nvPicPr>
+                  <pic:blipFill>
+                    <a:blip r:embed="rId21">
+                      <a:extLst>
+                        <a:ext uri="{28A0092B-C50C-407E-A947-70E740481C1C}">
+                          <a14:useLocalDpi xmlns:a14="http://schemas.microsoft.com/office/drawing/2010/main" val="0"/>
+                        </a:ext>
+                      </a:extLst>
+                    </a:blip>
+                    <a:stretch>
+                      <a:fillRect/>
+                    </a:stretch>
+                  </pic:blipFill>
+                  <pic:spPr>
+                    <a:xfrm>
+                      <a:off x="0" y="0"/>
+                      <a:ext cx="6120130" cy="5832475"/>
+                    </a:xfrm>
+                    <a:prstGeom prst="rect">
+                      <a:avLst/>
+                    </a:prstGeom>
+                  </pic:spPr>
+                </pic:pic>
+              </a:graphicData>
+            </a:graphic>
+          </wp:inline>
+        </w:drawing>
+      </w:r>
+    </w:p>
+    <w:p>
+      <w:pPr>
+        <w:spacing w:beforeAutospacing="1" w:after="100" w:afterAutospacing="1"/>
+        <w:rPr>
+          <w:rFonts w:ascii="Times New Roman" w:eastAsia="Times New Roman" w:hAnsi="Times New Roman" w:cs="Times New Roman"/>
+          <w:sz w:val="24"/>
+          <w:szCs w:val="24"/>
+          <w:lang w:val="en-IN" w:eastAsia="it-IT"/>
+        </w:rPr>
+      </w:pPr>
+    </w:p>
+    <w:p>
+      <w:pPr>
+        <w:pStyle w:val="Titolo2"/>
+        <w:rPr>
+          <w:b/>
+          <w:lang w:val="en-IN"/>
+        </w:rPr>
+      </w:pPr>
+      <w:r>
+        <w:rPr>
+          <w:b/>
+          <w:lang w:val="en-IN"/>
+        </w:rPr>
+        <w:t xml:space="preserve">5.8 </w:t>
+      </w:r>
+      <w:r>
+        <w:rPr>
+          <w:b/>
+          <w:lang w:val="en-IN"/>
+        </w:rPr>
+        <w:t>Analysis of the Graph: Population vs. Revenue</w:t>
+      </w:r>
+    </w:p>
+    <w:p>
+      <w:pPr>
+        <w:pStyle w:val="NormaleWeb"/>
+        <w:spacing w:line="276" w:lineRule="auto"/>
+        <w:jc w:val="both"/>
+        <w:rPr>
+          <w:lang w:val="en-IN"/>
+        </w:rPr>
+      </w:pPr>
+      <w:r>
+        <w:rPr>
+          <w:lang w:val="en-IN"/>
+        </w:rPr>
+        <w:t xml:space="preserve">This graph is a </w:t>
+      </w:r>
+      <w:r>
+        <w:rPr>
+          <w:b/>
+          <w:bCs/>
+          <w:lang w:val="en-IN"/>
+        </w:rPr>
+        <w:t>Strategic Opportunity Map</w:t>
+      </w:r>
+      <w:r>
+        <w:rPr>
+          <w:lang w:val="en-IN"/>
+        </w:rPr>
+        <w:t>. It compares the volume of customers (Population) against the financial value they generate (Revenue) across different business types.</w:t>
+      </w:r>
+    </w:p>
+    <w:p>
+      <w:pPr>
+        <w:pStyle w:val="NormaleWeb"/>
+        <w:numPr>
+          <w:ilvl w:val="0"/>
+          <w:numId w:val="17"/>
+        </w:numPr>
+        <w:spacing w:line="276" w:lineRule="auto"/>
+        <w:jc w:val="both"/>
+        <w:rPr>
+          <w:lang w:val="en-IN"/>
+        </w:rPr>
+      </w:pPr>
+      <w:r>
+        <w:rPr>
+          <w:b/>
+          <w:bCs/>
+          <w:lang w:val="en-IN"/>
+        </w:rPr>
+        <w:lastRenderedPageBreak/>
+        <w:t>Designer (High Revenue, High Population):</w:t>
+      </w:r>
+      <w:r>
+        <w:rPr>
+          <w:lang w:val="en-IN"/>
+        </w:rPr>
+        <w:t xml:space="preserve"> This is your </w:t>
+      </w:r>
+      <w:r>
+        <w:rPr>
+          <w:b/>
+          <w:bCs/>
+          <w:lang w:val="en-IN"/>
+        </w:rPr>
+        <w:t>Core Engine</w:t>
+      </w:r>
+      <w:r>
+        <w:rPr>
+          <w:lang w:val="en-IN"/>
+        </w:rPr>
+        <w:t xml:space="preserve">. They are the bread and butter of the business. The strategy here is </w:t>
+      </w:r>
+      <w:r>
+        <w:rPr>
+          <w:b/>
+          <w:bCs/>
+          <w:lang w:val="en-IN"/>
+        </w:rPr>
+        <w:t>Retention</w:t>
+      </w:r>
+      <w:r>
+        <w:rPr>
+          <w:lang w:val="en-IN"/>
+        </w:rPr>
+        <w:t>.</w:t>
+      </w:r>
+    </w:p>
+    <w:p>
+      <w:pPr>
+        <w:pStyle w:val="NormaleWeb"/>
+        <w:numPr>
+          <w:ilvl w:val="0"/>
+          <w:numId w:val="17"/>
+        </w:numPr>
+        <w:spacing w:line="276" w:lineRule="auto"/>
+        <w:jc w:val="both"/>
+        <w:rPr>
+          <w:lang w:val="en-IN"/>
+        </w:rPr>
+      </w:pPr>
+      <w:r>
+        <w:rPr>
+          <w:b/>
+          <w:bCs/>
+          <w:lang w:val="en-IN"/>
+        </w:rPr>
+        <w:t>Architect (Lower Revenue, High Population):</w:t>
+      </w:r>
+      <w:r>
+        <w:rPr>
+          <w:lang w:val="en-IN"/>
+        </w:rPr>
+        <w:t xml:space="preserve"> This is a </w:t>
+      </w:r>
+      <w:r>
+        <w:rPr>
+          <w:b/>
+          <w:bCs/>
+          <w:lang w:val="en-IN"/>
+        </w:rPr>
+        <w:t>Warning Sign or Opportunity</w:t>
+      </w:r>
+      <w:r>
+        <w:rPr>
+          <w:lang w:val="en-IN"/>
+        </w:rPr>
+        <w:t>. You have many Architects, but they aren't spending as much as Designers.</w:t>
+      </w:r>
+    </w:p>
+    <w:p>
+      <w:pPr>
+        <w:pStyle w:val="NormaleWeb"/>
+        <w:numPr>
+          <w:ilvl w:val="1"/>
+          <w:numId w:val="17"/>
+        </w:numPr>
+        <w:spacing w:line="276" w:lineRule="auto"/>
+        <w:jc w:val="both"/>
+      </w:pPr>
+      <w:r>
+        <w:rPr>
+          <w:i/>
+          <w:iCs/>
+          <w:lang w:val="en-IN"/>
+        </w:rPr>
+        <w:t>Insight:</w:t>
+      </w:r>
+      <w:r>
+        <w:rPr>
+          <w:lang w:val="en-IN"/>
+        </w:rPr>
+        <w:t xml:space="preserve"> Are they using Schumacher just for "sampling" but buying the final product elsewhere? </w:t>
+      </w:r>
+      <w:r>
+        <w:t xml:space="preserve">Or </w:t>
+      </w:r>
+      <w:proofErr w:type="spellStart"/>
+      <w:r>
+        <w:t>is</w:t>
+      </w:r>
+      <w:proofErr w:type="spellEnd"/>
+      <w:r>
+        <w:t xml:space="preserve"> </w:t>
+      </w:r>
+      <w:proofErr w:type="spellStart"/>
+      <w:r>
+        <w:t>their</w:t>
+      </w:r>
+      <w:proofErr w:type="spellEnd"/>
+      <w:r>
+        <w:t xml:space="preserve"> project </w:t>
+      </w:r>
+      <w:proofErr w:type="spellStart"/>
+      <w:r>
+        <w:t>cycle</w:t>
+      </w:r>
+      <w:proofErr w:type="spellEnd"/>
+      <w:r>
+        <w:t xml:space="preserve"> </w:t>
+      </w:r>
+      <w:proofErr w:type="spellStart"/>
+      <w:r>
+        <w:t>longer</w:t>
+      </w:r>
+      <w:proofErr w:type="spellEnd"/>
+      <w:r>
+        <w:t>?</w:t>
+      </w:r>
+    </w:p>
+    <w:p>
+      <w:pPr>
+        <w:pStyle w:val="NormaleWeb"/>
+        <w:numPr>
+          <w:ilvl w:val="0"/>
+          <w:numId w:val="17"/>
+        </w:numPr>
+        <w:spacing w:line="276" w:lineRule="auto"/>
+        <w:jc w:val="both"/>
+        <w:rPr>
+          <w:lang w:val="en-IN"/>
+        </w:rPr>
+      </w:pPr>
+      <w:r>
+        <w:rPr>
+          <w:b/>
+          <w:bCs/>
+          <w:lang w:val="en-IN"/>
+        </w:rPr>
+        <w:t>Retailer/Hospitality (Low Population, Low Revenue):</w:t>
+      </w:r>
+      <w:r>
+        <w:rPr>
+          <w:lang w:val="en-IN"/>
+        </w:rPr>
+        <w:t xml:space="preserve"> These are </w:t>
+      </w:r>
+      <w:r>
+        <w:rPr>
+          <w:b/>
+          <w:bCs/>
+          <w:lang w:val="en-IN"/>
+        </w:rPr>
+        <w:t>Niche Segments</w:t>
+      </w:r>
+      <w:r>
+        <w:rPr>
+          <w:lang w:val="en-IN"/>
+        </w:rPr>
+        <w:t>.</w:t>
+      </w:r>
+    </w:p>
+    <w:p>
+      <w:pPr>
+        <w:pStyle w:val="NormaleWeb"/>
+        <w:numPr>
+          <w:ilvl w:val="1"/>
+          <w:numId w:val="17"/>
+        </w:numPr>
+        <w:spacing w:line="276" w:lineRule="auto"/>
+        <w:jc w:val="both"/>
+        <w:rPr>
+          <w:lang w:val="en-IN"/>
+        </w:rPr>
+      </w:pPr>
+      <w:r>
+        <w:rPr>
+          <w:i/>
+          <w:iCs/>
+          <w:lang w:val="en-IN"/>
+        </w:rPr>
+        <w:t>Insight:</w:t>
+      </w:r>
+      <w:r>
+        <w:rPr>
+          <w:lang w:val="en-IN"/>
+        </w:rPr>
+        <w:t xml:space="preserve"> Don't ignore them, but don't over-invest marketing dollars here unless you see a high "Revenue per Head" (a steep slope).</w:t>
+      </w:r>
+    </w:p>
+    <w:p>
+      <w:pPr>
+        <w:pStyle w:val="NormaleWeb"/>
+        <w:spacing w:line="276" w:lineRule="auto"/>
+        <w:jc w:val="both"/>
+        <w:rPr>
+          <w:lang w:val="en-IN"/>
+        </w:rPr>
+      </w:pPr>
+      <w:r>
+        <w:rPr>
+          <w:noProof/>
+          <w:lang w:val="en-IN"/>
+        </w:rPr>
+        <w:drawing>
+          <wp:inline distT="0" distB="0" distL="0" distR="0" wp14:anchorId="77EF5B45" wp14:editId="18AD8BC1">
+            <wp:extent cx="6120130" cy="3551555"/>
+            <wp:effectExtent l="0" t="0" r="0" b="0"/>
+            <wp:docPr id="47" name="Immagine 47"/>
+            <wp:cNvGraphicFramePr>
+              <a:graphicFrameLocks xmlns:a="http://schemas.openxmlformats.org/drawingml/2006/main" noChangeAspect="1"/>
+            </wp:cNvGraphicFramePr>
+            <a:graphic xmlns:a="http://schemas.openxmlformats.org/drawingml/2006/main">
+              <a:graphicData uri="http://schemas.openxmlformats.org/drawingml/2006/picture">
+                <pic:pic xmlns:pic="http://schemas.openxmlformats.org/drawingml/2006/picture">
+                  <pic:nvPicPr>
+                    <pic:cNvPr id="47" name="population-vs-revenue.png"/>
+                    <pic:cNvPicPr/>
+                  </pic:nvPicPr>
+                  <pic:blipFill>
+                    <a:blip r:embed="rId22">
+                      <a:extLst>
+                        <a:ext uri="{28A0092B-C50C-407E-A947-70E740481C1C}">
+                          <a14:useLocalDpi xmlns:a14="http://schemas.microsoft.com/office/drawing/2010/main" val="0"/>
+                        </a:ext>
+                      </a:extLst>
+                    </a:blip>
+                    <a:stretch>
+                      <a:fillRect/>
+                    </a:stretch>
+                  </pic:blipFill>
+                  <pic:spPr>
+                    <a:xfrm>
+                      <a:off x="0" y="0"/>
+                      <a:ext cx="6120130" cy="3551555"/>
+                    </a:xfrm>
+                    <a:prstGeom prst="rect">
+                      <a:avLst/>
+                    </a:prstGeom>
+                  </pic:spPr>
+                </pic:pic>
+              </a:graphicData>
+            </a:graphic>
+          </wp:inline>
+        </w:drawing>
+      </w:r>
       <w:bookmarkStart w:id="1" w:name="_GoBack"/>
       <w:bookmarkEnd w:id="1"/>
     </w:p>
     <w:p>
       <w:pPr>
+        <w:pStyle w:val="NormaleWeb"/>
+        <w:spacing w:line="276" w:lineRule="auto"/>
+        <w:jc w:val="both"/>
+        <w:rPr>
+          <w:lang w:val="en-IN"/>
+        </w:rPr>
+      </w:pPr>
+    </w:p>
+    <w:p>
+      <w:pPr>
+        <w:pStyle w:val="NormaleWeb"/>
+        <w:spacing w:line="276" w:lineRule="auto"/>
+        <w:rPr>
+          <w:lang w:val="en-IN"/>
+        </w:rPr>
+      </w:pPr>
+    </w:p>
+    <w:p>
+      <w:pPr>
         <w:jc w:val="both"/>
         <w:rPr>
           <w:rFonts w:ascii="Times New Roman" w:hAnsi="Times New Roman" w:cs="Times New Roman"/>
@@ -30866,12 +33232,12 @@
       </w:pPr>
     </w:p>
     <w:sectPr>
-      <w:headerReference w:type="even" r:id="rId20"/>
-      <w:headerReference w:type="default" r:id="rId21"/>
-      <w:footerReference w:type="even" r:id="rId22"/>
-      <w:footerReference w:type="default" r:id="rId23"/>
-      <w:headerReference w:type="first" r:id="rId24"/>
-      <w:footerReference w:type="first" r:id="rId25"/>
+      <w:headerReference w:type="even" r:id="rId23"/>
+      <w:headerReference w:type="default" r:id="rId24"/>
+      <w:footerReference w:type="even" r:id="rId25"/>
+      <w:footerReference w:type="default" r:id="rId26"/>
+      <w:headerReference w:type="first" r:id="rId27"/>
+      <w:footerReference w:type="first" r:id="rId28"/>
       <w:pgSz w:w="11906" w:h="16838"/>
       <w:pgMar w:top="1417" w:right="1134" w:bottom="1134" w:left="1134" w:header="708" w:footer="708" w:gutter="0"/>
       <w:pgNumType w:start="0"/>
@@ -30996,6 +33362,119 @@
 <file path=word/numbering.xml><?xml version="1.0" encoding="utf-8"?>
 <w:numbering xmlns:wpc="http://schemas.microsoft.com/office/word/2010/wordprocessingCanvas" xmlns:cx="http://schemas.microsoft.com/office/drawing/2014/chartex" xmlns:cx1="http://schemas.microsoft.com/office/drawing/2015/9/8/chartex" xmlns:cx2="http://schemas.microsoft.com/office/drawing/2015/10/21/chartex" xmlns:cx3="http://schemas.microsoft.com/office/drawing/2016/5/9/chartex" xmlns:cx4="http://schemas.microsoft.com/office/drawing/2016/5/10/chartex" xmlns:cx5="http://schemas.microsoft.com/office/drawing/2016/5/11/chartex" xmlns:cx6="http://schemas.microsoft.com/office/drawing/2016/5/12/chartex" xmlns:cx7="http://schemas.microsoft.com/office/drawing/2016/5/13/chartex" xmlns:cx8="http://schemas.microsoft.com/office/drawing/2016/5/14/chartex" xmlns:mc="http://schemas.openxmlformats.org/markup-compatibility/2006" xmlns:aink="http://schemas.microsoft.com/office/drawing/2016/ink" xmlns:am3d="http://schemas.microsoft.com/office/drawing/2017/model3d" xmlns:o="urn:schemas-microsoft-com:office:office" xmlns:r="http://schemas.openxmlformats.org/officeDocument/2006/relationships" xmlns:m="http://schemas.openxmlformats.org/officeDocument/2006/math" xmlns:v="urn:schemas-microsoft-com:vml" xmlns:wp14="http://schemas.microsoft.com/office/word/2010/wordprocessingDrawing" xmlns:wp="http://schemas.openxmlformats.org/drawingml/2006/wordprocessingDrawing" xmlns:w10="urn:schemas-microsoft-com:office:word" xmlns:w="http://schemas.openxmlformats.org/wordprocessingml/2006/main" xmlns:w14="http://schemas.microsoft.com/office/word/2010/wordml" xmlns:w15="http://schemas.microsoft.com/office/word/2012/wordml" xmlns:w16cid="http://schemas.microsoft.com/office/word/2016/wordml/cid" xmlns:w16se="http://schemas.microsoft.com/office/word/2015/wordml/symex" xmlns:wpg="http://schemas.microsoft.com/office/word/2010/wordprocessingGroup" xmlns:wpi="http://schemas.microsoft.com/office/word/2010/wordprocessingInk" xmlns:wne="http://schemas.microsoft.com/office/word/2006/wordml" xmlns:wps="http://schemas.microsoft.com/office/word/2010/wordprocessingShape" mc:Ignorable="w14 w15 w16se w16cid wp14">
   <w:abstractNum w:abstractNumId="0" w15:restartNumberingAfterBreak="0">
+    <w:nsid w:val="0C6D5D8D"/>
+    <w:multiLevelType w:val="hybridMultilevel"/>
+    <w:tmpl w:val="7C0EC8B4"/>
+    <w:lvl w:ilvl="0" w:tplc="04100001">
+      <w:start w:val="1"/>
+      <w:numFmt w:val="bullet"/>
+      <w:lvlText w:val=""/>
+      <w:lvlJc w:val="left"/>
+      <w:pPr>
+        <w:ind w:left="720" w:hanging="360"/>
+      </w:pPr>
+      <w:rPr>
+        <w:rFonts w:ascii="Symbol" w:hAnsi="Symbol" w:hint="default"/>
+      </w:rPr>
+    </w:lvl>
+    <w:lvl w:ilvl="1" w:tplc="04100003" w:tentative="1">
+      <w:start w:val="1"/>
+      <w:numFmt w:val="bullet"/>
+      <w:lvlText w:val="o"/>
+      <w:lvlJc w:val="left"/>
+      <w:pPr>
+        <w:ind w:left="1440" w:hanging="360"/>
+      </w:pPr>
+      <w:rPr>
+        <w:rFonts w:ascii="Courier New" w:hAnsi="Courier New" w:cs="Courier New" w:hint="default"/>
+      </w:rPr>
+    </w:lvl>
+    <w:lvl w:ilvl="2" w:tplc="04100005" w:tentative="1">
+      <w:start w:val="1"/>
+      <w:numFmt w:val="bullet"/>
+      <w:lvlText w:val=""/>
+      <w:lvlJc w:val="left"/>
+      <w:pPr>
+        <w:ind w:left="2160" w:hanging="360"/>
+      </w:pPr>
+      <w:rPr>
+        <w:rFonts w:ascii="Wingdings" w:hAnsi="Wingdings" w:hint="default"/>
+      </w:rPr>
+    </w:lvl>
+    <w:lvl w:ilvl="3" w:tplc="04100001" w:tentative="1">
+      <w:start w:val="1"/>
+      <w:numFmt w:val="bullet"/>
+      <w:lvlText w:val=""/>
+      <w:lvlJc w:val="left"/>
+      <w:pPr>
+        <w:ind w:left="2880" w:hanging="360"/>
+      </w:pPr>
+      <w:rPr>
+        <w:rFonts w:ascii="Symbol" w:hAnsi="Symbol" w:hint="default"/>
+      </w:rPr>
+    </w:lvl>
+    <w:lvl w:ilvl="4" w:tplc="04100003" w:tentative="1">
+      <w:start w:val="1"/>
+      <w:numFmt w:val="bullet"/>
+      <w:lvlText w:val="o"/>
+      <w:lvlJc w:val="left"/>
+      <w:pPr>
+        <w:ind w:left="3600" w:hanging="360"/>
+      </w:pPr>
+      <w:rPr>
+        <w:rFonts w:ascii="Courier New" w:hAnsi="Courier New" w:cs="Courier New" w:hint="default"/>
+      </w:rPr>
+    </w:lvl>
+    <w:lvl w:ilvl="5" w:tplc="04100005" w:tentative="1">
+      <w:start w:val="1"/>
+      <w:numFmt w:val="bullet"/>
+      <w:lvlText w:val=""/>
+      <w:lvlJc w:val="left"/>
+      <w:pPr>
+        <w:ind w:left="4320" w:hanging="360"/>
+      </w:pPr>
+      <w:rPr>
+        <w:rFonts w:ascii="Wingdings" w:hAnsi="Wingdings" w:hint="default"/>
+      </w:rPr>
+    </w:lvl>
+    <w:lvl w:ilvl="6" w:tplc="04100001" w:tentative="1">
+      <w:start w:val="1"/>
+      <w:numFmt w:val="bullet"/>
+      <w:lvlText w:val=""/>
+      <w:lvlJc w:val="left"/>
+      <w:pPr>
+        <w:ind w:left="5040" w:hanging="360"/>
+      </w:pPr>
+      <w:rPr>
+        <w:rFonts w:ascii="Symbol" w:hAnsi="Symbol" w:hint="default"/>
+      </w:rPr>
+    </w:lvl>
+    <w:lvl w:ilvl="7" w:tplc="04100003" w:tentative="1">
+      <w:start w:val="1"/>
+      <w:numFmt w:val="bullet"/>
+      <w:lvlText w:val="o"/>
+      <w:lvlJc w:val="left"/>
+      <w:pPr>
+        <w:ind w:left="5760" w:hanging="360"/>
+      </w:pPr>
+      <w:rPr>
+        <w:rFonts w:ascii="Courier New" w:hAnsi="Courier New" w:cs="Courier New" w:hint="default"/>
+      </w:rPr>
+    </w:lvl>
+    <w:lvl w:ilvl="8" w:tplc="04100005" w:tentative="1">
+      <w:start w:val="1"/>
+      <w:numFmt w:val="bullet"/>
+      <w:lvlText w:val=""/>
+      <w:lvlJc w:val="left"/>
+      <w:pPr>
+        <w:ind w:left="6480" w:hanging="360"/>
+      </w:pPr>
+      <w:rPr>
+        <w:rFonts w:ascii="Wingdings" w:hAnsi="Wingdings" w:hint="default"/>
+      </w:rPr>
+    </w:lvl>
+  </w:abstractNum>
+  <w:abstractNum w:abstractNumId="1" w15:restartNumberingAfterBreak="0">
     <w:nsid w:val="0D9421C1"/>
     <w:multiLevelType w:val="multilevel"/>
     <w:tmpl w:val="1E62E8C6"/>
@@ -31144,7 +33623,7 @@
       </w:rPr>
     </w:lvl>
   </w:abstractNum>
-  <w:abstractNum w:abstractNumId="1" w15:restartNumberingAfterBreak="0">
+  <w:abstractNum w:abstractNumId="2" w15:restartNumberingAfterBreak="0">
     <w:nsid w:val="0F735D4A"/>
     <w:multiLevelType w:val="multilevel"/>
     <w:tmpl w:val="66309654"/>
@@ -31293,10 +33772,10 @@
       </w:rPr>
     </w:lvl>
   </w:abstractNum>
-  <w:abstractNum w:abstractNumId="2" w15:restartNumberingAfterBreak="0">
-    <w:nsid w:val="24477BA3"/>
+  <w:abstractNum w:abstractNumId="3" w15:restartNumberingAfterBreak="0">
+    <w:nsid w:val="146D41AA"/>
     <w:multiLevelType w:val="multilevel"/>
-    <w:tmpl w:val="CB622780"/>
+    <w:tmpl w:val="9306C8B4"/>
     <w:lvl w:ilvl="0">
       <w:start w:val="1"/>
       <w:numFmt w:val="bullet"/>
@@ -31442,10 +33921,159 @@
       </w:rPr>
     </w:lvl>
   </w:abstractNum>
-  <w:abstractNum w:abstractNumId="3" w15:restartNumberingAfterBreak="0">
-    <w:nsid w:val="2D350C81"/>
+  <w:abstractNum w:abstractNumId="4" w15:restartNumberingAfterBreak="0">
+    <w:nsid w:val="149D0E82"/>
     <w:multiLevelType w:val="multilevel"/>
-    <w:tmpl w:val="AE989244"/>
+    <w:tmpl w:val="66CAE502"/>
+    <w:lvl w:ilvl="0">
+      <w:start w:val="1"/>
+      <w:numFmt w:val="bullet"/>
+      <w:lvlText w:val=""/>
+      <w:lvlJc w:val="left"/>
+      <w:pPr>
+        <w:tabs>
+          <w:tab w:val="num" w:pos="720"/>
+        </w:tabs>
+        <w:ind w:left="720" w:hanging="360"/>
+      </w:pPr>
+      <w:rPr>
+        <w:rFonts w:ascii="Symbol" w:hAnsi="Symbol" w:hint="default"/>
+        <w:sz w:val="20"/>
+      </w:rPr>
+    </w:lvl>
+    <w:lvl w:ilvl="1">
+      <w:start w:val="1"/>
+      <w:numFmt w:val="bullet"/>
+      <w:lvlText w:val="o"/>
+      <w:lvlJc w:val="left"/>
+      <w:pPr>
+        <w:tabs>
+          <w:tab w:val="num" w:pos="1440"/>
+        </w:tabs>
+        <w:ind w:left="1440" w:hanging="360"/>
+      </w:pPr>
+      <w:rPr>
+        <w:rFonts w:ascii="Courier New" w:hAnsi="Courier New" w:hint="default"/>
+        <w:sz w:val="20"/>
+      </w:rPr>
+    </w:lvl>
+    <w:lvl w:ilvl="2" w:tentative="1">
+      <w:start w:val="1"/>
+      <w:numFmt w:val="bullet"/>
+      <w:lvlText w:val=""/>
+      <w:lvlJc w:val="left"/>
+      <w:pPr>
+        <w:tabs>
+          <w:tab w:val="num" w:pos="2160"/>
+        </w:tabs>
+        <w:ind w:left="2160" w:hanging="360"/>
+      </w:pPr>
+      <w:rPr>
+        <w:rFonts w:ascii="Wingdings" w:hAnsi="Wingdings" w:hint="default"/>
+        <w:sz w:val="20"/>
+      </w:rPr>
+    </w:lvl>
+    <w:lvl w:ilvl="3" w:tentative="1">
+      <w:start w:val="1"/>
+      <w:numFmt w:val="bullet"/>
+      <w:lvlText w:val=""/>
+      <w:lvlJc w:val="left"/>
+      <w:pPr>
+        <w:tabs>
+          <w:tab w:val="num" w:pos="2880"/>
+        </w:tabs>
+        <w:ind w:left="2880" w:hanging="360"/>
+      </w:pPr>
+      <w:rPr>
+        <w:rFonts w:ascii="Wingdings" w:hAnsi="Wingdings" w:hint="default"/>
+        <w:sz w:val="20"/>
+      </w:rPr>
+    </w:lvl>
+    <w:lvl w:ilvl="4" w:tentative="1">
+      <w:start w:val="1"/>
+      <w:numFmt w:val="bullet"/>
+      <w:lvlText w:val=""/>
+      <w:lvlJc w:val="left"/>
+      <w:pPr>
+        <w:tabs>
+          <w:tab w:val="num" w:pos="3600"/>
+        </w:tabs>
+        <w:ind w:left="3600" w:hanging="360"/>
+      </w:pPr>
+      <w:rPr>
+        <w:rFonts w:ascii="Wingdings" w:hAnsi="Wingdings" w:hint="default"/>
+        <w:sz w:val="20"/>
+      </w:rPr>
+    </w:lvl>
+    <w:lvl w:ilvl="5" w:tentative="1">
+      <w:start w:val="1"/>
+      <w:numFmt w:val="bullet"/>
+      <w:lvlText w:val=""/>
+      <w:lvlJc w:val="left"/>
+      <w:pPr>
+        <w:tabs>
+          <w:tab w:val="num" w:pos="4320"/>
+        </w:tabs>
+        <w:ind w:left="4320" w:hanging="360"/>
+      </w:pPr>
+      <w:rPr>
+        <w:rFonts w:ascii="Wingdings" w:hAnsi="Wingdings" w:hint="default"/>
+        <w:sz w:val="20"/>
+      </w:rPr>
+    </w:lvl>
+    <w:lvl w:ilvl="6" w:tentative="1">
+      <w:start w:val="1"/>
+      <w:numFmt w:val="bullet"/>
+      <w:lvlText w:val=""/>
+      <w:lvlJc w:val="left"/>
+      <w:pPr>
+        <w:tabs>
+          <w:tab w:val="num" w:pos="5040"/>
+        </w:tabs>
+        <w:ind w:left="5040" w:hanging="360"/>
+      </w:pPr>
+      <w:rPr>
+        <w:rFonts w:ascii="Wingdings" w:hAnsi="Wingdings" w:hint="default"/>
+        <w:sz w:val="20"/>
+      </w:rPr>
+    </w:lvl>
+    <w:lvl w:ilvl="7" w:tentative="1">
+      <w:start w:val="1"/>
+      <w:numFmt w:val="bullet"/>
+      <w:lvlText w:val=""/>
+      <w:lvlJc w:val="left"/>
+      <w:pPr>
+        <w:tabs>
+          <w:tab w:val="num" w:pos="5760"/>
+        </w:tabs>
+        <w:ind w:left="5760" w:hanging="360"/>
+      </w:pPr>
+      <w:rPr>
+        <w:rFonts w:ascii="Wingdings" w:hAnsi="Wingdings" w:hint="default"/>
+        <w:sz w:val="20"/>
+      </w:rPr>
+    </w:lvl>
+    <w:lvl w:ilvl="8" w:tentative="1">
+      <w:start w:val="1"/>
+      <w:numFmt w:val="bullet"/>
+      <w:lvlText w:val=""/>
+      <w:lvlJc w:val="left"/>
+      <w:pPr>
+        <w:tabs>
+          <w:tab w:val="num" w:pos="6480"/>
+        </w:tabs>
+        <w:ind w:left="6480" w:hanging="360"/>
+      </w:pPr>
+      <w:rPr>
+        <w:rFonts w:ascii="Wingdings" w:hAnsi="Wingdings" w:hint="default"/>
+        <w:sz w:val="20"/>
+      </w:rPr>
+    </w:lvl>
+  </w:abstractNum>
+  <w:abstractNum w:abstractNumId="5" w15:restartNumberingAfterBreak="0">
+    <w:nsid w:val="24477BA3"/>
+    <w:multiLevelType w:val="multilevel"/>
+    <w:tmpl w:val="CB622780"/>
     <w:lvl w:ilvl="0">
       <w:start w:val="1"/>
       <w:numFmt w:val="bullet"/>
@@ -31591,10 +34219,10 @@
       </w:rPr>
     </w:lvl>
   </w:abstractNum>
-  <w:abstractNum w:abstractNumId="4" w15:restartNumberingAfterBreak="0">
-    <w:nsid w:val="331A337C"/>
+  <w:abstractNum w:abstractNumId="6" w15:restartNumberingAfterBreak="0">
+    <w:nsid w:val="2D350C81"/>
     <w:multiLevelType w:val="multilevel"/>
-    <w:tmpl w:val="C9126180"/>
+    <w:tmpl w:val="AE989244"/>
     <w:lvl w:ilvl="0">
       <w:start w:val="1"/>
       <w:numFmt w:val="bullet"/>
@@ -31740,10 +34368,10 @@
       </w:rPr>
     </w:lvl>
   </w:abstractNum>
-  <w:abstractNum w:abstractNumId="5" w15:restartNumberingAfterBreak="0">
-    <w:nsid w:val="41563C19"/>
+  <w:abstractNum w:abstractNumId="7" w15:restartNumberingAfterBreak="0">
+    <w:nsid w:val="326E687B"/>
     <w:multiLevelType w:val="multilevel"/>
-    <w:tmpl w:val="AFFCFCB8"/>
+    <w:tmpl w:val="F61899F0"/>
     <w:lvl w:ilvl="0">
       <w:start w:val="1"/>
       <w:numFmt w:val="bullet"/>
@@ -31889,10 +34517,159 @@
       </w:rPr>
     </w:lvl>
   </w:abstractNum>
-  <w:abstractNum w:abstractNumId="6" w15:restartNumberingAfterBreak="0">
-    <w:nsid w:val="4A032203"/>
+  <w:abstractNum w:abstractNumId="8" w15:restartNumberingAfterBreak="0">
+    <w:nsid w:val="331A337C"/>
     <w:multiLevelType w:val="multilevel"/>
-    <w:tmpl w:val="F878B722"/>
+    <w:tmpl w:val="C9126180"/>
+    <w:lvl w:ilvl="0">
+      <w:start w:val="1"/>
+      <w:numFmt w:val="bullet"/>
+      <w:lvlText w:val=""/>
+      <w:lvlJc w:val="left"/>
+      <w:pPr>
+        <w:tabs>
+          <w:tab w:val="num" w:pos="720"/>
+        </w:tabs>
+        <w:ind w:left="720" w:hanging="360"/>
+      </w:pPr>
+      <w:rPr>
+        <w:rFonts w:ascii="Symbol" w:hAnsi="Symbol" w:hint="default"/>
+        <w:sz w:val="20"/>
+      </w:rPr>
+    </w:lvl>
+    <w:lvl w:ilvl="1" w:tentative="1">
+      <w:start w:val="1"/>
+      <w:numFmt w:val="bullet"/>
+      <w:lvlText w:val="o"/>
+      <w:lvlJc w:val="left"/>
+      <w:pPr>
+        <w:tabs>
+          <w:tab w:val="num" w:pos="1440"/>
+        </w:tabs>
+        <w:ind w:left="1440" w:hanging="360"/>
+      </w:pPr>
+      <w:rPr>
+        <w:rFonts w:ascii="Courier New" w:hAnsi="Courier New" w:hint="default"/>
+        <w:sz w:val="20"/>
+      </w:rPr>
+    </w:lvl>
+    <w:lvl w:ilvl="2" w:tentative="1">
+      <w:start w:val="1"/>
+      <w:numFmt w:val="bullet"/>
+      <w:lvlText w:val=""/>
+      <w:lvlJc w:val="left"/>
+      <w:pPr>
+        <w:tabs>
+          <w:tab w:val="num" w:pos="2160"/>
+        </w:tabs>
+        <w:ind w:left="2160" w:hanging="360"/>
+      </w:pPr>
+      <w:rPr>
+        <w:rFonts w:ascii="Wingdings" w:hAnsi="Wingdings" w:hint="default"/>
+        <w:sz w:val="20"/>
+      </w:rPr>
+    </w:lvl>
+    <w:lvl w:ilvl="3" w:tentative="1">
+      <w:start w:val="1"/>
+      <w:numFmt w:val="bullet"/>
+      <w:lvlText w:val=""/>
+      <w:lvlJc w:val="left"/>
+      <w:pPr>
+        <w:tabs>
+          <w:tab w:val="num" w:pos="2880"/>
+        </w:tabs>
+        <w:ind w:left="2880" w:hanging="360"/>
+      </w:pPr>
+      <w:rPr>
+        <w:rFonts w:ascii="Wingdings" w:hAnsi="Wingdings" w:hint="default"/>
+        <w:sz w:val="20"/>
+      </w:rPr>
+    </w:lvl>
+    <w:lvl w:ilvl="4" w:tentative="1">
+      <w:start w:val="1"/>
+      <w:numFmt w:val="bullet"/>
+      <w:lvlText w:val=""/>
+      <w:lvlJc w:val="left"/>
+      <w:pPr>
+        <w:tabs>
+          <w:tab w:val="num" w:pos="3600"/>
+        </w:tabs>
+        <w:ind w:left="3600" w:hanging="360"/>
+      </w:pPr>
+      <w:rPr>
+        <w:rFonts w:ascii="Wingdings" w:hAnsi="Wingdings" w:hint="default"/>
+        <w:sz w:val="20"/>
+      </w:rPr>
+    </w:lvl>
+    <w:lvl w:ilvl="5" w:tentative="1">
+      <w:start w:val="1"/>
+      <w:numFmt w:val="bullet"/>
+      <w:lvlText w:val=""/>
+      <w:lvlJc w:val="left"/>
+      <w:pPr>
+        <w:tabs>
+          <w:tab w:val="num" w:pos="4320"/>
+        </w:tabs>
+        <w:ind w:left="4320" w:hanging="360"/>
+      </w:pPr>
+      <w:rPr>
+        <w:rFonts w:ascii="Wingdings" w:hAnsi="Wingdings" w:hint="default"/>
+        <w:sz w:val="20"/>
+      </w:rPr>
+    </w:lvl>
+    <w:lvl w:ilvl="6" w:tentative="1">
+      <w:start w:val="1"/>
+      <w:numFmt w:val="bullet"/>
+      <w:lvlText w:val=""/>
+      <w:lvlJc w:val="left"/>
+      <w:pPr>
+        <w:tabs>
+          <w:tab w:val="num" w:pos="5040"/>
+        </w:tabs>
+        <w:ind w:left="5040" w:hanging="360"/>
+      </w:pPr>
+      <w:rPr>
+        <w:rFonts w:ascii="Wingdings" w:hAnsi="Wingdings" w:hint="default"/>
+        <w:sz w:val="20"/>
+      </w:rPr>
+    </w:lvl>
+    <w:lvl w:ilvl="7" w:tentative="1">
+      <w:start w:val="1"/>
+      <w:numFmt w:val="bullet"/>
+      <w:lvlText w:val=""/>
+      <w:lvlJc w:val="left"/>
+      <w:pPr>
+        <w:tabs>
+          <w:tab w:val="num" w:pos="5760"/>
+        </w:tabs>
+        <w:ind w:left="5760" w:hanging="360"/>
+      </w:pPr>
+      <w:rPr>
+        <w:rFonts w:ascii="Wingdings" w:hAnsi="Wingdings" w:hint="default"/>
+        <w:sz w:val="20"/>
+      </w:rPr>
+    </w:lvl>
+    <w:lvl w:ilvl="8" w:tentative="1">
+      <w:start w:val="1"/>
+      <w:numFmt w:val="bullet"/>
+      <w:lvlText w:val=""/>
+      <w:lvlJc w:val="left"/>
+      <w:pPr>
+        <w:tabs>
+          <w:tab w:val="num" w:pos="6480"/>
+        </w:tabs>
+        <w:ind w:left="6480" w:hanging="360"/>
+      </w:pPr>
+      <w:rPr>
+        <w:rFonts w:ascii="Wingdings" w:hAnsi="Wingdings" w:hint="default"/>
+        <w:sz w:val="20"/>
+      </w:rPr>
+    </w:lvl>
+  </w:abstractNum>
+  <w:abstractNum w:abstractNumId="9" w15:restartNumberingAfterBreak="0">
+    <w:nsid w:val="41563C19"/>
+    <w:multiLevelType w:val="multilevel"/>
+    <w:tmpl w:val="AFFCFCB8"/>
     <w:lvl w:ilvl="0">
       <w:start w:val="1"/>
       <w:numFmt w:val="bullet"/>
@@ -32038,7 +34815,156 @@
       </w:rPr>
     </w:lvl>
   </w:abstractNum>
-  <w:abstractNum w:abstractNumId="7" w15:restartNumberingAfterBreak="0">
+  <w:abstractNum w:abstractNumId="10" w15:restartNumberingAfterBreak="0">
+    <w:nsid w:val="4A032203"/>
+    <w:multiLevelType w:val="multilevel"/>
+    <w:tmpl w:val="F878B722"/>
+    <w:lvl w:ilvl="0">
+      <w:start w:val="1"/>
+      <w:numFmt w:val="bullet"/>
+      <w:lvlText w:val=""/>
+      <w:lvlJc w:val="left"/>
+      <w:pPr>
+        <w:tabs>
+          <w:tab w:val="num" w:pos="720"/>
+        </w:tabs>
+        <w:ind w:left="720" w:hanging="360"/>
+      </w:pPr>
+      <w:rPr>
+        <w:rFonts w:ascii="Symbol" w:hAnsi="Symbol" w:hint="default"/>
+        <w:sz w:val="20"/>
+      </w:rPr>
+    </w:lvl>
+    <w:lvl w:ilvl="1">
+      <w:start w:val="1"/>
+      <w:numFmt w:val="bullet"/>
+      <w:lvlText w:val="o"/>
+      <w:lvlJc w:val="left"/>
+      <w:pPr>
+        <w:tabs>
+          <w:tab w:val="num" w:pos="1440"/>
+        </w:tabs>
+        <w:ind w:left="1440" w:hanging="360"/>
+      </w:pPr>
+      <w:rPr>
+        <w:rFonts w:ascii="Courier New" w:hAnsi="Courier New" w:hint="default"/>
+        <w:sz w:val="20"/>
+      </w:rPr>
+    </w:lvl>
+    <w:lvl w:ilvl="2" w:tentative="1">
+      <w:start w:val="1"/>
+      <w:numFmt w:val="bullet"/>
+      <w:lvlText w:val=""/>
+      <w:lvlJc w:val="left"/>
+      <w:pPr>
+        <w:tabs>
+          <w:tab w:val="num" w:pos="2160"/>
+        </w:tabs>
+        <w:ind w:left="2160" w:hanging="360"/>
+      </w:pPr>
+      <w:rPr>
+        <w:rFonts w:ascii="Wingdings" w:hAnsi="Wingdings" w:hint="default"/>
+        <w:sz w:val="20"/>
+      </w:rPr>
+    </w:lvl>
+    <w:lvl w:ilvl="3" w:tentative="1">
+      <w:start w:val="1"/>
+      <w:numFmt w:val="bullet"/>
+      <w:lvlText w:val=""/>
+      <w:lvlJc w:val="left"/>
+      <w:pPr>
+        <w:tabs>
+          <w:tab w:val="num" w:pos="2880"/>
+        </w:tabs>
+        <w:ind w:left="2880" w:hanging="360"/>
+      </w:pPr>
+      <w:rPr>
+        <w:rFonts w:ascii="Wingdings" w:hAnsi="Wingdings" w:hint="default"/>
+        <w:sz w:val="20"/>
+      </w:rPr>
+    </w:lvl>
+    <w:lvl w:ilvl="4" w:tentative="1">
+      <w:start w:val="1"/>
+      <w:numFmt w:val="bullet"/>
+      <w:lvlText w:val=""/>
+      <w:lvlJc w:val="left"/>
+      <w:pPr>
+        <w:tabs>
+          <w:tab w:val="num" w:pos="3600"/>
+        </w:tabs>
+        <w:ind w:left="3600" w:hanging="360"/>
+      </w:pPr>
+      <w:rPr>
+        <w:rFonts w:ascii="Wingdings" w:hAnsi="Wingdings" w:hint="default"/>
+        <w:sz w:val="20"/>
+      </w:rPr>
+    </w:lvl>
+    <w:lvl w:ilvl="5" w:tentative="1">
+      <w:start w:val="1"/>
+      <w:numFmt w:val="bullet"/>
+      <w:lvlText w:val=""/>
+      <w:lvlJc w:val="left"/>
+      <w:pPr>
+        <w:tabs>
+          <w:tab w:val="num" w:pos="4320"/>
+        </w:tabs>
+        <w:ind w:left="4320" w:hanging="360"/>
+      </w:pPr>
+      <w:rPr>
+        <w:rFonts w:ascii="Wingdings" w:hAnsi="Wingdings" w:hint="default"/>
+        <w:sz w:val="20"/>
+      </w:rPr>
+    </w:lvl>
+    <w:lvl w:ilvl="6" w:tentative="1">
+      <w:start w:val="1"/>
+      <w:numFmt w:val="bullet"/>
+      <w:lvlText w:val=""/>
+      <w:lvlJc w:val="left"/>
+      <w:pPr>
+        <w:tabs>
+          <w:tab w:val="num" w:pos="5040"/>
+        </w:tabs>
+        <w:ind w:left="5040" w:hanging="360"/>
+      </w:pPr>
+      <w:rPr>
+        <w:rFonts w:ascii="Wingdings" w:hAnsi="Wingdings" w:hint="default"/>
+        <w:sz w:val="20"/>
+      </w:rPr>
+    </w:lvl>
+    <w:lvl w:ilvl="7" w:tentative="1">
+      <w:start w:val="1"/>
+      <w:numFmt w:val="bullet"/>
+      <w:lvlText w:val=""/>
+      <w:lvlJc w:val="left"/>
+      <w:pPr>
+        <w:tabs>
+          <w:tab w:val="num" w:pos="5760"/>
+        </w:tabs>
+        <w:ind w:left="5760" w:hanging="360"/>
+      </w:pPr>
+      <w:rPr>
+        <w:rFonts w:ascii="Wingdings" w:hAnsi="Wingdings" w:hint="default"/>
+        <w:sz w:val="20"/>
+      </w:rPr>
+    </w:lvl>
+    <w:lvl w:ilvl="8" w:tentative="1">
+      <w:start w:val="1"/>
+      <w:numFmt w:val="bullet"/>
+      <w:lvlText w:val=""/>
+      <w:lvlJc w:val="left"/>
+      <w:pPr>
+        <w:tabs>
+          <w:tab w:val="num" w:pos="6480"/>
+        </w:tabs>
+        <w:ind w:left="6480" w:hanging="360"/>
+      </w:pPr>
+      <w:rPr>
+        <w:rFonts w:ascii="Wingdings" w:hAnsi="Wingdings" w:hint="default"/>
+        <w:sz w:val="20"/>
+      </w:rPr>
+    </w:lvl>
+  </w:abstractNum>
+  <w:abstractNum w:abstractNumId="11" w15:restartNumberingAfterBreak="0">
     <w:nsid w:val="4C5F1244"/>
     <w:multiLevelType w:val="multilevel"/>
     <w:tmpl w:val="C8261270"/>
@@ -32187,10 +35113,10 @@
       </w:rPr>
     </w:lvl>
   </w:abstractNum>
-  <w:abstractNum w:abstractNumId="8" w15:restartNumberingAfterBreak="0">
-    <w:nsid w:val="661F0FC9"/>
+  <w:abstractNum w:abstractNumId="12" w15:restartNumberingAfterBreak="0">
+    <w:nsid w:val="4E584770"/>
     <w:multiLevelType w:val="multilevel"/>
-    <w:tmpl w:val="7A187616"/>
+    <w:tmpl w:val="9E6C03F2"/>
     <w:lvl w:ilvl="0">
       <w:start w:val="1"/>
       <w:numFmt w:val="bullet"/>
@@ -32336,123 +35262,10 @@
       </w:rPr>
     </w:lvl>
   </w:abstractNum>
-  <w:abstractNum w:abstractNumId="9" w15:restartNumberingAfterBreak="0">
-    <w:nsid w:val="73695714"/>
-    <w:multiLevelType w:val="hybridMultilevel"/>
-    <w:tmpl w:val="A43C27A8"/>
-    <w:lvl w:ilvl="0" w:tplc="04100001">
-      <w:start w:val="1"/>
-      <w:numFmt w:val="bullet"/>
-      <w:lvlText w:val=""/>
-      <w:lvlJc w:val="left"/>
-      <w:pPr>
-        <w:ind w:left="720" w:hanging="360"/>
-      </w:pPr>
-      <w:rPr>
-        <w:rFonts w:ascii="Symbol" w:hAnsi="Symbol" w:hint="default"/>
-      </w:rPr>
-    </w:lvl>
-    <w:lvl w:ilvl="1" w:tplc="04100003" w:tentative="1">
-      <w:start w:val="1"/>
-      <w:numFmt w:val="bullet"/>
-      <w:lvlText w:val="o"/>
-      <w:lvlJc w:val="left"/>
-      <w:pPr>
-        <w:ind w:left="1440" w:hanging="360"/>
-      </w:pPr>
-      <w:rPr>
-        <w:rFonts w:ascii="Courier New" w:hAnsi="Courier New" w:cs="Courier New" w:hint="default"/>
-      </w:rPr>
-    </w:lvl>
-    <w:lvl w:ilvl="2" w:tplc="04100005" w:tentative="1">
-      <w:start w:val="1"/>
-      <w:numFmt w:val="bullet"/>
-      <w:lvlText w:val=""/>
-      <w:lvlJc w:val="left"/>
-      <w:pPr>
-        <w:ind w:left="2160" w:hanging="360"/>
-      </w:pPr>
-      <w:rPr>
-        <w:rFonts w:ascii="Wingdings" w:hAnsi="Wingdings" w:hint="default"/>
-      </w:rPr>
-    </w:lvl>
-    <w:lvl w:ilvl="3" w:tplc="04100001" w:tentative="1">
-      <w:start w:val="1"/>
-      <w:numFmt w:val="bullet"/>
-      <w:lvlText w:val=""/>
-      <w:lvlJc w:val="left"/>
-      <w:pPr>
-        <w:ind w:left="2880" w:hanging="360"/>
-      </w:pPr>
-      <w:rPr>
-        <w:rFonts w:ascii="Symbol" w:hAnsi="Symbol" w:hint="default"/>
-      </w:rPr>
-    </w:lvl>
-    <w:lvl w:ilvl="4" w:tplc="04100003" w:tentative="1">
-      <w:start w:val="1"/>
-      <w:numFmt w:val="bullet"/>
-      <w:lvlText w:val="o"/>
-      <w:lvlJc w:val="left"/>
-      <w:pPr>
-        <w:ind w:left="3600" w:hanging="360"/>
-      </w:pPr>
-      <w:rPr>
-        <w:rFonts w:ascii="Courier New" w:hAnsi="Courier New" w:cs="Courier New" w:hint="default"/>
-      </w:rPr>
-    </w:lvl>
-    <w:lvl w:ilvl="5" w:tplc="04100005" w:tentative="1">
-      <w:start w:val="1"/>
-      <w:numFmt w:val="bullet"/>
-      <w:lvlText w:val=""/>
-      <w:lvlJc w:val="left"/>
-      <w:pPr>
-        <w:ind w:left="4320" w:hanging="360"/>
-      </w:pPr>
-      <w:rPr>
-        <w:rFonts w:ascii="Wingdings" w:hAnsi="Wingdings" w:hint="default"/>
-      </w:rPr>
-    </w:lvl>
-    <w:lvl w:ilvl="6" w:tplc="04100001" w:tentative="1">
-      <w:start w:val="1"/>
-      <w:numFmt w:val="bullet"/>
-      <w:lvlText w:val=""/>
-      <w:lvlJc w:val="left"/>
-      <w:pPr>
-        <w:ind w:left="5040" w:hanging="360"/>
-      </w:pPr>
-      <w:rPr>
-        <w:rFonts w:ascii="Symbol" w:hAnsi="Symbol" w:hint="default"/>
-      </w:rPr>
-    </w:lvl>
-    <w:lvl w:ilvl="7" w:tplc="04100003" w:tentative="1">
-      <w:start w:val="1"/>
-      <w:numFmt w:val="bullet"/>
-      <w:lvlText w:val="o"/>
-      <w:lvlJc w:val="left"/>
-      <w:pPr>
-        <w:ind w:left="5760" w:hanging="360"/>
-      </w:pPr>
-      <w:rPr>
-        <w:rFonts w:ascii="Courier New" w:hAnsi="Courier New" w:cs="Courier New" w:hint="default"/>
-      </w:rPr>
-    </w:lvl>
-    <w:lvl w:ilvl="8" w:tplc="04100005" w:tentative="1">
-      <w:start w:val="1"/>
-      <w:numFmt w:val="bullet"/>
-      <w:lvlText w:val=""/>
-      <w:lvlJc w:val="left"/>
-      <w:pPr>
-        <w:ind w:left="6480" w:hanging="360"/>
-      </w:pPr>
-      <w:rPr>
-        <w:rFonts w:ascii="Wingdings" w:hAnsi="Wingdings" w:hint="default"/>
-      </w:rPr>
-    </w:lvl>
-  </w:abstractNum>
-  <w:abstractNum w:abstractNumId="10" w15:restartNumberingAfterBreak="0">
-    <w:nsid w:val="75297974"/>
+  <w:abstractNum w:abstractNumId="13" w15:restartNumberingAfterBreak="0">
+    <w:nsid w:val="661F0FC9"/>
     <w:multiLevelType w:val="multilevel"/>
-    <w:tmpl w:val="69E284EC"/>
+    <w:tmpl w:val="7A187616"/>
     <w:lvl w:ilvl="0">
       <w:start w:val="1"/>
       <w:numFmt w:val="bullet"/>
@@ -32598,38 +35411,467 @@
       </w:rPr>
     </w:lvl>
   </w:abstractNum>
+  <w:abstractNum w:abstractNumId="14" w15:restartNumberingAfterBreak="0">
+    <w:nsid w:val="73695714"/>
+    <w:multiLevelType w:val="hybridMultilevel"/>
+    <w:tmpl w:val="A43C27A8"/>
+    <w:lvl w:ilvl="0" w:tplc="04100001">
+      <w:start w:val="1"/>
+      <w:numFmt w:val="bullet"/>
+      <w:lvlText w:val=""/>
+      <w:lvlJc w:val="left"/>
+      <w:pPr>
+        <w:ind w:left="720" w:hanging="360"/>
+      </w:pPr>
+      <w:rPr>
+        <w:rFonts w:ascii="Symbol" w:hAnsi="Symbol" w:hint="default"/>
+      </w:rPr>
+    </w:lvl>
+    <w:lvl w:ilvl="1" w:tplc="04100003" w:tentative="1">
+      <w:start w:val="1"/>
+      <w:numFmt w:val="bullet"/>
+      <w:lvlText w:val="o"/>
+      <w:lvlJc w:val="left"/>
+      <w:pPr>
+        <w:ind w:left="1440" w:hanging="360"/>
+      </w:pPr>
+      <w:rPr>
+        <w:rFonts w:ascii="Courier New" w:hAnsi="Courier New" w:cs="Courier New" w:hint="default"/>
+      </w:rPr>
+    </w:lvl>
+    <w:lvl w:ilvl="2" w:tplc="04100005" w:tentative="1">
+      <w:start w:val="1"/>
+      <w:numFmt w:val="bullet"/>
+      <w:lvlText w:val=""/>
+      <w:lvlJc w:val="left"/>
+      <w:pPr>
+        <w:ind w:left="2160" w:hanging="360"/>
+      </w:pPr>
+      <w:rPr>
+        <w:rFonts w:ascii="Wingdings" w:hAnsi="Wingdings" w:hint="default"/>
+      </w:rPr>
+    </w:lvl>
+    <w:lvl w:ilvl="3" w:tplc="04100001" w:tentative="1">
+      <w:start w:val="1"/>
+      <w:numFmt w:val="bullet"/>
+      <w:lvlText w:val=""/>
+      <w:lvlJc w:val="left"/>
+      <w:pPr>
+        <w:ind w:left="2880" w:hanging="360"/>
+      </w:pPr>
+      <w:rPr>
+        <w:rFonts w:ascii="Symbol" w:hAnsi="Symbol" w:hint="default"/>
+      </w:rPr>
+    </w:lvl>
+    <w:lvl w:ilvl="4" w:tplc="04100003" w:tentative="1">
+      <w:start w:val="1"/>
+      <w:numFmt w:val="bullet"/>
+      <w:lvlText w:val="o"/>
+      <w:lvlJc w:val="left"/>
+      <w:pPr>
+        <w:ind w:left="3600" w:hanging="360"/>
+      </w:pPr>
+      <w:rPr>
+        <w:rFonts w:ascii="Courier New" w:hAnsi="Courier New" w:cs="Courier New" w:hint="default"/>
+      </w:rPr>
+    </w:lvl>
+    <w:lvl w:ilvl="5" w:tplc="04100005" w:tentative="1">
+      <w:start w:val="1"/>
+      <w:numFmt w:val="bullet"/>
+      <w:lvlText w:val=""/>
+      <w:lvlJc w:val="left"/>
+      <w:pPr>
+        <w:ind w:left="4320" w:hanging="360"/>
+      </w:pPr>
+      <w:rPr>
+        <w:rFonts w:ascii="Wingdings" w:hAnsi="Wingdings" w:hint="default"/>
+      </w:rPr>
+    </w:lvl>
+    <w:lvl w:ilvl="6" w:tplc="04100001" w:tentative="1">
+      <w:start w:val="1"/>
+      <w:numFmt w:val="bullet"/>
+      <w:lvlText w:val=""/>
+      <w:lvlJc w:val="left"/>
+      <w:pPr>
+        <w:ind w:left="5040" w:hanging="360"/>
+      </w:pPr>
+      <w:rPr>
+        <w:rFonts w:ascii="Symbol" w:hAnsi="Symbol" w:hint="default"/>
+      </w:rPr>
+    </w:lvl>
+    <w:lvl w:ilvl="7" w:tplc="04100003" w:tentative="1">
+      <w:start w:val="1"/>
+      <w:numFmt w:val="bullet"/>
+      <w:lvlText w:val="o"/>
+      <w:lvlJc w:val="left"/>
+      <w:pPr>
+        <w:ind w:left="5760" w:hanging="360"/>
+      </w:pPr>
+      <w:rPr>
+        <w:rFonts w:ascii="Courier New" w:hAnsi="Courier New" w:cs="Courier New" w:hint="default"/>
+      </w:rPr>
+    </w:lvl>
+    <w:lvl w:ilvl="8" w:tplc="04100005" w:tentative="1">
+      <w:start w:val="1"/>
+      <w:numFmt w:val="bullet"/>
+      <w:lvlText w:val=""/>
+      <w:lvlJc w:val="left"/>
+      <w:pPr>
+        <w:ind w:left="6480" w:hanging="360"/>
+      </w:pPr>
+      <w:rPr>
+        <w:rFonts w:ascii="Wingdings" w:hAnsi="Wingdings" w:hint="default"/>
+      </w:rPr>
+    </w:lvl>
+  </w:abstractNum>
+  <w:abstractNum w:abstractNumId="15" w15:restartNumberingAfterBreak="0">
+    <w:nsid w:val="75297974"/>
+    <w:multiLevelType w:val="multilevel"/>
+    <w:tmpl w:val="69E284EC"/>
+    <w:lvl w:ilvl="0">
+      <w:start w:val="1"/>
+      <w:numFmt w:val="bullet"/>
+      <w:lvlText w:val=""/>
+      <w:lvlJc w:val="left"/>
+      <w:pPr>
+        <w:tabs>
+          <w:tab w:val="num" w:pos="720"/>
+        </w:tabs>
+        <w:ind w:left="720" w:hanging="360"/>
+      </w:pPr>
+      <w:rPr>
+        <w:rFonts w:ascii="Symbol" w:hAnsi="Symbol" w:hint="default"/>
+        <w:sz w:val="20"/>
+      </w:rPr>
+    </w:lvl>
+    <w:lvl w:ilvl="1" w:tentative="1">
+      <w:start w:val="1"/>
+      <w:numFmt w:val="bullet"/>
+      <w:lvlText w:val="o"/>
+      <w:lvlJc w:val="left"/>
+      <w:pPr>
+        <w:tabs>
+          <w:tab w:val="num" w:pos="1440"/>
+        </w:tabs>
+        <w:ind w:left="1440" w:hanging="360"/>
+      </w:pPr>
+      <w:rPr>
+        <w:rFonts w:ascii="Courier New" w:hAnsi="Courier New" w:hint="default"/>
+        <w:sz w:val="20"/>
+      </w:rPr>
+    </w:lvl>
+    <w:lvl w:ilvl="2" w:tentative="1">
+      <w:start w:val="1"/>
+      <w:numFmt w:val="bullet"/>
+      <w:lvlText w:val=""/>
+      <w:lvlJc w:val="left"/>
+      <w:pPr>
+        <w:tabs>
+          <w:tab w:val="num" w:pos="2160"/>
+        </w:tabs>
+        <w:ind w:left="2160" w:hanging="360"/>
+      </w:pPr>
+      <w:rPr>
+        <w:rFonts w:ascii="Wingdings" w:hAnsi="Wingdings" w:hint="default"/>
+        <w:sz w:val="20"/>
+      </w:rPr>
+    </w:lvl>
+    <w:lvl w:ilvl="3" w:tentative="1">
+      <w:start w:val="1"/>
+      <w:numFmt w:val="bullet"/>
+      <w:lvlText w:val=""/>
+      <w:lvlJc w:val="left"/>
+      <w:pPr>
+        <w:tabs>
+          <w:tab w:val="num" w:pos="2880"/>
+        </w:tabs>
+        <w:ind w:left="2880" w:hanging="360"/>
+      </w:pPr>
+      <w:rPr>
+        <w:rFonts w:ascii="Wingdings" w:hAnsi="Wingdings" w:hint="default"/>
+        <w:sz w:val="20"/>
+      </w:rPr>
+    </w:lvl>
+    <w:lvl w:ilvl="4" w:tentative="1">
+      <w:start w:val="1"/>
+      <w:numFmt w:val="bullet"/>
+      <w:lvlText w:val=""/>
+      <w:lvlJc w:val="left"/>
+      <w:pPr>
+        <w:tabs>
+          <w:tab w:val="num" w:pos="3600"/>
+        </w:tabs>
+        <w:ind w:left="3600" w:hanging="360"/>
+      </w:pPr>
+      <w:rPr>
+        <w:rFonts w:ascii="Wingdings" w:hAnsi="Wingdings" w:hint="default"/>
+        <w:sz w:val="20"/>
+      </w:rPr>
+    </w:lvl>
+    <w:lvl w:ilvl="5" w:tentative="1">
+      <w:start w:val="1"/>
+      <w:numFmt w:val="bullet"/>
+      <w:lvlText w:val=""/>
+      <w:lvlJc w:val="left"/>
+      <w:pPr>
+        <w:tabs>
+          <w:tab w:val="num" w:pos="4320"/>
+        </w:tabs>
+        <w:ind w:left="4320" w:hanging="360"/>
+      </w:pPr>
+      <w:rPr>
+        <w:rFonts w:ascii="Wingdings" w:hAnsi="Wingdings" w:hint="default"/>
+        <w:sz w:val="20"/>
+      </w:rPr>
+    </w:lvl>
+    <w:lvl w:ilvl="6" w:tentative="1">
+      <w:start w:val="1"/>
+      <w:numFmt w:val="bullet"/>
+      <w:lvlText w:val=""/>
+      <w:lvlJc w:val="left"/>
+      <w:pPr>
+        <w:tabs>
+          <w:tab w:val="num" w:pos="5040"/>
+        </w:tabs>
+        <w:ind w:left="5040" w:hanging="360"/>
+      </w:pPr>
+      <w:rPr>
+        <w:rFonts w:ascii="Wingdings" w:hAnsi="Wingdings" w:hint="default"/>
+        <w:sz w:val="20"/>
+      </w:rPr>
+    </w:lvl>
+    <w:lvl w:ilvl="7" w:tentative="1">
+      <w:start w:val="1"/>
+      <w:numFmt w:val="bullet"/>
+      <w:lvlText w:val=""/>
+      <w:lvlJc w:val="left"/>
+      <w:pPr>
+        <w:tabs>
+          <w:tab w:val="num" w:pos="5760"/>
+        </w:tabs>
+        <w:ind w:left="5760" w:hanging="360"/>
+      </w:pPr>
+      <w:rPr>
+        <w:rFonts w:ascii="Wingdings" w:hAnsi="Wingdings" w:hint="default"/>
+        <w:sz w:val="20"/>
+      </w:rPr>
+    </w:lvl>
+    <w:lvl w:ilvl="8" w:tentative="1">
+      <w:start w:val="1"/>
+      <w:numFmt w:val="bullet"/>
+      <w:lvlText w:val=""/>
+      <w:lvlJc w:val="left"/>
+      <w:pPr>
+        <w:tabs>
+          <w:tab w:val="num" w:pos="6480"/>
+        </w:tabs>
+        <w:ind w:left="6480" w:hanging="360"/>
+      </w:pPr>
+      <w:rPr>
+        <w:rFonts w:ascii="Wingdings" w:hAnsi="Wingdings" w:hint="default"/>
+        <w:sz w:val="20"/>
+      </w:rPr>
+    </w:lvl>
+  </w:abstractNum>
+  <w:abstractNum w:abstractNumId="16" w15:restartNumberingAfterBreak="0">
+    <w:nsid w:val="7D47637C"/>
+    <w:multiLevelType w:val="multilevel"/>
+    <w:tmpl w:val="A2FAC6F4"/>
+    <w:lvl w:ilvl="0">
+      <w:start w:val="1"/>
+      <w:numFmt w:val="bullet"/>
+      <w:lvlText w:val=""/>
+      <w:lvlJc w:val="left"/>
+      <w:pPr>
+        <w:tabs>
+          <w:tab w:val="num" w:pos="720"/>
+        </w:tabs>
+        <w:ind w:left="720" w:hanging="360"/>
+      </w:pPr>
+      <w:rPr>
+        <w:rFonts w:ascii="Symbol" w:hAnsi="Symbol" w:hint="default"/>
+        <w:sz w:val="20"/>
+      </w:rPr>
+    </w:lvl>
+    <w:lvl w:ilvl="1" w:tentative="1">
+      <w:start w:val="1"/>
+      <w:numFmt w:val="bullet"/>
+      <w:lvlText w:val="o"/>
+      <w:lvlJc w:val="left"/>
+      <w:pPr>
+        <w:tabs>
+          <w:tab w:val="num" w:pos="1440"/>
+        </w:tabs>
+        <w:ind w:left="1440" w:hanging="360"/>
+      </w:pPr>
+      <w:rPr>
+        <w:rFonts w:ascii="Courier New" w:hAnsi="Courier New" w:hint="default"/>
+        <w:sz w:val="20"/>
+      </w:rPr>
+    </w:lvl>
+    <w:lvl w:ilvl="2" w:tentative="1">
+      <w:start w:val="1"/>
+      <w:numFmt w:val="bullet"/>
+      <w:lvlText w:val=""/>
+      <w:lvlJc w:val="left"/>
+      <w:pPr>
+        <w:tabs>
+          <w:tab w:val="num" w:pos="2160"/>
+        </w:tabs>
+        <w:ind w:left="2160" w:hanging="360"/>
+      </w:pPr>
+      <w:rPr>
+        <w:rFonts w:ascii="Wingdings" w:hAnsi="Wingdings" w:hint="default"/>
+        <w:sz w:val="20"/>
+      </w:rPr>
+    </w:lvl>
+    <w:lvl w:ilvl="3" w:tentative="1">
+      <w:start w:val="1"/>
+      <w:numFmt w:val="bullet"/>
+      <w:lvlText w:val=""/>
+      <w:lvlJc w:val="left"/>
+      <w:pPr>
+        <w:tabs>
+          <w:tab w:val="num" w:pos="2880"/>
+        </w:tabs>
+        <w:ind w:left="2880" w:hanging="360"/>
+      </w:pPr>
+      <w:rPr>
+        <w:rFonts w:ascii="Wingdings" w:hAnsi="Wingdings" w:hint="default"/>
+        <w:sz w:val="20"/>
+      </w:rPr>
+    </w:lvl>
+    <w:lvl w:ilvl="4" w:tentative="1">
+      <w:start w:val="1"/>
+      <w:numFmt w:val="bullet"/>
+      <w:lvlText w:val=""/>
+      <w:lvlJc w:val="left"/>
+      <w:pPr>
+        <w:tabs>
+          <w:tab w:val="num" w:pos="3600"/>
+        </w:tabs>
+        <w:ind w:left="3600" w:hanging="360"/>
+      </w:pPr>
+      <w:rPr>
+        <w:rFonts w:ascii="Wingdings" w:hAnsi="Wingdings" w:hint="default"/>
+        <w:sz w:val="20"/>
+      </w:rPr>
+    </w:lvl>
+    <w:lvl w:ilvl="5" w:tentative="1">
+      <w:start w:val="1"/>
+      <w:numFmt w:val="bullet"/>
+      <w:lvlText w:val=""/>
+      <w:lvlJc w:val="left"/>
+      <w:pPr>
+        <w:tabs>
+          <w:tab w:val="num" w:pos="4320"/>
+        </w:tabs>
+        <w:ind w:left="4320" w:hanging="360"/>
+      </w:pPr>
+      <w:rPr>
+        <w:rFonts w:ascii="Wingdings" w:hAnsi="Wingdings" w:hint="default"/>
+        <w:sz w:val="20"/>
+      </w:rPr>
+    </w:lvl>
+    <w:lvl w:ilvl="6" w:tentative="1">
+      <w:start w:val="1"/>
+      <w:numFmt w:val="bullet"/>
+      <w:lvlText w:val=""/>
+      <w:lvlJc w:val="left"/>
+      <w:pPr>
+        <w:tabs>
+          <w:tab w:val="num" w:pos="5040"/>
+        </w:tabs>
+        <w:ind w:left="5040" w:hanging="360"/>
+      </w:pPr>
+      <w:rPr>
+        <w:rFonts w:ascii="Wingdings" w:hAnsi="Wingdings" w:hint="default"/>
+        <w:sz w:val="20"/>
+      </w:rPr>
+    </w:lvl>
+    <w:lvl w:ilvl="7" w:tentative="1">
+      <w:start w:val="1"/>
+      <w:numFmt w:val="bullet"/>
+      <w:lvlText w:val=""/>
+      <w:lvlJc w:val="left"/>
+      <w:pPr>
+        <w:tabs>
+          <w:tab w:val="num" w:pos="5760"/>
+        </w:tabs>
+        <w:ind w:left="5760" w:hanging="360"/>
+      </w:pPr>
+      <w:rPr>
+        <w:rFonts w:ascii="Wingdings" w:hAnsi="Wingdings" w:hint="default"/>
+        <w:sz w:val="20"/>
+      </w:rPr>
+    </w:lvl>
+    <w:lvl w:ilvl="8" w:tentative="1">
+      <w:start w:val="1"/>
+      <w:numFmt w:val="bullet"/>
+      <w:lvlText w:val=""/>
+      <w:lvlJc w:val="left"/>
+      <w:pPr>
+        <w:tabs>
+          <w:tab w:val="num" w:pos="6480"/>
+        </w:tabs>
+        <w:ind w:left="6480" w:hanging="360"/>
+      </w:pPr>
+      <w:rPr>
+        <w:rFonts w:ascii="Wingdings" w:hAnsi="Wingdings" w:hint="default"/>
+        <w:sz w:val="20"/>
+      </w:rPr>
+    </w:lvl>
+  </w:abstractNum>
   <w:num w:numId="1">
+    <w:abstractNumId w:val="1"/>
+  </w:num>
+  <w:num w:numId="2">
+    <w:abstractNumId w:val="6"/>
+  </w:num>
+  <w:num w:numId="3">
+    <w:abstractNumId w:val="11"/>
+  </w:num>
+  <w:num w:numId="4">
+    <w:abstractNumId w:val="8"/>
+  </w:num>
+  <w:num w:numId="5">
+    <w:abstractNumId w:val="15"/>
+  </w:num>
+  <w:num w:numId="6">
+    <w:abstractNumId w:val="2"/>
+  </w:num>
+  <w:num w:numId="7">
+    <w:abstractNumId w:val="14"/>
+  </w:num>
+  <w:num w:numId="8">
+    <w:abstractNumId w:val="13"/>
+  </w:num>
+  <w:num w:numId="9">
+    <w:abstractNumId w:val="10"/>
+  </w:num>
+  <w:num w:numId="10">
+    <w:abstractNumId w:val="9"/>
+  </w:num>
+  <w:num w:numId="11">
+    <w:abstractNumId w:val="5"/>
+  </w:num>
+  <w:num w:numId="12">
+    <w:abstractNumId w:val="16"/>
+  </w:num>
+  <w:num w:numId="13">
+    <w:abstractNumId w:val="12"/>
+  </w:num>
+  <w:num w:numId="14">
     <w:abstractNumId w:val="0"/>
   </w:num>
-  <w:num w:numId="2">
+  <w:num w:numId="15">
+    <w:abstractNumId w:val="4"/>
+  </w:num>
+  <w:num w:numId="16">
     <w:abstractNumId w:val="3"/>
   </w:num>
-  <w:num w:numId="3">
+  <w:num w:numId="17">
     <w:abstractNumId w:val="7"/>
-  </w:num>
-  <w:num w:numId="4">
-    <w:abstractNumId w:val="4"/>
-  </w:num>
-  <w:num w:numId="5">
-    <w:abstractNumId w:val="10"/>
-  </w:num>
-  <w:num w:numId="6">
-    <w:abstractNumId w:val="1"/>
-  </w:num>
-  <w:num w:numId="7">
-    <w:abstractNumId w:val="9"/>
-  </w:num>
-  <w:num w:numId="8">
-    <w:abstractNumId w:val="8"/>
-  </w:num>
-  <w:num w:numId="9">
-    <w:abstractNumId w:val="6"/>
-  </w:num>
-  <w:num w:numId="10">
-    <w:abstractNumId w:val="5"/>
-  </w:num>
-  <w:num w:numId="11">
-    <w:abstractNumId w:val="2"/>
   </w:num>
 </w:numbering>
 </file>

</xml_diff>

<commit_message>
data: add the heatmap to the project
</commit_message>
<xml_diff>
--- a/Technical report.docx
+++ b/Technical report.docx
@@ -56,7 +56,7 @@
                         <pic:cNvPicPr/>
                       </pic:nvPicPr>
                       <pic:blipFill>
-                        <a:blip r:embed="rId8">
+                        <a:blip r:embed="rId9">
                           <a:extLst>
                             <a:ext uri="{28A0092B-C50C-407E-A947-70E740481C1C}">
                               <a14:useLocalDpi xmlns:a14="http://schemas.microsoft.com/office/drawing/2010/main" val="0"/>
@@ -10665,7 +10665,7 @@
                     <pic:cNvPicPr/>
                   </pic:nvPicPr>
                   <pic:blipFill>
-                    <a:blip r:embed="rId9">
+                    <a:blip r:embed="rId10">
                       <a:extLst>
                         <a:ext uri="{28A0092B-C50C-407E-A947-70E740481C1C}">
                           <a14:useLocalDpi xmlns:a14="http://schemas.microsoft.com/office/drawing/2010/main" val="0"/>
@@ -14780,7 +14780,7 @@
                     <pic:cNvPicPr/>
                   </pic:nvPicPr>
                   <pic:blipFill>
-                    <a:blip r:embed="rId10" cstate="print">
+                    <a:blip r:embed="rId11" cstate="print">
                       <a:extLst>
                         <a:ext uri="{28A0092B-C50C-407E-A947-70E740481C1C}">
                           <a14:useLocalDpi xmlns:a14="http://schemas.microsoft.com/office/drawing/2010/main" val="0"/>
@@ -16315,7 +16315,7 @@
                     <pic:cNvPicPr/>
                   </pic:nvPicPr>
                   <pic:blipFill>
-                    <a:blip r:embed="rId11" cstate="print">
+                    <a:blip r:embed="rId12" cstate="print">
                       <a:extLst>
                         <a:ext uri="{28A0092B-C50C-407E-A947-70E740481C1C}">
                           <a14:useLocalDpi xmlns:a14="http://schemas.microsoft.com/office/drawing/2010/main" val="0"/>
@@ -16425,7 +16425,7 @@
                     <pic:cNvPicPr/>
                   </pic:nvPicPr>
                   <pic:blipFill>
-                    <a:blip r:embed="rId12">
+                    <a:blip r:embed="rId13">
                       <a:extLst>
                         <a:ext uri="{28A0092B-C50C-407E-A947-70E740481C1C}">
                           <a14:useLocalDpi xmlns:a14="http://schemas.microsoft.com/office/drawing/2010/main" val="0"/>
@@ -18170,7 +18170,7 @@
                     <pic:cNvPicPr/>
                   </pic:nvPicPr>
                   <pic:blipFill>
-                    <a:blip r:embed="rId13">
+                    <a:blip r:embed="rId14">
                       <a:extLst>
                         <a:ext uri="{28A0092B-C50C-407E-A947-70E740481C1C}">
                           <a14:useLocalDpi xmlns:a14="http://schemas.microsoft.com/office/drawing/2010/main" val="0"/>
@@ -18471,7 +18471,7 @@
                     <pic:cNvPicPr/>
                   </pic:nvPicPr>
                   <pic:blipFill>
-                    <a:blip r:embed="rId14" cstate="print">
+                    <a:blip r:embed="rId15" cstate="print">
                       <a:extLst>
                         <a:ext uri="{28A0092B-C50C-407E-A947-70E740481C1C}">
                           <a14:useLocalDpi xmlns:a14="http://schemas.microsoft.com/office/drawing/2010/main" val="0"/>
@@ -21966,7 +21966,7 @@
                     <pic:cNvPicPr/>
                   </pic:nvPicPr>
                   <pic:blipFill>
-                    <a:blip r:embed="rId15" cstate="print">
+                    <a:blip r:embed="rId16" cstate="print">
                       <a:extLst>
                         <a:ext uri="{28A0092B-C50C-407E-A947-70E740481C1C}">
                           <a14:useLocalDpi xmlns:a14="http://schemas.microsoft.com/office/drawing/2010/main" val="0"/>
@@ -22969,7 +22969,7 @@
                     <pic:cNvPicPr/>
                   </pic:nvPicPr>
                   <pic:blipFill>
-                    <a:blip r:embed="rId16">
+                    <a:blip r:embed="rId17">
                       <a:extLst>
                         <a:ext uri="{28A0092B-C50C-407E-A947-70E740481C1C}">
                           <a14:useLocalDpi xmlns:a14="http://schemas.microsoft.com/office/drawing/2010/main" val="0"/>
@@ -28660,7 +28660,7 @@
                     <pic:cNvPicPr/>
                   </pic:nvPicPr>
                   <pic:blipFill>
-                    <a:blip r:embed="rId17">
+                    <a:blip r:embed="rId18">
                       <a:extLst>
                         <a:ext uri="{28A0092B-C50C-407E-A947-70E740481C1C}">
                           <a14:useLocalDpi xmlns:a14="http://schemas.microsoft.com/office/drawing/2010/main" val="0"/>
@@ -28898,7 +28898,7 @@
                     <pic:cNvPicPr/>
                   </pic:nvPicPr>
                   <pic:blipFill>
-                    <a:blip r:embed="rId18" cstate="print">
+                    <a:blip r:embed="rId19" cstate="print">
                       <a:extLst>
                         <a:ext uri="{28A0092B-C50C-407E-A947-70E740481C1C}">
                           <a14:useLocalDpi xmlns:a14="http://schemas.microsoft.com/office/drawing/2010/main" val="0"/>
@@ -30665,7 +30665,7 @@
                     <pic:cNvPicPr/>
                   </pic:nvPicPr>
                   <pic:blipFill>
-                    <a:blip r:embed="rId19">
+                    <a:blip r:embed="rId20">
                       <a:extLst>
                         <a:ext uri="{28A0092B-C50C-407E-A947-70E740481C1C}">
                           <a14:useLocalDpi xmlns:a14="http://schemas.microsoft.com/office/drawing/2010/main" val="0"/>
@@ -32219,7 +32219,7 @@
                     <pic:cNvPicPr/>
                   </pic:nvPicPr>
                   <pic:blipFill>
-                    <a:blip r:embed="rId20">
+                    <a:blip r:embed="rId21">
                       <a:extLst>
                         <a:ext uri="{28A0092B-C50C-407E-A947-70E740481C1C}">
                           <a14:useLocalDpi xmlns:a14="http://schemas.microsoft.com/office/drawing/2010/main" val="0"/>
@@ -32808,8 +32808,8 @@
           <w:lang w:val="en-IN"/>
         </w:rPr>
         <w:drawing>
-          <wp:inline distT="0" distB="0" distL="0" distR="0" wp14:anchorId="37189C3B" wp14:editId="3A04F485">
-            <wp:extent cx="6120130" cy="5832475"/>
+          <wp:inline distT="0" distB="0" distL="0" distR="0" wp14:anchorId="37189C3B" wp14:editId="12A8E553">
+            <wp:extent cx="6382745" cy="6082747"/>
             <wp:effectExtent l="0" t="0" r="0" b="0"/>
             <wp:docPr id="46" name="Immagine 46"/>
             <wp:cNvGraphicFramePr>
@@ -32823,7 +32823,7 @@
                     <pic:cNvPicPr/>
                   </pic:nvPicPr>
                   <pic:blipFill>
-                    <a:blip r:embed="rId21">
+                    <a:blip r:embed="rId22">
                       <a:extLst>
                         <a:ext uri="{28A0092B-C50C-407E-A947-70E740481C1C}">
                           <a14:useLocalDpi xmlns:a14="http://schemas.microsoft.com/office/drawing/2010/main" val="0"/>
@@ -32837,7 +32837,7 @@
                   <pic:spPr>
                     <a:xfrm>
                       <a:off x="0" y="0"/>
-                      <a:ext cx="6120130" cy="5832475"/>
+                      <a:ext cx="6382745" cy="6082747"/>
                     </a:xfrm>
                     <a:prstGeom prst="rect">
                       <a:avLst/>
@@ -32863,6 +32863,39 @@
     </w:p>
     <w:p>
       <w:pPr>
+        <w:spacing w:beforeAutospacing="1" w:after="100" w:afterAutospacing="1"/>
+        <w:rPr>
+          <w:rFonts w:ascii="Times New Roman" w:eastAsia="Times New Roman" w:hAnsi="Times New Roman" w:cs="Times New Roman"/>
+          <w:sz w:val="24"/>
+          <w:szCs w:val="24"/>
+          <w:lang w:val="en-IN" w:eastAsia="it-IT"/>
+        </w:rPr>
+      </w:pPr>
+    </w:p>
+    <w:p>
+      <w:pPr>
+        <w:spacing w:beforeAutospacing="1" w:after="100" w:afterAutospacing="1"/>
+        <w:rPr>
+          <w:rFonts w:ascii="Times New Roman" w:eastAsia="Times New Roman" w:hAnsi="Times New Roman" w:cs="Times New Roman"/>
+          <w:sz w:val="24"/>
+          <w:szCs w:val="24"/>
+          <w:lang w:val="en-IN" w:eastAsia="it-IT"/>
+        </w:rPr>
+      </w:pPr>
+    </w:p>
+    <w:p>
+      <w:pPr>
+        <w:spacing w:beforeAutospacing="1" w:after="100" w:afterAutospacing="1"/>
+        <w:rPr>
+          <w:rFonts w:ascii="Times New Roman" w:eastAsia="Times New Roman" w:hAnsi="Times New Roman" w:cs="Times New Roman"/>
+          <w:sz w:val="24"/>
+          <w:szCs w:val="24"/>
+          <w:lang w:val="en-IN" w:eastAsia="it-IT"/>
+        </w:rPr>
+      </w:pPr>
+    </w:p>
+    <w:p>
+      <w:pPr>
         <w:pStyle w:val="Titolo2"/>
         <w:rPr>
           <w:b/>
@@ -32874,6 +32907,7 @@
           <w:b/>
           <w:lang w:val="en-IN"/>
         </w:rPr>
+        <w:lastRenderedPageBreak/>
         <w:t xml:space="preserve">5.8 </w:t>
       </w:r>
       <w:r>
@@ -32933,7 +32967,6 @@
           <w:bCs/>
           <w:lang w:val="en-IN"/>
         </w:rPr>
-        <w:lastRenderedPageBreak/>
         <w:t>Designer (High Revenue, High Population):</w:t>
       </w:r>
       <w:r>
@@ -33173,7 +33206,7 @@
                     <pic:cNvPicPr/>
                   </pic:nvPicPr>
                   <pic:blipFill>
-                    <a:blip r:embed="rId22">
+                    <a:blip r:embed="rId23">
                       <a:extLst>
                         <a:ext uri="{28A0092B-C50C-407E-A947-70E740481C1C}">
                           <a14:useLocalDpi xmlns:a14="http://schemas.microsoft.com/office/drawing/2010/main" val="0"/>
@@ -33199,8 +33232,6 @@
           </wp:inline>
         </w:drawing>
       </w:r>
-      <w:bookmarkStart w:id="1" w:name="_GoBack"/>
-      <w:bookmarkEnd w:id="1"/>
     </w:p>
     <w:p>
       <w:pPr>
@@ -33216,6 +33247,7 @@
       <w:pPr>
         <w:pStyle w:val="NormaleWeb"/>
         <w:spacing w:line="276" w:lineRule="auto"/>
+        <w:jc w:val="both"/>
         <w:rPr>
           <w:lang w:val="en-IN"/>
         </w:rPr>
@@ -33223,6 +33255,2290 @@
     </w:p>
     <w:p>
       <w:pPr>
+        <w:pStyle w:val="NormaleWeb"/>
+        <w:spacing w:line="276" w:lineRule="auto"/>
+        <w:jc w:val="both"/>
+        <w:rPr>
+          <w:lang w:val="en-IN"/>
+        </w:rPr>
+      </w:pPr>
+    </w:p>
+    <w:p>
+      <w:pPr>
+        <w:pStyle w:val="NormaleWeb"/>
+        <w:spacing w:line="276" w:lineRule="auto"/>
+        <w:jc w:val="both"/>
+        <w:rPr>
+          <w:lang w:val="en-IN"/>
+        </w:rPr>
+      </w:pPr>
+    </w:p>
+    <w:p>
+      <w:pPr>
+        <w:pStyle w:val="NormaleWeb"/>
+        <w:spacing w:line="276" w:lineRule="auto"/>
+        <w:jc w:val="both"/>
+        <w:rPr>
+          <w:lang w:val="en-IN"/>
+        </w:rPr>
+      </w:pPr>
+    </w:p>
+    <w:p>
+      <w:pPr>
+        <w:pStyle w:val="NormaleWeb"/>
+        <w:spacing w:line="276" w:lineRule="auto"/>
+        <w:jc w:val="both"/>
+        <w:rPr>
+          <w:lang w:val="en-IN"/>
+        </w:rPr>
+      </w:pPr>
+    </w:p>
+    <w:p>
+      <w:pPr>
+        <w:pStyle w:val="Titolo1"/>
+        <w:rPr>
+          <w:b/>
+          <w:lang w:val="en-IN"/>
+        </w:rPr>
+      </w:pPr>
+      <w:r>
+        <w:rPr>
+          <w:b/>
+          <w:lang w:val="en-IN"/>
+        </w:rPr>
+        <w:lastRenderedPageBreak/>
+        <w:t>6.0 PRODUCT AFFINITY AND PRICING</w:t>
+      </w:r>
+    </w:p>
+    <w:p>
+      <w:pPr>
+        <w:pStyle w:val="NormaleWeb"/>
+        <w:spacing w:line="276" w:lineRule="auto"/>
+        <w:jc w:val="both"/>
+        <w:rPr>
+          <w:lang w:val="en-IN"/>
+        </w:rPr>
+      </w:pPr>
+      <w:r>
+        <w:rPr>
+          <w:lang w:val="en-IN"/>
+        </w:rPr>
+        <w:t xml:space="preserve">Product affinity and pricing analysis are critical for transforming raw transaction data into strategic business intelligence. By identifying which categories are frequently sampled together through </w:t>
+      </w:r>
+      <w:r>
+        <w:rPr>
+          <w:b/>
+          <w:bCs/>
+          <w:lang w:val="en-IN"/>
+        </w:rPr>
+        <w:t>Category Affinity Analysis</w:t>
+      </w:r>
+      <w:r>
+        <w:rPr>
+          <w:lang w:val="en-IN"/>
+        </w:rPr>
+        <w:t xml:space="preserve">, businesses can optimize cross-selling strategies and product bundling. Simultaneously, evaluating </w:t>
+      </w:r>
+      <w:r>
+        <w:rPr>
+          <w:b/>
+          <w:bCs/>
+          <w:lang w:val="en-IN"/>
+        </w:rPr>
+        <w:t>Price Elasticity</w:t>
+      </w:r>
+      <w:r>
+        <w:rPr>
+          <w:lang w:val="en-IN"/>
+        </w:rPr>
+        <w:t xml:space="preserve"> reveals how different price brackets influence the conversion rate from a free sample to a paid sale, allowing for more precise high-ticket targeting. When combined with </w:t>
+      </w:r>
+      <w:r>
+        <w:rPr>
+          <w:b/>
+          <w:bCs/>
+          <w:lang w:val="en-IN"/>
+        </w:rPr>
+        <w:t>Pareto Analysis</w:t>
+      </w:r>
+      <w:r>
+        <w:rPr>
+          <w:lang w:val="en-IN"/>
+        </w:rPr>
+        <w:t xml:space="preserve"> to identify top-tier revenue-generating customers, these insights enable a company to reduce waste in sampling programs and maximize return on investment by focusing on the most profitable products and motifs.</w:t>
+      </w:r>
+    </w:p>
+    <w:p>
+      <w:pPr>
+        <w:pStyle w:val="Titolo2"/>
+        <w:rPr>
+          <w:b/>
+          <w:lang w:val="en-IN"/>
+        </w:rPr>
+      </w:pPr>
+      <w:r>
+        <w:rPr>
+          <w:b/>
+          <w:lang w:val="en-IN"/>
+        </w:rPr>
+        <w:t xml:space="preserve">6.1 </w:t>
+      </w:r>
+      <w:r>
+        <w:rPr>
+          <w:b/>
+          <w:lang w:val="en-IN"/>
+        </w:rPr>
+        <w:t>Pareto Analysis: Revenue Concentration</w:t>
+      </w:r>
+    </w:p>
+    <w:p>
+      <w:pPr>
+        <w:spacing w:beforeAutospacing="1" w:after="100" w:afterAutospacing="1"/>
+        <w:jc w:val="both"/>
+        <w:rPr>
+          <w:rFonts w:ascii="Times New Roman" w:eastAsia="Times New Roman" w:hAnsi="Times New Roman" w:cs="Times New Roman"/>
+          <w:sz w:val="24"/>
+          <w:szCs w:val="24"/>
+          <w:lang w:val="en-IN" w:eastAsia="it-IT"/>
+        </w:rPr>
+      </w:pPr>
+      <w:r>
+        <w:rPr>
+          <w:rFonts w:ascii="Times New Roman" w:eastAsia="Times New Roman" w:hAnsi="Times New Roman" w:cs="Times New Roman"/>
+          <w:sz w:val="24"/>
+          <w:szCs w:val="24"/>
+          <w:lang w:val="en-IN" w:eastAsia="it-IT"/>
+        </w:rPr>
+        <w:t xml:space="preserve">The </w:t>
+      </w:r>
+      <w:r>
+        <w:rPr>
+          <w:rFonts w:ascii="Times New Roman" w:eastAsia="Times New Roman" w:hAnsi="Times New Roman" w:cs="Times New Roman"/>
+          <w:b/>
+          <w:bCs/>
+          <w:sz w:val="24"/>
+          <w:szCs w:val="24"/>
+          <w:lang w:val="en-IN" w:eastAsia="it-IT"/>
+        </w:rPr>
+        <w:t>Pareto Analysis</w:t>
+      </w:r>
+      <w:r>
+        <w:rPr>
+          <w:rFonts w:ascii="Times New Roman" w:eastAsia="Times New Roman" w:hAnsi="Times New Roman" w:cs="Times New Roman"/>
+          <w:sz w:val="24"/>
+          <w:szCs w:val="24"/>
+          <w:lang w:val="en-IN" w:eastAsia="it-IT"/>
+        </w:rPr>
+        <w:t xml:space="preserve"> was conducted to identify the degree of revenue concentration within the customer base, following the principle that a small percentage of clients often drive the majority of total sales. By plotting the cumulative percentage of total revenue against the percentage of customers, the analysis reveals the "Vital Few" high-value accounts.</w:t>
+      </w:r>
+    </w:p>
+    <w:p>
+      <w:pPr>
+        <w:shd w:val="clear" w:color="auto" w:fill="1E1E1E"/>
+        <w:spacing w:before="0" w:after="0" w:line="240" w:lineRule="auto"/>
+        <w:rPr>
+          <w:rFonts w:ascii="Consolas" w:eastAsia="Times New Roman" w:hAnsi="Consolas" w:cs="Times New Roman"/>
+          <w:color w:val="D4D4D4"/>
+          <w:sz w:val="18"/>
+          <w:szCs w:val="21"/>
+          <w:lang w:val="en-IN" w:eastAsia="it-IT"/>
+        </w:rPr>
+      </w:pPr>
+      <w:proofErr w:type="spellStart"/>
+      <w:r>
+        <w:rPr>
+          <w:rFonts w:ascii="Consolas" w:eastAsia="Times New Roman" w:hAnsi="Consolas" w:cs="Times New Roman"/>
+          <w:color w:val="9CDCFE"/>
+          <w:sz w:val="18"/>
+          <w:szCs w:val="21"/>
+          <w:lang w:val="en-IN" w:eastAsia="it-IT"/>
+        </w:rPr>
+        <w:t>revenue_per_cust</w:t>
+      </w:r>
+      <w:proofErr w:type="spellEnd"/>
+      <w:r>
+        <w:rPr>
+          <w:rFonts w:ascii="Consolas" w:eastAsia="Times New Roman" w:hAnsi="Consolas" w:cs="Times New Roman"/>
+          <w:color w:val="D4D4D4"/>
+          <w:sz w:val="18"/>
+          <w:szCs w:val="21"/>
+          <w:lang w:val="en-IN" w:eastAsia="it-IT"/>
+        </w:rPr>
+        <w:t xml:space="preserve"> = </w:t>
+      </w:r>
+      <w:proofErr w:type="spellStart"/>
+      <w:r>
+        <w:rPr>
+          <w:rFonts w:ascii="Consolas" w:eastAsia="Times New Roman" w:hAnsi="Consolas" w:cs="Times New Roman"/>
+          <w:color w:val="9CDCFE"/>
+          <w:sz w:val="18"/>
+          <w:szCs w:val="21"/>
+          <w:lang w:val="en-IN" w:eastAsia="it-IT"/>
+        </w:rPr>
+        <w:t>df_master</w:t>
+      </w:r>
+      <w:proofErr w:type="spellEnd"/>
+      <w:r>
+        <w:rPr>
+          <w:rFonts w:ascii="Consolas" w:eastAsia="Times New Roman" w:hAnsi="Consolas" w:cs="Times New Roman"/>
+          <w:color w:val="D4D4D4"/>
+          <w:sz w:val="18"/>
+          <w:szCs w:val="21"/>
+          <w:lang w:val="en-IN" w:eastAsia="it-IT"/>
+        </w:rPr>
+        <w:t>[</w:t>
+      </w:r>
+      <w:proofErr w:type="spellStart"/>
+      <w:r>
+        <w:rPr>
+          <w:rFonts w:ascii="Consolas" w:eastAsia="Times New Roman" w:hAnsi="Consolas" w:cs="Times New Roman"/>
+          <w:color w:val="9CDCFE"/>
+          <w:sz w:val="18"/>
+          <w:szCs w:val="21"/>
+          <w:lang w:val="en-IN" w:eastAsia="it-IT"/>
+        </w:rPr>
+        <w:t>df_master</w:t>
+      </w:r>
+      <w:proofErr w:type="spellEnd"/>
+      <w:r>
+        <w:rPr>
+          <w:rFonts w:ascii="Consolas" w:eastAsia="Times New Roman" w:hAnsi="Consolas" w:cs="Times New Roman"/>
+          <w:color w:val="D4D4D4"/>
+          <w:sz w:val="18"/>
+          <w:szCs w:val="21"/>
+          <w:lang w:val="en-IN" w:eastAsia="it-IT"/>
+        </w:rPr>
+        <w:t>[</w:t>
+      </w:r>
+      <w:r>
+        <w:rPr>
+          <w:rFonts w:ascii="Consolas" w:eastAsia="Times New Roman" w:hAnsi="Consolas" w:cs="Times New Roman"/>
+          <w:color w:val="CE9178"/>
+          <w:sz w:val="18"/>
+          <w:szCs w:val="21"/>
+          <w:lang w:val="en-IN" w:eastAsia="it-IT"/>
+        </w:rPr>
+        <w:t>'type'</w:t>
+      </w:r>
+      <w:r>
+        <w:rPr>
+          <w:rFonts w:ascii="Consolas" w:eastAsia="Times New Roman" w:hAnsi="Consolas" w:cs="Times New Roman"/>
+          <w:color w:val="D4D4D4"/>
+          <w:sz w:val="18"/>
+          <w:szCs w:val="21"/>
+          <w:lang w:val="en-IN" w:eastAsia="it-IT"/>
+        </w:rPr>
+        <w:t xml:space="preserve">] </w:t>
+      </w:r>
+      <w:r>
+        <w:rPr>
+          <w:rFonts w:ascii="Consolas" w:eastAsia="Times New Roman" w:hAnsi="Consolas" w:cs="Times New Roman"/>
+          <w:color w:val="DCDCAA"/>
+          <w:sz w:val="18"/>
+          <w:szCs w:val="21"/>
+          <w:lang w:val="en-IN" w:eastAsia="it-IT"/>
+        </w:rPr>
+        <w:t>==</w:t>
+      </w:r>
+      <w:r>
+        <w:rPr>
+          <w:rFonts w:ascii="Consolas" w:eastAsia="Times New Roman" w:hAnsi="Consolas" w:cs="Times New Roman"/>
+          <w:color w:val="D4D4D4"/>
+          <w:sz w:val="18"/>
+          <w:szCs w:val="21"/>
+          <w:lang w:val="en-IN" w:eastAsia="it-IT"/>
+        </w:rPr>
+        <w:t xml:space="preserve"> </w:t>
+      </w:r>
+      <w:r>
+        <w:rPr>
+          <w:rFonts w:ascii="Consolas" w:eastAsia="Times New Roman" w:hAnsi="Consolas" w:cs="Times New Roman"/>
+          <w:color w:val="CE9178"/>
+          <w:sz w:val="18"/>
+          <w:szCs w:val="21"/>
+          <w:lang w:val="en-IN" w:eastAsia="it-IT"/>
+        </w:rPr>
+        <w:t>'SALE'</w:t>
+      </w:r>
+      <w:proofErr w:type="gramStart"/>
+      <w:r>
+        <w:rPr>
+          <w:rFonts w:ascii="Consolas" w:eastAsia="Times New Roman" w:hAnsi="Consolas" w:cs="Times New Roman"/>
+          <w:color w:val="D4D4D4"/>
+          <w:sz w:val="18"/>
+          <w:szCs w:val="21"/>
+          <w:lang w:val="en-IN" w:eastAsia="it-IT"/>
+        </w:rPr>
+        <w:t>].</w:t>
+      </w:r>
+      <w:r>
+        <w:rPr>
+          <w:rFonts w:ascii="Consolas" w:eastAsia="Times New Roman" w:hAnsi="Consolas" w:cs="Times New Roman"/>
+          <w:color w:val="DCDCAA"/>
+          <w:sz w:val="18"/>
+          <w:szCs w:val="21"/>
+          <w:lang w:val="en-IN" w:eastAsia="it-IT"/>
+        </w:rPr>
+        <w:t>groupby</w:t>
+      </w:r>
+      <w:proofErr w:type="gramEnd"/>
+      <w:r>
+        <w:rPr>
+          <w:rFonts w:ascii="Consolas" w:eastAsia="Times New Roman" w:hAnsi="Consolas" w:cs="Times New Roman"/>
+          <w:color w:val="D4D4D4"/>
+          <w:sz w:val="18"/>
+          <w:szCs w:val="21"/>
+          <w:lang w:val="en-IN" w:eastAsia="it-IT"/>
+        </w:rPr>
+        <w:t>(</w:t>
+      </w:r>
+      <w:r>
+        <w:rPr>
+          <w:rFonts w:ascii="Consolas" w:eastAsia="Times New Roman" w:hAnsi="Consolas" w:cs="Times New Roman"/>
+          <w:color w:val="CE9178"/>
+          <w:sz w:val="18"/>
+          <w:szCs w:val="21"/>
+          <w:lang w:val="en-IN" w:eastAsia="it-IT"/>
+        </w:rPr>
+        <w:t>'trade_account_id'</w:t>
+      </w:r>
+      <w:r>
+        <w:rPr>
+          <w:rFonts w:ascii="Consolas" w:eastAsia="Times New Roman" w:hAnsi="Consolas" w:cs="Times New Roman"/>
+          <w:color w:val="D4D4D4"/>
+          <w:sz w:val="18"/>
+          <w:szCs w:val="21"/>
+          <w:lang w:val="en-IN" w:eastAsia="it-IT"/>
+        </w:rPr>
+        <w:t>)[</w:t>
+      </w:r>
+      <w:r>
+        <w:rPr>
+          <w:rFonts w:ascii="Consolas" w:eastAsia="Times New Roman" w:hAnsi="Consolas" w:cs="Times New Roman"/>
+          <w:color w:val="CE9178"/>
+          <w:sz w:val="18"/>
+          <w:szCs w:val="21"/>
+          <w:lang w:val="en-IN" w:eastAsia="it-IT"/>
+        </w:rPr>
+        <w:t>'netrevenue'</w:t>
+      </w:r>
+      <w:r>
+        <w:rPr>
+          <w:rFonts w:ascii="Consolas" w:eastAsia="Times New Roman" w:hAnsi="Consolas" w:cs="Times New Roman"/>
+          <w:color w:val="D4D4D4"/>
+          <w:sz w:val="18"/>
+          <w:szCs w:val="21"/>
+          <w:lang w:val="en-IN" w:eastAsia="it-IT"/>
+        </w:rPr>
+        <w:t>].</w:t>
+      </w:r>
+      <w:r>
+        <w:rPr>
+          <w:rFonts w:ascii="Consolas" w:eastAsia="Times New Roman" w:hAnsi="Consolas" w:cs="Times New Roman"/>
+          <w:color w:val="DCDCAA"/>
+          <w:sz w:val="18"/>
+          <w:szCs w:val="21"/>
+          <w:lang w:val="en-IN" w:eastAsia="it-IT"/>
+        </w:rPr>
+        <w:t>sum</w:t>
+      </w:r>
+      <w:r>
+        <w:rPr>
+          <w:rFonts w:ascii="Consolas" w:eastAsia="Times New Roman" w:hAnsi="Consolas" w:cs="Times New Roman"/>
+          <w:color w:val="D4D4D4"/>
+          <w:sz w:val="18"/>
+          <w:szCs w:val="21"/>
+          <w:lang w:val="en-IN" w:eastAsia="it-IT"/>
+        </w:rPr>
+        <w:t>().</w:t>
+      </w:r>
+      <w:r>
+        <w:rPr>
+          <w:rFonts w:ascii="Consolas" w:eastAsia="Times New Roman" w:hAnsi="Consolas" w:cs="Times New Roman"/>
+          <w:color w:val="DCDCAA"/>
+          <w:sz w:val="18"/>
+          <w:szCs w:val="21"/>
+          <w:lang w:val="en-IN" w:eastAsia="it-IT"/>
+        </w:rPr>
+        <w:t>sort_values</w:t>
+      </w:r>
+      <w:r>
+        <w:rPr>
+          <w:rFonts w:ascii="Consolas" w:eastAsia="Times New Roman" w:hAnsi="Consolas" w:cs="Times New Roman"/>
+          <w:color w:val="D4D4D4"/>
+          <w:sz w:val="18"/>
+          <w:szCs w:val="21"/>
+          <w:lang w:val="en-IN" w:eastAsia="it-IT"/>
+        </w:rPr>
+        <w:t>(</w:t>
+      </w:r>
+      <w:r>
+        <w:rPr>
+          <w:rFonts w:ascii="Consolas" w:eastAsia="Times New Roman" w:hAnsi="Consolas" w:cs="Times New Roman"/>
+          <w:color w:val="9CDCFE"/>
+          <w:sz w:val="18"/>
+          <w:szCs w:val="21"/>
+          <w:lang w:val="en-IN" w:eastAsia="it-IT"/>
+        </w:rPr>
+        <w:t>ascending</w:t>
+      </w:r>
+      <w:r>
+        <w:rPr>
+          <w:rFonts w:ascii="Consolas" w:eastAsia="Times New Roman" w:hAnsi="Consolas" w:cs="Times New Roman"/>
+          <w:color w:val="D4D4D4"/>
+          <w:sz w:val="18"/>
+          <w:szCs w:val="21"/>
+          <w:lang w:val="en-IN" w:eastAsia="it-IT"/>
+        </w:rPr>
+        <w:t>=</w:t>
+      </w:r>
+      <w:r>
+        <w:rPr>
+          <w:rFonts w:ascii="Consolas" w:eastAsia="Times New Roman" w:hAnsi="Consolas" w:cs="Times New Roman"/>
+          <w:color w:val="569CD6"/>
+          <w:sz w:val="18"/>
+          <w:szCs w:val="21"/>
+          <w:lang w:val="en-IN" w:eastAsia="it-IT"/>
+        </w:rPr>
+        <w:t>False</w:t>
+      </w:r>
+      <w:r>
+        <w:rPr>
+          <w:rFonts w:ascii="Consolas" w:eastAsia="Times New Roman" w:hAnsi="Consolas" w:cs="Times New Roman"/>
+          <w:color w:val="D4D4D4"/>
+          <w:sz w:val="18"/>
+          <w:szCs w:val="21"/>
+          <w:lang w:val="en-IN" w:eastAsia="it-IT"/>
+        </w:rPr>
+        <w:t>).</w:t>
+      </w:r>
+      <w:r>
+        <w:rPr>
+          <w:rFonts w:ascii="Consolas" w:eastAsia="Times New Roman" w:hAnsi="Consolas" w:cs="Times New Roman"/>
+          <w:color w:val="DCDCAA"/>
+          <w:sz w:val="18"/>
+          <w:szCs w:val="21"/>
+          <w:lang w:val="en-IN" w:eastAsia="it-IT"/>
+        </w:rPr>
+        <w:t>reset_index</w:t>
+      </w:r>
+      <w:r>
+        <w:rPr>
+          <w:rFonts w:ascii="Consolas" w:eastAsia="Times New Roman" w:hAnsi="Consolas" w:cs="Times New Roman"/>
+          <w:color w:val="D4D4D4"/>
+          <w:sz w:val="18"/>
+          <w:szCs w:val="21"/>
+          <w:lang w:val="en-IN" w:eastAsia="it-IT"/>
+        </w:rPr>
+        <w:t>()</w:t>
+      </w:r>
+    </w:p>
+    <w:p>
+      <w:pPr>
+        <w:shd w:val="clear" w:color="auto" w:fill="1E1E1E"/>
+        <w:spacing w:before="0" w:after="0" w:line="240" w:lineRule="auto"/>
+        <w:rPr>
+          <w:rFonts w:ascii="Consolas" w:eastAsia="Times New Roman" w:hAnsi="Consolas" w:cs="Times New Roman"/>
+          <w:color w:val="D4D4D4"/>
+          <w:sz w:val="18"/>
+          <w:szCs w:val="21"/>
+          <w:lang w:val="en-IN" w:eastAsia="it-IT"/>
+        </w:rPr>
+      </w:pPr>
+      <w:proofErr w:type="spellStart"/>
+      <w:r>
+        <w:rPr>
+          <w:rFonts w:ascii="Consolas" w:eastAsia="Times New Roman" w:hAnsi="Consolas" w:cs="Times New Roman"/>
+          <w:color w:val="9CDCFE"/>
+          <w:sz w:val="18"/>
+          <w:szCs w:val="21"/>
+          <w:lang w:val="en-IN" w:eastAsia="it-IT"/>
+        </w:rPr>
+        <w:t>revenue_per_cust</w:t>
+      </w:r>
+      <w:proofErr w:type="spellEnd"/>
+      <w:r>
+        <w:rPr>
+          <w:rFonts w:ascii="Consolas" w:eastAsia="Times New Roman" w:hAnsi="Consolas" w:cs="Times New Roman"/>
+          <w:color w:val="D4D4D4"/>
+          <w:sz w:val="18"/>
+          <w:szCs w:val="21"/>
+          <w:lang w:val="en-IN" w:eastAsia="it-IT"/>
+        </w:rPr>
+        <w:t>[</w:t>
+      </w:r>
+      <w:r>
+        <w:rPr>
+          <w:rFonts w:ascii="Consolas" w:eastAsia="Times New Roman" w:hAnsi="Consolas" w:cs="Times New Roman"/>
+          <w:color w:val="CE9178"/>
+          <w:sz w:val="18"/>
+          <w:szCs w:val="21"/>
+          <w:lang w:val="en-IN" w:eastAsia="it-IT"/>
+        </w:rPr>
+        <w:t>'</w:t>
+      </w:r>
+      <w:proofErr w:type="spellStart"/>
+      <w:r>
+        <w:rPr>
+          <w:rFonts w:ascii="Consolas" w:eastAsia="Times New Roman" w:hAnsi="Consolas" w:cs="Times New Roman"/>
+          <w:color w:val="CE9178"/>
+          <w:sz w:val="18"/>
+          <w:szCs w:val="21"/>
+          <w:lang w:val="en-IN" w:eastAsia="it-IT"/>
+        </w:rPr>
+        <w:t>cum_pct</w:t>
+      </w:r>
+      <w:proofErr w:type="spellEnd"/>
+      <w:r>
+        <w:rPr>
+          <w:rFonts w:ascii="Consolas" w:eastAsia="Times New Roman" w:hAnsi="Consolas" w:cs="Times New Roman"/>
+          <w:color w:val="CE9178"/>
+          <w:sz w:val="18"/>
+          <w:szCs w:val="21"/>
+          <w:lang w:val="en-IN" w:eastAsia="it-IT"/>
+        </w:rPr>
+        <w:t>'</w:t>
+      </w:r>
+      <w:r>
+        <w:rPr>
+          <w:rFonts w:ascii="Consolas" w:eastAsia="Times New Roman" w:hAnsi="Consolas" w:cs="Times New Roman"/>
+          <w:color w:val="D4D4D4"/>
+          <w:sz w:val="18"/>
+          <w:szCs w:val="21"/>
+          <w:lang w:val="en-IN" w:eastAsia="it-IT"/>
+        </w:rPr>
+        <w:t xml:space="preserve">] = </w:t>
+      </w:r>
+      <w:proofErr w:type="spellStart"/>
+      <w:r>
+        <w:rPr>
+          <w:rFonts w:ascii="Consolas" w:eastAsia="Times New Roman" w:hAnsi="Consolas" w:cs="Times New Roman"/>
+          <w:color w:val="9CDCFE"/>
+          <w:sz w:val="18"/>
+          <w:szCs w:val="21"/>
+          <w:lang w:val="en-IN" w:eastAsia="it-IT"/>
+        </w:rPr>
+        <w:t>revenue_per_cust</w:t>
+      </w:r>
+      <w:proofErr w:type="spellEnd"/>
+      <w:r>
+        <w:rPr>
+          <w:rFonts w:ascii="Consolas" w:eastAsia="Times New Roman" w:hAnsi="Consolas" w:cs="Times New Roman"/>
+          <w:color w:val="D4D4D4"/>
+          <w:sz w:val="18"/>
+          <w:szCs w:val="21"/>
+          <w:lang w:val="en-IN" w:eastAsia="it-IT"/>
+        </w:rPr>
+        <w:t>[</w:t>
+      </w:r>
+      <w:r>
+        <w:rPr>
+          <w:rFonts w:ascii="Consolas" w:eastAsia="Times New Roman" w:hAnsi="Consolas" w:cs="Times New Roman"/>
+          <w:color w:val="CE9178"/>
+          <w:sz w:val="18"/>
+          <w:szCs w:val="21"/>
+          <w:lang w:val="en-IN" w:eastAsia="it-IT"/>
+        </w:rPr>
+        <w:t>'</w:t>
+      </w:r>
+      <w:proofErr w:type="spellStart"/>
+      <w:r>
+        <w:rPr>
+          <w:rFonts w:ascii="Consolas" w:eastAsia="Times New Roman" w:hAnsi="Consolas" w:cs="Times New Roman"/>
+          <w:color w:val="CE9178"/>
+          <w:sz w:val="18"/>
+          <w:szCs w:val="21"/>
+          <w:lang w:val="en-IN" w:eastAsia="it-IT"/>
+        </w:rPr>
+        <w:t>netrevenue</w:t>
+      </w:r>
+      <w:proofErr w:type="spellEnd"/>
+      <w:r>
+        <w:rPr>
+          <w:rFonts w:ascii="Consolas" w:eastAsia="Times New Roman" w:hAnsi="Consolas" w:cs="Times New Roman"/>
+          <w:color w:val="CE9178"/>
+          <w:sz w:val="18"/>
+          <w:szCs w:val="21"/>
+          <w:lang w:val="en-IN" w:eastAsia="it-IT"/>
+        </w:rPr>
+        <w:t>'</w:t>
+      </w:r>
+      <w:proofErr w:type="gramStart"/>
+      <w:r>
+        <w:rPr>
+          <w:rFonts w:ascii="Consolas" w:eastAsia="Times New Roman" w:hAnsi="Consolas" w:cs="Times New Roman"/>
+          <w:color w:val="D4D4D4"/>
+          <w:sz w:val="18"/>
+          <w:szCs w:val="21"/>
+          <w:lang w:val="en-IN" w:eastAsia="it-IT"/>
+        </w:rPr>
+        <w:t>].</w:t>
+      </w:r>
+      <w:proofErr w:type="spellStart"/>
+      <w:r>
+        <w:rPr>
+          <w:rFonts w:ascii="Consolas" w:eastAsia="Times New Roman" w:hAnsi="Consolas" w:cs="Times New Roman"/>
+          <w:color w:val="DCDCAA"/>
+          <w:sz w:val="18"/>
+          <w:szCs w:val="21"/>
+          <w:lang w:val="en-IN" w:eastAsia="it-IT"/>
+        </w:rPr>
+        <w:t>cumsum</w:t>
+      </w:r>
+      <w:proofErr w:type="spellEnd"/>
+      <w:proofErr w:type="gramEnd"/>
+      <w:r>
+        <w:rPr>
+          <w:rFonts w:ascii="Consolas" w:eastAsia="Times New Roman" w:hAnsi="Consolas" w:cs="Times New Roman"/>
+          <w:color w:val="D4D4D4"/>
+          <w:sz w:val="18"/>
+          <w:szCs w:val="21"/>
+          <w:lang w:val="en-IN" w:eastAsia="it-IT"/>
+        </w:rPr>
+        <w:t xml:space="preserve">() </w:t>
+      </w:r>
+      <w:r>
+        <w:rPr>
+          <w:rFonts w:ascii="Consolas" w:eastAsia="Times New Roman" w:hAnsi="Consolas" w:cs="Times New Roman"/>
+          <w:color w:val="DCDCAA"/>
+          <w:sz w:val="18"/>
+          <w:szCs w:val="21"/>
+          <w:lang w:val="en-IN" w:eastAsia="it-IT"/>
+        </w:rPr>
+        <w:t>/</w:t>
+      </w:r>
+      <w:r>
+        <w:rPr>
+          <w:rFonts w:ascii="Consolas" w:eastAsia="Times New Roman" w:hAnsi="Consolas" w:cs="Times New Roman"/>
+          <w:color w:val="D4D4D4"/>
+          <w:sz w:val="18"/>
+          <w:szCs w:val="21"/>
+          <w:lang w:val="en-IN" w:eastAsia="it-IT"/>
+        </w:rPr>
+        <w:t xml:space="preserve"> </w:t>
+      </w:r>
+      <w:proofErr w:type="spellStart"/>
+      <w:r>
+        <w:rPr>
+          <w:rFonts w:ascii="Consolas" w:eastAsia="Times New Roman" w:hAnsi="Consolas" w:cs="Times New Roman"/>
+          <w:color w:val="9CDCFE"/>
+          <w:sz w:val="18"/>
+          <w:szCs w:val="21"/>
+          <w:lang w:val="en-IN" w:eastAsia="it-IT"/>
+        </w:rPr>
+        <w:t>revenue_per_cust</w:t>
+      </w:r>
+      <w:proofErr w:type="spellEnd"/>
+      <w:r>
+        <w:rPr>
+          <w:rFonts w:ascii="Consolas" w:eastAsia="Times New Roman" w:hAnsi="Consolas" w:cs="Times New Roman"/>
+          <w:color w:val="D4D4D4"/>
+          <w:sz w:val="18"/>
+          <w:szCs w:val="21"/>
+          <w:lang w:val="en-IN" w:eastAsia="it-IT"/>
+        </w:rPr>
+        <w:t>[</w:t>
+      </w:r>
+      <w:r>
+        <w:rPr>
+          <w:rFonts w:ascii="Consolas" w:eastAsia="Times New Roman" w:hAnsi="Consolas" w:cs="Times New Roman"/>
+          <w:color w:val="CE9178"/>
+          <w:sz w:val="18"/>
+          <w:szCs w:val="21"/>
+          <w:lang w:val="en-IN" w:eastAsia="it-IT"/>
+        </w:rPr>
+        <w:t>'</w:t>
+      </w:r>
+      <w:proofErr w:type="spellStart"/>
+      <w:r>
+        <w:rPr>
+          <w:rFonts w:ascii="Consolas" w:eastAsia="Times New Roman" w:hAnsi="Consolas" w:cs="Times New Roman"/>
+          <w:color w:val="CE9178"/>
+          <w:sz w:val="18"/>
+          <w:szCs w:val="21"/>
+          <w:lang w:val="en-IN" w:eastAsia="it-IT"/>
+        </w:rPr>
+        <w:t>netrevenue</w:t>
+      </w:r>
+      <w:proofErr w:type="spellEnd"/>
+      <w:r>
+        <w:rPr>
+          <w:rFonts w:ascii="Consolas" w:eastAsia="Times New Roman" w:hAnsi="Consolas" w:cs="Times New Roman"/>
+          <w:color w:val="CE9178"/>
+          <w:sz w:val="18"/>
+          <w:szCs w:val="21"/>
+          <w:lang w:val="en-IN" w:eastAsia="it-IT"/>
+        </w:rPr>
+        <w:t>'</w:t>
+      </w:r>
+      <w:r>
+        <w:rPr>
+          <w:rFonts w:ascii="Consolas" w:eastAsia="Times New Roman" w:hAnsi="Consolas" w:cs="Times New Roman"/>
+          <w:color w:val="D4D4D4"/>
+          <w:sz w:val="18"/>
+          <w:szCs w:val="21"/>
+          <w:lang w:val="en-IN" w:eastAsia="it-IT"/>
+        </w:rPr>
+        <w:t>].</w:t>
+      </w:r>
+      <w:r>
+        <w:rPr>
+          <w:rFonts w:ascii="Consolas" w:eastAsia="Times New Roman" w:hAnsi="Consolas" w:cs="Times New Roman"/>
+          <w:color w:val="DCDCAA"/>
+          <w:sz w:val="18"/>
+          <w:szCs w:val="21"/>
+          <w:lang w:val="en-IN" w:eastAsia="it-IT"/>
+        </w:rPr>
+        <w:t>sum</w:t>
+      </w:r>
+      <w:r>
+        <w:rPr>
+          <w:rFonts w:ascii="Consolas" w:eastAsia="Times New Roman" w:hAnsi="Consolas" w:cs="Times New Roman"/>
+          <w:color w:val="D4D4D4"/>
+          <w:sz w:val="18"/>
+          <w:szCs w:val="21"/>
+          <w:lang w:val="en-IN" w:eastAsia="it-IT"/>
+        </w:rPr>
+        <w:t xml:space="preserve">() * </w:t>
+      </w:r>
+      <w:r>
+        <w:rPr>
+          <w:rFonts w:ascii="Consolas" w:eastAsia="Times New Roman" w:hAnsi="Consolas" w:cs="Times New Roman"/>
+          <w:color w:val="B5CEA8"/>
+          <w:sz w:val="18"/>
+          <w:szCs w:val="21"/>
+          <w:lang w:val="en-IN" w:eastAsia="it-IT"/>
+        </w:rPr>
+        <w:t>100</w:t>
+      </w:r>
+    </w:p>
+    <w:p>
+      <w:pPr>
+        <w:shd w:val="clear" w:color="auto" w:fill="1E1E1E"/>
+        <w:spacing w:before="0" w:after="0" w:line="240" w:lineRule="auto"/>
+        <w:rPr>
+          <w:rFonts w:ascii="Consolas" w:eastAsia="Times New Roman" w:hAnsi="Consolas" w:cs="Times New Roman"/>
+          <w:color w:val="B5CEA8"/>
+          <w:sz w:val="18"/>
+          <w:szCs w:val="21"/>
+          <w:lang w:val="en-IN" w:eastAsia="it-IT"/>
+        </w:rPr>
+      </w:pPr>
+      <w:proofErr w:type="spellStart"/>
+      <w:r>
+        <w:rPr>
+          <w:rFonts w:ascii="Consolas" w:eastAsia="Times New Roman" w:hAnsi="Consolas" w:cs="Times New Roman"/>
+          <w:color w:val="9CDCFE"/>
+          <w:sz w:val="18"/>
+          <w:szCs w:val="21"/>
+          <w:lang w:val="en-IN" w:eastAsia="it-IT"/>
+        </w:rPr>
+        <w:t>revenue_per_cust</w:t>
+      </w:r>
+      <w:proofErr w:type="spellEnd"/>
+      <w:r>
+        <w:rPr>
+          <w:rFonts w:ascii="Consolas" w:eastAsia="Times New Roman" w:hAnsi="Consolas" w:cs="Times New Roman"/>
+          <w:color w:val="D4D4D4"/>
+          <w:sz w:val="18"/>
+          <w:szCs w:val="21"/>
+          <w:lang w:val="en-IN" w:eastAsia="it-IT"/>
+        </w:rPr>
+        <w:t>[</w:t>
+      </w:r>
+      <w:r>
+        <w:rPr>
+          <w:rFonts w:ascii="Consolas" w:eastAsia="Times New Roman" w:hAnsi="Consolas" w:cs="Times New Roman"/>
+          <w:color w:val="CE9178"/>
+          <w:sz w:val="18"/>
+          <w:szCs w:val="21"/>
+          <w:lang w:val="en-IN" w:eastAsia="it-IT"/>
+        </w:rPr>
+        <w:t>'</w:t>
+      </w:r>
+      <w:proofErr w:type="spellStart"/>
+      <w:r>
+        <w:rPr>
+          <w:rFonts w:ascii="Consolas" w:eastAsia="Times New Roman" w:hAnsi="Consolas" w:cs="Times New Roman"/>
+          <w:color w:val="CE9178"/>
+          <w:sz w:val="18"/>
+          <w:szCs w:val="21"/>
+          <w:lang w:val="en-IN" w:eastAsia="it-IT"/>
+        </w:rPr>
+        <w:t>cust_pct</w:t>
+      </w:r>
+      <w:proofErr w:type="spellEnd"/>
+      <w:r>
+        <w:rPr>
+          <w:rFonts w:ascii="Consolas" w:eastAsia="Times New Roman" w:hAnsi="Consolas" w:cs="Times New Roman"/>
+          <w:color w:val="CE9178"/>
+          <w:sz w:val="18"/>
+          <w:szCs w:val="21"/>
+          <w:lang w:val="en-IN" w:eastAsia="it-IT"/>
+        </w:rPr>
+        <w:t>'</w:t>
+      </w:r>
+      <w:r>
+        <w:rPr>
+          <w:rFonts w:ascii="Consolas" w:eastAsia="Times New Roman" w:hAnsi="Consolas" w:cs="Times New Roman"/>
+          <w:color w:val="D4D4D4"/>
+          <w:sz w:val="18"/>
+          <w:szCs w:val="21"/>
+          <w:lang w:val="en-IN" w:eastAsia="it-IT"/>
+        </w:rPr>
+        <w:t>] = (</w:t>
+      </w:r>
+      <w:proofErr w:type="spellStart"/>
+      <w:r>
+        <w:rPr>
+          <w:rFonts w:ascii="Consolas" w:eastAsia="Times New Roman" w:hAnsi="Consolas" w:cs="Times New Roman"/>
+          <w:color w:val="9CDCFE"/>
+          <w:sz w:val="18"/>
+          <w:szCs w:val="21"/>
+          <w:lang w:val="en-IN" w:eastAsia="it-IT"/>
+        </w:rPr>
+        <w:t>revenue_per_</w:t>
+      </w:r>
+      <w:proofErr w:type="gramStart"/>
+      <w:r>
+        <w:rPr>
+          <w:rFonts w:ascii="Consolas" w:eastAsia="Times New Roman" w:hAnsi="Consolas" w:cs="Times New Roman"/>
+          <w:color w:val="9CDCFE"/>
+          <w:sz w:val="18"/>
+          <w:szCs w:val="21"/>
+          <w:lang w:val="en-IN" w:eastAsia="it-IT"/>
+        </w:rPr>
+        <w:t>cust</w:t>
+      </w:r>
+      <w:r>
+        <w:rPr>
+          <w:rFonts w:ascii="Consolas" w:eastAsia="Times New Roman" w:hAnsi="Consolas" w:cs="Times New Roman"/>
+          <w:color w:val="D4D4D4"/>
+          <w:sz w:val="18"/>
+          <w:szCs w:val="21"/>
+          <w:lang w:val="en-IN" w:eastAsia="it-IT"/>
+        </w:rPr>
+        <w:t>.</w:t>
+      </w:r>
+      <w:r>
+        <w:rPr>
+          <w:rFonts w:ascii="Consolas" w:eastAsia="Times New Roman" w:hAnsi="Consolas" w:cs="Times New Roman"/>
+          <w:color w:val="9CDCFE"/>
+          <w:sz w:val="18"/>
+          <w:szCs w:val="21"/>
+          <w:lang w:val="en-IN" w:eastAsia="it-IT"/>
+        </w:rPr>
+        <w:t>index</w:t>
+      </w:r>
+      <w:proofErr w:type="spellEnd"/>
+      <w:proofErr w:type="gramEnd"/>
+      <w:r>
+        <w:rPr>
+          <w:rFonts w:ascii="Consolas" w:eastAsia="Times New Roman" w:hAnsi="Consolas" w:cs="Times New Roman"/>
+          <w:color w:val="D4D4D4"/>
+          <w:sz w:val="18"/>
+          <w:szCs w:val="21"/>
+          <w:lang w:val="en-IN" w:eastAsia="it-IT"/>
+        </w:rPr>
+        <w:t xml:space="preserve"> </w:t>
+      </w:r>
+      <w:r>
+        <w:rPr>
+          <w:rFonts w:ascii="Consolas" w:eastAsia="Times New Roman" w:hAnsi="Consolas" w:cs="Times New Roman"/>
+          <w:color w:val="DCDCAA"/>
+          <w:sz w:val="18"/>
+          <w:szCs w:val="21"/>
+          <w:lang w:val="en-IN" w:eastAsia="it-IT"/>
+        </w:rPr>
+        <w:t>+</w:t>
+      </w:r>
+      <w:r>
+        <w:rPr>
+          <w:rFonts w:ascii="Consolas" w:eastAsia="Times New Roman" w:hAnsi="Consolas" w:cs="Times New Roman"/>
+          <w:color w:val="D4D4D4"/>
+          <w:sz w:val="18"/>
+          <w:szCs w:val="21"/>
+          <w:lang w:val="en-IN" w:eastAsia="it-IT"/>
+        </w:rPr>
+        <w:t xml:space="preserve"> </w:t>
+      </w:r>
+      <w:r>
+        <w:rPr>
+          <w:rFonts w:ascii="Consolas" w:eastAsia="Times New Roman" w:hAnsi="Consolas" w:cs="Times New Roman"/>
+          <w:color w:val="B5CEA8"/>
+          <w:sz w:val="18"/>
+          <w:szCs w:val="21"/>
+          <w:lang w:val="en-IN" w:eastAsia="it-IT"/>
+        </w:rPr>
+        <w:t>1</w:t>
+      </w:r>
+      <w:r>
+        <w:rPr>
+          <w:rFonts w:ascii="Consolas" w:eastAsia="Times New Roman" w:hAnsi="Consolas" w:cs="Times New Roman"/>
+          <w:color w:val="D4D4D4"/>
+          <w:sz w:val="18"/>
+          <w:szCs w:val="21"/>
+          <w:lang w:val="en-IN" w:eastAsia="it-IT"/>
+        </w:rPr>
+        <w:t xml:space="preserve">) </w:t>
+      </w:r>
+      <w:r>
+        <w:rPr>
+          <w:rFonts w:ascii="Consolas" w:eastAsia="Times New Roman" w:hAnsi="Consolas" w:cs="Times New Roman"/>
+          <w:color w:val="DCDCAA"/>
+          <w:sz w:val="18"/>
+          <w:szCs w:val="21"/>
+          <w:lang w:val="en-IN" w:eastAsia="it-IT"/>
+        </w:rPr>
+        <w:t>/</w:t>
+      </w:r>
+      <w:r>
+        <w:rPr>
+          <w:rFonts w:ascii="Consolas" w:eastAsia="Times New Roman" w:hAnsi="Consolas" w:cs="Times New Roman"/>
+          <w:color w:val="D4D4D4"/>
+          <w:sz w:val="18"/>
+          <w:szCs w:val="21"/>
+          <w:lang w:val="en-IN" w:eastAsia="it-IT"/>
+        </w:rPr>
+        <w:t xml:space="preserve"> </w:t>
+      </w:r>
+      <w:proofErr w:type="spellStart"/>
+      <w:r>
+        <w:rPr>
+          <w:rFonts w:ascii="Consolas" w:eastAsia="Times New Roman" w:hAnsi="Consolas" w:cs="Times New Roman"/>
+          <w:color w:val="DCDCAA"/>
+          <w:sz w:val="18"/>
+          <w:szCs w:val="21"/>
+          <w:lang w:val="en-IN" w:eastAsia="it-IT"/>
+        </w:rPr>
+        <w:t>len</w:t>
+      </w:r>
+      <w:proofErr w:type="spellEnd"/>
+      <w:r>
+        <w:rPr>
+          <w:rFonts w:ascii="Consolas" w:eastAsia="Times New Roman" w:hAnsi="Consolas" w:cs="Times New Roman"/>
+          <w:color w:val="D4D4D4"/>
+          <w:sz w:val="18"/>
+          <w:szCs w:val="21"/>
+          <w:lang w:val="en-IN" w:eastAsia="it-IT"/>
+        </w:rPr>
+        <w:t>(</w:t>
+      </w:r>
+      <w:proofErr w:type="spellStart"/>
+      <w:r>
+        <w:rPr>
+          <w:rFonts w:ascii="Consolas" w:eastAsia="Times New Roman" w:hAnsi="Consolas" w:cs="Times New Roman"/>
+          <w:color w:val="9CDCFE"/>
+          <w:sz w:val="18"/>
+          <w:szCs w:val="21"/>
+          <w:lang w:val="en-IN" w:eastAsia="it-IT"/>
+        </w:rPr>
+        <w:t>revenue_per_cust</w:t>
+      </w:r>
+      <w:proofErr w:type="spellEnd"/>
+      <w:r>
+        <w:rPr>
+          <w:rFonts w:ascii="Consolas" w:eastAsia="Times New Roman" w:hAnsi="Consolas" w:cs="Times New Roman"/>
+          <w:color w:val="D4D4D4"/>
+          <w:sz w:val="18"/>
+          <w:szCs w:val="21"/>
+          <w:lang w:val="en-IN" w:eastAsia="it-IT"/>
+        </w:rPr>
+        <w:t xml:space="preserve">) </w:t>
+      </w:r>
+      <w:r>
+        <w:rPr>
+          <w:rFonts w:ascii="Consolas" w:eastAsia="Times New Roman" w:hAnsi="Consolas" w:cs="Times New Roman"/>
+          <w:color w:val="DCDCAA"/>
+          <w:sz w:val="18"/>
+          <w:szCs w:val="21"/>
+          <w:lang w:val="en-IN" w:eastAsia="it-IT"/>
+        </w:rPr>
+        <w:t>*</w:t>
+      </w:r>
+      <w:r>
+        <w:rPr>
+          <w:rFonts w:ascii="Consolas" w:eastAsia="Times New Roman" w:hAnsi="Consolas" w:cs="Times New Roman"/>
+          <w:color w:val="D4D4D4"/>
+          <w:sz w:val="18"/>
+          <w:szCs w:val="21"/>
+          <w:lang w:val="en-IN" w:eastAsia="it-IT"/>
+        </w:rPr>
+        <w:t xml:space="preserve"> </w:t>
+      </w:r>
+      <w:r>
+        <w:rPr>
+          <w:rFonts w:ascii="Consolas" w:eastAsia="Times New Roman" w:hAnsi="Consolas" w:cs="Times New Roman"/>
+          <w:color w:val="B5CEA8"/>
+          <w:sz w:val="18"/>
+          <w:szCs w:val="21"/>
+          <w:lang w:val="en-IN" w:eastAsia="it-IT"/>
+        </w:rPr>
+        <w:t>100</w:t>
+      </w:r>
+    </w:p>
+    <w:p>
+      <w:pPr>
+        <w:shd w:val="clear" w:color="auto" w:fill="1E1E1E"/>
+        <w:spacing w:before="0" w:after="0" w:line="240" w:lineRule="auto"/>
+        <w:rPr>
+          <w:rFonts w:ascii="Consolas" w:eastAsia="Times New Roman" w:hAnsi="Consolas" w:cs="Times New Roman"/>
+          <w:color w:val="D4D4D4"/>
+          <w:sz w:val="18"/>
+          <w:szCs w:val="21"/>
+          <w:lang w:val="en-IN" w:eastAsia="it-IT"/>
+        </w:rPr>
+      </w:pPr>
+      <w:r>
+        <w:rPr>
+          <w:rFonts w:ascii="Consolas" w:eastAsia="Times New Roman" w:hAnsi="Consolas" w:cs="Times New Roman"/>
+          <w:color w:val="D4D4D4"/>
+          <w:sz w:val="18"/>
+          <w:szCs w:val="21"/>
+          <w:lang w:val="en-IN" w:eastAsia="it-IT"/>
+        </w:rPr>
+        <w:t>[root/notebooks/</w:t>
+      </w:r>
+      <w:r>
+        <w:rPr>
+          <w:rFonts w:ascii="Consolas" w:eastAsia="Times New Roman" w:hAnsi="Consolas" w:cs="Times New Roman"/>
+          <w:color w:val="D4D4D4"/>
+          <w:sz w:val="18"/>
+          <w:szCs w:val="21"/>
+          <w:lang w:val="en-IN" w:eastAsia="it-IT"/>
+        </w:rPr>
+        <w:t>0</w:t>
+      </w:r>
+      <w:r>
+        <w:rPr>
+          <w:rFonts w:ascii="Consolas" w:eastAsia="Times New Roman" w:hAnsi="Consolas" w:cs="Times New Roman"/>
+          <w:color w:val="D4D4D4"/>
+          <w:sz w:val="18"/>
+          <w:szCs w:val="21"/>
+          <w:lang w:val="en-IN" w:eastAsia="it-IT"/>
+        </w:rPr>
+        <w:t>5_product_affinity_&amp;_</w:t>
+      </w:r>
+      <w:proofErr w:type="gramStart"/>
+      <w:r>
+        <w:rPr>
+          <w:rFonts w:ascii="Consolas" w:eastAsia="Times New Roman" w:hAnsi="Consolas" w:cs="Times New Roman"/>
+          <w:color w:val="D4D4D4"/>
+          <w:sz w:val="18"/>
+          <w:szCs w:val="21"/>
+          <w:lang w:val="en-IN" w:eastAsia="it-IT"/>
+        </w:rPr>
+        <w:t>pricing</w:t>
+      </w:r>
+      <w:r>
+        <w:rPr>
+          <w:rFonts w:ascii="Consolas" w:eastAsia="Times New Roman" w:hAnsi="Consolas" w:cs="Times New Roman"/>
+          <w:color w:val="D4D4D4"/>
+          <w:sz w:val="18"/>
+          <w:szCs w:val="21"/>
+          <w:lang w:val="en-IN" w:eastAsia="it-IT"/>
+        </w:rPr>
+        <w:t>.ipynb</w:t>
+      </w:r>
+      <w:proofErr w:type="gramEnd"/>
+      <w:r>
+        <w:rPr>
+          <w:rFonts w:ascii="Consolas" w:eastAsia="Times New Roman" w:hAnsi="Consolas" w:cs="Times New Roman"/>
+          <w:color w:val="D4D4D4"/>
+          <w:sz w:val="18"/>
+          <w:szCs w:val="21"/>
+          <w:lang w:val="en-IN" w:eastAsia="it-IT"/>
+        </w:rPr>
+        <w:t>]</w:t>
+      </w:r>
+    </w:p>
+    <w:p>
+      <w:pPr>
+        <w:spacing w:beforeAutospacing="1" w:after="100" w:afterAutospacing="1" w:line="240" w:lineRule="auto"/>
+        <w:rPr>
+          <w:rFonts w:ascii="Times New Roman" w:eastAsia="Times New Roman" w:hAnsi="Times New Roman" w:cs="Times New Roman"/>
+          <w:sz w:val="24"/>
+          <w:szCs w:val="24"/>
+          <w:lang w:val="en-IN" w:eastAsia="it-IT"/>
+        </w:rPr>
+      </w:pPr>
+      <w:r>
+        <w:rPr>
+          <w:rFonts w:ascii="Times New Roman" w:eastAsia="Times New Roman" w:hAnsi="Times New Roman" w:cs="Times New Roman"/>
+          <w:noProof/>
+          <w:sz w:val="24"/>
+          <w:szCs w:val="24"/>
+          <w:lang w:val="en-IN" w:eastAsia="it-IT"/>
+        </w:rPr>
+        <w:drawing>
+          <wp:inline distT="0" distB="0" distL="0" distR="0" wp14:anchorId="0DAA166A" wp14:editId="318F76D9">
+            <wp:extent cx="6190957" cy="3991555"/>
+            <wp:effectExtent l="0" t="0" r="635" b="9525"/>
+            <wp:docPr id="49" name="Immagine 49"/>
+            <wp:cNvGraphicFramePr>
+              <a:graphicFrameLocks xmlns:a="http://schemas.openxmlformats.org/drawingml/2006/main" noChangeAspect="1"/>
+            </wp:cNvGraphicFramePr>
+            <a:graphic xmlns:a="http://schemas.openxmlformats.org/drawingml/2006/main">
+              <a:graphicData uri="http://schemas.openxmlformats.org/drawingml/2006/picture">
+                <pic:pic xmlns:pic="http://schemas.openxmlformats.org/drawingml/2006/picture">
+                  <pic:nvPicPr>
+                    <pic:cNvPr id="49" name="pareto.png"/>
+                    <pic:cNvPicPr/>
+                  </pic:nvPicPr>
+                  <pic:blipFill>
+                    <a:blip r:embed="rId24">
+                      <a:extLst>
+                        <a:ext uri="{28A0092B-C50C-407E-A947-70E740481C1C}">
+                          <a14:useLocalDpi xmlns:a14="http://schemas.microsoft.com/office/drawing/2010/main" val="0"/>
+                        </a:ext>
+                      </a:extLst>
+                    </a:blip>
+                    <a:stretch>
+                      <a:fillRect/>
+                    </a:stretch>
+                  </pic:blipFill>
+                  <pic:spPr>
+                    <a:xfrm>
+                      <a:off x="0" y="0"/>
+                      <a:ext cx="6195195" cy="3994287"/>
+                    </a:xfrm>
+                    <a:prstGeom prst="rect">
+                      <a:avLst/>
+                    </a:prstGeom>
+                  </pic:spPr>
+                </pic:pic>
+              </a:graphicData>
+            </a:graphic>
+          </wp:inline>
+        </w:drawing>
+      </w:r>
+    </w:p>
+    <w:p>
+      <w:pPr>
+        <w:spacing w:beforeAutospacing="1" w:after="100" w:afterAutospacing="1"/>
+        <w:jc w:val="both"/>
+        <w:rPr>
+          <w:rFonts w:ascii="Times New Roman" w:eastAsia="Times New Roman" w:hAnsi="Times New Roman" w:cs="Times New Roman"/>
+          <w:sz w:val="24"/>
+          <w:szCs w:val="24"/>
+          <w:lang w:eastAsia="it-IT"/>
+        </w:rPr>
+      </w:pPr>
+      <w:proofErr w:type="spellStart"/>
+      <w:r>
+        <w:rPr>
+          <w:rFonts w:ascii="Times New Roman" w:eastAsia="Times New Roman" w:hAnsi="Times New Roman" w:cs="Times New Roman"/>
+          <w:b/>
+          <w:bCs/>
+          <w:sz w:val="24"/>
+          <w:szCs w:val="24"/>
+          <w:lang w:eastAsia="it-IT"/>
+        </w:rPr>
+        <w:lastRenderedPageBreak/>
+        <w:t>Outcome</w:t>
+      </w:r>
+      <w:proofErr w:type="spellEnd"/>
+      <w:r>
+        <w:rPr>
+          <w:rFonts w:ascii="Times New Roman" w:eastAsia="Times New Roman" w:hAnsi="Times New Roman" w:cs="Times New Roman"/>
+          <w:b/>
+          <w:bCs/>
+          <w:sz w:val="24"/>
+          <w:szCs w:val="24"/>
+          <w:lang w:eastAsia="it-IT"/>
+        </w:rPr>
+        <w:t xml:space="preserve"> of the Plot:</w:t>
+      </w:r>
+    </w:p>
+    <w:p>
+      <w:pPr>
+        <w:numPr>
+          <w:ilvl w:val="0"/>
+          <w:numId w:val="18"/>
+        </w:numPr>
+        <w:spacing w:beforeAutospacing="1" w:after="100" w:afterAutospacing="1"/>
+        <w:jc w:val="both"/>
+        <w:rPr>
+          <w:rFonts w:ascii="Times New Roman" w:eastAsia="Times New Roman" w:hAnsi="Times New Roman" w:cs="Times New Roman"/>
+          <w:sz w:val="24"/>
+          <w:szCs w:val="24"/>
+          <w:lang w:val="en-IN" w:eastAsia="it-IT"/>
+        </w:rPr>
+      </w:pPr>
+      <w:r>
+        <w:rPr>
+          <w:rFonts w:ascii="Times New Roman" w:eastAsia="Times New Roman" w:hAnsi="Times New Roman" w:cs="Times New Roman"/>
+          <w:sz w:val="24"/>
+          <w:szCs w:val="24"/>
+          <w:lang w:val="en-IN" w:eastAsia="it-IT"/>
+        </w:rPr>
+        <w:t xml:space="preserve">The plot confirms a significant concentration of wealth, where approximately </w:t>
+      </w:r>
+      <w:r>
+        <w:rPr>
+          <w:rFonts w:ascii="Times New Roman" w:eastAsia="Times New Roman" w:hAnsi="Times New Roman" w:cs="Times New Roman"/>
+          <w:b/>
+          <w:bCs/>
+          <w:sz w:val="24"/>
+          <w:szCs w:val="24"/>
+          <w:lang w:val="en-IN" w:eastAsia="it-IT"/>
+        </w:rPr>
+        <w:t>20% of customers</w:t>
+      </w:r>
+      <w:r>
+        <w:rPr>
+          <w:rFonts w:ascii="Times New Roman" w:eastAsia="Times New Roman" w:hAnsi="Times New Roman" w:cs="Times New Roman"/>
+          <w:sz w:val="24"/>
+          <w:szCs w:val="24"/>
+          <w:lang w:val="en-IN" w:eastAsia="it-IT"/>
+        </w:rPr>
+        <w:t xml:space="preserve"> contribute to roughly </w:t>
+      </w:r>
+      <w:r>
+        <w:rPr>
+          <w:rFonts w:ascii="Times New Roman" w:eastAsia="Times New Roman" w:hAnsi="Times New Roman" w:cs="Times New Roman"/>
+          <w:b/>
+          <w:bCs/>
+          <w:sz w:val="24"/>
+          <w:szCs w:val="24"/>
+          <w:lang w:val="en-IN" w:eastAsia="it-IT"/>
+        </w:rPr>
+        <w:t>80% of the total net revenue</w:t>
+      </w:r>
+      <w:r>
+        <w:rPr>
+          <w:rFonts w:ascii="Times New Roman" w:eastAsia="Times New Roman" w:hAnsi="Times New Roman" w:cs="Times New Roman"/>
+          <w:sz w:val="24"/>
+          <w:szCs w:val="24"/>
+          <w:lang w:val="en-IN" w:eastAsia="it-IT"/>
+        </w:rPr>
+        <w:t>.</w:t>
+      </w:r>
+    </w:p>
+    <w:p>
+      <w:pPr>
+        <w:numPr>
+          <w:ilvl w:val="0"/>
+          <w:numId w:val="18"/>
+        </w:numPr>
+        <w:spacing w:beforeAutospacing="1" w:after="100" w:afterAutospacing="1"/>
+        <w:jc w:val="both"/>
+        <w:rPr>
+          <w:rFonts w:ascii="Times New Roman" w:eastAsia="Times New Roman" w:hAnsi="Times New Roman" w:cs="Times New Roman"/>
+          <w:sz w:val="24"/>
+          <w:szCs w:val="24"/>
+          <w:lang w:val="en-IN" w:eastAsia="it-IT"/>
+        </w:rPr>
+      </w:pPr>
+      <w:r>
+        <w:rPr>
+          <w:rFonts w:ascii="Times New Roman" w:eastAsia="Times New Roman" w:hAnsi="Times New Roman" w:cs="Times New Roman"/>
+          <w:sz w:val="24"/>
+          <w:szCs w:val="24"/>
+          <w:lang w:val="en-IN" w:eastAsia="it-IT"/>
+        </w:rPr>
+        <w:t>The steep initial curve indicates that the top-tier accounts are critical to business stability; a minor churn in this segment would result in a disproportionate loss of income.</w:t>
+      </w:r>
+    </w:p>
+    <w:p>
+      <w:pPr>
+        <w:numPr>
+          <w:ilvl w:val="0"/>
+          <w:numId w:val="18"/>
+        </w:numPr>
+        <w:spacing w:beforeAutospacing="1" w:after="100" w:afterAutospacing="1"/>
+        <w:jc w:val="both"/>
+        <w:rPr>
+          <w:rFonts w:ascii="Times New Roman" w:eastAsia="Times New Roman" w:hAnsi="Times New Roman" w:cs="Times New Roman"/>
+          <w:sz w:val="24"/>
+          <w:szCs w:val="24"/>
+          <w:lang w:val="en-IN" w:eastAsia="it-IT"/>
+        </w:rPr>
+      </w:pPr>
+      <w:r>
+        <w:rPr>
+          <w:rFonts w:ascii="Times New Roman" w:eastAsia="Times New Roman" w:hAnsi="Times New Roman" w:cs="Times New Roman"/>
+          <w:sz w:val="24"/>
+          <w:szCs w:val="24"/>
+          <w:lang w:val="en-IN" w:eastAsia="it-IT"/>
+        </w:rPr>
+        <w:t>The "long tail" of the graph represents a high volume of lower-value customers who contribute marginally to the bottom line, suggesting an opportunity to shift marketing focus toward the high-conversion segments identified in the price elasticity analysis.</w:t>
+      </w:r>
+    </w:p>
+    <w:p>
+      <w:pPr>
+        <w:pStyle w:val="Titolo2"/>
+        <w:rPr>
+          <w:rFonts w:ascii="Times New Roman" w:eastAsia="Times New Roman" w:hAnsi="Times New Roman" w:cs="Times New Roman"/>
+          <w:b/>
+          <w:sz w:val="24"/>
+          <w:szCs w:val="24"/>
+          <w:lang w:val="en-IN" w:eastAsia="it-IT"/>
+        </w:rPr>
+      </w:pPr>
+      <w:r>
+        <w:rPr>
+          <w:b/>
+          <w:lang w:val="en-IN"/>
+        </w:rPr>
+        <w:t xml:space="preserve">6.2 </w:t>
+      </w:r>
+      <w:r>
+        <w:rPr>
+          <w:b/>
+          <w:lang w:val="en-IN"/>
+        </w:rPr>
+        <w:t>Category Affinity Analysis</w:t>
+      </w:r>
+    </w:p>
+    <w:p>
+      <w:pPr>
+        <w:spacing w:beforeAutospacing="1" w:after="100" w:afterAutospacing="1"/>
+        <w:jc w:val="both"/>
+        <w:rPr>
+          <w:rFonts w:ascii="Times New Roman" w:eastAsia="Times New Roman" w:hAnsi="Times New Roman" w:cs="Times New Roman"/>
+          <w:sz w:val="24"/>
+          <w:szCs w:val="24"/>
+          <w:lang w:val="en-IN" w:eastAsia="it-IT"/>
+        </w:rPr>
+      </w:pPr>
+      <w:r>
+        <w:rPr>
+          <w:rFonts w:ascii="Times New Roman" w:eastAsia="Times New Roman" w:hAnsi="Times New Roman" w:cs="Times New Roman"/>
+          <w:sz w:val="24"/>
+          <w:szCs w:val="24"/>
+          <w:lang w:val="en-IN" w:eastAsia="it-IT"/>
+        </w:rPr>
+        <w:t xml:space="preserve">The heatmap uses a </w:t>
+      </w:r>
+      <w:proofErr w:type="spellStart"/>
+      <w:r>
+        <w:rPr>
+          <w:rFonts w:ascii="Times New Roman" w:eastAsia="Times New Roman" w:hAnsi="Times New Roman" w:cs="Times New Roman"/>
+          <w:sz w:val="24"/>
+          <w:szCs w:val="24"/>
+          <w:lang w:val="en-IN" w:eastAsia="it-IT"/>
+        </w:rPr>
+        <w:t>color</w:t>
+      </w:r>
+      <w:proofErr w:type="spellEnd"/>
+      <w:r>
+        <w:rPr>
+          <w:rFonts w:ascii="Times New Roman" w:eastAsia="Times New Roman" w:hAnsi="Times New Roman" w:cs="Times New Roman"/>
+          <w:sz w:val="24"/>
+          <w:szCs w:val="24"/>
+          <w:lang w:val="en-IN" w:eastAsia="it-IT"/>
+        </w:rPr>
+        <w:t xml:space="preserve"> scale (typically Red-to-Blue) to represent the </w:t>
+      </w:r>
+      <w:r>
+        <w:rPr>
+          <w:rFonts w:ascii="Times New Roman" w:eastAsia="Times New Roman" w:hAnsi="Times New Roman" w:cs="Times New Roman"/>
+          <w:b/>
+          <w:bCs/>
+          <w:sz w:val="24"/>
+          <w:szCs w:val="24"/>
+          <w:lang w:val="en-IN" w:eastAsia="it-IT"/>
+        </w:rPr>
+        <w:t>Pearson Correlation Coefficient</w:t>
+      </w:r>
+      <w:r>
+        <w:rPr>
+          <w:rFonts w:ascii="Times New Roman" w:eastAsia="Times New Roman" w:hAnsi="Times New Roman" w:cs="Times New Roman"/>
+          <w:sz w:val="24"/>
+          <w:szCs w:val="24"/>
+          <w:lang w:val="en-IN" w:eastAsia="it-IT"/>
+        </w:rPr>
+        <w:t xml:space="preserve"> between different product categories:</w:t>
+      </w:r>
+    </w:p>
+    <w:p>
+      <w:pPr>
+        <w:numPr>
+          <w:ilvl w:val="0"/>
+          <w:numId w:val="19"/>
+        </w:numPr>
+        <w:spacing w:beforeAutospacing="1" w:after="100" w:afterAutospacing="1"/>
+        <w:jc w:val="both"/>
+        <w:rPr>
+          <w:rFonts w:ascii="Times New Roman" w:eastAsia="Times New Roman" w:hAnsi="Times New Roman" w:cs="Times New Roman"/>
+          <w:sz w:val="24"/>
+          <w:szCs w:val="24"/>
+          <w:lang w:val="en-IN" w:eastAsia="it-IT"/>
+        </w:rPr>
+      </w:pPr>
+      <w:r>
+        <w:rPr>
+          <w:rFonts w:ascii="Times New Roman" w:eastAsia="Times New Roman" w:hAnsi="Times New Roman" w:cs="Times New Roman"/>
+          <w:b/>
+          <w:bCs/>
+          <w:sz w:val="24"/>
+          <w:szCs w:val="24"/>
+          <w:lang w:val="en-IN" w:eastAsia="it-IT"/>
+        </w:rPr>
+        <w:t>The Diagonal Line</w:t>
+      </w:r>
+      <w:r>
+        <w:rPr>
+          <w:rFonts w:ascii="Times New Roman" w:eastAsia="Times New Roman" w:hAnsi="Times New Roman" w:cs="Times New Roman"/>
+          <w:sz w:val="24"/>
+          <w:szCs w:val="24"/>
+          <w:lang w:val="en-IN" w:eastAsia="it-IT"/>
+        </w:rPr>
+        <w:t xml:space="preserve">: You will notice a consistent line of </w:t>
+      </w:r>
+      <w:r>
+        <w:rPr>
+          <w:rFonts w:ascii="Times New Roman" w:eastAsia="Times New Roman" w:hAnsi="Times New Roman" w:cs="Times New Roman"/>
+          <w:b/>
+          <w:bCs/>
+          <w:sz w:val="24"/>
+          <w:szCs w:val="24"/>
+          <w:lang w:val="en-IN" w:eastAsia="it-IT"/>
+        </w:rPr>
+        <w:t>1.00</w:t>
+      </w:r>
+      <w:r>
+        <w:rPr>
+          <w:rFonts w:ascii="Times New Roman" w:eastAsia="Times New Roman" w:hAnsi="Times New Roman" w:cs="Times New Roman"/>
+          <w:sz w:val="24"/>
+          <w:szCs w:val="24"/>
+          <w:lang w:val="en-IN" w:eastAsia="it-IT"/>
+        </w:rPr>
+        <w:t xml:space="preserve"> running diagonally from the top-left to the bottom-right. This signifies a perfect correlation because it compares a category to itself.</w:t>
+      </w:r>
+    </w:p>
+    <w:p>
+      <w:pPr>
+        <w:numPr>
+          <w:ilvl w:val="0"/>
+          <w:numId w:val="19"/>
+        </w:numPr>
+        <w:spacing w:beforeAutospacing="1" w:after="100" w:afterAutospacing="1"/>
+        <w:jc w:val="both"/>
+        <w:rPr>
+          <w:rFonts w:ascii="Times New Roman" w:eastAsia="Times New Roman" w:hAnsi="Times New Roman" w:cs="Times New Roman"/>
+          <w:sz w:val="24"/>
+          <w:szCs w:val="24"/>
+          <w:lang w:val="en-IN" w:eastAsia="it-IT"/>
+        </w:rPr>
+      </w:pPr>
+      <w:r>
+        <w:rPr>
+          <w:rFonts w:ascii="Times New Roman" w:eastAsia="Times New Roman" w:hAnsi="Times New Roman" w:cs="Times New Roman"/>
+          <w:b/>
+          <w:bCs/>
+          <w:sz w:val="24"/>
+          <w:szCs w:val="24"/>
+          <w:lang w:val="en-IN" w:eastAsia="it-IT"/>
+        </w:rPr>
+        <w:t>Positive Values (Closer to 1)</w:t>
+      </w:r>
+      <w:r>
+        <w:rPr>
+          <w:rFonts w:ascii="Times New Roman" w:eastAsia="Times New Roman" w:hAnsi="Times New Roman" w:cs="Times New Roman"/>
+          <w:sz w:val="24"/>
+          <w:szCs w:val="24"/>
+          <w:lang w:val="en-IN" w:eastAsia="it-IT"/>
+        </w:rPr>
+        <w:t xml:space="preserve">: Cells with higher positive numbers and distinct </w:t>
+      </w:r>
+      <w:proofErr w:type="spellStart"/>
+      <w:r>
+        <w:rPr>
+          <w:rFonts w:ascii="Times New Roman" w:eastAsia="Times New Roman" w:hAnsi="Times New Roman" w:cs="Times New Roman"/>
+          <w:sz w:val="24"/>
+          <w:szCs w:val="24"/>
+          <w:lang w:val="en-IN" w:eastAsia="it-IT"/>
+        </w:rPr>
+        <w:t>coloring</w:t>
+      </w:r>
+      <w:proofErr w:type="spellEnd"/>
+      <w:r>
+        <w:rPr>
+          <w:rFonts w:ascii="Times New Roman" w:eastAsia="Times New Roman" w:hAnsi="Times New Roman" w:cs="Times New Roman"/>
+          <w:sz w:val="24"/>
+          <w:szCs w:val="24"/>
+          <w:lang w:val="en-IN" w:eastAsia="it-IT"/>
+        </w:rPr>
+        <w:t xml:space="preserve"> indicate categories that have a strong "affinity". When a customer requests a sample from one of these categories, they are statistically very likely to request the other.</w:t>
+      </w:r>
+    </w:p>
+    <w:p>
+      <w:pPr>
+        <w:numPr>
+          <w:ilvl w:val="0"/>
+          <w:numId w:val="19"/>
+        </w:numPr>
+        <w:spacing w:beforeAutospacing="1" w:after="100" w:afterAutospacing="1"/>
+        <w:jc w:val="both"/>
+        <w:rPr>
+          <w:rFonts w:ascii="Times New Roman" w:eastAsia="Times New Roman" w:hAnsi="Times New Roman" w:cs="Times New Roman"/>
+          <w:sz w:val="24"/>
+          <w:szCs w:val="24"/>
+          <w:lang w:val="en-IN" w:eastAsia="it-IT"/>
+        </w:rPr>
+      </w:pPr>
+      <w:r>
+        <w:rPr>
+          <w:rFonts w:ascii="Times New Roman" w:eastAsia="Times New Roman" w:hAnsi="Times New Roman" w:cs="Times New Roman"/>
+          <w:b/>
+          <w:bCs/>
+          <w:sz w:val="24"/>
+          <w:szCs w:val="24"/>
+          <w:lang w:val="en-IN" w:eastAsia="it-IT"/>
+        </w:rPr>
+        <w:t>Negative or Zero Values</w:t>
+      </w:r>
+      <w:r>
+        <w:rPr>
+          <w:rFonts w:ascii="Times New Roman" w:eastAsia="Times New Roman" w:hAnsi="Times New Roman" w:cs="Times New Roman"/>
+          <w:sz w:val="24"/>
+          <w:szCs w:val="24"/>
+          <w:lang w:val="en-IN" w:eastAsia="it-IT"/>
+        </w:rPr>
+        <w:t>: These indicate that categories are rarely sampled together, suggesting they belong to different design interests or distinct customer needs.</w:t>
+      </w:r>
+    </w:p>
+    <w:p>
+      <w:pPr>
+        <w:pStyle w:val="Paragrafoelenco"/>
+        <w:numPr>
+          <w:ilvl w:val="0"/>
+          <w:numId w:val="19"/>
+        </w:numPr>
+        <w:shd w:val="clear" w:color="auto" w:fill="1E1E1E"/>
+        <w:spacing w:before="0" w:after="0" w:line="240" w:lineRule="auto"/>
+        <w:rPr>
+          <w:rFonts w:ascii="Consolas" w:eastAsia="Times New Roman" w:hAnsi="Consolas" w:cs="Times New Roman"/>
+          <w:color w:val="D4D4D4"/>
+          <w:sz w:val="18"/>
+          <w:szCs w:val="21"/>
+          <w:lang w:val="en-IN" w:eastAsia="it-IT"/>
+        </w:rPr>
+      </w:pPr>
+      <w:r>
+        <w:rPr>
+          <w:rFonts w:ascii="Consolas" w:eastAsia="Times New Roman" w:hAnsi="Consolas" w:cs="Times New Roman"/>
+          <w:color w:val="9CDCFE"/>
+          <w:sz w:val="18"/>
+          <w:szCs w:val="21"/>
+          <w:lang w:val="en-IN" w:eastAsia="it-IT"/>
+        </w:rPr>
+        <w:t>basket</w:t>
+      </w:r>
+      <w:r>
+        <w:rPr>
+          <w:rFonts w:ascii="Consolas" w:eastAsia="Times New Roman" w:hAnsi="Consolas" w:cs="Times New Roman"/>
+          <w:color w:val="D4D4D4"/>
+          <w:sz w:val="18"/>
+          <w:szCs w:val="21"/>
+          <w:lang w:val="en-IN" w:eastAsia="it-IT"/>
+        </w:rPr>
+        <w:t xml:space="preserve"> = </w:t>
+      </w:r>
+      <w:proofErr w:type="spellStart"/>
+      <w:r>
+        <w:rPr>
+          <w:rFonts w:ascii="Consolas" w:eastAsia="Times New Roman" w:hAnsi="Consolas" w:cs="Times New Roman"/>
+          <w:color w:val="9CDCFE"/>
+          <w:sz w:val="18"/>
+          <w:szCs w:val="21"/>
+          <w:lang w:val="en-IN" w:eastAsia="it-IT"/>
+        </w:rPr>
+        <w:t>df_master</w:t>
+      </w:r>
+      <w:proofErr w:type="spellEnd"/>
+      <w:r>
+        <w:rPr>
+          <w:rFonts w:ascii="Consolas" w:eastAsia="Times New Roman" w:hAnsi="Consolas" w:cs="Times New Roman"/>
+          <w:color w:val="D4D4D4"/>
+          <w:sz w:val="18"/>
+          <w:szCs w:val="21"/>
+          <w:lang w:val="en-IN" w:eastAsia="it-IT"/>
+        </w:rPr>
+        <w:t>[</w:t>
+      </w:r>
+      <w:proofErr w:type="spellStart"/>
+      <w:r>
+        <w:rPr>
+          <w:rFonts w:ascii="Consolas" w:eastAsia="Times New Roman" w:hAnsi="Consolas" w:cs="Times New Roman"/>
+          <w:color w:val="9CDCFE"/>
+          <w:sz w:val="18"/>
+          <w:szCs w:val="21"/>
+          <w:lang w:val="en-IN" w:eastAsia="it-IT"/>
+        </w:rPr>
+        <w:t>df_master</w:t>
+      </w:r>
+      <w:proofErr w:type="spellEnd"/>
+      <w:r>
+        <w:rPr>
+          <w:rFonts w:ascii="Consolas" w:eastAsia="Times New Roman" w:hAnsi="Consolas" w:cs="Times New Roman"/>
+          <w:color w:val="D4D4D4"/>
+          <w:sz w:val="18"/>
+          <w:szCs w:val="21"/>
+          <w:lang w:val="en-IN" w:eastAsia="it-IT"/>
+        </w:rPr>
+        <w:t>[</w:t>
+      </w:r>
+      <w:r>
+        <w:rPr>
+          <w:rFonts w:ascii="Consolas" w:eastAsia="Times New Roman" w:hAnsi="Consolas" w:cs="Times New Roman"/>
+          <w:color w:val="CE9178"/>
+          <w:sz w:val="18"/>
+          <w:szCs w:val="21"/>
+          <w:lang w:val="en-IN" w:eastAsia="it-IT"/>
+        </w:rPr>
+        <w:t>'type'</w:t>
+      </w:r>
+      <w:r>
+        <w:rPr>
+          <w:rFonts w:ascii="Consolas" w:eastAsia="Times New Roman" w:hAnsi="Consolas" w:cs="Times New Roman"/>
+          <w:color w:val="D4D4D4"/>
+          <w:sz w:val="18"/>
+          <w:szCs w:val="21"/>
+          <w:lang w:val="en-IN" w:eastAsia="it-IT"/>
+        </w:rPr>
+        <w:t xml:space="preserve">] </w:t>
+      </w:r>
+      <w:r>
+        <w:rPr>
+          <w:rFonts w:ascii="Consolas" w:eastAsia="Times New Roman" w:hAnsi="Consolas" w:cs="Times New Roman"/>
+          <w:color w:val="DCDCAA"/>
+          <w:sz w:val="18"/>
+          <w:szCs w:val="21"/>
+          <w:lang w:val="en-IN" w:eastAsia="it-IT"/>
+        </w:rPr>
+        <w:t>==</w:t>
+      </w:r>
+      <w:r>
+        <w:rPr>
+          <w:rFonts w:ascii="Consolas" w:eastAsia="Times New Roman" w:hAnsi="Consolas" w:cs="Times New Roman"/>
+          <w:color w:val="D4D4D4"/>
+          <w:sz w:val="18"/>
+          <w:szCs w:val="21"/>
+          <w:lang w:val="en-IN" w:eastAsia="it-IT"/>
+        </w:rPr>
+        <w:t xml:space="preserve"> </w:t>
+      </w:r>
+      <w:r>
+        <w:rPr>
+          <w:rFonts w:ascii="Consolas" w:eastAsia="Times New Roman" w:hAnsi="Consolas" w:cs="Times New Roman"/>
+          <w:color w:val="CE9178"/>
+          <w:sz w:val="18"/>
+          <w:szCs w:val="21"/>
+          <w:lang w:val="en-IN" w:eastAsia="it-IT"/>
+        </w:rPr>
+        <w:t>'SAMPLE'</w:t>
+      </w:r>
+      <w:proofErr w:type="gramStart"/>
+      <w:r>
+        <w:rPr>
+          <w:rFonts w:ascii="Consolas" w:eastAsia="Times New Roman" w:hAnsi="Consolas" w:cs="Times New Roman"/>
+          <w:color w:val="D4D4D4"/>
+          <w:sz w:val="18"/>
+          <w:szCs w:val="21"/>
+          <w:lang w:val="en-IN" w:eastAsia="it-IT"/>
+        </w:rPr>
+        <w:t>].</w:t>
+      </w:r>
+      <w:proofErr w:type="spellStart"/>
+      <w:r>
+        <w:rPr>
+          <w:rFonts w:ascii="Consolas" w:eastAsia="Times New Roman" w:hAnsi="Consolas" w:cs="Times New Roman"/>
+          <w:color w:val="DCDCAA"/>
+          <w:sz w:val="18"/>
+          <w:szCs w:val="21"/>
+          <w:lang w:val="en-IN" w:eastAsia="it-IT"/>
+        </w:rPr>
+        <w:t>groupby</w:t>
+      </w:r>
+      <w:proofErr w:type="spellEnd"/>
+      <w:proofErr w:type="gramEnd"/>
+      <w:r>
+        <w:rPr>
+          <w:rFonts w:ascii="Consolas" w:eastAsia="Times New Roman" w:hAnsi="Consolas" w:cs="Times New Roman"/>
+          <w:color w:val="D4D4D4"/>
+          <w:sz w:val="18"/>
+          <w:szCs w:val="21"/>
+          <w:lang w:val="en-IN" w:eastAsia="it-IT"/>
+        </w:rPr>
+        <w:t>([</w:t>
+      </w:r>
+      <w:r>
+        <w:rPr>
+          <w:rFonts w:ascii="Consolas" w:eastAsia="Times New Roman" w:hAnsi="Consolas" w:cs="Times New Roman"/>
+          <w:color w:val="CE9178"/>
+          <w:sz w:val="18"/>
+          <w:szCs w:val="21"/>
+          <w:lang w:val="en-IN" w:eastAsia="it-IT"/>
+        </w:rPr>
+        <w:t>'</w:t>
+      </w:r>
+      <w:proofErr w:type="spellStart"/>
+      <w:r>
+        <w:rPr>
+          <w:rFonts w:ascii="Consolas" w:eastAsia="Times New Roman" w:hAnsi="Consolas" w:cs="Times New Roman"/>
+          <w:color w:val="CE9178"/>
+          <w:sz w:val="18"/>
+          <w:szCs w:val="21"/>
+          <w:lang w:val="en-IN" w:eastAsia="it-IT"/>
+        </w:rPr>
+        <w:t>order_id</w:t>
+      </w:r>
+      <w:proofErr w:type="spellEnd"/>
+      <w:r>
+        <w:rPr>
+          <w:rFonts w:ascii="Consolas" w:eastAsia="Times New Roman" w:hAnsi="Consolas" w:cs="Times New Roman"/>
+          <w:color w:val="CE9178"/>
+          <w:sz w:val="18"/>
+          <w:szCs w:val="21"/>
+          <w:lang w:val="en-IN" w:eastAsia="it-IT"/>
+        </w:rPr>
+        <w:t>'</w:t>
+      </w:r>
+      <w:r>
+        <w:rPr>
+          <w:rFonts w:ascii="Consolas" w:eastAsia="Times New Roman" w:hAnsi="Consolas" w:cs="Times New Roman"/>
+          <w:color w:val="D4D4D4"/>
+          <w:sz w:val="18"/>
+          <w:szCs w:val="21"/>
+          <w:lang w:val="en-IN" w:eastAsia="it-IT"/>
+        </w:rPr>
+        <w:t xml:space="preserve">, </w:t>
+      </w:r>
+      <w:r>
+        <w:rPr>
+          <w:rFonts w:ascii="Consolas" w:eastAsia="Times New Roman" w:hAnsi="Consolas" w:cs="Times New Roman"/>
+          <w:color w:val="CE9178"/>
+          <w:sz w:val="18"/>
+          <w:szCs w:val="21"/>
+          <w:lang w:val="en-IN" w:eastAsia="it-IT"/>
+        </w:rPr>
+        <w:t>'</w:t>
+      </w:r>
+      <w:proofErr w:type="spellStart"/>
+      <w:r>
+        <w:rPr>
+          <w:rFonts w:ascii="Consolas" w:eastAsia="Times New Roman" w:hAnsi="Consolas" w:cs="Times New Roman"/>
+          <w:color w:val="CE9178"/>
+          <w:sz w:val="18"/>
+          <w:szCs w:val="21"/>
+          <w:lang w:val="en-IN" w:eastAsia="it-IT"/>
+        </w:rPr>
+        <w:t>category_name</w:t>
+      </w:r>
+      <w:proofErr w:type="spellEnd"/>
+      <w:r>
+        <w:rPr>
+          <w:rFonts w:ascii="Consolas" w:eastAsia="Times New Roman" w:hAnsi="Consolas" w:cs="Times New Roman"/>
+          <w:color w:val="CE9178"/>
+          <w:sz w:val="18"/>
+          <w:szCs w:val="21"/>
+          <w:lang w:val="en-IN" w:eastAsia="it-IT"/>
+        </w:rPr>
+        <w:t>'</w:t>
+      </w:r>
+      <w:r>
+        <w:rPr>
+          <w:rFonts w:ascii="Consolas" w:eastAsia="Times New Roman" w:hAnsi="Consolas" w:cs="Times New Roman"/>
+          <w:color w:val="D4D4D4"/>
+          <w:sz w:val="18"/>
+          <w:szCs w:val="21"/>
+          <w:lang w:val="en-IN" w:eastAsia="it-IT"/>
+        </w:rPr>
+        <w:t>]).</w:t>
+      </w:r>
+      <w:r>
+        <w:rPr>
+          <w:rFonts w:ascii="Consolas" w:eastAsia="Times New Roman" w:hAnsi="Consolas" w:cs="Times New Roman"/>
+          <w:color w:val="DCDCAA"/>
+          <w:sz w:val="18"/>
+          <w:szCs w:val="21"/>
+          <w:lang w:val="en-IN" w:eastAsia="it-IT"/>
+        </w:rPr>
+        <w:t>size</w:t>
+      </w:r>
+      <w:r>
+        <w:rPr>
+          <w:rFonts w:ascii="Consolas" w:eastAsia="Times New Roman" w:hAnsi="Consolas" w:cs="Times New Roman"/>
+          <w:color w:val="D4D4D4"/>
+          <w:sz w:val="18"/>
+          <w:szCs w:val="21"/>
+          <w:lang w:val="en-IN" w:eastAsia="it-IT"/>
+        </w:rPr>
+        <w:t>().</w:t>
+      </w:r>
+      <w:r>
+        <w:rPr>
+          <w:rFonts w:ascii="Consolas" w:eastAsia="Times New Roman" w:hAnsi="Consolas" w:cs="Times New Roman"/>
+          <w:color w:val="DCDCAA"/>
+          <w:sz w:val="18"/>
+          <w:szCs w:val="21"/>
+          <w:lang w:val="en-IN" w:eastAsia="it-IT"/>
+        </w:rPr>
+        <w:t>unstack</w:t>
+      </w:r>
+      <w:r>
+        <w:rPr>
+          <w:rFonts w:ascii="Consolas" w:eastAsia="Times New Roman" w:hAnsi="Consolas" w:cs="Times New Roman"/>
+          <w:color w:val="D4D4D4"/>
+          <w:sz w:val="18"/>
+          <w:szCs w:val="21"/>
+          <w:lang w:val="en-IN" w:eastAsia="it-IT"/>
+        </w:rPr>
+        <w:t>().</w:t>
+      </w:r>
+      <w:proofErr w:type="spellStart"/>
+      <w:r>
+        <w:rPr>
+          <w:rFonts w:ascii="Consolas" w:eastAsia="Times New Roman" w:hAnsi="Consolas" w:cs="Times New Roman"/>
+          <w:color w:val="DCDCAA"/>
+          <w:sz w:val="18"/>
+          <w:szCs w:val="21"/>
+          <w:lang w:val="en-IN" w:eastAsia="it-IT"/>
+        </w:rPr>
+        <w:t>fillna</w:t>
+      </w:r>
+      <w:proofErr w:type="spellEnd"/>
+      <w:r>
+        <w:rPr>
+          <w:rFonts w:ascii="Consolas" w:eastAsia="Times New Roman" w:hAnsi="Consolas" w:cs="Times New Roman"/>
+          <w:color w:val="D4D4D4"/>
+          <w:sz w:val="18"/>
+          <w:szCs w:val="21"/>
+          <w:lang w:val="en-IN" w:eastAsia="it-IT"/>
+        </w:rPr>
+        <w:t>(</w:t>
+      </w:r>
+      <w:r>
+        <w:rPr>
+          <w:rFonts w:ascii="Consolas" w:eastAsia="Times New Roman" w:hAnsi="Consolas" w:cs="Times New Roman"/>
+          <w:color w:val="B5CEA8"/>
+          <w:sz w:val="18"/>
+          <w:szCs w:val="21"/>
+          <w:lang w:val="en-IN" w:eastAsia="it-IT"/>
+        </w:rPr>
+        <w:t>0</w:t>
+      </w:r>
+      <w:r>
+        <w:rPr>
+          <w:rFonts w:ascii="Consolas" w:eastAsia="Times New Roman" w:hAnsi="Consolas" w:cs="Times New Roman"/>
+          <w:color w:val="D4D4D4"/>
+          <w:sz w:val="18"/>
+          <w:szCs w:val="21"/>
+          <w:lang w:val="en-IN" w:eastAsia="it-IT"/>
+        </w:rPr>
+        <w:t>)</w:t>
+      </w:r>
+    </w:p>
+    <w:p>
+      <w:pPr>
+        <w:pStyle w:val="Paragrafoelenco"/>
+        <w:numPr>
+          <w:ilvl w:val="0"/>
+          <w:numId w:val="19"/>
+        </w:numPr>
+        <w:shd w:val="clear" w:color="auto" w:fill="1E1E1E"/>
+        <w:spacing w:before="0" w:after="0" w:line="240" w:lineRule="auto"/>
+        <w:rPr>
+          <w:rFonts w:ascii="Consolas" w:eastAsia="Times New Roman" w:hAnsi="Consolas" w:cs="Times New Roman"/>
+          <w:color w:val="D4D4D4"/>
+          <w:sz w:val="18"/>
+          <w:szCs w:val="21"/>
+          <w:lang w:val="en-IN" w:eastAsia="it-IT"/>
+        </w:rPr>
+      </w:pPr>
+      <w:r>
+        <w:rPr>
+          <w:rFonts w:ascii="Consolas" w:eastAsia="Times New Roman" w:hAnsi="Consolas" w:cs="Times New Roman"/>
+          <w:color w:val="9CDCFE"/>
+          <w:sz w:val="18"/>
+          <w:szCs w:val="21"/>
+          <w:lang w:val="en-IN" w:eastAsia="it-IT"/>
+        </w:rPr>
+        <w:t>basket</w:t>
+      </w:r>
+      <w:r>
+        <w:rPr>
+          <w:rFonts w:ascii="Consolas" w:eastAsia="Times New Roman" w:hAnsi="Consolas" w:cs="Times New Roman"/>
+          <w:color w:val="D4D4D4"/>
+          <w:sz w:val="18"/>
+          <w:szCs w:val="21"/>
+          <w:lang w:val="en-IN" w:eastAsia="it-IT"/>
+        </w:rPr>
+        <w:t xml:space="preserve"> = </w:t>
+      </w:r>
+      <w:proofErr w:type="spellStart"/>
+      <w:proofErr w:type="gramStart"/>
+      <w:r>
+        <w:rPr>
+          <w:rFonts w:ascii="Consolas" w:eastAsia="Times New Roman" w:hAnsi="Consolas" w:cs="Times New Roman"/>
+          <w:color w:val="9CDCFE"/>
+          <w:sz w:val="18"/>
+          <w:szCs w:val="21"/>
+          <w:lang w:val="en-IN" w:eastAsia="it-IT"/>
+        </w:rPr>
+        <w:t>basket</w:t>
+      </w:r>
+      <w:r>
+        <w:rPr>
+          <w:rFonts w:ascii="Consolas" w:eastAsia="Times New Roman" w:hAnsi="Consolas" w:cs="Times New Roman"/>
+          <w:color w:val="D4D4D4"/>
+          <w:sz w:val="18"/>
+          <w:szCs w:val="21"/>
+          <w:lang w:val="en-IN" w:eastAsia="it-IT"/>
+        </w:rPr>
+        <w:t>.applymap</w:t>
+      </w:r>
+      <w:proofErr w:type="spellEnd"/>
+      <w:proofErr w:type="gramEnd"/>
+      <w:r>
+        <w:rPr>
+          <w:rFonts w:ascii="Consolas" w:eastAsia="Times New Roman" w:hAnsi="Consolas" w:cs="Times New Roman"/>
+          <w:color w:val="D4D4D4"/>
+          <w:sz w:val="18"/>
+          <w:szCs w:val="21"/>
+          <w:lang w:val="en-IN" w:eastAsia="it-IT"/>
+        </w:rPr>
+        <w:t>(</w:t>
+      </w:r>
+      <w:r>
+        <w:rPr>
+          <w:rFonts w:ascii="Consolas" w:eastAsia="Times New Roman" w:hAnsi="Consolas" w:cs="Times New Roman"/>
+          <w:color w:val="569CD6"/>
+          <w:sz w:val="18"/>
+          <w:szCs w:val="21"/>
+          <w:lang w:val="en-IN" w:eastAsia="it-IT"/>
+        </w:rPr>
+        <w:t>lambda</w:t>
+      </w:r>
+      <w:r>
+        <w:rPr>
+          <w:rFonts w:ascii="Consolas" w:eastAsia="Times New Roman" w:hAnsi="Consolas" w:cs="Times New Roman"/>
+          <w:color w:val="D4D4D4"/>
+          <w:sz w:val="18"/>
+          <w:szCs w:val="21"/>
+          <w:lang w:val="en-IN" w:eastAsia="it-IT"/>
+        </w:rPr>
+        <w:t xml:space="preserve"> </w:t>
+      </w:r>
+      <w:r>
+        <w:rPr>
+          <w:rFonts w:ascii="Consolas" w:eastAsia="Times New Roman" w:hAnsi="Consolas" w:cs="Times New Roman"/>
+          <w:color w:val="9CDCFE"/>
+          <w:sz w:val="18"/>
+          <w:szCs w:val="21"/>
+          <w:lang w:val="en-IN" w:eastAsia="it-IT"/>
+        </w:rPr>
+        <w:t>x</w:t>
+      </w:r>
+      <w:r>
+        <w:rPr>
+          <w:rFonts w:ascii="Consolas" w:eastAsia="Times New Roman" w:hAnsi="Consolas" w:cs="Times New Roman"/>
+          <w:color w:val="D4D4D4"/>
+          <w:sz w:val="18"/>
+          <w:szCs w:val="21"/>
+          <w:lang w:val="en-IN" w:eastAsia="it-IT"/>
+        </w:rPr>
+        <w:t xml:space="preserve">: </w:t>
+      </w:r>
+      <w:r>
+        <w:rPr>
+          <w:rFonts w:ascii="Consolas" w:eastAsia="Times New Roman" w:hAnsi="Consolas" w:cs="Times New Roman"/>
+          <w:color w:val="B5CEA8"/>
+          <w:sz w:val="18"/>
+          <w:szCs w:val="21"/>
+          <w:lang w:val="en-IN" w:eastAsia="it-IT"/>
+        </w:rPr>
+        <w:t>1</w:t>
+      </w:r>
+      <w:r>
+        <w:rPr>
+          <w:rFonts w:ascii="Consolas" w:eastAsia="Times New Roman" w:hAnsi="Consolas" w:cs="Times New Roman"/>
+          <w:color w:val="D4D4D4"/>
+          <w:sz w:val="18"/>
+          <w:szCs w:val="21"/>
+          <w:lang w:val="en-IN" w:eastAsia="it-IT"/>
+        </w:rPr>
+        <w:t xml:space="preserve"> </w:t>
+      </w:r>
+      <w:r>
+        <w:rPr>
+          <w:rFonts w:ascii="Consolas" w:eastAsia="Times New Roman" w:hAnsi="Consolas" w:cs="Times New Roman"/>
+          <w:color w:val="C586C0"/>
+          <w:sz w:val="18"/>
+          <w:szCs w:val="21"/>
+          <w:lang w:val="en-IN" w:eastAsia="it-IT"/>
+        </w:rPr>
+        <w:t>if</w:t>
+      </w:r>
+      <w:r>
+        <w:rPr>
+          <w:rFonts w:ascii="Consolas" w:eastAsia="Times New Roman" w:hAnsi="Consolas" w:cs="Times New Roman"/>
+          <w:color w:val="D4D4D4"/>
+          <w:sz w:val="18"/>
+          <w:szCs w:val="21"/>
+          <w:lang w:val="en-IN" w:eastAsia="it-IT"/>
+        </w:rPr>
+        <w:t xml:space="preserve"> </w:t>
+      </w:r>
+      <w:r>
+        <w:rPr>
+          <w:rFonts w:ascii="Consolas" w:eastAsia="Times New Roman" w:hAnsi="Consolas" w:cs="Times New Roman"/>
+          <w:color w:val="9CDCFE"/>
+          <w:sz w:val="18"/>
+          <w:szCs w:val="21"/>
+          <w:lang w:val="en-IN" w:eastAsia="it-IT"/>
+        </w:rPr>
+        <w:t>x</w:t>
+      </w:r>
+      <w:r>
+        <w:rPr>
+          <w:rFonts w:ascii="Consolas" w:eastAsia="Times New Roman" w:hAnsi="Consolas" w:cs="Times New Roman"/>
+          <w:color w:val="D4D4D4"/>
+          <w:sz w:val="18"/>
+          <w:szCs w:val="21"/>
+          <w:lang w:val="en-IN" w:eastAsia="it-IT"/>
+        </w:rPr>
+        <w:t xml:space="preserve"> &gt; </w:t>
+      </w:r>
+      <w:r>
+        <w:rPr>
+          <w:rFonts w:ascii="Consolas" w:eastAsia="Times New Roman" w:hAnsi="Consolas" w:cs="Times New Roman"/>
+          <w:color w:val="B5CEA8"/>
+          <w:sz w:val="18"/>
+          <w:szCs w:val="21"/>
+          <w:lang w:val="en-IN" w:eastAsia="it-IT"/>
+        </w:rPr>
+        <w:t>0</w:t>
+      </w:r>
+      <w:r>
+        <w:rPr>
+          <w:rFonts w:ascii="Consolas" w:eastAsia="Times New Roman" w:hAnsi="Consolas" w:cs="Times New Roman"/>
+          <w:color w:val="D4D4D4"/>
+          <w:sz w:val="18"/>
+          <w:szCs w:val="21"/>
+          <w:lang w:val="en-IN" w:eastAsia="it-IT"/>
+        </w:rPr>
+        <w:t xml:space="preserve"> </w:t>
+      </w:r>
+      <w:r>
+        <w:rPr>
+          <w:rFonts w:ascii="Consolas" w:eastAsia="Times New Roman" w:hAnsi="Consolas" w:cs="Times New Roman"/>
+          <w:color w:val="C586C0"/>
+          <w:sz w:val="18"/>
+          <w:szCs w:val="21"/>
+          <w:lang w:val="en-IN" w:eastAsia="it-IT"/>
+        </w:rPr>
+        <w:t>else</w:t>
+      </w:r>
+      <w:r>
+        <w:rPr>
+          <w:rFonts w:ascii="Consolas" w:eastAsia="Times New Roman" w:hAnsi="Consolas" w:cs="Times New Roman"/>
+          <w:color w:val="D4D4D4"/>
+          <w:sz w:val="18"/>
+          <w:szCs w:val="21"/>
+          <w:lang w:val="en-IN" w:eastAsia="it-IT"/>
+        </w:rPr>
+        <w:t xml:space="preserve"> </w:t>
+      </w:r>
+      <w:r>
+        <w:rPr>
+          <w:rFonts w:ascii="Consolas" w:eastAsia="Times New Roman" w:hAnsi="Consolas" w:cs="Times New Roman"/>
+          <w:color w:val="B5CEA8"/>
+          <w:sz w:val="18"/>
+          <w:szCs w:val="21"/>
+          <w:lang w:val="en-IN" w:eastAsia="it-IT"/>
+        </w:rPr>
+        <w:t>0</w:t>
+      </w:r>
+      <w:r>
+        <w:rPr>
+          <w:rFonts w:ascii="Consolas" w:eastAsia="Times New Roman" w:hAnsi="Consolas" w:cs="Times New Roman"/>
+          <w:color w:val="D4D4D4"/>
+          <w:sz w:val="18"/>
+          <w:szCs w:val="21"/>
+          <w:lang w:val="en-IN" w:eastAsia="it-IT"/>
+        </w:rPr>
+        <w:t>)</w:t>
+      </w:r>
+    </w:p>
+    <w:p>
+      <w:pPr>
+        <w:pStyle w:val="Paragrafoelenco"/>
+        <w:numPr>
+          <w:ilvl w:val="0"/>
+          <w:numId w:val="19"/>
+        </w:numPr>
+        <w:shd w:val="clear" w:color="auto" w:fill="1E1E1E"/>
+        <w:spacing w:before="0" w:after="0" w:line="240" w:lineRule="auto"/>
+        <w:rPr>
+          <w:rFonts w:ascii="Consolas" w:eastAsia="Times New Roman" w:hAnsi="Consolas" w:cs="Times New Roman"/>
+          <w:color w:val="D4D4D4"/>
+          <w:sz w:val="18"/>
+          <w:szCs w:val="21"/>
+          <w:lang w:eastAsia="it-IT"/>
+        </w:rPr>
+      </w:pPr>
+      <w:proofErr w:type="spellStart"/>
+      <w:r>
+        <w:rPr>
+          <w:rFonts w:ascii="Consolas" w:eastAsia="Times New Roman" w:hAnsi="Consolas" w:cs="Times New Roman"/>
+          <w:color w:val="9CDCFE"/>
+          <w:sz w:val="18"/>
+          <w:szCs w:val="21"/>
+          <w:lang w:eastAsia="it-IT"/>
+        </w:rPr>
+        <w:t>item_affinity</w:t>
+      </w:r>
+      <w:proofErr w:type="spellEnd"/>
+      <w:r>
+        <w:rPr>
+          <w:rFonts w:ascii="Consolas" w:eastAsia="Times New Roman" w:hAnsi="Consolas" w:cs="Times New Roman"/>
+          <w:color w:val="D4D4D4"/>
+          <w:sz w:val="18"/>
+          <w:szCs w:val="21"/>
+          <w:lang w:eastAsia="it-IT"/>
+        </w:rPr>
+        <w:t xml:space="preserve"> = </w:t>
+      </w:r>
+      <w:proofErr w:type="spellStart"/>
+      <w:proofErr w:type="gramStart"/>
+      <w:r>
+        <w:rPr>
+          <w:rFonts w:ascii="Consolas" w:eastAsia="Times New Roman" w:hAnsi="Consolas" w:cs="Times New Roman"/>
+          <w:color w:val="9CDCFE"/>
+          <w:sz w:val="18"/>
+          <w:szCs w:val="21"/>
+          <w:lang w:eastAsia="it-IT"/>
+        </w:rPr>
+        <w:t>basket</w:t>
+      </w:r>
+      <w:r>
+        <w:rPr>
+          <w:rFonts w:ascii="Consolas" w:eastAsia="Times New Roman" w:hAnsi="Consolas" w:cs="Times New Roman"/>
+          <w:color w:val="D4D4D4"/>
+          <w:sz w:val="18"/>
+          <w:szCs w:val="21"/>
+          <w:lang w:eastAsia="it-IT"/>
+        </w:rPr>
+        <w:t>.corr</w:t>
+      </w:r>
+      <w:proofErr w:type="spellEnd"/>
+      <w:proofErr w:type="gramEnd"/>
+      <w:r>
+        <w:rPr>
+          <w:rFonts w:ascii="Consolas" w:eastAsia="Times New Roman" w:hAnsi="Consolas" w:cs="Times New Roman"/>
+          <w:color w:val="D4D4D4"/>
+          <w:sz w:val="18"/>
+          <w:szCs w:val="21"/>
+          <w:lang w:eastAsia="it-IT"/>
+        </w:rPr>
+        <w:t>()</w:t>
+      </w:r>
+    </w:p>
+    <w:p>
+      <w:pPr>
+        <w:spacing w:beforeAutospacing="1" w:after="100" w:afterAutospacing="1"/>
+        <w:jc w:val="both"/>
+        <w:rPr>
+          <w:rFonts w:ascii="Times New Roman" w:eastAsia="Times New Roman" w:hAnsi="Times New Roman" w:cs="Times New Roman"/>
+          <w:sz w:val="24"/>
+          <w:szCs w:val="24"/>
+          <w:lang w:val="en-IN" w:eastAsia="it-IT"/>
+        </w:rPr>
+      </w:pPr>
+      <w:r>
+        <w:rPr>
+          <w:rFonts w:ascii="Times New Roman" w:eastAsia="Times New Roman" w:hAnsi="Times New Roman" w:cs="Times New Roman"/>
+          <w:noProof/>
+          <w:sz w:val="24"/>
+          <w:szCs w:val="24"/>
+          <w:lang w:val="en-IN" w:eastAsia="it-IT"/>
+        </w:rPr>
+        <w:drawing>
+          <wp:anchor distT="0" distB="0" distL="114300" distR="114300" simplePos="0" relativeHeight="251671552" behindDoc="0" locked="0" layoutInCell="1" allowOverlap="1" wp14:anchorId="4C0952E9" wp14:editId="51A2E7D1">
+            <wp:simplePos x="0" y="0"/>
+            <wp:positionH relativeFrom="column">
+              <wp:posOffset>1187919</wp:posOffset>
+            </wp:positionH>
+            <wp:positionV relativeFrom="paragraph">
+              <wp:posOffset>184481</wp:posOffset>
+            </wp:positionV>
+            <wp:extent cx="3641697" cy="3337531"/>
+            <wp:effectExtent l="0" t="0" r="0" b="0"/>
+            <wp:wrapSquare wrapText="bothSides"/>
+            <wp:docPr id="51" name="Immagine 51"/>
+            <wp:cNvGraphicFramePr>
+              <a:graphicFrameLocks xmlns:a="http://schemas.openxmlformats.org/drawingml/2006/main" noChangeAspect="1"/>
+            </wp:cNvGraphicFramePr>
+            <a:graphic xmlns:a="http://schemas.openxmlformats.org/drawingml/2006/main">
+              <a:graphicData uri="http://schemas.openxmlformats.org/drawingml/2006/picture">
+                <pic:pic xmlns:pic="http://schemas.openxmlformats.org/drawingml/2006/picture">
+                  <pic:nvPicPr>
+                    <pic:cNvPr id="51" name="heatmap.png"/>
+                    <pic:cNvPicPr/>
+                  </pic:nvPicPr>
+                  <pic:blipFill>
+                    <a:blip r:embed="rId25" cstate="print">
+                      <a:extLst>
+                        <a:ext uri="{28A0092B-C50C-407E-A947-70E740481C1C}">
+                          <a14:useLocalDpi xmlns:a14="http://schemas.microsoft.com/office/drawing/2010/main" val="0"/>
+                        </a:ext>
+                      </a:extLst>
+                    </a:blip>
+                    <a:stretch>
+                      <a:fillRect/>
+                    </a:stretch>
+                  </pic:blipFill>
+                  <pic:spPr>
+                    <a:xfrm>
+                      <a:off x="0" y="0"/>
+                      <a:ext cx="3641697" cy="3337531"/>
+                    </a:xfrm>
+                    <a:prstGeom prst="rect">
+                      <a:avLst/>
+                    </a:prstGeom>
+                  </pic:spPr>
+                </pic:pic>
+              </a:graphicData>
+            </a:graphic>
+          </wp:anchor>
+        </w:drawing>
+      </w:r>
+    </w:p>
+    <w:p>
+      <w:pPr>
+        <w:pStyle w:val="NormaleWeb"/>
+        <w:spacing w:line="276" w:lineRule="auto"/>
+        <w:jc w:val="both"/>
+        <w:rPr>
+          <w:lang w:val="en-IN"/>
+        </w:rPr>
+      </w:pPr>
+    </w:p>
+    <w:p>
+      <w:pPr>
+        <w:pStyle w:val="NormaleWeb"/>
+        <w:spacing w:line="276" w:lineRule="auto"/>
+        <w:jc w:val="both"/>
+        <w:rPr>
+          <w:lang w:val="en-IN"/>
+        </w:rPr>
+      </w:pPr>
+    </w:p>
+    <w:p>
+      <w:pPr>
+        <w:pStyle w:val="NormaleWeb"/>
+        <w:spacing w:line="276" w:lineRule="auto"/>
+        <w:rPr>
+          <w:lang w:val="en-IN"/>
+        </w:rPr>
+      </w:pPr>
+    </w:p>
+    <w:p>
+      <w:pPr>
         <w:jc w:val="both"/>
         <w:rPr>
           <w:rFonts w:ascii="Times New Roman" w:hAnsi="Times New Roman" w:cs="Times New Roman"/>
@@ -33231,13 +35547,814 @@
         </w:rPr>
       </w:pPr>
     </w:p>
+    <w:p>
+      <w:pPr>
+        <w:rPr>
+          <w:rFonts w:ascii="Times New Roman" w:hAnsi="Times New Roman" w:cs="Times New Roman"/>
+          <w:sz w:val="24"/>
+          <w:lang w:val="en-IN"/>
+        </w:rPr>
+      </w:pPr>
+      <w:r>
+        <w:rPr>
+          <w:rFonts w:ascii="Times New Roman" w:hAnsi="Times New Roman" w:cs="Times New Roman"/>
+          <w:sz w:val="24"/>
+          <w:lang w:val="en-IN"/>
+        </w:rPr>
+        <w:br w:type="page"/>
+      </w:r>
+    </w:p>
+    <w:p>
+      <w:pPr>
+        <w:spacing w:beforeAutospacing="1" w:after="100" w:afterAutospacing="1"/>
+        <w:jc w:val="both"/>
+        <w:rPr>
+          <w:rFonts w:ascii="Times New Roman" w:eastAsia="Times New Roman" w:hAnsi="Times New Roman" w:cs="Times New Roman"/>
+          <w:sz w:val="24"/>
+          <w:szCs w:val="24"/>
+          <w:lang w:eastAsia="it-IT"/>
+        </w:rPr>
+      </w:pPr>
+      <w:r>
+        <w:rPr>
+          <w:rFonts w:ascii="Times New Roman" w:eastAsia="Times New Roman" w:hAnsi="Times New Roman" w:cs="Times New Roman"/>
+          <w:sz w:val="24"/>
+          <w:szCs w:val="24"/>
+          <w:lang w:val="en-IN" w:eastAsia="it-IT"/>
+        </w:rPr>
+        <w:lastRenderedPageBreak/>
+        <w:t xml:space="preserve">This analysis is a form of </w:t>
+      </w:r>
+      <w:r>
+        <w:rPr>
+          <w:rFonts w:ascii="Times New Roman" w:eastAsia="Times New Roman" w:hAnsi="Times New Roman" w:cs="Times New Roman"/>
+          <w:b/>
+          <w:bCs/>
+          <w:sz w:val="24"/>
+          <w:szCs w:val="24"/>
+          <w:lang w:val="en-IN" w:eastAsia="it-IT"/>
+        </w:rPr>
+        <w:t>Market Basket Analysis</w:t>
+      </w:r>
+      <w:r>
+        <w:rPr>
+          <w:rFonts w:ascii="Times New Roman" w:eastAsia="Times New Roman" w:hAnsi="Times New Roman" w:cs="Times New Roman"/>
+          <w:sz w:val="24"/>
+          <w:szCs w:val="24"/>
+          <w:lang w:val="en-IN" w:eastAsia="it-IT"/>
+        </w:rPr>
+        <w:t xml:space="preserve"> applied to the sampling phase of the customer journey. </w:t>
+      </w:r>
+      <w:proofErr w:type="spellStart"/>
+      <w:r>
+        <w:rPr>
+          <w:rFonts w:ascii="Times New Roman" w:eastAsia="Times New Roman" w:hAnsi="Times New Roman" w:cs="Times New Roman"/>
+          <w:sz w:val="24"/>
+          <w:szCs w:val="24"/>
+          <w:lang w:eastAsia="it-IT"/>
+        </w:rPr>
+        <w:t>Its</w:t>
+      </w:r>
+      <w:proofErr w:type="spellEnd"/>
+      <w:r>
+        <w:rPr>
+          <w:rFonts w:ascii="Times New Roman" w:eastAsia="Times New Roman" w:hAnsi="Times New Roman" w:cs="Times New Roman"/>
+          <w:sz w:val="24"/>
+          <w:szCs w:val="24"/>
+          <w:lang w:eastAsia="it-IT"/>
+        </w:rPr>
+        <w:t xml:space="preserve"> business </w:t>
+      </w:r>
+      <w:proofErr w:type="spellStart"/>
+      <w:r>
+        <w:rPr>
+          <w:rFonts w:ascii="Times New Roman" w:eastAsia="Times New Roman" w:hAnsi="Times New Roman" w:cs="Times New Roman"/>
+          <w:sz w:val="24"/>
+          <w:szCs w:val="24"/>
+          <w:lang w:eastAsia="it-IT"/>
+        </w:rPr>
+        <w:t>significance</w:t>
+      </w:r>
+      <w:proofErr w:type="spellEnd"/>
+      <w:r>
+        <w:rPr>
+          <w:rFonts w:ascii="Times New Roman" w:eastAsia="Times New Roman" w:hAnsi="Times New Roman" w:cs="Times New Roman"/>
+          <w:sz w:val="24"/>
+          <w:szCs w:val="24"/>
+          <w:lang w:eastAsia="it-IT"/>
+        </w:rPr>
+        <w:t xml:space="preserve"> </w:t>
+      </w:r>
+      <w:proofErr w:type="spellStart"/>
+      <w:r>
+        <w:rPr>
+          <w:rFonts w:ascii="Times New Roman" w:eastAsia="Times New Roman" w:hAnsi="Times New Roman" w:cs="Times New Roman"/>
+          <w:sz w:val="24"/>
+          <w:szCs w:val="24"/>
+          <w:lang w:eastAsia="it-IT"/>
+        </w:rPr>
+        <w:t>includes</w:t>
+      </w:r>
+      <w:proofErr w:type="spellEnd"/>
+      <w:r>
+        <w:rPr>
+          <w:rFonts w:ascii="Times New Roman" w:eastAsia="Times New Roman" w:hAnsi="Times New Roman" w:cs="Times New Roman"/>
+          <w:sz w:val="24"/>
+          <w:szCs w:val="24"/>
+          <w:lang w:eastAsia="it-IT"/>
+        </w:rPr>
+        <w:t>:</w:t>
+      </w:r>
+    </w:p>
+    <w:p>
+      <w:pPr>
+        <w:numPr>
+          <w:ilvl w:val="0"/>
+          <w:numId w:val="20"/>
+        </w:numPr>
+        <w:spacing w:beforeAutospacing="1" w:after="100" w:afterAutospacing="1"/>
+        <w:jc w:val="both"/>
+        <w:rPr>
+          <w:rFonts w:ascii="Times New Roman" w:eastAsia="Times New Roman" w:hAnsi="Times New Roman" w:cs="Times New Roman"/>
+          <w:sz w:val="24"/>
+          <w:szCs w:val="24"/>
+          <w:lang w:val="en-IN" w:eastAsia="it-IT"/>
+        </w:rPr>
+      </w:pPr>
+      <w:r>
+        <w:rPr>
+          <w:rFonts w:ascii="Times New Roman" w:eastAsia="Times New Roman" w:hAnsi="Times New Roman" w:cs="Times New Roman"/>
+          <w:b/>
+          <w:bCs/>
+          <w:sz w:val="24"/>
+          <w:szCs w:val="24"/>
+          <w:lang w:val="en-IN" w:eastAsia="it-IT"/>
+        </w:rPr>
+        <w:t>Cross-Selling Opportunities</w:t>
+      </w:r>
+      <w:r>
+        <w:rPr>
+          <w:rFonts w:ascii="Times New Roman" w:eastAsia="Times New Roman" w:hAnsi="Times New Roman" w:cs="Times New Roman"/>
+          <w:sz w:val="24"/>
+          <w:szCs w:val="24"/>
+          <w:lang w:val="en-IN" w:eastAsia="it-IT"/>
+        </w:rPr>
+        <w:t>: If the heatmap shows a high correlation between "Wallpaper" and "Fabric" categories, the marketing team should ensure that when a customer views a wallpaper motif, the corresponding fabric is cross-promoted.</w:t>
+      </w:r>
+    </w:p>
+    <w:p>
+      <w:pPr>
+        <w:numPr>
+          <w:ilvl w:val="0"/>
+          <w:numId w:val="20"/>
+        </w:numPr>
+        <w:spacing w:beforeAutospacing="1" w:after="100" w:afterAutospacing="1"/>
+        <w:jc w:val="both"/>
+        <w:rPr>
+          <w:rFonts w:ascii="Times New Roman" w:eastAsia="Times New Roman" w:hAnsi="Times New Roman" w:cs="Times New Roman"/>
+          <w:sz w:val="24"/>
+          <w:szCs w:val="24"/>
+          <w:lang w:val="en-IN" w:eastAsia="it-IT"/>
+        </w:rPr>
+      </w:pPr>
+      <w:r>
+        <w:rPr>
+          <w:rFonts w:ascii="Times New Roman" w:eastAsia="Times New Roman" w:hAnsi="Times New Roman" w:cs="Times New Roman"/>
+          <w:b/>
+          <w:bCs/>
+          <w:sz w:val="24"/>
+          <w:szCs w:val="24"/>
+          <w:lang w:val="en-IN" w:eastAsia="it-IT"/>
+        </w:rPr>
+        <w:t>Sample Bundling</w:t>
+      </w:r>
+      <w:r>
+        <w:rPr>
+          <w:rFonts w:ascii="Times New Roman" w:eastAsia="Times New Roman" w:hAnsi="Times New Roman" w:cs="Times New Roman"/>
+          <w:sz w:val="24"/>
+          <w:szCs w:val="24"/>
+          <w:lang w:val="en-IN" w:eastAsia="it-IT"/>
+        </w:rPr>
+        <w:t>: The company can create "Pre-packed Sample Kits" based on these affinities. If two categories are almost always requested together, bundling them reduces shipping touches and improves the customer experience.</w:t>
+      </w:r>
+    </w:p>
+    <w:p>
+      <w:pPr>
+        <w:numPr>
+          <w:ilvl w:val="0"/>
+          <w:numId w:val="20"/>
+        </w:numPr>
+        <w:spacing w:beforeAutospacing="1" w:after="100" w:afterAutospacing="1"/>
+        <w:jc w:val="both"/>
+        <w:rPr>
+          <w:rFonts w:ascii="Times New Roman" w:eastAsia="Times New Roman" w:hAnsi="Times New Roman" w:cs="Times New Roman"/>
+          <w:sz w:val="24"/>
+          <w:szCs w:val="24"/>
+          <w:lang w:val="en-IN" w:eastAsia="it-IT"/>
+        </w:rPr>
+      </w:pPr>
+      <w:r>
+        <w:rPr>
+          <w:rFonts w:ascii="Times New Roman" w:eastAsia="Times New Roman" w:hAnsi="Times New Roman" w:cs="Times New Roman"/>
+          <w:b/>
+          <w:bCs/>
+          <w:sz w:val="24"/>
+          <w:szCs w:val="24"/>
+          <w:lang w:val="en-IN" w:eastAsia="it-IT"/>
+        </w:rPr>
+        <w:t>Customer Segmentation</w:t>
+      </w:r>
+      <w:r>
+        <w:rPr>
+          <w:rFonts w:ascii="Times New Roman" w:eastAsia="Times New Roman" w:hAnsi="Times New Roman" w:cs="Times New Roman"/>
+          <w:sz w:val="24"/>
+          <w:szCs w:val="24"/>
+          <w:lang w:val="en-IN" w:eastAsia="it-IT"/>
+        </w:rPr>
+        <w:t>: Strong clusters in the heatmap signify distinct buyer personas (e.g., a "Residential Decorator" persona might sample different category pairs than a "Commercial Architect" persona).</w:t>
+      </w:r>
+    </w:p>
+    <w:p>
+      <w:pPr>
+        <w:numPr>
+          <w:ilvl w:val="0"/>
+          <w:numId w:val="20"/>
+        </w:numPr>
+        <w:spacing w:beforeAutospacing="1" w:after="100" w:afterAutospacing="1"/>
+        <w:jc w:val="both"/>
+        <w:rPr>
+          <w:rFonts w:ascii="Times New Roman" w:eastAsia="Times New Roman" w:hAnsi="Times New Roman" w:cs="Times New Roman"/>
+          <w:sz w:val="24"/>
+          <w:szCs w:val="24"/>
+          <w:lang w:val="en-IN" w:eastAsia="it-IT"/>
+        </w:rPr>
+      </w:pPr>
+      <w:r>
+        <w:rPr>
+          <w:rFonts w:ascii="Times New Roman" w:eastAsia="Times New Roman" w:hAnsi="Times New Roman" w:cs="Times New Roman"/>
+          <w:b/>
+          <w:bCs/>
+          <w:sz w:val="24"/>
+          <w:szCs w:val="24"/>
+          <w:lang w:val="en-IN" w:eastAsia="it-IT"/>
+        </w:rPr>
+        <w:t>Inventory Placement</w:t>
+      </w:r>
+      <w:r>
+        <w:rPr>
+          <w:rFonts w:ascii="Times New Roman" w:eastAsia="Times New Roman" w:hAnsi="Times New Roman" w:cs="Times New Roman"/>
+          <w:sz w:val="24"/>
+          <w:szCs w:val="24"/>
+          <w:lang w:val="en-IN" w:eastAsia="it-IT"/>
+        </w:rPr>
+        <w:t>: Data on product affinity can inform warehouse slotting, placing highly correlated items near each other to speed up the picking and packing of sample kits.</w:t>
+      </w:r>
+    </w:p>
+    <w:p>
+      <w:pPr>
+        <w:pStyle w:val="Titolo2"/>
+        <w:rPr>
+          <w:b/>
+          <w:lang w:val="en-IN"/>
+        </w:rPr>
+      </w:pPr>
+      <w:r>
+        <w:rPr>
+          <w:b/>
+          <w:lang w:val="en-IN"/>
+        </w:rPr>
+        <w:t xml:space="preserve">6.3 </w:t>
+      </w:r>
+      <w:r>
+        <w:rPr>
+          <w:b/>
+          <w:lang w:val="en-IN"/>
+        </w:rPr>
+        <w:t>Price elas</w:t>
+      </w:r>
+      <w:r>
+        <w:rPr>
+          <w:b/>
+          <w:lang w:val="en-IN"/>
+        </w:rPr>
+        <w:t>ticity analysis</w:t>
+      </w:r>
+    </w:p>
+    <w:p>
+      <w:pPr>
+        <w:jc w:val="both"/>
+        <w:rPr>
+          <w:rFonts w:ascii="Times New Roman" w:hAnsi="Times New Roman" w:cs="Times New Roman"/>
+          <w:sz w:val="24"/>
+          <w:lang w:val="en-IN"/>
+        </w:rPr>
+      </w:pPr>
+      <w:r>
+        <w:rPr>
+          <w:rFonts w:ascii="Times New Roman" w:hAnsi="Times New Roman" w:cs="Times New Roman"/>
+          <w:sz w:val="24"/>
+          <w:lang w:val="en-IN"/>
+        </w:rPr>
+        <w:t xml:space="preserve">The </w:t>
+      </w:r>
+      <w:r>
+        <w:rPr>
+          <w:rFonts w:ascii="Times New Roman" w:hAnsi="Times New Roman" w:cs="Times New Roman"/>
+          <w:b/>
+          <w:bCs/>
+          <w:sz w:val="24"/>
+          <w:lang w:val="en-IN"/>
+        </w:rPr>
+        <w:t>Price Elasticity of Demand</w:t>
+      </w:r>
+      <w:r>
+        <w:rPr>
+          <w:rFonts w:ascii="Times New Roman" w:hAnsi="Times New Roman" w:cs="Times New Roman"/>
+          <w:sz w:val="24"/>
+          <w:lang w:val="en-IN"/>
+        </w:rPr>
+        <w:t xml:space="preserve"> analysis reveals a distinct inverse relationship between unit price and quantity sold, characterized by a high sensitivity in the lower price brackets. As prices exceed the </w:t>
+      </w:r>
+      <w:r>
+        <w:rPr>
+          <w:rFonts w:ascii="Times New Roman" w:hAnsi="Times New Roman" w:cs="Times New Roman"/>
+          <w:b/>
+          <w:bCs/>
+          <w:sz w:val="24"/>
+          <w:lang w:val="en-IN"/>
+        </w:rPr>
+        <w:t>$200–$300 threshold</w:t>
+      </w:r>
+      <w:r>
+        <w:rPr>
+          <w:rFonts w:ascii="Times New Roman" w:hAnsi="Times New Roman" w:cs="Times New Roman"/>
+          <w:sz w:val="24"/>
+          <w:lang w:val="en-IN"/>
+        </w:rPr>
+        <w:t xml:space="preserve">, we observe a 'long tail' distribution where demand stabilizes despite price increases—a hallmark of luxury positioning. This suggests that for premium 'Luxe' segments, purchasing decisions are driven more by </w:t>
+      </w:r>
+      <w:r>
+        <w:rPr>
+          <w:rFonts w:ascii="Times New Roman" w:hAnsi="Times New Roman" w:cs="Times New Roman"/>
+          <w:b/>
+          <w:bCs/>
+          <w:sz w:val="24"/>
+          <w:lang w:val="en-IN"/>
+        </w:rPr>
+        <w:t>design exclusivity and motif affinity</w:t>
+      </w:r>
+      <w:r>
+        <w:rPr>
+          <w:rFonts w:ascii="Times New Roman" w:hAnsi="Times New Roman" w:cs="Times New Roman"/>
+          <w:sz w:val="24"/>
+          <w:lang w:val="en-IN"/>
+        </w:rPr>
+        <w:t xml:space="preserve"> than by marginal price changes, presenting a significant opportunity for value-based pricing rather than volume-based discounting.</w:t>
+      </w:r>
+    </w:p>
+    <w:p>
+      <w:pPr>
+        <w:jc w:val="both"/>
+        <w:rPr>
+          <w:rFonts w:ascii="Times New Roman" w:hAnsi="Times New Roman" w:cs="Times New Roman"/>
+          <w:sz w:val="24"/>
+          <w:lang w:val="en-IN"/>
+        </w:rPr>
+      </w:pPr>
+      <w:r>
+        <w:rPr>
+          <w:rFonts w:ascii="Times New Roman" w:hAnsi="Times New Roman" w:cs="Times New Roman"/>
+          <w:noProof/>
+          <w:sz w:val="24"/>
+          <w:lang w:val="en-IN"/>
+        </w:rPr>
+        <w:drawing>
+          <wp:inline distT="0" distB="0" distL="0" distR="0" wp14:anchorId="75CA06E8" wp14:editId="3A03925F">
+            <wp:extent cx="6120130" cy="3373120"/>
+            <wp:effectExtent l="0" t="0" r="0" b="0"/>
+            <wp:docPr id="52" name="Immagine 52"/>
+            <wp:cNvGraphicFramePr>
+              <a:graphicFrameLocks xmlns:a="http://schemas.openxmlformats.org/drawingml/2006/main" noChangeAspect="1"/>
+            </wp:cNvGraphicFramePr>
+            <a:graphic xmlns:a="http://schemas.openxmlformats.org/drawingml/2006/main">
+              <a:graphicData uri="http://schemas.openxmlformats.org/drawingml/2006/picture">
+                <pic:pic xmlns:pic="http://schemas.openxmlformats.org/drawingml/2006/picture">
+                  <pic:nvPicPr>
+                    <pic:cNvPr id="52" name="price elasticity.png"/>
+                    <pic:cNvPicPr/>
+                  </pic:nvPicPr>
+                  <pic:blipFill>
+                    <a:blip r:embed="rId26">
+                      <a:extLst>
+                        <a:ext uri="{28A0092B-C50C-407E-A947-70E740481C1C}">
+                          <a14:useLocalDpi xmlns:a14="http://schemas.microsoft.com/office/drawing/2010/main" val="0"/>
+                        </a:ext>
+                      </a:extLst>
+                    </a:blip>
+                    <a:stretch>
+                      <a:fillRect/>
+                    </a:stretch>
+                  </pic:blipFill>
+                  <pic:spPr>
+                    <a:xfrm>
+                      <a:off x="0" y="0"/>
+                      <a:ext cx="6120130" cy="3373120"/>
+                    </a:xfrm>
+                    <a:prstGeom prst="rect">
+                      <a:avLst/>
+                    </a:prstGeom>
+                  </pic:spPr>
+                </pic:pic>
+              </a:graphicData>
+            </a:graphic>
+          </wp:inline>
+        </w:drawing>
+      </w:r>
+    </w:p>
+    <w:p>
+      <w:pPr>
+        <w:jc w:val="both"/>
+        <w:rPr>
+          <w:rFonts w:ascii="Times New Roman" w:hAnsi="Times New Roman" w:cs="Times New Roman"/>
+          <w:sz w:val="24"/>
+          <w:lang w:val="en-IN"/>
+        </w:rPr>
+      </w:pPr>
+    </w:p>
+    <w:p>
+      <w:pPr>
+        <w:jc w:val="both"/>
+        <w:rPr>
+          <w:rFonts w:ascii="Times New Roman" w:hAnsi="Times New Roman" w:cs="Times New Roman"/>
+          <w:sz w:val="24"/>
+          <w:lang w:val="en-IN"/>
+        </w:rPr>
+      </w:pPr>
+    </w:p>
+    <w:p>
+      <w:pPr>
+        <w:pStyle w:val="Titolo2"/>
+        <w:rPr>
+          <w:b/>
+          <w:lang w:val="en-IN"/>
+        </w:rPr>
+      </w:pPr>
+      <w:r>
+        <w:rPr>
+          <w:b/>
+          <w:lang w:val="en-IN"/>
+        </w:rPr>
+        <w:lastRenderedPageBreak/>
+        <w:t xml:space="preserve">6.4 </w:t>
+      </w:r>
+      <w:r>
+        <w:rPr>
+          <w:b/>
+          <w:lang w:val="en-IN"/>
+        </w:rPr>
+        <w:t>Product Motif Revenue Performance</w:t>
+      </w:r>
+    </w:p>
+    <w:p>
+      <w:pPr>
+        <w:pStyle w:val="NormaleWeb"/>
+        <w:spacing w:line="276" w:lineRule="auto"/>
+        <w:jc w:val="both"/>
+        <w:rPr>
+          <w:lang w:val="en-IN"/>
+        </w:rPr>
+      </w:pPr>
+      <w:r>
+        <w:rPr>
+          <w:lang w:val="en-IN"/>
+        </w:rPr>
+        <w:t xml:space="preserve">The analysis of revenue distribution across product motifs reveals a highly concentrated performance profile, characteristic of a "power law" distribution within the Schumacher portfolio. The </w:t>
+      </w:r>
+      <w:r>
+        <w:rPr>
+          <w:b/>
+          <w:bCs/>
+          <w:lang w:val="en-IN"/>
+        </w:rPr>
+        <w:t>Plain/Solid</w:t>
+      </w:r>
+      <w:r>
+        <w:rPr>
+          <w:lang w:val="en-IN"/>
+        </w:rPr>
+        <w:t xml:space="preserve"> motif stands as the definitive anchor of the business, generating the highest net revenue. This suggests that while Schumacher is celebrated for its decorative heritage, its financial foundation is built on versatile, foundational elements that serve as the "canvas" for interior design projects. From a strategic standpoint, this indicates that the "Plain/Solid" category acts as a primary entry point for trade professionals, likely seeing high attachment rates with more decorative, high-margin patterned items.</w:t>
+      </w:r>
+    </w:p>
+    <w:p>
+      <w:pPr>
+        <w:pStyle w:val="NormaleWeb"/>
+        <w:spacing w:line="276" w:lineRule="auto"/>
+        <w:jc w:val="both"/>
+        <w:rPr>
+          <w:lang w:val="en-IN"/>
+        </w:rPr>
+      </w:pPr>
+      <w:r>
+        <w:rPr>
+          <w:lang w:val="en-IN"/>
+        </w:rPr>
+        <w:t xml:space="preserve">Beyond the foundational solids, the secondary tier of performance is driven by </w:t>
+      </w:r>
+      <w:r>
+        <w:rPr>
+          <w:b/>
+          <w:bCs/>
+          <w:lang w:val="en-IN"/>
+        </w:rPr>
+        <w:t>Floral, Texture, and Geometric</w:t>
+      </w:r>
+      <w:r>
+        <w:rPr>
+          <w:lang w:val="en-IN"/>
+        </w:rPr>
+        <w:t xml:space="preserve"> motifs. These categories represent the "design identity" of the brand. The strong performance of "Texture" suggests a growing market preference for tactile luxury</w:t>
+      </w:r>
+      <w:r>
+        <w:rPr>
+          <w:lang w:val="en-IN"/>
+        </w:rPr>
+        <w:t xml:space="preserve"> </w:t>
+      </w:r>
+      <w:r>
+        <w:rPr>
+          <w:lang w:val="en-IN"/>
+        </w:rPr>
+        <w:t>where the aesthetic value is derived from the weave and hand-feel rather than high-contrast patterns. In a predictive personalization model, these motifs should be treated as "Style Anchors." By identifying which secondary motif a customer gravitates toward after selecting a solid, the recommendation engine can accurately predict their "Design Persona" (e.g., Traditionalist/Floral vs. Modernist/Geometric), allowing for more hyper-localized marketing spend.</w:t>
+      </w:r>
+    </w:p>
+    <w:p>
+      <w:pPr>
+        <w:pStyle w:val="NormaleWeb"/>
+        <w:spacing w:line="276" w:lineRule="auto"/>
+        <w:jc w:val="both"/>
+        <w:rPr>
+          <w:lang w:val="en-IN"/>
+        </w:rPr>
+      </w:pPr>
+      <w:r>
+        <w:rPr>
+          <w:lang w:val="en-IN"/>
+        </w:rPr>
+        <w:t>Furthermore, the "long tail" of the motif distribution</w:t>
+      </w:r>
+      <w:r>
+        <w:rPr>
+          <w:lang w:val="en-IN"/>
+        </w:rPr>
+        <w:t xml:space="preserve"> </w:t>
+      </w:r>
+      <w:r>
+        <w:rPr>
+          <w:lang w:val="en-IN"/>
+        </w:rPr>
+        <w:t xml:space="preserve">including </w:t>
+      </w:r>
+      <w:r>
+        <w:rPr>
+          <w:b/>
+          <w:bCs/>
+          <w:lang w:val="en-IN"/>
+        </w:rPr>
+        <w:t>Stripes, Animal Prints, and Toiles</w:t>
+      </w:r>
+      <w:r>
+        <w:rPr>
+          <w:lang w:val="en-IN"/>
+        </w:rPr>
+        <w:t xml:space="preserve"> </w:t>
+      </w:r>
+      <w:r>
+        <w:rPr>
+          <w:lang w:val="en-IN"/>
+        </w:rPr>
+        <w:t xml:space="preserve">highlights a critical opportunity for niche market dominance. While these motifs contribute less to total aggregate revenue, they often carry a "Vocal Brand Identity." For a luxury leader like Schumacher, these motifs are essential for maintaining a high-fashion perception. In a technical "Sample-to-Sale" funnel analysis, these lower-volume motifs often exhibit higher conversion rates among elite trade accounts. Therefore, the data suggests a dual-path inventory strategy: high-volume stocking for "Plain/Solid" to ensure </w:t>
+      </w:r>
+      <w:r>
+        <w:rPr>
+          <w:lang w:val="en-IN"/>
+        </w:rPr>
+        <w:t>fulfilment</w:t>
+      </w:r>
+      <w:r>
+        <w:rPr>
+          <w:lang w:val="en-IN"/>
+        </w:rPr>
+        <w:t xml:space="preserve"> speed, and "Just-in-Time" or curated sampling for specialty motifs to maximize warehouse efficiency without sacrificing the brand’s diverse aesthetic appeal.</w:t>
+      </w:r>
+    </w:p>
+    <w:p>
+      <w:pPr>
+        <w:pStyle w:val="NormaleWeb"/>
+        <w:spacing w:line="276" w:lineRule="auto"/>
+        <w:jc w:val="both"/>
+        <w:rPr>
+          <w:lang w:val="en-IN"/>
+        </w:rPr>
+      </w:pPr>
+      <w:r>
+        <w:rPr>
+          <w:noProof/>
+          <w:lang w:val="en-IN"/>
+        </w:rPr>
+        <w:drawing>
+          <wp:anchor distT="0" distB="0" distL="114300" distR="114300" simplePos="0" relativeHeight="251672576" behindDoc="1" locked="0" layoutInCell="1" allowOverlap="1" wp14:anchorId="728D365F" wp14:editId="295E4CBB">
+            <wp:simplePos x="0" y="0"/>
+            <wp:positionH relativeFrom="margin">
+              <wp:align>center</wp:align>
+            </wp:positionH>
+            <wp:positionV relativeFrom="paragraph">
+              <wp:posOffset>-154830</wp:posOffset>
+            </wp:positionV>
+            <wp:extent cx="5229108" cy="3217871"/>
+            <wp:effectExtent l="0" t="0" r="0" b="1905"/>
+            <wp:wrapTight wrapText="bothSides">
+              <wp:wrapPolygon edited="0">
+                <wp:start x="0" y="0"/>
+                <wp:lineTo x="0" y="21485"/>
+                <wp:lineTo x="21485" y="21485"/>
+                <wp:lineTo x="21485" y="0"/>
+                <wp:lineTo x="0" y="0"/>
+              </wp:wrapPolygon>
+            </wp:wrapTight>
+            <wp:docPr id="53" name="Immagine 53"/>
+            <wp:cNvGraphicFramePr>
+              <a:graphicFrameLocks xmlns:a="http://schemas.openxmlformats.org/drawingml/2006/main" noChangeAspect="1"/>
+            </wp:cNvGraphicFramePr>
+            <a:graphic xmlns:a="http://schemas.openxmlformats.org/drawingml/2006/main">
+              <a:graphicData uri="http://schemas.openxmlformats.org/drawingml/2006/picture">
+                <pic:pic xmlns:pic="http://schemas.openxmlformats.org/drawingml/2006/picture">
+                  <pic:nvPicPr>
+                    <pic:cNvPr id="53" name="motifs.png"/>
+                    <pic:cNvPicPr/>
+                  </pic:nvPicPr>
+                  <pic:blipFill>
+                    <a:blip r:embed="rId27">
+                      <a:extLst>
+                        <a:ext uri="{28A0092B-C50C-407E-A947-70E740481C1C}">
+                          <a14:useLocalDpi xmlns:a14="http://schemas.microsoft.com/office/drawing/2010/main" val="0"/>
+                        </a:ext>
+                      </a:extLst>
+                    </a:blip>
+                    <a:stretch>
+                      <a:fillRect/>
+                    </a:stretch>
+                  </pic:blipFill>
+                  <pic:spPr>
+                    <a:xfrm>
+                      <a:off x="0" y="0"/>
+                      <a:ext cx="5229108" cy="3217871"/>
+                    </a:xfrm>
+                    <a:prstGeom prst="rect">
+                      <a:avLst/>
+                    </a:prstGeom>
+                  </pic:spPr>
+                </pic:pic>
+              </a:graphicData>
+            </a:graphic>
+            <wp14:sizeRelH relativeFrom="margin">
+              <wp14:pctWidth>0</wp14:pctWidth>
+            </wp14:sizeRelH>
+            <wp14:sizeRelV relativeFrom="margin">
+              <wp14:pctHeight>0</wp14:pctHeight>
+            </wp14:sizeRelV>
+          </wp:anchor>
+        </w:drawing>
+      </w:r>
+    </w:p>
+    <w:p>
+      <w:pPr>
+        <w:rPr>
+          <w:rFonts w:ascii="Times New Roman" w:hAnsi="Times New Roman" w:cs="Times New Roman"/>
+          <w:sz w:val="24"/>
+          <w:lang w:val="en-IN"/>
+        </w:rPr>
+      </w:pPr>
+    </w:p>
+    <w:p>
+      <w:pPr>
+        <w:rPr>
+          <w:rFonts w:ascii="Times New Roman" w:hAnsi="Times New Roman" w:cs="Times New Roman"/>
+          <w:sz w:val="24"/>
+          <w:lang w:val="en-IN"/>
+        </w:rPr>
+      </w:pPr>
+      <w:r>
+        <w:rPr>
+          <w:rFonts w:ascii="Times New Roman" w:hAnsi="Times New Roman" w:cs="Times New Roman"/>
+          <w:sz w:val="24"/>
+          <w:lang w:val="en-IN"/>
+        </w:rPr>
+        <w:br w:type="page"/>
+      </w:r>
+    </w:p>
+    <w:p>
+      <w:pPr>
+        <w:pStyle w:val="Titolo1"/>
+        <w:rPr>
+          <w:rFonts w:ascii="Times New Roman" w:hAnsi="Times New Roman" w:cs="Times New Roman"/>
+          <w:b/>
+          <w:sz w:val="24"/>
+          <w:lang w:val="en-IN"/>
+        </w:rPr>
+      </w:pPr>
+      <w:r>
+        <w:rPr>
+          <w:b/>
+          <w:lang w:val="en-IN"/>
+        </w:rPr>
+        <w:lastRenderedPageBreak/>
+        <w:t xml:space="preserve">7.0 </w:t>
+      </w:r>
+      <w:r>
+        <w:rPr>
+          <w:b/>
+          <w:lang w:val="en-IN"/>
+        </w:rPr>
+        <w:t>Architectural Design of the Personalized Recommendation Engine</w:t>
+      </w:r>
+    </w:p>
+    <w:p>
+      <w:pPr>
+        <w:jc w:val="both"/>
+        <w:rPr>
+          <w:rFonts w:ascii="Times New Roman" w:hAnsi="Times New Roman" w:cs="Times New Roman"/>
+          <w:sz w:val="24"/>
+          <w:lang w:val="en-IN"/>
+        </w:rPr>
+      </w:pPr>
+      <w:r>
+        <w:rPr>
+          <w:rFonts w:ascii="Times New Roman" w:hAnsi="Times New Roman" w:cs="Times New Roman"/>
+          <w:sz w:val="24"/>
+          <w:lang w:val="en-IN"/>
+        </w:rPr>
+        <w:t>The core of the Schumacher Luxe Intelligence platform is a proprietary Recommendation Engine designed to automate personalized product discovery for trade professionals. Unlike generic retail algorithms, this engine is engineered to respect the 'Design Lifecycle'</w:t>
+      </w:r>
+      <w:r>
+        <w:rPr>
+          <w:rFonts w:ascii="Times New Roman" w:hAnsi="Times New Roman" w:cs="Times New Roman"/>
+          <w:sz w:val="24"/>
+          <w:lang w:val="en-IN"/>
+        </w:rPr>
+        <w:t xml:space="preserve"> </w:t>
+      </w:r>
+      <w:r>
+        <w:rPr>
+          <w:rFonts w:ascii="Times New Roman" w:hAnsi="Times New Roman" w:cs="Times New Roman"/>
+          <w:sz w:val="24"/>
+          <w:lang w:val="en-IN"/>
+        </w:rPr>
+        <w:t xml:space="preserve">understanding that a designer's journey typically begins with a sample and matures into a high-value sale. By leveraging the </w:t>
+      </w:r>
+      <w:r>
+        <w:rPr>
+          <w:rFonts w:ascii="Times New Roman" w:hAnsi="Times New Roman" w:cs="Times New Roman"/>
+          <w:b/>
+          <w:bCs/>
+          <w:sz w:val="24"/>
+          <w:lang w:val="en-IN"/>
+        </w:rPr>
+        <w:t>Cluster-based Collaborative Filtering</w:t>
+      </w:r>
+      <w:r>
+        <w:rPr>
+          <w:rFonts w:ascii="Times New Roman" w:hAnsi="Times New Roman" w:cs="Times New Roman"/>
+          <w:sz w:val="24"/>
+          <w:lang w:val="en-IN"/>
+        </w:rPr>
+        <w:t xml:space="preserve"> approach, the system identifies high-affinity products based on the collective </w:t>
+      </w:r>
+      <w:r>
+        <w:rPr>
+          <w:rFonts w:ascii="Times New Roman" w:hAnsi="Times New Roman" w:cs="Times New Roman"/>
+          <w:sz w:val="24"/>
+          <w:lang w:val="en-IN"/>
+        </w:rPr>
+        <w:t>behaviour</w:t>
+      </w:r>
+      <w:bookmarkStart w:id="1" w:name="_GoBack"/>
+      <w:bookmarkEnd w:id="1"/>
+      <w:r>
+        <w:rPr>
+          <w:rFonts w:ascii="Times New Roman" w:hAnsi="Times New Roman" w:cs="Times New Roman"/>
+          <w:sz w:val="24"/>
+          <w:lang w:val="en-IN"/>
+        </w:rPr>
+        <w:t xml:space="preserve"> of similar design 'Personas' (e.g., VIP Champions vs. Loyal General Trade).</w:t>
+      </w:r>
+    </w:p>
     <w:sectPr>
-      <w:headerReference w:type="even" r:id="rId23"/>
-      <w:headerReference w:type="default" r:id="rId24"/>
-      <w:footerReference w:type="even" r:id="rId25"/>
-      <w:footerReference w:type="default" r:id="rId26"/>
-      <w:headerReference w:type="first" r:id="rId27"/>
-      <w:footerReference w:type="first" r:id="rId28"/>
+      <w:headerReference w:type="even" r:id="rId28"/>
+      <w:headerReference w:type="default" r:id="rId29"/>
+      <w:footerReference w:type="even" r:id="rId30"/>
+      <w:footerReference w:type="default" r:id="rId31"/>
+      <w:headerReference w:type="first" r:id="rId32"/>
+      <w:footerReference w:type="first" r:id="rId33"/>
       <w:pgSz w:w="11906" w:h="16838"/>
       <w:pgMar w:top="1417" w:right="1134" w:bottom="1134" w:left="1134" w:header="708" w:footer="708" w:gutter="0"/>
       <w:pgNumType w:start="0"/>
@@ -33773,9 +36890,9 @@
     </w:lvl>
   </w:abstractNum>
   <w:abstractNum w:abstractNumId="3" w15:restartNumberingAfterBreak="0">
-    <w:nsid w:val="146D41AA"/>
+    <w:nsid w:val="0FE32905"/>
     <w:multiLevelType w:val="multilevel"/>
-    <w:tmpl w:val="9306C8B4"/>
+    <w:tmpl w:val="D64004C2"/>
     <w:lvl w:ilvl="0">
       <w:start w:val="1"/>
       <w:numFmt w:val="bullet"/>
@@ -33922,6 +37039,155 @@
     </w:lvl>
   </w:abstractNum>
   <w:abstractNum w:abstractNumId="4" w15:restartNumberingAfterBreak="0">
+    <w:nsid w:val="146D41AA"/>
+    <w:multiLevelType w:val="multilevel"/>
+    <w:tmpl w:val="9306C8B4"/>
+    <w:lvl w:ilvl="0">
+      <w:start w:val="1"/>
+      <w:numFmt w:val="bullet"/>
+      <w:lvlText w:val=""/>
+      <w:lvlJc w:val="left"/>
+      <w:pPr>
+        <w:tabs>
+          <w:tab w:val="num" w:pos="720"/>
+        </w:tabs>
+        <w:ind w:left="720" w:hanging="360"/>
+      </w:pPr>
+      <w:rPr>
+        <w:rFonts w:ascii="Symbol" w:hAnsi="Symbol" w:hint="default"/>
+        <w:sz w:val="20"/>
+      </w:rPr>
+    </w:lvl>
+    <w:lvl w:ilvl="1" w:tentative="1">
+      <w:start w:val="1"/>
+      <w:numFmt w:val="bullet"/>
+      <w:lvlText w:val="o"/>
+      <w:lvlJc w:val="left"/>
+      <w:pPr>
+        <w:tabs>
+          <w:tab w:val="num" w:pos="1440"/>
+        </w:tabs>
+        <w:ind w:left="1440" w:hanging="360"/>
+      </w:pPr>
+      <w:rPr>
+        <w:rFonts w:ascii="Courier New" w:hAnsi="Courier New" w:hint="default"/>
+        <w:sz w:val="20"/>
+      </w:rPr>
+    </w:lvl>
+    <w:lvl w:ilvl="2" w:tentative="1">
+      <w:start w:val="1"/>
+      <w:numFmt w:val="bullet"/>
+      <w:lvlText w:val=""/>
+      <w:lvlJc w:val="left"/>
+      <w:pPr>
+        <w:tabs>
+          <w:tab w:val="num" w:pos="2160"/>
+        </w:tabs>
+        <w:ind w:left="2160" w:hanging="360"/>
+      </w:pPr>
+      <w:rPr>
+        <w:rFonts w:ascii="Wingdings" w:hAnsi="Wingdings" w:hint="default"/>
+        <w:sz w:val="20"/>
+      </w:rPr>
+    </w:lvl>
+    <w:lvl w:ilvl="3" w:tentative="1">
+      <w:start w:val="1"/>
+      <w:numFmt w:val="bullet"/>
+      <w:lvlText w:val=""/>
+      <w:lvlJc w:val="left"/>
+      <w:pPr>
+        <w:tabs>
+          <w:tab w:val="num" w:pos="2880"/>
+        </w:tabs>
+        <w:ind w:left="2880" w:hanging="360"/>
+      </w:pPr>
+      <w:rPr>
+        <w:rFonts w:ascii="Wingdings" w:hAnsi="Wingdings" w:hint="default"/>
+        <w:sz w:val="20"/>
+      </w:rPr>
+    </w:lvl>
+    <w:lvl w:ilvl="4" w:tentative="1">
+      <w:start w:val="1"/>
+      <w:numFmt w:val="bullet"/>
+      <w:lvlText w:val=""/>
+      <w:lvlJc w:val="left"/>
+      <w:pPr>
+        <w:tabs>
+          <w:tab w:val="num" w:pos="3600"/>
+        </w:tabs>
+        <w:ind w:left="3600" w:hanging="360"/>
+      </w:pPr>
+      <w:rPr>
+        <w:rFonts w:ascii="Wingdings" w:hAnsi="Wingdings" w:hint="default"/>
+        <w:sz w:val="20"/>
+      </w:rPr>
+    </w:lvl>
+    <w:lvl w:ilvl="5" w:tentative="1">
+      <w:start w:val="1"/>
+      <w:numFmt w:val="bullet"/>
+      <w:lvlText w:val=""/>
+      <w:lvlJc w:val="left"/>
+      <w:pPr>
+        <w:tabs>
+          <w:tab w:val="num" w:pos="4320"/>
+        </w:tabs>
+        <w:ind w:left="4320" w:hanging="360"/>
+      </w:pPr>
+      <w:rPr>
+        <w:rFonts w:ascii="Wingdings" w:hAnsi="Wingdings" w:hint="default"/>
+        <w:sz w:val="20"/>
+      </w:rPr>
+    </w:lvl>
+    <w:lvl w:ilvl="6" w:tentative="1">
+      <w:start w:val="1"/>
+      <w:numFmt w:val="bullet"/>
+      <w:lvlText w:val=""/>
+      <w:lvlJc w:val="left"/>
+      <w:pPr>
+        <w:tabs>
+          <w:tab w:val="num" w:pos="5040"/>
+        </w:tabs>
+        <w:ind w:left="5040" w:hanging="360"/>
+      </w:pPr>
+      <w:rPr>
+        <w:rFonts w:ascii="Wingdings" w:hAnsi="Wingdings" w:hint="default"/>
+        <w:sz w:val="20"/>
+      </w:rPr>
+    </w:lvl>
+    <w:lvl w:ilvl="7" w:tentative="1">
+      <w:start w:val="1"/>
+      <w:numFmt w:val="bullet"/>
+      <w:lvlText w:val=""/>
+      <w:lvlJc w:val="left"/>
+      <w:pPr>
+        <w:tabs>
+          <w:tab w:val="num" w:pos="5760"/>
+        </w:tabs>
+        <w:ind w:left="5760" w:hanging="360"/>
+      </w:pPr>
+      <w:rPr>
+        <w:rFonts w:ascii="Wingdings" w:hAnsi="Wingdings" w:hint="default"/>
+        <w:sz w:val="20"/>
+      </w:rPr>
+    </w:lvl>
+    <w:lvl w:ilvl="8" w:tentative="1">
+      <w:start w:val="1"/>
+      <w:numFmt w:val="bullet"/>
+      <w:lvlText w:val=""/>
+      <w:lvlJc w:val="left"/>
+      <w:pPr>
+        <w:tabs>
+          <w:tab w:val="num" w:pos="6480"/>
+        </w:tabs>
+        <w:ind w:left="6480" w:hanging="360"/>
+      </w:pPr>
+      <w:rPr>
+        <w:rFonts w:ascii="Wingdings" w:hAnsi="Wingdings" w:hint="default"/>
+        <w:sz w:val="20"/>
+      </w:rPr>
+    </w:lvl>
+  </w:abstractNum>
+  <w:abstractNum w:abstractNumId="5" w15:restartNumberingAfterBreak="0">
     <w:nsid w:val="149D0E82"/>
     <w:multiLevelType w:val="multilevel"/>
     <w:tmpl w:val="66CAE502"/>
@@ -34070,10 +37336,10 @@
       </w:rPr>
     </w:lvl>
   </w:abstractNum>
-  <w:abstractNum w:abstractNumId="5" w15:restartNumberingAfterBreak="0">
-    <w:nsid w:val="24477BA3"/>
+  <w:abstractNum w:abstractNumId="6" w15:restartNumberingAfterBreak="0">
+    <w:nsid w:val="1DE216A2"/>
     <w:multiLevelType w:val="multilevel"/>
-    <w:tmpl w:val="CB622780"/>
+    <w:tmpl w:val="DEA63B06"/>
     <w:lvl w:ilvl="0">
       <w:start w:val="1"/>
       <w:numFmt w:val="bullet"/>
@@ -34219,10 +37485,10 @@
       </w:rPr>
     </w:lvl>
   </w:abstractNum>
-  <w:abstractNum w:abstractNumId="6" w15:restartNumberingAfterBreak="0">
-    <w:nsid w:val="2D350C81"/>
+  <w:abstractNum w:abstractNumId="7" w15:restartNumberingAfterBreak="0">
+    <w:nsid w:val="24477BA3"/>
     <w:multiLevelType w:val="multilevel"/>
-    <w:tmpl w:val="AE989244"/>
+    <w:tmpl w:val="CB622780"/>
     <w:lvl w:ilvl="0">
       <w:start w:val="1"/>
       <w:numFmt w:val="bullet"/>
@@ -34368,7 +37634,156 @@
       </w:rPr>
     </w:lvl>
   </w:abstractNum>
-  <w:abstractNum w:abstractNumId="7" w15:restartNumberingAfterBreak="0">
+  <w:abstractNum w:abstractNumId="8" w15:restartNumberingAfterBreak="0">
+    <w:nsid w:val="2D350C81"/>
+    <w:multiLevelType w:val="multilevel"/>
+    <w:tmpl w:val="AE989244"/>
+    <w:lvl w:ilvl="0">
+      <w:start w:val="1"/>
+      <w:numFmt w:val="bullet"/>
+      <w:lvlText w:val=""/>
+      <w:lvlJc w:val="left"/>
+      <w:pPr>
+        <w:tabs>
+          <w:tab w:val="num" w:pos="720"/>
+        </w:tabs>
+        <w:ind w:left="720" w:hanging="360"/>
+      </w:pPr>
+      <w:rPr>
+        <w:rFonts w:ascii="Symbol" w:hAnsi="Symbol" w:hint="default"/>
+        <w:sz w:val="20"/>
+      </w:rPr>
+    </w:lvl>
+    <w:lvl w:ilvl="1" w:tentative="1">
+      <w:start w:val="1"/>
+      <w:numFmt w:val="bullet"/>
+      <w:lvlText w:val="o"/>
+      <w:lvlJc w:val="left"/>
+      <w:pPr>
+        <w:tabs>
+          <w:tab w:val="num" w:pos="1440"/>
+        </w:tabs>
+        <w:ind w:left="1440" w:hanging="360"/>
+      </w:pPr>
+      <w:rPr>
+        <w:rFonts w:ascii="Courier New" w:hAnsi="Courier New" w:hint="default"/>
+        <w:sz w:val="20"/>
+      </w:rPr>
+    </w:lvl>
+    <w:lvl w:ilvl="2" w:tentative="1">
+      <w:start w:val="1"/>
+      <w:numFmt w:val="bullet"/>
+      <w:lvlText w:val=""/>
+      <w:lvlJc w:val="left"/>
+      <w:pPr>
+        <w:tabs>
+          <w:tab w:val="num" w:pos="2160"/>
+        </w:tabs>
+        <w:ind w:left="2160" w:hanging="360"/>
+      </w:pPr>
+      <w:rPr>
+        <w:rFonts w:ascii="Wingdings" w:hAnsi="Wingdings" w:hint="default"/>
+        <w:sz w:val="20"/>
+      </w:rPr>
+    </w:lvl>
+    <w:lvl w:ilvl="3" w:tentative="1">
+      <w:start w:val="1"/>
+      <w:numFmt w:val="bullet"/>
+      <w:lvlText w:val=""/>
+      <w:lvlJc w:val="left"/>
+      <w:pPr>
+        <w:tabs>
+          <w:tab w:val="num" w:pos="2880"/>
+        </w:tabs>
+        <w:ind w:left="2880" w:hanging="360"/>
+      </w:pPr>
+      <w:rPr>
+        <w:rFonts w:ascii="Wingdings" w:hAnsi="Wingdings" w:hint="default"/>
+        <w:sz w:val="20"/>
+      </w:rPr>
+    </w:lvl>
+    <w:lvl w:ilvl="4" w:tentative="1">
+      <w:start w:val="1"/>
+      <w:numFmt w:val="bullet"/>
+      <w:lvlText w:val=""/>
+      <w:lvlJc w:val="left"/>
+      <w:pPr>
+        <w:tabs>
+          <w:tab w:val="num" w:pos="3600"/>
+        </w:tabs>
+        <w:ind w:left="3600" w:hanging="360"/>
+      </w:pPr>
+      <w:rPr>
+        <w:rFonts w:ascii="Wingdings" w:hAnsi="Wingdings" w:hint="default"/>
+        <w:sz w:val="20"/>
+      </w:rPr>
+    </w:lvl>
+    <w:lvl w:ilvl="5" w:tentative="1">
+      <w:start w:val="1"/>
+      <w:numFmt w:val="bullet"/>
+      <w:lvlText w:val=""/>
+      <w:lvlJc w:val="left"/>
+      <w:pPr>
+        <w:tabs>
+          <w:tab w:val="num" w:pos="4320"/>
+        </w:tabs>
+        <w:ind w:left="4320" w:hanging="360"/>
+      </w:pPr>
+      <w:rPr>
+        <w:rFonts w:ascii="Wingdings" w:hAnsi="Wingdings" w:hint="default"/>
+        <w:sz w:val="20"/>
+      </w:rPr>
+    </w:lvl>
+    <w:lvl w:ilvl="6" w:tentative="1">
+      <w:start w:val="1"/>
+      <w:numFmt w:val="bullet"/>
+      <w:lvlText w:val=""/>
+      <w:lvlJc w:val="left"/>
+      <w:pPr>
+        <w:tabs>
+          <w:tab w:val="num" w:pos="5040"/>
+        </w:tabs>
+        <w:ind w:left="5040" w:hanging="360"/>
+      </w:pPr>
+      <w:rPr>
+        <w:rFonts w:ascii="Wingdings" w:hAnsi="Wingdings" w:hint="default"/>
+        <w:sz w:val="20"/>
+      </w:rPr>
+    </w:lvl>
+    <w:lvl w:ilvl="7" w:tentative="1">
+      <w:start w:val="1"/>
+      <w:numFmt w:val="bullet"/>
+      <w:lvlText w:val=""/>
+      <w:lvlJc w:val="left"/>
+      <w:pPr>
+        <w:tabs>
+          <w:tab w:val="num" w:pos="5760"/>
+        </w:tabs>
+        <w:ind w:left="5760" w:hanging="360"/>
+      </w:pPr>
+      <w:rPr>
+        <w:rFonts w:ascii="Wingdings" w:hAnsi="Wingdings" w:hint="default"/>
+        <w:sz w:val="20"/>
+      </w:rPr>
+    </w:lvl>
+    <w:lvl w:ilvl="8" w:tentative="1">
+      <w:start w:val="1"/>
+      <w:numFmt w:val="bullet"/>
+      <w:lvlText w:val=""/>
+      <w:lvlJc w:val="left"/>
+      <w:pPr>
+        <w:tabs>
+          <w:tab w:val="num" w:pos="6480"/>
+        </w:tabs>
+        <w:ind w:left="6480" w:hanging="360"/>
+      </w:pPr>
+      <w:rPr>
+        <w:rFonts w:ascii="Wingdings" w:hAnsi="Wingdings" w:hint="default"/>
+        <w:sz w:val="20"/>
+      </w:rPr>
+    </w:lvl>
+  </w:abstractNum>
+  <w:abstractNum w:abstractNumId="9" w15:restartNumberingAfterBreak="0">
     <w:nsid w:val="326E687B"/>
     <w:multiLevelType w:val="multilevel"/>
     <w:tmpl w:val="F61899F0"/>
@@ -34517,7 +37932,7 @@
       </w:rPr>
     </w:lvl>
   </w:abstractNum>
-  <w:abstractNum w:abstractNumId="8" w15:restartNumberingAfterBreak="0">
+  <w:abstractNum w:abstractNumId="10" w15:restartNumberingAfterBreak="0">
     <w:nsid w:val="331A337C"/>
     <w:multiLevelType w:val="multilevel"/>
     <w:tmpl w:val="C9126180"/>
@@ -34666,7 +38081,7 @@
       </w:rPr>
     </w:lvl>
   </w:abstractNum>
-  <w:abstractNum w:abstractNumId="9" w15:restartNumberingAfterBreak="0">
+  <w:abstractNum w:abstractNumId="11" w15:restartNumberingAfterBreak="0">
     <w:nsid w:val="41563C19"/>
     <w:multiLevelType w:val="multilevel"/>
     <w:tmpl w:val="AFFCFCB8"/>
@@ -34815,7 +38230,7 @@
       </w:rPr>
     </w:lvl>
   </w:abstractNum>
-  <w:abstractNum w:abstractNumId="10" w15:restartNumberingAfterBreak="0">
+  <w:abstractNum w:abstractNumId="12" w15:restartNumberingAfterBreak="0">
     <w:nsid w:val="4A032203"/>
     <w:multiLevelType w:val="multilevel"/>
     <w:tmpl w:val="F878B722"/>
@@ -34964,10 +38379,10 @@
       </w:rPr>
     </w:lvl>
   </w:abstractNum>
-  <w:abstractNum w:abstractNumId="11" w15:restartNumberingAfterBreak="0">
-    <w:nsid w:val="4C5F1244"/>
+  <w:abstractNum w:abstractNumId="13" w15:restartNumberingAfterBreak="0">
+    <w:nsid w:val="4A991C2F"/>
     <w:multiLevelType w:val="multilevel"/>
-    <w:tmpl w:val="C8261270"/>
+    <w:tmpl w:val="E576776A"/>
     <w:lvl w:ilvl="0">
       <w:start w:val="1"/>
       <w:numFmt w:val="bullet"/>
@@ -35113,10 +38528,10 @@
       </w:rPr>
     </w:lvl>
   </w:abstractNum>
-  <w:abstractNum w:abstractNumId="12" w15:restartNumberingAfterBreak="0">
-    <w:nsid w:val="4E584770"/>
+  <w:abstractNum w:abstractNumId="14" w15:restartNumberingAfterBreak="0">
+    <w:nsid w:val="4C5F1244"/>
     <w:multiLevelType w:val="multilevel"/>
-    <w:tmpl w:val="9E6C03F2"/>
+    <w:tmpl w:val="C8261270"/>
     <w:lvl w:ilvl="0">
       <w:start w:val="1"/>
       <w:numFmt w:val="bullet"/>
@@ -35262,10 +38677,10 @@
       </w:rPr>
     </w:lvl>
   </w:abstractNum>
-  <w:abstractNum w:abstractNumId="13" w15:restartNumberingAfterBreak="0">
-    <w:nsid w:val="661F0FC9"/>
+  <w:abstractNum w:abstractNumId="15" w15:restartNumberingAfterBreak="0">
+    <w:nsid w:val="4E584770"/>
     <w:multiLevelType w:val="multilevel"/>
-    <w:tmpl w:val="7A187616"/>
+    <w:tmpl w:val="9E6C03F2"/>
     <w:lvl w:ilvl="0">
       <w:start w:val="1"/>
       <w:numFmt w:val="bullet"/>
@@ -35411,123 +38826,10 @@
       </w:rPr>
     </w:lvl>
   </w:abstractNum>
-  <w:abstractNum w:abstractNumId="14" w15:restartNumberingAfterBreak="0">
-    <w:nsid w:val="73695714"/>
-    <w:multiLevelType w:val="hybridMultilevel"/>
-    <w:tmpl w:val="A43C27A8"/>
-    <w:lvl w:ilvl="0" w:tplc="04100001">
-      <w:start w:val="1"/>
-      <w:numFmt w:val="bullet"/>
-      <w:lvlText w:val=""/>
-      <w:lvlJc w:val="left"/>
-      <w:pPr>
-        <w:ind w:left="720" w:hanging="360"/>
-      </w:pPr>
-      <w:rPr>
-        <w:rFonts w:ascii="Symbol" w:hAnsi="Symbol" w:hint="default"/>
-      </w:rPr>
-    </w:lvl>
-    <w:lvl w:ilvl="1" w:tplc="04100003" w:tentative="1">
-      <w:start w:val="1"/>
-      <w:numFmt w:val="bullet"/>
-      <w:lvlText w:val="o"/>
-      <w:lvlJc w:val="left"/>
-      <w:pPr>
-        <w:ind w:left="1440" w:hanging="360"/>
-      </w:pPr>
-      <w:rPr>
-        <w:rFonts w:ascii="Courier New" w:hAnsi="Courier New" w:cs="Courier New" w:hint="default"/>
-      </w:rPr>
-    </w:lvl>
-    <w:lvl w:ilvl="2" w:tplc="04100005" w:tentative="1">
-      <w:start w:val="1"/>
-      <w:numFmt w:val="bullet"/>
-      <w:lvlText w:val=""/>
-      <w:lvlJc w:val="left"/>
-      <w:pPr>
-        <w:ind w:left="2160" w:hanging="360"/>
-      </w:pPr>
-      <w:rPr>
-        <w:rFonts w:ascii="Wingdings" w:hAnsi="Wingdings" w:hint="default"/>
-      </w:rPr>
-    </w:lvl>
-    <w:lvl w:ilvl="3" w:tplc="04100001" w:tentative="1">
-      <w:start w:val="1"/>
-      <w:numFmt w:val="bullet"/>
-      <w:lvlText w:val=""/>
-      <w:lvlJc w:val="left"/>
-      <w:pPr>
-        <w:ind w:left="2880" w:hanging="360"/>
-      </w:pPr>
-      <w:rPr>
-        <w:rFonts w:ascii="Symbol" w:hAnsi="Symbol" w:hint="default"/>
-      </w:rPr>
-    </w:lvl>
-    <w:lvl w:ilvl="4" w:tplc="04100003" w:tentative="1">
-      <w:start w:val="1"/>
-      <w:numFmt w:val="bullet"/>
-      <w:lvlText w:val="o"/>
-      <w:lvlJc w:val="left"/>
-      <w:pPr>
-        <w:ind w:left="3600" w:hanging="360"/>
-      </w:pPr>
-      <w:rPr>
-        <w:rFonts w:ascii="Courier New" w:hAnsi="Courier New" w:cs="Courier New" w:hint="default"/>
-      </w:rPr>
-    </w:lvl>
-    <w:lvl w:ilvl="5" w:tplc="04100005" w:tentative="1">
-      <w:start w:val="1"/>
-      <w:numFmt w:val="bullet"/>
-      <w:lvlText w:val=""/>
-      <w:lvlJc w:val="left"/>
-      <w:pPr>
-        <w:ind w:left="4320" w:hanging="360"/>
-      </w:pPr>
-      <w:rPr>
-        <w:rFonts w:ascii="Wingdings" w:hAnsi="Wingdings" w:hint="default"/>
-      </w:rPr>
-    </w:lvl>
-    <w:lvl w:ilvl="6" w:tplc="04100001" w:tentative="1">
-      <w:start w:val="1"/>
-      <w:numFmt w:val="bullet"/>
-      <w:lvlText w:val=""/>
-      <w:lvlJc w:val="left"/>
-      <w:pPr>
-        <w:ind w:left="5040" w:hanging="360"/>
-      </w:pPr>
-      <w:rPr>
-        <w:rFonts w:ascii="Symbol" w:hAnsi="Symbol" w:hint="default"/>
-      </w:rPr>
-    </w:lvl>
-    <w:lvl w:ilvl="7" w:tplc="04100003" w:tentative="1">
-      <w:start w:val="1"/>
-      <w:numFmt w:val="bullet"/>
-      <w:lvlText w:val="o"/>
-      <w:lvlJc w:val="left"/>
-      <w:pPr>
-        <w:ind w:left="5760" w:hanging="360"/>
-      </w:pPr>
-      <w:rPr>
-        <w:rFonts w:ascii="Courier New" w:hAnsi="Courier New" w:cs="Courier New" w:hint="default"/>
-      </w:rPr>
-    </w:lvl>
-    <w:lvl w:ilvl="8" w:tplc="04100005" w:tentative="1">
-      <w:start w:val="1"/>
-      <w:numFmt w:val="bullet"/>
-      <w:lvlText w:val=""/>
-      <w:lvlJc w:val="left"/>
-      <w:pPr>
-        <w:ind w:left="6480" w:hanging="360"/>
-      </w:pPr>
-      <w:rPr>
-        <w:rFonts w:ascii="Wingdings" w:hAnsi="Wingdings" w:hint="default"/>
-      </w:rPr>
-    </w:lvl>
-  </w:abstractNum>
-  <w:abstractNum w:abstractNumId="15" w15:restartNumberingAfterBreak="0">
-    <w:nsid w:val="75297974"/>
+  <w:abstractNum w:abstractNumId="16" w15:restartNumberingAfterBreak="0">
+    <w:nsid w:val="661F0FC9"/>
     <w:multiLevelType w:val="multilevel"/>
-    <w:tmpl w:val="69E284EC"/>
+    <w:tmpl w:val="7A187616"/>
     <w:lvl w:ilvl="0">
       <w:start w:val="1"/>
       <w:numFmt w:val="bullet"/>
@@ -35673,10 +38975,123 @@
       </w:rPr>
     </w:lvl>
   </w:abstractNum>
-  <w:abstractNum w:abstractNumId="16" w15:restartNumberingAfterBreak="0">
-    <w:nsid w:val="7D47637C"/>
+  <w:abstractNum w:abstractNumId="17" w15:restartNumberingAfterBreak="0">
+    <w:nsid w:val="73695714"/>
+    <w:multiLevelType w:val="hybridMultilevel"/>
+    <w:tmpl w:val="A43C27A8"/>
+    <w:lvl w:ilvl="0" w:tplc="04100001">
+      <w:start w:val="1"/>
+      <w:numFmt w:val="bullet"/>
+      <w:lvlText w:val=""/>
+      <w:lvlJc w:val="left"/>
+      <w:pPr>
+        <w:ind w:left="720" w:hanging="360"/>
+      </w:pPr>
+      <w:rPr>
+        <w:rFonts w:ascii="Symbol" w:hAnsi="Symbol" w:hint="default"/>
+      </w:rPr>
+    </w:lvl>
+    <w:lvl w:ilvl="1" w:tplc="04100003" w:tentative="1">
+      <w:start w:val="1"/>
+      <w:numFmt w:val="bullet"/>
+      <w:lvlText w:val="o"/>
+      <w:lvlJc w:val="left"/>
+      <w:pPr>
+        <w:ind w:left="1440" w:hanging="360"/>
+      </w:pPr>
+      <w:rPr>
+        <w:rFonts w:ascii="Courier New" w:hAnsi="Courier New" w:cs="Courier New" w:hint="default"/>
+      </w:rPr>
+    </w:lvl>
+    <w:lvl w:ilvl="2" w:tplc="04100005" w:tentative="1">
+      <w:start w:val="1"/>
+      <w:numFmt w:val="bullet"/>
+      <w:lvlText w:val=""/>
+      <w:lvlJc w:val="left"/>
+      <w:pPr>
+        <w:ind w:left="2160" w:hanging="360"/>
+      </w:pPr>
+      <w:rPr>
+        <w:rFonts w:ascii="Wingdings" w:hAnsi="Wingdings" w:hint="default"/>
+      </w:rPr>
+    </w:lvl>
+    <w:lvl w:ilvl="3" w:tplc="04100001" w:tentative="1">
+      <w:start w:val="1"/>
+      <w:numFmt w:val="bullet"/>
+      <w:lvlText w:val=""/>
+      <w:lvlJc w:val="left"/>
+      <w:pPr>
+        <w:ind w:left="2880" w:hanging="360"/>
+      </w:pPr>
+      <w:rPr>
+        <w:rFonts w:ascii="Symbol" w:hAnsi="Symbol" w:hint="default"/>
+      </w:rPr>
+    </w:lvl>
+    <w:lvl w:ilvl="4" w:tplc="04100003" w:tentative="1">
+      <w:start w:val="1"/>
+      <w:numFmt w:val="bullet"/>
+      <w:lvlText w:val="o"/>
+      <w:lvlJc w:val="left"/>
+      <w:pPr>
+        <w:ind w:left="3600" w:hanging="360"/>
+      </w:pPr>
+      <w:rPr>
+        <w:rFonts w:ascii="Courier New" w:hAnsi="Courier New" w:cs="Courier New" w:hint="default"/>
+      </w:rPr>
+    </w:lvl>
+    <w:lvl w:ilvl="5" w:tplc="04100005" w:tentative="1">
+      <w:start w:val="1"/>
+      <w:numFmt w:val="bullet"/>
+      <w:lvlText w:val=""/>
+      <w:lvlJc w:val="left"/>
+      <w:pPr>
+        <w:ind w:left="4320" w:hanging="360"/>
+      </w:pPr>
+      <w:rPr>
+        <w:rFonts w:ascii="Wingdings" w:hAnsi="Wingdings" w:hint="default"/>
+      </w:rPr>
+    </w:lvl>
+    <w:lvl w:ilvl="6" w:tplc="04100001" w:tentative="1">
+      <w:start w:val="1"/>
+      <w:numFmt w:val="bullet"/>
+      <w:lvlText w:val=""/>
+      <w:lvlJc w:val="left"/>
+      <w:pPr>
+        <w:ind w:left="5040" w:hanging="360"/>
+      </w:pPr>
+      <w:rPr>
+        <w:rFonts w:ascii="Symbol" w:hAnsi="Symbol" w:hint="default"/>
+      </w:rPr>
+    </w:lvl>
+    <w:lvl w:ilvl="7" w:tplc="04100003" w:tentative="1">
+      <w:start w:val="1"/>
+      <w:numFmt w:val="bullet"/>
+      <w:lvlText w:val="o"/>
+      <w:lvlJc w:val="left"/>
+      <w:pPr>
+        <w:ind w:left="5760" w:hanging="360"/>
+      </w:pPr>
+      <w:rPr>
+        <w:rFonts w:ascii="Courier New" w:hAnsi="Courier New" w:cs="Courier New" w:hint="default"/>
+      </w:rPr>
+    </w:lvl>
+    <w:lvl w:ilvl="8" w:tplc="04100005" w:tentative="1">
+      <w:start w:val="1"/>
+      <w:numFmt w:val="bullet"/>
+      <w:lvlText w:val=""/>
+      <w:lvlJc w:val="left"/>
+      <w:pPr>
+        <w:ind w:left="6480" w:hanging="360"/>
+      </w:pPr>
+      <w:rPr>
+        <w:rFonts w:ascii="Wingdings" w:hAnsi="Wingdings" w:hint="default"/>
+      </w:rPr>
+    </w:lvl>
+  </w:abstractNum>
+  <w:abstractNum w:abstractNumId="18" w15:restartNumberingAfterBreak="0">
+    <w:nsid w:val="75297974"/>
     <w:multiLevelType w:val="multilevel"/>
-    <w:tmpl w:val="A2FAC6F4"/>
+    <w:tmpl w:val="69E284EC"/>
     <w:lvl w:ilvl="0">
       <w:start w:val="1"/>
       <w:numFmt w:val="bullet"/>
@@ -35822,56 +39237,214 @@
       </w:rPr>
     </w:lvl>
   </w:abstractNum>
+  <w:abstractNum w:abstractNumId="19" w15:restartNumberingAfterBreak="0">
+    <w:nsid w:val="7D47637C"/>
+    <w:multiLevelType w:val="multilevel"/>
+    <w:tmpl w:val="A2FAC6F4"/>
+    <w:lvl w:ilvl="0">
+      <w:start w:val="1"/>
+      <w:numFmt w:val="bullet"/>
+      <w:lvlText w:val=""/>
+      <w:lvlJc w:val="left"/>
+      <w:pPr>
+        <w:tabs>
+          <w:tab w:val="num" w:pos="720"/>
+        </w:tabs>
+        <w:ind w:left="720" w:hanging="360"/>
+      </w:pPr>
+      <w:rPr>
+        <w:rFonts w:ascii="Symbol" w:hAnsi="Symbol" w:hint="default"/>
+        <w:sz w:val="20"/>
+      </w:rPr>
+    </w:lvl>
+    <w:lvl w:ilvl="1" w:tentative="1">
+      <w:start w:val="1"/>
+      <w:numFmt w:val="bullet"/>
+      <w:lvlText w:val="o"/>
+      <w:lvlJc w:val="left"/>
+      <w:pPr>
+        <w:tabs>
+          <w:tab w:val="num" w:pos="1440"/>
+        </w:tabs>
+        <w:ind w:left="1440" w:hanging="360"/>
+      </w:pPr>
+      <w:rPr>
+        <w:rFonts w:ascii="Courier New" w:hAnsi="Courier New" w:hint="default"/>
+        <w:sz w:val="20"/>
+      </w:rPr>
+    </w:lvl>
+    <w:lvl w:ilvl="2" w:tentative="1">
+      <w:start w:val="1"/>
+      <w:numFmt w:val="bullet"/>
+      <w:lvlText w:val=""/>
+      <w:lvlJc w:val="left"/>
+      <w:pPr>
+        <w:tabs>
+          <w:tab w:val="num" w:pos="2160"/>
+        </w:tabs>
+        <w:ind w:left="2160" w:hanging="360"/>
+      </w:pPr>
+      <w:rPr>
+        <w:rFonts w:ascii="Wingdings" w:hAnsi="Wingdings" w:hint="default"/>
+        <w:sz w:val="20"/>
+      </w:rPr>
+    </w:lvl>
+    <w:lvl w:ilvl="3" w:tentative="1">
+      <w:start w:val="1"/>
+      <w:numFmt w:val="bullet"/>
+      <w:lvlText w:val=""/>
+      <w:lvlJc w:val="left"/>
+      <w:pPr>
+        <w:tabs>
+          <w:tab w:val="num" w:pos="2880"/>
+        </w:tabs>
+        <w:ind w:left="2880" w:hanging="360"/>
+      </w:pPr>
+      <w:rPr>
+        <w:rFonts w:ascii="Wingdings" w:hAnsi="Wingdings" w:hint="default"/>
+        <w:sz w:val="20"/>
+      </w:rPr>
+    </w:lvl>
+    <w:lvl w:ilvl="4" w:tentative="1">
+      <w:start w:val="1"/>
+      <w:numFmt w:val="bullet"/>
+      <w:lvlText w:val=""/>
+      <w:lvlJc w:val="left"/>
+      <w:pPr>
+        <w:tabs>
+          <w:tab w:val="num" w:pos="3600"/>
+        </w:tabs>
+        <w:ind w:left="3600" w:hanging="360"/>
+      </w:pPr>
+      <w:rPr>
+        <w:rFonts w:ascii="Wingdings" w:hAnsi="Wingdings" w:hint="default"/>
+        <w:sz w:val="20"/>
+      </w:rPr>
+    </w:lvl>
+    <w:lvl w:ilvl="5" w:tentative="1">
+      <w:start w:val="1"/>
+      <w:numFmt w:val="bullet"/>
+      <w:lvlText w:val=""/>
+      <w:lvlJc w:val="left"/>
+      <w:pPr>
+        <w:tabs>
+          <w:tab w:val="num" w:pos="4320"/>
+        </w:tabs>
+        <w:ind w:left="4320" w:hanging="360"/>
+      </w:pPr>
+      <w:rPr>
+        <w:rFonts w:ascii="Wingdings" w:hAnsi="Wingdings" w:hint="default"/>
+        <w:sz w:val="20"/>
+      </w:rPr>
+    </w:lvl>
+    <w:lvl w:ilvl="6" w:tentative="1">
+      <w:start w:val="1"/>
+      <w:numFmt w:val="bullet"/>
+      <w:lvlText w:val=""/>
+      <w:lvlJc w:val="left"/>
+      <w:pPr>
+        <w:tabs>
+          <w:tab w:val="num" w:pos="5040"/>
+        </w:tabs>
+        <w:ind w:left="5040" w:hanging="360"/>
+      </w:pPr>
+      <w:rPr>
+        <w:rFonts w:ascii="Wingdings" w:hAnsi="Wingdings" w:hint="default"/>
+        <w:sz w:val="20"/>
+      </w:rPr>
+    </w:lvl>
+    <w:lvl w:ilvl="7" w:tentative="1">
+      <w:start w:val="1"/>
+      <w:numFmt w:val="bullet"/>
+      <w:lvlText w:val=""/>
+      <w:lvlJc w:val="left"/>
+      <w:pPr>
+        <w:tabs>
+          <w:tab w:val="num" w:pos="5760"/>
+        </w:tabs>
+        <w:ind w:left="5760" w:hanging="360"/>
+      </w:pPr>
+      <w:rPr>
+        <w:rFonts w:ascii="Wingdings" w:hAnsi="Wingdings" w:hint="default"/>
+        <w:sz w:val="20"/>
+      </w:rPr>
+    </w:lvl>
+    <w:lvl w:ilvl="8" w:tentative="1">
+      <w:start w:val="1"/>
+      <w:numFmt w:val="bullet"/>
+      <w:lvlText w:val=""/>
+      <w:lvlJc w:val="left"/>
+      <w:pPr>
+        <w:tabs>
+          <w:tab w:val="num" w:pos="6480"/>
+        </w:tabs>
+        <w:ind w:left="6480" w:hanging="360"/>
+      </w:pPr>
+      <w:rPr>
+        <w:rFonts w:ascii="Wingdings" w:hAnsi="Wingdings" w:hint="default"/>
+        <w:sz w:val="20"/>
+      </w:rPr>
+    </w:lvl>
+  </w:abstractNum>
   <w:num w:numId="1">
     <w:abstractNumId w:val="1"/>
   </w:num>
   <w:num w:numId="2">
-    <w:abstractNumId w:val="6"/>
+    <w:abstractNumId w:val="8"/>
   </w:num>
   <w:num w:numId="3">
-    <w:abstractNumId w:val="11"/>
+    <w:abstractNumId w:val="14"/>
   </w:num>
   <w:num w:numId="4">
-    <w:abstractNumId w:val="8"/>
+    <w:abstractNumId w:val="10"/>
   </w:num>
   <w:num w:numId="5">
-    <w:abstractNumId w:val="15"/>
+    <w:abstractNumId w:val="18"/>
   </w:num>
   <w:num w:numId="6">
     <w:abstractNumId w:val="2"/>
   </w:num>
   <w:num w:numId="7">
-    <w:abstractNumId w:val="14"/>
+    <w:abstractNumId w:val="17"/>
   </w:num>
   <w:num w:numId="8">
-    <w:abstractNumId w:val="13"/>
+    <w:abstractNumId w:val="16"/>
   </w:num>
   <w:num w:numId="9">
-    <w:abstractNumId w:val="10"/>
+    <w:abstractNumId w:val="12"/>
   </w:num>
   <w:num w:numId="10">
-    <w:abstractNumId w:val="9"/>
+    <w:abstractNumId w:val="11"/>
   </w:num>
   <w:num w:numId="11">
-    <w:abstractNumId w:val="5"/>
+    <w:abstractNumId w:val="7"/>
   </w:num>
   <w:num w:numId="12">
-    <w:abstractNumId w:val="16"/>
+    <w:abstractNumId w:val="19"/>
   </w:num>
   <w:num w:numId="13">
-    <w:abstractNumId w:val="12"/>
+    <w:abstractNumId w:val="15"/>
   </w:num>
   <w:num w:numId="14">
     <w:abstractNumId w:val="0"/>
   </w:num>
   <w:num w:numId="15">
+    <w:abstractNumId w:val="5"/>
+  </w:num>
+  <w:num w:numId="16">
     <w:abstractNumId w:val="4"/>
   </w:num>
-  <w:num w:numId="16">
+  <w:num w:numId="17">
+    <w:abstractNumId w:val="9"/>
+  </w:num>
+  <w:num w:numId="18">
+    <w:abstractNumId w:val="13"/>
+  </w:num>
+  <w:num w:numId="19">
     <w:abstractNumId w:val="3"/>
   </w:num>
-  <w:num w:numId="17">
-    <w:abstractNumId w:val="7"/>
+  <w:num w:numId="20">
+    <w:abstractNumId w:val="6"/>
   </w:num>
 </w:numbering>
 </file>
@@ -37432,10 +41005,22 @@
 </CoverPageProperties>
 </file>
 
+<file path=customXml/item2.xml><?xml version="1.0" encoding="utf-8"?>
+<b:Sources xmlns:b="http://schemas.openxmlformats.org/officeDocument/2006/bibliography" xmlns="http://schemas.openxmlformats.org/officeDocument/2006/bibliography" SelectedStyle="\APASixthEditionOfficeOnline.xsl" StyleName="APA" Version="6"/>
+</file>
+
 <file path=customXml/itemProps1.xml><?xml version="1.0" encoding="utf-8"?>
 <ds:datastoreItem xmlns:ds="http://schemas.openxmlformats.org/officeDocument/2006/customXml" ds:itemID="{55AF091B-3C7A-41E3-B477-F2FDAA23CFDA}">
   <ds:schemaRefs>
     <ds:schemaRef ds:uri="http://schemas.microsoft.com/office/2006/coverPageProps"/>
   </ds:schemaRefs>
 </ds:datastoreItem>
+</file>
+
+<file path=customXml/itemProps2.xml><?xml version="1.0" encoding="utf-8"?>
+<ds:datastoreItem xmlns:ds="http://schemas.openxmlformats.org/officeDocument/2006/customXml" ds:itemID="{4A7BA4D8-665F-49AE-8F2A-D33E469F1951}">
+  <ds:schemaRefs>
+    <ds:schemaRef ds:uri="http://schemas.openxmlformats.org/officeDocument/2006/bibliography"/>
+  </ds:schemaRefs>
+</ds:datastoreItem>
 </file>
</xml_diff>

<commit_message>
doc: changes in the files
</commit_message>
<xml_diff>
--- a/Technical report.docx
+++ b/Technical report.docx
@@ -215,6 +215,7 @@
                                       <w:calendar w:val="gregorian"/>
                                     </w:date>
                                   </w:sdtPr>
+                                  <w:sdtEndPr/>
                                   <w:sdtContent>
                                     <w:p>
                                       <w:pPr>
@@ -3530,6 +3531,7 @@
                                 <w:calendar w:val="gregorian"/>
                               </w:date>
                             </w:sdtPr>
+                            <w:sdtEndPr/>
                             <w:sdtContent>
                               <w:p>
                                 <w:pPr>
@@ -3754,6 +3756,7 @@
                                     <w:dataBinding w:prefixMappings="xmlns:ns0='http://purl.org/dc/elements/1.1/' xmlns:ns1='http://schemas.openxmlformats.org/package/2006/metadata/core-properties' " w:xpath="/ns1:coreProperties[1]/ns0:creator[1]" w:storeItemID="{6C3C8BC8-F283-45AE-878A-BAB7291924A1}"/>
                                     <w:text/>
                                   </w:sdtPr>
+                                  <w:sdtEndPr/>
                                   <w:sdtContent>
                                     <w:r>
                                       <w:rPr>
@@ -3785,6 +3788,7 @@
                                     <w:dataBinding w:prefixMappings="xmlns:ns0='http://schemas.openxmlformats.org/officeDocument/2006/extended-properties' " w:xpath="/ns0:Properties[1]/ns0:Company[1]" w:storeItemID="{6668398D-A668-4E3E-A5EB-62B293D839F1}"/>
                                     <w:text/>
                                   </w:sdtPr>
+                                  <w:sdtEndPr/>
                                   <w:sdtContent>
                                     <w:r>
                                       <w:rPr>
@@ -3847,6 +3851,7 @@
                               <w:dataBinding w:prefixMappings="xmlns:ns0='http://purl.org/dc/elements/1.1/' xmlns:ns1='http://schemas.openxmlformats.org/package/2006/metadata/core-properties' " w:xpath="/ns1:coreProperties[1]/ns0:creator[1]" w:storeItemID="{6C3C8BC8-F283-45AE-878A-BAB7291924A1}"/>
                               <w:text/>
                             </w:sdtPr>
+                            <w:sdtEndPr/>
                             <w:sdtContent>
                               <w:r>
                                 <w:rPr>
@@ -3878,6 +3883,7 @@
                               <w:dataBinding w:prefixMappings="xmlns:ns0='http://schemas.openxmlformats.org/officeDocument/2006/extended-properties' " w:xpath="/ns0:Properties[1]/ns0:Company[1]" w:storeItemID="{6668398D-A668-4E3E-A5EB-62B293D839F1}"/>
                               <w:text/>
                             </w:sdtPr>
+                            <w:sdtEndPr/>
                             <w:sdtContent>
                               <w:r>
                                 <w:rPr>
@@ -3974,6 +3980,7 @@
                                     <w:dataBinding w:prefixMappings="xmlns:ns0='http://purl.org/dc/elements/1.1/' xmlns:ns1='http://schemas.openxmlformats.org/package/2006/metadata/core-properties' " w:xpath="/ns1:coreProperties[1]/ns0:title[1]" w:storeItemID="{6C3C8BC8-F283-45AE-878A-BAB7291924A1}"/>
                                     <w:text/>
                                   </w:sdtPr>
+                                  <w:sdtEndPr/>
                                   <w:sdtContent>
                                     <w:r>
                                       <w:rPr>
@@ -4035,6 +4042,7 @@
                               <w:dataBinding w:prefixMappings="xmlns:ns0='http://purl.org/dc/elements/1.1/' xmlns:ns1='http://schemas.openxmlformats.org/package/2006/metadata/core-properties' " w:xpath="/ns1:coreProperties[1]/ns0:title[1]" w:storeItemID="{6C3C8BC8-F283-45AE-878A-BAB7291924A1}"/>
                               <w:text/>
                             </w:sdtPr>
+                            <w:sdtEndPr/>
                             <w:sdtContent>
                               <w:r>
                                 <w:rPr>
@@ -4202,6 +4210,13 @@
     </w:p>
     <w:sdt>
       <w:sdtPr>
+        <w:rPr>
+          <w:caps w:val="0"/>
+          <w:color w:val="auto"/>
+          <w:spacing w:val="0"/>
+          <w:sz w:val="20"/>
+          <w:szCs w:val="20"/>
+        </w:rPr>
         <w:id w:val="388463461"/>
         <w:docPartObj>
           <w:docPartGallery w:val="Table of Contents"/>
@@ -4212,11 +4227,6 @@
         <w:rPr>
           <w:b/>
           <w:bCs/>
-          <w:caps w:val="0"/>
-          <w:color w:val="auto"/>
-          <w:spacing w:val="0"/>
-          <w:sz w:val="20"/>
-          <w:szCs w:val="20"/>
         </w:rPr>
       </w:sdtEndPr>
       <w:sdtContent>
@@ -7540,37 +7550,35 @@
         </w:rPr>
         <w:br w:type="page"/>
       </w:r>
-      <w:bookmarkStart w:id="0" w:name="_GoBack"/>
+    </w:p>
+    <w:p>
+      <w:pPr>
+        <w:pStyle w:val="Titolo1"/>
+        <w:rPr>
+          <w:b/>
+          <w:lang w:val="en-IN"/>
+        </w:rPr>
+      </w:pPr>
+      <w:bookmarkStart w:id="0" w:name="_Toc223365906"/>
+      <w:r>
+        <w:rPr>
+          <w:b/>
+          <w:lang w:val="en-IN"/>
+        </w:rPr>
+        <w:lastRenderedPageBreak/>
+        <w:t xml:space="preserve">1.0 </w:t>
+      </w:r>
+      <w:r>
+        <w:rPr>
+          <w:b/>
+          <w:lang w:val="en-IN"/>
+        </w:rPr>
+        <w:t>INTRODUCTION</w:t>
+      </w:r>
       <w:bookmarkEnd w:id="0"/>
     </w:p>
     <w:p>
       <w:pPr>
-        <w:pStyle w:val="Titolo1"/>
-        <w:rPr>
-          <w:b/>
-          <w:lang w:val="en-IN"/>
-        </w:rPr>
-      </w:pPr>
-      <w:bookmarkStart w:id="1" w:name="_Toc223365906"/>
-      <w:r>
-        <w:rPr>
-          <w:b/>
-          <w:lang w:val="en-IN"/>
-        </w:rPr>
-        <w:lastRenderedPageBreak/>
-        <w:t xml:space="preserve">1.0 </w:t>
-      </w:r>
-      <w:r>
-        <w:rPr>
-          <w:b/>
-          <w:lang w:val="en-IN"/>
-        </w:rPr>
-        <w:t>INTRODUCTION</w:t>
-      </w:r>
-      <w:bookmarkEnd w:id="1"/>
-    </w:p>
-    <w:p>
-      <w:pPr>
         <w:jc w:val="both"/>
         <w:rPr>
           <w:rFonts w:ascii="Times New Roman" w:hAnsi="Times New Roman" w:cs="Times New Roman"/>
@@ -7690,7 +7698,7 @@
           <w:lang w:val="en-IN"/>
         </w:rPr>
       </w:pPr>
-      <w:bookmarkStart w:id="2" w:name="_Toc223365907"/>
+      <w:bookmarkStart w:id="1" w:name="_Toc223365907"/>
       <w:r>
         <w:rPr>
           <w:lang w:val="en-IN"/>
@@ -7703,7 +7711,7 @@
         </w:rPr>
         <w:t>Strategic Importance of Findings</w:t>
       </w:r>
-      <w:bookmarkEnd w:id="2"/>
+      <w:bookmarkEnd w:id="1"/>
     </w:p>
     <w:p>
       <w:pPr>
@@ -7964,7 +7972,7 @@
           <w:lang w:val="en-IN"/>
         </w:rPr>
       </w:pPr>
-      <w:bookmarkStart w:id="3" w:name="_Toc223365908"/>
+      <w:bookmarkStart w:id="2" w:name="_Toc223365908"/>
       <w:r>
         <w:rPr>
           <w:lang w:val="en-IN"/>
@@ -7976,6 +7984,181 @@
           <w:lang w:val="en-IN"/>
         </w:rPr>
         <w:t>Project Scope &amp; Technical Vision</w:t>
+      </w:r>
+      <w:bookmarkEnd w:id="2"/>
+    </w:p>
+    <w:p>
+      <w:pPr>
+        <w:pStyle w:val="NormaleWeb"/>
+        <w:spacing w:line="276" w:lineRule="auto"/>
+        <w:jc w:val="both"/>
+        <w:rPr>
+          <w:lang w:val="en-IN"/>
+        </w:rPr>
+      </w:pPr>
+      <w:r>
+        <w:rPr>
+          <w:rStyle w:val="citation-400"/>
+          <w:lang w:val="en-IN"/>
+        </w:rPr>
+        <w:t xml:space="preserve">The </w:t>
+      </w:r>
+      <w:r>
+        <w:rPr>
+          <w:rStyle w:val="citation-400"/>
+          <w:b/>
+          <w:bCs/>
+          <w:lang w:val="en-IN"/>
+        </w:rPr>
+        <w:t>LuxeIntelligence</w:t>
+      </w:r>
+      <w:r>
+        <w:rPr>
+          <w:rStyle w:val="citation-400"/>
+          <w:lang w:val="en-IN"/>
+        </w:rPr>
+        <w:t xml:space="preserve"> initiative is designed to move beyond traditional reactive reporting and toward </w:t>
+      </w:r>
+      <w:r>
+        <w:rPr>
+          <w:rStyle w:val="citation-400"/>
+          <w:b/>
+          <w:bCs/>
+          <w:lang w:val="en-IN"/>
+        </w:rPr>
+        <w:t xml:space="preserve">proactive predictive </w:t>
+      </w:r>
+      <w:proofErr w:type="spellStart"/>
+      <w:r>
+        <w:rPr>
+          <w:rStyle w:val="citation-400"/>
+          <w:b/>
+          <w:bCs/>
+          <w:lang w:val="en-IN"/>
+        </w:rPr>
+        <w:t>modeling</w:t>
+      </w:r>
+      <w:proofErr w:type="spellEnd"/>
+      <w:r>
+        <w:rPr>
+          <w:lang w:val="en-IN"/>
+        </w:rPr>
+        <w:t xml:space="preserve">. </w:t>
+      </w:r>
+      <w:r>
+        <w:rPr>
+          <w:rStyle w:val="citation-399"/>
+          <w:lang w:val="en-IN"/>
+        </w:rPr>
+        <w:t>The scope of this project encompasses the entire data lifecycle</w:t>
+      </w:r>
+      <w:r>
+        <w:rPr>
+          <w:rStyle w:val="citation-399"/>
+          <w:lang w:val="en-IN"/>
+        </w:rPr>
+        <w:t xml:space="preserve"> </w:t>
+      </w:r>
+      <w:r>
+        <w:rPr>
+          <w:rStyle w:val="citation-399"/>
+          <w:lang w:val="en-IN"/>
+        </w:rPr>
+        <w:t>from the ingestion of raw transaction logs and product attributes to the deployment of a sophisticated recommendation architecture</w:t>
+      </w:r>
+      <w:r>
+        <w:rPr>
+          <w:lang w:val="en-IN"/>
+        </w:rPr>
+        <w:t xml:space="preserve">. </w:t>
+      </w:r>
+      <w:r>
+        <w:rPr>
+          <w:rStyle w:val="citation-398"/>
+          <w:lang w:val="en-IN"/>
+        </w:rPr>
+        <w:t xml:space="preserve">By leveraging a modern tech stack, including </w:t>
+      </w:r>
+      <w:r>
+        <w:rPr>
+          <w:rStyle w:val="citation-398"/>
+          <w:b/>
+          <w:bCs/>
+          <w:lang w:val="en-IN"/>
+        </w:rPr>
+        <w:t>Python</w:t>
+      </w:r>
+      <w:r>
+        <w:rPr>
+          <w:rStyle w:val="citation-398"/>
+          <w:lang w:val="en-IN"/>
+        </w:rPr>
+        <w:t xml:space="preserve"> for high-performance data processing and </w:t>
+      </w:r>
+      <w:proofErr w:type="spellStart"/>
+      <w:r>
+        <w:rPr>
+          <w:rStyle w:val="citation-398"/>
+          <w:b/>
+          <w:bCs/>
+          <w:lang w:val="en-IN"/>
+        </w:rPr>
+        <w:t>ChromaDB</w:t>
+      </w:r>
+      <w:proofErr w:type="spellEnd"/>
+      <w:r>
+        <w:rPr>
+          <w:rStyle w:val="citation-398"/>
+          <w:lang w:val="en-IN"/>
+        </w:rPr>
+        <w:t xml:space="preserve"> for semantic search, we establish a scalable foundation for future AI-driven initiatives such as visual search and automated trend forecasting</w:t>
+      </w:r>
+      <w:r>
+        <w:rPr>
+          <w:lang w:val="en-IN"/>
+        </w:rPr>
+        <w:t>.</w:t>
+      </w:r>
+    </w:p>
+    <w:p>
+      <w:pPr>
+        <w:rPr>
+          <w:rFonts w:ascii="Times New Roman" w:eastAsia="Times New Roman" w:hAnsi="Times New Roman" w:cs="Times New Roman"/>
+          <w:sz w:val="24"/>
+          <w:szCs w:val="24"/>
+          <w:lang w:val="en-IN" w:eastAsia="it-IT"/>
+        </w:rPr>
+      </w:pPr>
+      <w:r>
+        <w:rPr>
+          <w:lang w:val="en-IN"/>
+        </w:rPr>
+        <w:br w:type="page"/>
+      </w:r>
+    </w:p>
+    <w:p>
+      <w:pPr>
+        <w:pStyle w:val="Titolo1"/>
+        <w:rPr>
+          <w:b/>
+          <w:lang w:val="en-IN"/>
+        </w:rPr>
+      </w:pPr>
+      <w:bookmarkStart w:id="3" w:name="_Toc223365909"/>
+      <w:r>
+        <w:rPr>
+          <w:b/>
+          <w:lang w:val="en-IN"/>
+        </w:rPr>
+        <w:lastRenderedPageBreak/>
+        <w:t xml:space="preserve">2.0 </w:t>
+      </w:r>
+      <w:r>
+        <w:rPr>
+          <w:b/>
+          <w:lang w:val="en-IN"/>
+        </w:rPr>
+        <w:t>Data ENGINEERING &amp; Exploratory Insights</w:t>
       </w:r>
       <w:bookmarkEnd w:id="3"/>
     </w:p>
@@ -7990,199 +8173,24 @@
       </w:pPr>
       <w:r>
         <w:rPr>
-          <w:rStyle w:val="citation-400"/>
-          <w:lang w:val="en-IN"/>
-        </w:rPr>
-        <w:t xml:space="preserve">The </w:t>
-      </w:r>
-      <w:r>
-        <w:rPr>
-          <w:rStyle w:val="citation-400"/>
-          <w:b/>
-          <w:bCs/>
-          <w:lang w:val="en-IN"/>
-        </w:rPr>
-        <w:t>LuxeIntelligence</w:t>
-      </w:r>
-      <w:r>
-        <w:rPr>
-          <w:rStyle w:val="citation-400"/>
-          <w:lang w:val="en-IN"/>
-        </w:rPr>
-        <w:t xml:space="preserve"> initiative is designed to move beyond traditional reactive reporting and toward </w:t>
-      </w:r>
-      <w:r>
-        <w:rPr>
-          <w:rStyle w:val="citation-400"/>
-          <w:b/>
-          <w:bCs/>
-          <w:lang w:val="en-IN"/>
-        </w:rPr>
-        <w:t xml:space="preserve">proactive predictive </w:t>
-      </w:r>
-      <w:proofErr w:type="spellStart"/>
-      <w:r>
-        <w:rPr>
-          <w:rStyle w:val="citation-400"/>
-          <w:b/>
-          <w:bCs/>
-          <w:lang w:val="en-IN"/>
-        </w:rPr>
-        <w:t>modeling</w:t>
-      </w:r>
-      <w:proofErr w:type="spellEnd"/>
-      <w:r>
-        <w:rPr>
-          <w:lang w:val="en-IN"/>
-        </w:rPr>
-        <w:t xml:space="preserve">. </w:t>
-      </w:r>
-      <w:r>
-        <w:rPr>
-          <w:rStyle w:val="citation-399"/>
-          <w:lang w:val="en-IN"/>
-        </w:rPr>
-        <w:t>The scope of this project encompasses the entire data lifecycle</w:t>
-      </w:r>
-      <w:r>
-        <w:rPr>
-          <w:rStyle w:val="citation-399"/>
-          <w:lang w:val="en-IN"/>
-        </w:rPr>
-        <w:t xml:space="preserve"> </w:t>
-      </w:r>
-      <w:r>
-        <w:rPr>
-          <w:rStyle w:val="citation-399"/>
-          <w:lang w:val="en-IN"/>
-        </w:rPr>
-        <w:t>from the ingestion of raw transaction logs and product attributes to the deployment of a sophisticated recommendation architecture</w:t>
-      </w:r>
-      <w:r>
-        <w:rPr>
-          <w:lang w:val="en-IN"/>
-        </w:rPr>
-        <w:t xml:space="preserve">. </w:t>
-      </w:r>
-      <w:r>
-        <w:rPr>
-          <w:rStyle w:val="citation-398"/>
-          <w:lang w:val="en-IN"/>
-        </w:rPr>
-        <w:t xml:space="preserve">By leveraging a modern tech stack, including </w:t>
-      </w:r>
-      <w:r>
-        <w:rPr>
-          <w:rStyle w:val="citation-398"/>
-          <w:b/>
-          <w:bCs/>
-          <w:lang w:val="en-IN"/>
-        </w:rPr>
-        <w:t>Python</w:t>
-      </w:r>
-      <w:r>
-        <w:rPr>
-          <w:rStyle w:val="citation-398"/>
-          <w:lang w:val="en-IN"/>
-        </w:rPr>
-        <w:t xml:space="preserve"> for high-performance data processing and </w:t>
-      </w:r>
-      <w:proofErr w:type="spellStart"/>
-      <w:r>
-        <w:rPr>
-          <w:rStyle w:val="citation-398"/>
-          <w:b/>
-          <w:bCs/>
-          <w:lang w:val="en-IN"/>
-        </w:rPr>
-        <w:t>ChromaDB</w:t>
-      </w:r>
-      <w:proofErr w:type="spellEnd"/>
-      <w:r>
-        <w:rPr>
-          <w:rStyle w:val="citation-398"/>
-          <w:lang w:val="en-IN"/>
-        </w:rPr>
-        <w:t xml:space="preserve"> for semantic search, we establish a scalable foundation for future AI-driven initiatives such as visual search and automated trend forecasting</w:t>
-      </w:r>
-      <w:r>
-        <w:rPr>
-          <w:lang w:val="en-IN"/>
-        </w:rPr>
-        <w:t>.</w:t>
+          <w:lang w:val="en-IN"/>
+        </w:rPr>
+        <w:t>This chapter outlines the rigorous process of data unification and the initial discoveries that define the "Schumacher Customer."</w:t>
       </w:r>
     </w:p>
     <w:p>
       <w:pPr>
-        <w:rPr>
-          <w:rFonts w:ascii="Times New Roman" w:eastAsia="Times New Roman" w:hAnsi="Times New Roman" w:cs="Times New Roman"/>
-          <w:sz w:val="24"/>
-          <w:szCs w:val="24"/>
-          <w:lang w:val="en-IN" w:eastAsia="it-IT"/>
-        </w:rPr>
-      </w:pPr>
-      <w:r>
-        <w:rPr>
-          <w:lang w:val="en-IN"/>
-        </w:rPr>
-        <w:br w:type="page"/>
-      </w:r>
-    </w:p>
-    <w:p>
-      <w:pPr>
-        <w:pStyle w:val="Titolo1"/>
-        <w:rPr>
-          <w:b/>
-          <w:lang w:val="en-IN"/>
-        </w:rPr>
-      </w:pPr>
-      <w:bookmarkStart w:id="4" w:name="_Toc223365909"/>
-      <w:r>
-        <w:rPr>
-          <w:b/>
-          <w:lang w:val="en-IN"/>
-        </w:rPr>
-        <w:lastRenderedPageBreak/>
-        <w:t xml:space="preserve">2.0 </w:t>
-      </w:r>
-      <w:r>
-        <w:rPr>
-          <w:b/>
-          <w:lang w:val="en-IN"/>
-        </w:rPr>
-        <w:t>Data ENGINEERING &amp; Exploratory Insights</w:t>
-      </w:r>
-      <w:bookmarkEnd w:id="4"/>
-    </w:p>
-    <w:p>
-      <w:pPr>
-        <w:pStyle w:val="NormaleWeb"/>
-        <w:spacing w:line="276" w:lineRule="auto"/>
-        <w:jc w:val="both"/>
-        <w:rPr>
-          <w:lang w:val="en-IN"/>
-        </w:rPr>
-      </w:pPr>
-      <w:r>
-        <w:rPr>
-          <w:lang w:val="en-IN"/>
-        </w:rPr>
-        <w:t>This chapter outlines the rigorous process of data unification and the initial discoveries that define the "Schumacher Customer."</w:t>
-      </w:r>
-    </w:p>
-    <w:p>
-      <w:pPr>
         <w:pStyle w:val="Titolo2"/>
         <w:jc w:val="both"/>
       </w:pPr>
-      <w:bookmarkStart w:id="5" w:name="_Toc223365910"/>
+      <w:bookmarkStart w:id="4" w:name="_Toc223365910"/>
       <w:r>
         <w:t xml:space="preserve">2.1 </w:t>
       </w:r>
       <w:r>
         <w:t>Data Integration &amp; Feature Engineering</w:t>
       </w:r>
-      <w:bookmarkEnd w:id="5"/>
+      <w:bookmarkEnd w:id="4"/>
     </w:p>
     <w:p>
       <w:pPr>
@@ -8621,7 +8629,7 @@
           <w:lang w:val="en-IN"/>
         </w:rPr>
       </w:pPr>
-      <w:bookmarkStart w:id="6" w:name="_Toc223365911"/>
+      <w:bookmarkStart w:id="5" w:name="_Toc223365911"/>
       <w:r>
         <w:rPr>
           <w:lang w:val="en-IN"/>
@@ -8634,7 +8642,7 @@
         </w:rPr>
         <w:t>Decoding the "Sample-to-Sale" Path</w:t>
       </w:r>
-      <w:bookmarkEnd w:id="6"/>
+      <w:bookmarkEnd w:id="5"/>
     </w:p>
     <w:p>
       <w:pPr>
@@ -8869,14 +8877,14 @@
         <w:pStyle w:val="Titolo2"/>
         <w:jc w:val="both"/>
       </w:pPr>
-      <w:bookmarkStart w:id="7" w:name="_Toc223365912"/>
+      <w:bookmarkStart w:id="6" w:name="_Toc223365912"/>
       <w:r>
         <w:t xml:space="preserve">2.3 </w:t>
       </w:r>
       <w:r>
         <w:t>Exploratory DAta analysis</w:t>
       </w:r>
-      <w:bookmarkEnd w:id="7"/>
+      <w:bookmarkEnd w:id="6"/>
     </w:p>
     <w:p>
       <w:pPr>
@@ -9105,7 +9113,7 @@
           <w:lang w:val="en-IN"/>
         </w:rPr>
       </w:pPr>
-      <w:bookmarkStart w:id="8" w:name="_Toc223365913"/>
+      <w:bookmarkStart w:id="7" w:name="_Toc223365913"/>
       <w:r>
         <w:rPr>
           <w:lang w:val="en-IN"/>
@@ -9118,7 +9126,7 @@
         </w:rPr>
         <w:t>Data Ingestion &amp; Audit Summary</w:t>
       </w:r>
-      <w:bookmarkEnd w:id="8"/>
+      <w:bookmarkEnd w:id="7"/>
     </w:p>
     <w:p>
       <w:pPr>
@@ -9843,7 +9851,7 @@
           <w:lang w:val="en-IN" w:eastAsia="it-IT"/>
         </w:rPr>
       </w:pPr>
-      <w:bookmarkStart w:id="9" w:name="_Hlk223291874"/>
+      <w:bookmarkStart w:id="8" w:name="_Hlk223291874"/>
       <w:r>
         <w:rPr>
           <w:rFonts w:ascii="Consolas" w:eastAsia="Times New Roman" w:hAnsi="Consolas" w:cs="Times New Roman"/>
@@ -9857,46 +9865,24 @@
     </w:p>
     <w:tbl>
       <w:tblPr>
-        <w:tblW w:w="0" w:type="auto"/>
-        <w:tblCellSpacing w:w="15" w:type="dxa"/>
-        <w:tblCellMar>
-          <w:left w:w="0" w:type="dxa"/>
-          <w:right w:w="0" w:type="dxa"/>
-        </w:tblCellMar>
+        <w:tblStyle w:val="Grigliatabella"/>
+        <w:tblW w:w="5228" w:type="dxa"/>
         <w:tblLook w:val="04A0" w:firstRow="1" w:lastRow="0" w:firstColumn="1" w:lastColumn="0" w:noHBand="0" w:noVBand="1"/>
       </w:tblPr>
       <w:tblGrid>
-        <w:gridCol w:w="2275"/>
-        <w:gridCol w:w="1587"/>
-        <w:gridCol w:w="1963"/>
+        <w:gridCol w:w="2230"/>
+        <w:gridCol w:w="1350"/>
+        <w:gridCol w:w="1648"/>
       </w:tblGrid>
       <w:tr>
-        <w:trPr>
-          <w:tblHeader/>
-          <w:tblCellSpacing w:w="15" w:type="dxa"/>
-        </w:trPr>
         <w:tc>
           <w:tcPr>
-            <w:tcW w:w="0" w:type="auto"/>
-            <w:tcBorders>
-              <w:top w:val="single" w:sz="6" w:space="0" w:color="auto"/>
-              <w:left w:val="single" w:sz="6" w:space="0" w:color="auto"/>
-              <w:bottom w:val="single" w:sz="6" w:space="0" w:color="auto"/>
-              <w:right w:val="single" w:sz="6" w:space="0" w:color="auto"/>
-            </w:tcBorders>
-            <w:tcMar>
-              <w:top w:w="120" w:type="dxa"/>
-              <w:left w:w="180" w:type="dxa"/>
-              <w:bottom w:w="120" w:type="dxa"/>
-              <w:right w:w="180" w:type="dxa"/>
-            </w:tcMar>
-            <w:vAlign w:val="center"/>
+            <w:tcW w:w="2230" w:type="dxa"/>
             <w:hideMark/>
           </w:tcPr>
-          <w:bookmarkEnd w:id="9"/>
+          <w:bookmarkEnd w:id="8"/>
           <w:p>
             <w:pPr>
-              <w:spacing w:before="0" w:after="0" w:line="240" w:lineRule="auto"/>
               <w:rPr>
                 <w:rFonts w:ascii="Times New Roman" w:eastAsia="Times New Roman" w:hAnsi="Times New Roman" w:cs="Times New Roman"/>
                 <w:color w:val="1F1F1F"/>
@@ -9925,25 +9911,11 @@
         </w:tc>
         <w:tc>
           <w:tcPr>
-            <w:tcW w:w="0" w:type="auto"/>
-            <w:tcBorders>
-              <w:top w:val="single" w:sz="6" w:space="0" w:color="auto"/>
-              <w:left w:val="single" w:sz="6" w:space="0" w:color="auto"/>
-              <w:bottom w:val="single" w:sz="6" w:space="0" w:color="auto"/>
-              <w:right w:val="single" w:sz="6" w:space="0" w:color="auto"/>
-            </w:tcBorders>
-            <w:tcMar>
-              <w:top w:w="120" w:type="dxa"/>
-              <w:left w:w="180" w:type="dxa"/>
-              <w:bottom w:w="120" w:type="dxa"/>
-              <w:right w:w="180" w:type="dxa"/>
-            </w:tcMar>
-            <w:vAlign w:val="center"/>
+            <w:tcW w:w="1350" w:type="dxa"/>
             <w:hideMark/>
           </w:tcPr>
           <w:p>
             <w:pPr>
-              <w:spacing w:before="0" w:after="0" w:line="240" w:lineRule="auto"/>
               <w:rPr>
                 <w:rFonts w:ascii="Times New Roman" w:eastAsia="Times New Roman" w:hAnsi="Times New Roman" w:cs="Times New Roman"/>
                 <w:color w:val="1F1F1F"/>
@@ -9999,25 +9971,11 @@
         </w:tc>
         <w:tc>
           <w:tcPr>
-            <w:tcW w:w="0" w:type="auto"/>
-            <w:tcBorders>
-              <w:top w:val="single" w:sz="6" w:space="0" w:color="auto"/>
-              <w:left w:val="single" w:sz="6" w:space="0" w:color="auto"/>
-              <w:bottom w:val="single" w:sz="6" w:space="0" w:color="auto"/>
-              <w:right w:val="single" w:sz="6" w:space="0" w:color="auto"/>
-            </w:tcBorders>
-            <w:tcMar>
-              <w:top w:w="120" w:type="dxa"/>
-              <w:left w:w="180" w:type="dxa"/>
-              <w:bottom w:w="120" w:type="dxa"/>
-              <w:right w:w="180" w:type="dxa"/>
-            </w:tcMar>
-            <w:vAlign w:val="center"/>
+            <w:tcW w:w="1648" w:type="dxa"/>
             <w:hideMark/>
           </w:tcPr>
           <w:p>
             <w:pPr>
-              <w:spacing w:before="0" w:after="0" w:line="240" w:lineRule="auto"/>
               <w:rPr>
                 <w:rFonts w:ascii="Times New Roman" w:eastAsia="Times New Roman" w:hAnsi="Times New Roman" w:cs="Times New Roman"/>
                 <w:color w:val="1F1F1F"/>
@@ -10073,30 +10031,13 @@
         </w:tc>
       </w:tr>
       <w:tr>
-        <w:trPr>
-          <w:tblCellSpacing w:w="15" w:type="dxa"/>
-        </w:trPr>
         <w:tc>
           <w:tcPr>
-            <w:tcW w:w="0" w:type="auto"/>
-            <w:tcBorders>
-              <w:top w:val="single" w:sz="6" w:space="0" w:color="auto"/>
-              <w:left w:val="single" w:sz="6" w:space="0" w:color="auto"/>
-              <w:bottom w:val="single" w:sz="6" w:space="0" w:color="auto"/>
-              <w:right w:val="single" w:sz="6" w:space="0" w:color="auto"/>
-            </w:tcBorders>
-            <w:tcMar>
-              <w:top w:w="120" w:type="dxa"/>
-              <w:left w:w="180" w:type="dxa"/>
-              <w:bottom w:w="120" w:type="dxa"/>
-              <w:right w:w="180" w:type="dxa"/>
-            </w:tcMar>
-            <w:vAlign w:val="center"/>
+            <w:tcW w:w="2230" w:type="dxa"/>
             <w:hideMark/>
           </w:tcPr>
           <w:p>
             <w:pPr>
-              <w:spacing w:before="0" w:after="0" w:line="240" w:lineRule="auto"/>
               <w:rPr>
                 <w:rFonts w:ascii="Times New Roman" w:eastAsia="Times New Roman" w:hAnsi="Times New Roman" w:cs="Times New Roman"/>
                 <w:color w:val="1F1F1F"/>
@@ -10122,25 +10063,11 @@
         </w:tc>
         <w:tc>
           <w:tcPr>
-            <w:tcW w:w="0" w:type="auto"/>
-            <w:tcBorders>
-              <w:top w:val="single" w:sz="6" w:space="0" w:color="auto"/>
-              <w:left w:val="single" w:sz="6" w:space="0" w:color="auto"/>
-              <w:bottom w:val="single" w:sz="6" w:space="0" w:color="auto"/>
-              <w:right w:val="single" w:sz="6" w:space="0" w:color="auto"/>
-            </w:tcBorders>
-            <w:tcMar>
-              <w:top w:w="120" w:type="dxa"/>
-              <w:left w:w="180" w:type="dxa"/>
-              <w:bottom w:w="120" w:type="dxa"/>
-              <w:right w:w="180" w:type="dxa"/>
-            </w:tcMar>
-            <w:vAlign w:val="center"/>
+            <w:tcW w:w="1350" w:type="dxa"/>
             <w:hideMark/>
           </w:tcPr>
           <w:p>
             <w:pPr>
-              <w:spacing w:before="0" w:after="0" w:line="240" w:lineRule="auto"/>
               <w:rPr>
                 <w:rFonts w:ascii="Times New Roman" w:eastAsia="Times New Roman" w:hAnsi="Times New Roman" w:cs="Times New Roman"/>
                 <w:color w:val="1F1F1F"/>
@@ -10164,25 +10091,11 @@
         </w:tc>
         <w:tc>
           <w:tcPr>
-            <w:tcW w:w="0" w:type="auto"/>
-            <w:tcBorders>
-              <w:top w:val="single" w:sz="6" w:space="0" w:color="auto"/>
-              <w:left w:val="single" w:sz="6" w:space="0" w:color="auto"/>
-              <w:bottom w:val="single" w:sz="6" w:space="0" w:color="auto"/>
-              <w:right w:val="single" w:sz="6" w:space="0" w:color="auto"/>
-            </w:tcBorders>
-            <w:tcMar>
-              <w:top w:w="120" w:type="dxa"/>
-              <w:left w:w="180" w:type="dxa"/>
-              <w:bottom w:w="120" w:type="dxa"/>
-              <w:right w:w="180" w:type="dxa"/>
-            </w:tcMar>
-            <w:vAlign w:val="center"/>
+            <w:tcW w:w="1648" w:type="dxa"/>
             <w:hideMark/>
           </w:tcPr>
           <w:p>
             <w:pPr>
-              <w:spacing w:before="0" w:after="0" w:line="240" w:lineRule="auto"/>
               <w:rPr>
                 <w:rFonts w:ascii="Times New Roman" w:eastAsia="Times New Roman" w:hAnsi="Times New Roman" w:cs="Times New Roman"/>
                 <w:color w:val="1F1F1F"/>
@@ -10206,30 +10119,13 @@
         </w:tc>
       </w:tr>
       <w:tr>
-        <w:trPr>
-          <w:tblCellSpacing w:w="15" w:type="dxa"/>
-        </w:trPr>
         <w:tc>
           <w:tcPr>
-            <w:tcW w:w="0" w:type="auto"/>
-            <w:tcBorders>
-              <w:top w:val="single" w:sz="6" w:space="0" w:color="auto"/>
-              <w:left w:val="single" w:sz="6" w:space="0" w:color="auto"/>
-              <w:bottom w:val="single" w:sz="6" w:space="0" w:color="auto"/>
-              <w:right w:val="single" w:sz="6" w:space="0" w:color="auto"/>
-            </w:tcBorders>
-            <w:tcMar>
-              <w:top w:w="120" w:type="dxa"/>
-              <w:left w:w="180" w:type="dxa"/>
-              <w:bottom w:w="120" w:type="dxa"/>
-              <w:right w:w="180" w:type="dxa"/>
-            </w:tcMar>
-            <w:vAlign w:val="center"/>
+            <w:tcW w:w="2230" w:type="dxa"/>
             <w:hideMark/>
           </w:tcPr>
           <w:p>
             <w:pPr>
-              <w:spacing w:before="0" w:after="0" w:line="240" w:lineRule="auto"/>
               <w:rPr>
                 <w:rFonts w:ascii="Times New Roman" w:eastAsia="Times New Roman" w:hAnsi="Times New Roman" w:cs="Times New Roman"/>
                 <w:color w:val="1F1F1F"/>
@@ -10270,25 +10166,11 @@
         </w:tc>
         <w:tc>
           <w:tcPr>
-            <w:tcW w:w="0" w:type="auto"/>
-            <w:tcBorders>
-              <w:top w:val="single" w:sz="6" w:space="0" w:color="auto"/>
-              <w:left w:val="single" w:sz="6" w:space="0" w:color="auto"/>
-              <w:bottom w:val="single" w:sz="6" w:space="0" w:color="auto"/>
-              <w:right w:val="single" w:sz="6" w:space="0" w:color="auto"/>
-            </w:tcBorders>
-            <w:tcMar>
-              <w:top w:w="120" w:type="dxa"/>
-              <w:left w:w="180" w:type="dxa"/>
-              <w:bottom w:w="120" w:type="dxa"/>
-              <w:right w:w="180" w:type="dxa"/>
-            </w:tcMar>
-            <w:vAlign w:val="center"/>
+            <w:tcW w:w="1350" w:type="dxa"/>
             <w:hideMark/>
           </w:tcPr>
           <w:p>
             <w:pPr>
-              <w:spacing w:before="0" w:after="0" w:line="240" w:lineRule="auto"/>
               <w:rPr>
                 <w:rFonts w:ascii="Times New Roman" w:eastAsia="Times New Roman" w:hAnsi="Times New Roman" w:cs="Times New Roman"/>
                 <w:color w:val="1F1F1F"/>
@@ -10312,25 +10194,11 @@
         </w:tc>
         <w:tc>
           <w:tcPr>
-            <w:tcW w:w="0" w:type="auto"/>
-            <w:tcBorders>
-              <w:top w:val="single" w:sz="6" w:space="0" w:color="auto"/>
-              <w:left w:val="single" w:sz="6" w:space="0" w:color="auto"/>
-              <w:bottom w:val="single" w:sz="6" w:space="0" w:color="auto"/>
-              <w:right w:val="single" w:sz="6" w:space="0" w:color="auto"/>
-            </w:tcBorders>
-            <w:tcMar>
-              <w:top w:w="120" w:type="dxa"/>
-              <w:left w:w="180" w:type="dxa"/>
-              <w:bottom w:w="120" w:type="dxa"/>
-              <w:right w:w="180" w:type="dxa"/>
-            </w:tcMar>
-            <w:vAlign w:val="center"/>
+            <w:tcW w:w="1648" w:type="dxa"/>
             <w:hideMark/>
           </w:tcPr>
           <w:p>
             <w:pPr>
-              <w:spacing w:before="0" w:after="0" w:line="240" w:lineRule="auto"/>
               <w:rPr>
                 <w:rFonts w:ascii="Times New Roman" w:eastAsia="Times New Roman" w:hAnsi="Times New Roman" w:cs="Times New Roman"/>
                 <w:color w:val="1F1F1F"/>
@@ -10354,30 +10222,13 @@
         </w:tc>
       </w:tr>
       <w:tr>
-        <w:trPr>
-          <w:tblCellSpacing w:w="15" w:type="dxa"/>
-        </w:trPr>
         <w:tc>
           <w:tcPr>
-            <w:tcW w:w="0" w:type="auto"/>
-            <w:tcBorders>
-              <w:top w:val="single" w:sz="6" w:space="0" w:color="auto"/>
-              <w:left w:val="single" w:sz="6" w:space="0" w:color="auto"/>
-              <w:bottom w:val="single" w:sz="6" w:space="0" w:color="auto"/>
-              <w:right w:val="single" w:sz="6" w:space="0" w:color="auto"/>
-            </w:tcBorders>
-            <w:tcMar>
-              <w:top w:w="120" w:type="dxa"/>
-              <w:left w:w="180" w:type="dxa"/>
-              <w:bottom w:w="120" w:type="dxa"/>
-              <w:right w:w="180" w:type="dxa"/>
-            </w:tcMar>
-            <w:vAlign w:val="center"/>
+            <w:tcW w:w="2230" w:type="dxa"/>
             <w:hideMark/>
           </w:tcPr>
           <w:p>
             <w:pPr>
-              <w:spacing w:before="0" w:after="0" w:line="240" w:lineRule="auto"/>
               <w:rPr>
                 <w:rFonts w:ascii="Times New Roman" w:eastAsia="Times New Roman" w:hAnsi="Times New Roman" w:cs="Times New Roman"/>
                 <w:color w:val="1F1F1F"/>
@@ -10418,25 +10269,11 @@
         </w:tc>
         <w:tc>
           <w:tcPr>
-            <w:tcW w:w="0" w:type="auto"/>
-            <w:tcBorders>
-              <w:top w:val="single" w:sz="6" w:space="0" w:color="auto"/>
-              <w:left w:val="single" w:sz="6" w:space="0" w:color="auto"/>
-              <w:bottom w:val="single" w:sz="6" w:space="0" w:color="auto"/>
-              <w:right w:val="single" w:sz="6" w:space="0" w:color="auto"/>
-            </w:tcBorders>
-            <w:tcMar>
-              <w:top w:w="120" w:type="dxa"/>
-              <w:left w:w="180" w:type="dxa"/>
-              <w:bottom w:w="120" w:type="dxa"/>
-              <w:right w:w="180" w:type="dxa"/>
-            </w:tcMar>
-            <w:vAlign w:val="center"/>
+            <w:tcW w:w="1350" w:type="dxa"/>
             <w:hideMark/>
           </w:tcPr>
           <w:p>
             <w:pPr>
-              <w:spacing w:before="0" w:after="0" w:line="240" w:lineRule="auto"/>
               <w:rPr>
                 <w:rFonts w:ascii="Times New Roman" w:eastAsia="Times New Roman" w:hAnsi="Times New Roman" w:cs="Times New Roman"/>
                 <w:color w:val="1F1F1F"/>
@@ -10460,25 +10297,11 @@
         </w:tc>
         <w:tc>
           <w:tcPr>
-            <w:tcW w:w="0" w:type="auto"/>
-            <w:tcBorders>
-              <w:top w:val="single" w:sz="6" w:space="0" w:color="auto"/>
-              <w:left w:val="single" w:sz="6" w:space="0" w:color="auto"/>
-              <w:bottom w:val="single" w:sz="6" w:space="0" w:color="auto"/>
-              <w:right w:val="single" w:sz="6" w:space="0" w:color="auto"/>
-            </w:tcBorders>
-            <w:tcMar>
-              <w:top w:w="120" w:type="dxa"/>
-              <w:left w:w="180" w:type="dxa"/>
-              <w:bottom w:w="120" w:type="dxa"/>
-              <w:right w:w="180" w:type="dxa"/>
-            </w:tcMar>
-            <w:vAlign w:val="center"/>
+            <w:tcW w:w="1648" w:type="dxa"/>
             <w:hideMark/>
           </w:tcPr>
           <w:p>
             <w:pPr>
-              <w:spacing w:before="0" w:after="0" w:line="240" w:lineRule="auto"/>
               <w:rPr>
                 <w:rFonts w:ascii="Times New Roman" w:eastAsia="Times New Roman" w:hAnsi="Times New Roman" w:cs="Times New Roman"/>
                 <w:color w:val="1F1F1F"/>
@@ -11977,7 +11800,7 @@
           <w:lang w:val="en-IN"/>
         </w:rPr>
       </w:pPr>
-      <w:bookmarkStart w:id="10" w:name="_Toc223365914"/>
+      <w:bookmarkStart w:id="9" w:name="_Toc223365914"/>
       <w:r>
         <w:rPr>
           <w:lang w:val="en-IN"/>
@@ -11990,7 +11813,7 @@
         </w:rPr>
         <w:t>Data Cleaning &amp; Sanitization</w:t>
       </w:r>
-      <w:bookmarkEnd w:id="10"/>
+      <w:bookmarkEnd w:id="9"/>
     </w:p>
     <w:p>
       <w:pPr>
@@ -13792,12 +13615,11 @@
           <w:lang w:val="en-IN"/>
         </w:rPr>
       </w:pPr>
-      <w:bookmarkStart w:id="11" w:name="_Toc223365915"/>
-      <w:r>
-        <w:rPr>
-          <w:lang w:val="en-IN"/>
-        </w:rPr>
-        <w:lastRenderedPageBreak/>
+      <w:bookmarkStart w:id="10" w:name="_Toc223365915"/>
+      <w:r>
+        <w:rPr>
+          <w:lang w:val="en-IN"/>
+        </w:rPr>
         <w:t xml:space="preserve">2.6 </w:t>
       </w:r>
       <w:r>
@@ -13812,7 +13634,7 @@
         </w:rPr>
         <w:t>plot</w:t>
       </w:r>
-      <w:bookmarkEnd w:id="11"/>
+      <w:bookmarkEnd w:id="10"/>
     </w:p>
     <w:p>
       <w:pPr>
@@ -13828,6 +13650,7 @@
           <w:rStyle w:val="citation-851"/>
           <w:lang w:val="en-IN"/>
         </w:rPr>
+        <w:lastRenderedPageBreak/>
         <w:t xml:space="preserve">The audit of </w:t>
       </w:r>
       <w:r>
@@ -14037,7 +13860,7 @@
           <w:lang w:val="en-IN"/>
         </w:rPr>
       </w:pPr>
-      <w:bookmarkStart w:id="12" w:name="_Toc223365916"/>
+      <w:bookmarkStart w:id="11" w:name="_Toc223365916"/>
       <w:r>
         <w:rPr>
           <w:b/>
@@ -14052,62 +13875,62 @@
           <w:lang w:val="en-IN"/>
         </w:rPr>
         <w:t>Data Processing &amp; Outlier Mitigation</w:t>
+      </w:r>
+      <w:bookmarkEnd w:id="11"/>
+    </w:p>
+    <w:p>
+      <w:pPr>
+        <w:pStyle w:val="NormaleWeb"/>
+        <w:rPr>
+          <w:lang w:val="en-IN"/>
+        </w:rPr>
+      </w:pPr>
+      <w:r>
+        <w:rPr>
+          <w:lang w:val="en-IN"/>
+        </w:rPr>
+        <w:t xml:space="preserve">This chapter details the transformation of raw variables into high-signal features and the systematic handling of data anomalies to refine the </w:t>
+      </w:r>
+      <w:r>
+        <w:rPr>
+          <w:b/>
+          <w:bCs/>
+          <w:lang w:val="en-IN"/>
+        </w:rPr>
+        <w:t>LuxeIntelligence</w:t>
+      </w:r>
+      <w:r>
+        <w:rPr>
+          <w:lang w:val="en-IN"/>
+        </w:rPr>
+        <w:t xml:space="preserve"> engine.</w:t>
+      </w:r>
+    </w:p>
+    <w:p>
+      <w:pPr>
+        <w:pStyle w:val="Titolo2"/>
+        <w:rPr>
+          <w:lang w:val="en-IN"/>
+        </w:rPr>
+      </w:pPr>
+      <w:bookmarkStart w:id="12" w:name="_Toc223365917"/>
+      <w:r>
+        <w:rPr>
+          <w:lang w:val="en-IN"/>
+        </w:rPr>
+        <w:t xml:space="preserve">3.1 </w:t>
+      </w:r>
+      <w:r>
+        <w:rPr>
+          <w:lang w:val="en-IN"/>
+        </w:rPr>
+        <w:t>Temporal Feature Engineering</w:t>
       </w:r>
       <w:bookmarkEnd w:id="12"/>
     </w:p>
     <w:p>
       <w:pPr>
         <w:pStyle w:val="NormaleWeb"/>
-        <w:rPr>
-          <w:lang w:val="en-IN"/>
-        </w:rPr>
-      </w:pPr>
-      <w:r>
-        <w:rPr>
-          <w:lang w:val="en-IN"/>
-        </w:rPr>
-        <w:t xml:space="preserve">This chapter details the transformation of raw variables into high-signal features and the systematic handling of data anomalies to refine the </w:t>
-      </w:r>
-      <w:r>
-        <w:rPr>
-          <w:b/>
-          <w:bCs/>
-          <w:lang w:val="en-IN"/>
-        </w:rPr>
-        <w:t>LuxeIntelligence</w:t>
-      </w:r>
-      <w:r>
-        <w:rPr>
-          <w:lang w:val="en-IN"/>
-        </w:rPr>
-        <w:t xml:space="preserve"> engine.</w:t>
-      </w:r>
-    </w:p>
-    <w:p>
-      <w:pPr>
-        <w:pStyle w:val="Titolo2"/>
-        <w:rPr>
-          <w:lang w:val="en-IN"/>
-        </w:rPr>
-      </w:pPr>
-      <w:bookmarkStart w:id="13" w:name="_Toc223365917"/>
-      <w:r>
-        <w:rPr>
-          <w:lang w:val="en-IN"/>
-        </w:rPr>
-        <w:t xml:space="preserve">3.1 </w:t>
-      </w:r>
-      <w:r>
-        <w:rPr>
-          <w:lang w:val="en-IN"/>
-        </w:rPr>
-        <w:t>Temporal Feature Engineering</w:t>
-      </w:r>
-      <w:bookmarkEnd w:id="13"/>
-    </w:p>
-    <w:p>
-      <w:pPr>
-        <w:pStyle w:val="NormaleWeb"/>
         <w:jc w:val="both"/>
         <w:rPr>
           <w:lang w:val="en-IN"/>
@@ -16129,14 +15952,14 @@
         <w:pStyle w:val="Titolo2"/>
         <w:jc w:val="both"/>
       </w:pPr>
-      <w:bookmarkStart w:id="14" w:name="_Toc223365918"/>
+      <w:bookmarkStart w:id="13" w:name="_Toc223365918"/>
       <w:r>
         <w:t xml:space="preserve">3.2 </w:t>
       </w:r>
       <w:r>
         <w:t>Standardization &amp; Anomaly Remediation</w:t>
       </w:r>
-      <w:bookmarkEnd w:id="14"/>
+      <w:bookmarkEnd w:id="13"/>
     </w:p>
     <w:p>
       <w:pPr>
@@ -18030,7 +17853,7 @@
           <w:lang w:val="en-IN"/>
         </w:rPr>
       </w:pPr>
-      <w:bookmarkStart w:id="15" w:name="_Toc223365919"/>
+      <w:bookmarkStart w:id="14" w:name="_Toc223365919"/>
       <w:r>
         <w:rPr>
           <w:lang w:val="en-IN"/>
@@ -18044,7 +17867,7 @@
         </w:rPr>
         <w:t>Visual Description: Transactional Health &amp; Categorization</w:t>
       </w:r>
-      <w:bookmarkEnd w:id="15"/>
+      <w:bookmarkEnd w:id="14"/>
     </w:p>
     <w:p>
       <w:pPr>
@@ -18813,7 +18636,7 @@
           <w:lang w:val="en-IN"/>
         </w:rPr>
       </w:pPr>
-      <w:bookmarkStart w:id="16" w:name="_Toc223365920"/>
+      <w:bookmarkStart w:id="15" w:name="_Toc223365920"/>
       <w:r>
         <w:rPr>
           <w:lang w:val="en-IN"/>
@@ -18826,7 +18649,7 @@
         </w:rPr>
         <w:t>Strategic Significance</w:t>
       </w:r>
-      <w:bookmarkEnd w:id="16"/>
+      <w:bookmarkEnd w:id="15"/>
       <w:r>
         <w:rPr>
           <w:lang w:val="en-IN"/>
@@ -18893,12 +18716,614 @@
           <w:lang w:val="en-IN"/>
         </w:rPr>
       </w:pPr>
-      <w:bookmarkStart w:id="17" w:name="_Toc223365921"/>
+      <w:bookmarkStart w:id="16" w:name="_Toc223365921"/>
       <w:r>
         <w:rPr>
           <w:lang w:val="en-IN"/>
         </w:rPr>
         <w:t>3.5 Parquet Optimization</w:t>
+      </w:r>
+      <w:bookmarkEnd w:id="16"/>
+    </w:p>
+    <w:p>
+      <w:pPr>
+        <w:pStyle w:val="NormaleWeb"/>
+        <w:spacing w:line="276" w:lineRule="auto"/>
+        <w:jc w:val="both"/>
+        <w:rPr>
+          <w:lang w:val="en-IN"/>
+        </w:rPr>
+      </w:pPr>
+      <w:r>
+        <w:rPr>
+          <w:lang w:val="en-IN"/>
+        </w:rPr>
+        <w:t>T</w:t>
+      </w:r>
+      <w:r>
+        <w:rPr>
+          <w:lang w:val="en-IN"/>
+        </w:rPr>
+        <w:t>he Master Analytical File was converted from CSV to Parquet to handle nearly 2 million records with high performance. As a columnar format, Parquet enables superior compression and allows the recommendation engine to load specific features, such as motif, without reading the entire dataset. This transition reduces disk usage, preserves complex data types, and provides a scalable foundation</w:t>
+      </w:r>
+      <w:r>
+        <w:rPr>
+          <w:lang w:val="en-IN"/>
+        </w:rPr>
+        <w:t>.</w:t>
+      </w:r>
+    </w:p>
+    <w:p>
+      <w:pPr>
+        <w:shd w:val="clear" w:color="auto" w:fill="1E1E1E"/>
+        <w:spacing w:before="0" w:after="0" w:line="240" w:lineRule="auto"/>
+        <w:rPr>
+          <w:rFonts w:ascii="Consolas" w:eastAsia="Times New Roman" w:hAnsi="Consolas" w:cs="Times New Roman"/>
+          <w:color w:val="D4D4D4"/>
+          <w:sz w:val="18"/>
+          <w:szCs w:val="21"/>
+          <w:lang w:val="en-IN" w:eastAsia="it-IT"/>
+        </w:rPr>
+      </w:pPr>
+      <w:proofErr w:type="spellStart"/>
+      <w:r>
+        <w:rPr>
+          <w:rFonts w:ascii="Consolas" w:eastAsia="Times New Roman" w:hAnsi="Consolas" w:cs="Times New Roman"/>
+          <w:color w:val="9CDCFE"/>
+          <w:sz w:val="18"/>
+          <w:szCs w:val="21"/>
+          <w:lang w:val="en-IN" w:eastAsia="it-IT"/>
+        </w:rPr>
+        <w:t>processed_dir</w:t>
+      </w:r>
+      <w:proofErr w:type="spellEnd"/>
+      <w:r>
+        <w:rPr>
+          <w:rFonts w:ascii="Consolas" w:eastAsia="Times New Roman" w:hAnsi="Consolas" w:cs="Times New Roman"/>
+          <w:color w:val="D4D4D4"/>
+          <w:sz w:val="18"/>
+          <w:szCs w:val="21"/>
+          <w:lang w:val="en-IN" w:eastAsia="it-IT"/>
+        </w:rPr>
+        <w:t xml:space="preserve"> = </w:t>
+      </w:r>
+      <w:proofErr w:type="gramStart"/>
+      <w:r>
+        <w:rPr>
+          <w:rFonts w:ascii="Consolas" w:eastAsia="Times New Roman" w:hAnsi="Consolas" w:cs="Times New Roman"/>
+          <w:color w:val="CE9178"/>
+          <w:sz w:val="18"/>
+          <w:szCs w:val="21"/>
+          <w:lang w:val="en-IN" w:eastAsia="it-IT"/>
+        </w:rPr>
+        <w:t>'..</w:t>
+      </w:r>
+      <w:proofErr w:type="gramEnd"/>
+      <w:r>
+        <w:rPr>
+          <w:rFonts w:ascii="Consolas" w:eastAsia="Times New Roman" w:hAnsi="Consolas" w:cs="Times New Roman"/>
+          <w:color w:val="CE9178"/>
+          <w:sz w:val="18"/>
+          <w:szCs w:val="21"/>
+          <w:lang w:val="en-IN" w:eastAsia="it-IT"/>
+        </w:rPr>
+        <w:t>/data/processed/notebooks'</w:t>
+      </w:r>
+    </w:p>
+    <w:p>
+      <w:pPr>
+        <w:shd w:val="clear" w:color="auto" w:fill="1E1E1E"/>
+        <w:spacing w:before="0" w:after="0" w:line="240" w:lineRule="auto"/>
+        <w:rPr>
+          <w:rFonts w:ascii="Consolas" w:eastAsia="Times New Roman" w:hAnsi="Consolas" w:cs="Times New Roman"/>
+          <w:color w:val="D4D4D4"/>
+          <w:sz w:val="18"/>
+          <w:szCs w:val="21"/>
+          <w:lang w:val="en-IN" w:eastAsia="it-IT"/>
+        </w:rPr>
+      </w:pPr>
+      <w:proofErr w:type="spellStart"/>
+      <w:proofErr w:type="gramStart"/>
+      <w:r>
+        <w:rPr>
+          <w:rFonts w:ascii="Consolas" w:eastAsia="Times New Roman" w:hAnsi="Consolas" w:cs="Times New Roman"/>
+          <w:color w:val="4EC9B0"/>
+          <w:sz w:val="18"/>
+          <w:szCs w:val="21"/>
+          <w:lang w:val="en-IN" w:eastAsia="it-IT"/>
+        </w:rPr>
+        <w:t>os</w:t>
+      </w:r>
+      <w:r>
+        <w:rPr>
+          <w:rFonts w:ascii="Consolas" w:eastAsia="Times New Roman" w:hAnsi="Consolas" w:cs="Times New Roman"/>
+          <w:color w:val="D4D4D4"/>
+          <w:sz w:val="18"/>
+          <w:szCs w:val="21"/>
+          <w:lang w:val="en-IN" w:eastAsia="it-IT"/>
+        </w:rPr>
+        <w:t>.</w:t>
+      </w:r>
+      <w:r>
+        <w:rPr>
+          <w:rFonts w:ascii="Consolas" w:eastAsia="Times New Roman" w:hAnsi="Consolas" w:cs="Times New Roman"/>
+          <w:color w:val="DCDCAA"/>
+          <w:sz w:val="18"/>
+          <w:szCs w:val="21"/>
+          <w:lang w:val="en-IN" w:eastAsia="it-IT"/>
+        </w:rPr>
+        <w:t>makedirs</w:t>
+      </w:r>
+      <w:proofErr w:type="spellEnd"/>
+      <w:proofErr w:type="gramEnd"/>
+      <w:r>
+        <w:rPr>
+          <w:rFonts w:ascii="Consolas" w:eastAsia="Times New Roman" w:hAnsi="Consolas" w:cs="Times New Roman"/>
+          <w:color w:val="D4D4D4"/>
+          <w:sz w:val="18"/>
+          <w:szCs w:val="21"/>
+          <w:lang w:val="en-IN" w:eastAsia="it-IT"/>
+        </w:rPr>
+        <w:t>(</w:t>
+      </w:r>
+      <w:proofErr w:type="spellStart"/>
+      <w:r>
+        <w:rPr>
+          <w:rFonts w:ascii="Consolas" w:eastAsia="Times New Roman" w:hAnsi="Consolas" w:cs="Times New Roman"/>
+          <w:color w:val="9CDCFE"/>
+          <w:sz w:val="18"/>
+          <w:szCs w:val="21"/>
+          <w:lang w:val="en-IN" w:eastAsia="it-IT"/>
+        </w:rPr>
+        <w:t>processed_dir</w:t>
+      </w:r>
+      <w:proofErr w:type="spellEnd"/>
+      <w:r>
+        <w:rPr>
+          <w:rFonts w:ascii="Consolas" w:eastAsia="Times New Roman" w:hAnsi="Consolas" w:cs="Times New Roman"/>
+          <w:color w:val="D4D4D4"/>
+          <w:sz w:val="18"/>
+          <w:szCs w:val="21"/>
+          <w:lang w:val="en-IN" w:eastAsia="it-IT"/>
+        </w:rPr>
+        <w:t xml:space="preserve">, </w:t>
+      </w:r>
+      <w:proofErr w:type="spellStart"/>
+      <w:r>
+        <w:rPr>
+          <w:rFonts w:ascii="Consolas" w:eastAsia="Times New Roman" w:hAnsi="Consolas" w:cs="Times New Roman"/>
+          <w:color w:val="9CDCFE"/>
+          <w:sz w:val="18"/>
+          <w:szCs w:val="21"/>
+          <w:lang w:val="en-IN" w:eastAsia="it-IT"/>
+        </w:rPr>
+        <w:t>exist_ok</w:t>
+      </w:r>
+      <w:proofErr w:type="spellEnd"/>
+      <w:r>
+        <w:rPr>
+          <w:rFonts w:ascii="Consolas" w:eastAsia="Times New Roman" w:hAnsi="Consolas" w:cs="Times New Roman"/>
+          <w:color w:val="D4D4D4"/>
+          <w:sz w:val="18"/>
+          <w:szCs w:val="21"/>
+          <w:lang w:val="en-IN" w:eastAsia="it-IT"/>
+        </w:rPr>
+        <w:t>=</w:t>
+      </w:r>
+      <w:r>
+        <w:rPr>
+          <w:rFonts w:ascii="Consolas" w:eastAsia="Times New Roman" w:hAnsi="Consolas" w:cs="Times New Roman"/>
+          <w:color w:val="569CD6"/>
+          <w:sz w:val="18"/>
+          <w:szCs w:val="21"/>
+          <w:lang w:val="en-IN" w:eastAsia="it-IT"/>
+        </w:rPr>
+        <w:t>True</w:t>
+      </w:r>
+      <w:r>
+        <w:rPr>
+          <w:rFonts w:ascii="Consolas" w:eastAsia="Times New Roman" w:hAnsi="Consolas" w:cs="Times New Roman"/>
+          <w:color w:val="D4D4D4"/>
+          <w:sz w:val="18"/>
+          <w:szCs w:val="21"/>
+          <w:lang w:val="en-IN" w:eastAsia="it-IT"/>
+        </w:rPr>
+        <w:t>)</w:t>
+      </w:r>
+    </w:p>
+    <w:p>
+      <w:pPr>
+        <w:shd w:val="clear" w:color="auto" w:fill="1E1E1E"/>
+        <w:spacing w:before="0" w:after="0" w:line="240" w:lineRule="auto"/>
+        <w:rPr>
+          <w:rFonts w:ascii="Consolas" w:eastAsia="Times New Roman" w:hAnsi="Consolas" w:cs="Times New Roman"/>
+          <w:color w:val="D4D4D4"/>
+          <w:sz w:val="18"/>
+          <w:szCs w:val="21"/>
+          <w:lang w:val="en-IN" w:eastAsia="it-IT"/>
+        </w:rPr>
+      </w:pPr>
+      <w:proofErr w:type="spellStart"/>
+      <w:r>
+        <w:rPr>
+          <w:rFonts w:ascii="Consolas" w:eastAsia="Times New Roman" w:hAnsi="Consolas" w:cs="Times New Roman"/>
+          <w:color w:val="9CDCFE"/>
+          <w:sz w:val="18"/>
+          <w:szCs w:val="21"/>
+          <w:lang w:val="en-IN" w:eastAsia="it-IT"/>
+        </w:rPr>
+        <w:t>output_path</w:t>
+      </w:r>
+      <w:proofErr w:type="spellEnd"/>
+      <w:r>
+        <w:rPr>
+          <w:rFonts w:ascii="Consolas" w:eastAsia="Times New Roman" w:hAnsi="Consolas" w:cs="Times New Roman"/>
+          <w:color w:val="D4D4D4"/>
+          <w:sz w:val="18"/>
+          <w:szCs w:val="21"/>
+          <w:lang w:val="en-IN" w:eastAsia="it-IT"/>
+        </w:rPr>
+        <w:t xml:space="preserve"> = </w:t>
+      </w:r>
+      <w:proofErr w:type="spellStart"/>
+      <w:proofErr w:type="gramStart"/>
+      <w:r>
+        <w:rPr>
+          <w:rFonts w:ascii="Consolas" w:eastAsia="Times New Roman" w:hAnsi="Consolas" w:cs="Times New Roman"/>
+          <w:color w:val="4EC9B0"/>
+          <w:sz w:val="18"/>
+          <w:szCs w:val="21"/>
+          <w:lang w:val="en-IN" w:eastAsia="it-IT"/>
+        </w:rPr>
+        <w:t>os</w:t>
+      </w:r>
+      <w:r>
+        <w:rPr>
+          <w:rFonts w:ascii="Consolas" w:eastAsia="Times New Roman" w:hAnsi="Consolas" w:cs="Times New Roman"/>
+          <w:color w:val="D4D4D4"/>
+          <w:sz w:val="18"/>
+          <w:szCs w:val="21"/>
+          <w:lang w:val="en-IN" w:eastAsia="it-IT"/>
+        </w:rPr>
+        <w:t>.</w:t>
+      </w:r>
+      <w:r>
+        <w:rPr>
+          <w:rFonts w:ascii="Consolas" w:eastAsia="Times New Roman" w:hAnsi="Consolas" w:cs="Times New Roman"/>
+          <w:color w:val="4EC9B0"/>
+          <w:sz w:val="18"/>
+          <w:szCs w:val="21"/>
+          <w:lang w:val="en-IN" w:eastAsia="it-IT"/>
+        </w:rPr>
+        <w:t>path</w:t>
+      </w:r>
+      <w:proofErr w:type="gramEnd"/>
+      <w:r>
+        <w:rPr>
+          <w:rFonts w:ascii="Consolas" w:eastAsia="Times New Roman" w:hAnsi="Consolas" w:cs="Times New Roman"/>
+          <w:color w:val="D4D4D4"/>
+          <w:sz w:val="18"/>
+          <w:szCs w:val="21"/>
+          <w:lang w:val="en-IN" w:eastAsia="it-IT"/>
+        </w:rPr>
+        <w:t>.</w:t>
+      </w:r>
+      <w:r>
+        <w:rPr>
+          <w:rFonts w:ascii="Consolas" w:eastAsia="Times New Roman" w:hAnsi="Consolas" w:cs="Times New Roman"/>
+          <w:color w:val="DCDCAA"/>
+          <w:sz w:val="18"/>
+          <w:szCs w:val="21"/>
+          <w:lang w:val="en-IN" w:eastAsia="it-IT"/>
+        </w:rPr>
+        <w:t>join</w:t>
+      </w:r>
+      <w:proofErr w:type="spellEnd"/>
+      <w:r>
+        <w:rPr>
+          <w:rFonts w:ascii="Consolas" w:eastAsia="Times New Roman" w:hAnsi="Consolas" w:cs="Times New Roman"/>
+          <w:color w:val="D4D4D4"/>
+          <w:sz w:val="18"/>
+          <w:szCs w:val="21"/>
+          <w:lang w:val="en-IN" w:eastAsia="it-IT"/>
+        </w:rPr>
+        <w:t>(</w:t>
+      </w:r>
+      <w:proofErr w:type="spellStart"/>
+      <w:r>
+        <w:rPr>
+          <w:rFonts w:ascii="Consolas" w:eastAsia="Times New Roman" w:hAnsi="Consolas" w:cs="Times New Roman"/>
+          <w:color w:val="9CDCFE"/>
+          <w:sz w:val="18"/>
+          <w:szCs w:val="21"/>
+          <w:lang w:val="en-IN" w:eastAsia="it-IT"/>
+        </w:rPr>
+        <w:t>processed_dir</w:t>
+      </w:r>
+      <w:proofErr w:type="spellEnd"/>
+      <w:r>
+        <w:rPr>
+          <w:rFonts w:ascii="Consolas" w:eastAsia="Times New Roman" w:hAnsi="Consolas" w:cs="Times New Roman"/>
+          <w:color w:val="D4D4D4"/>
+          <w:sz w:val="18"/>
+          <w:szCs w:val="21"/>
+          <w:lang w:val="en-IN" w:eastAsia="it-IT"/>
+        </w:rPr>
+        <w:t xml:space="preserve">, </w:t>
+      </w:r>
+      <w:r>
+        <w:rPr>
+          <w:rFonts w:ascii="Consolas" w:eastAsia="Times New Roman" w:hAnsi="Consolas" w:cs="Times New Roman"/>
+          <w:color w:val="CE9178"/>
+          <w:sz w:val="18"/>
+          <w:szCs w:val="21"/>
+          <w:lang w:val="en-IN" w:eastAsia="it-IT"/>
+        </w:rPr>
+        <w:t>'</w:t>
+      </w:r>
+      <w:proofErr w:type="spellStart"/>
+      <w:r>
+        <w:rPr>
+          <w:rFonts w:ascii="Consolas" w:eastAsia="Times New Roman" w:hAnsi="Consolas" w:cs="Times New Roman"/>
+          <w:color w:val="CE9178"/>
+          <w:sz w:val="18"/>
+          <w:szCs w:val="21"/>
+          <w:lang w:val="en-IN" w:eastAsia="it-IT"/>
+        </w:rPr>
+        <w:t>master_analytical_file.parquet</w:t>
+      </w:r>
+      <w:proofErr w:type="spellEnd"/>
+      <w:r>
+        <w:rPr>
+          <w:rFonts w:ascii="Consolas" w:eastAsia="Times New Roman" w:hAnsi="Consolas" w:cs="Times New Roman"/>
+          <w:color w:val="CE9178"/>
+          <w:sz w:val="18"/>
+          <w:szCs w:val="21"/>
+          <w:lang w:val="en-IN" w:eastAsia="it-IT"/>
+        </w:rPr>
+        <w:t>'</w:t>
+      </w:r>
+      <w:r>
+        <w:rPr>
+          <w:rFonts w:ascii="Consolas" w:eastAsia="Times New Roman" w:hAnsi="Consolas" w:cs="Times New Roman"/>
+          <w:color w:val="D4D4D4"/>
+          <w:sz w:val="18"/>
+          <w:szCs w:val="21"/>
+          <w:lang w:val="en-IN" w:eastAsia="it-IT"/>
+        </w:rPr>
+        <w:t>)</w:t>
+      </w:r>
+    </w:p>
+    <w:p>
+      <w:pPr>
+        <w:shd w:val="clear" w:color="auto" w:fill="1E1E1E"/>
+        <w:spacing w:before="0" w:after="0" w:line="240" w:lineRule="auto"/>
+        <w:rPr>
+          <w:rFonts w:ascii="Consolas" w:eastAsia="Times New Roman" w:hAnsi="Consolas" w:cs="Times New Roman"/>
+          <w:color w:val="D4D4D4"/>
+          <w:sz w:val="18"/>
+          <w:szCs w:val="21"/>
+          <w:lang w:val="en-IN" w:eastAsia="it-IT"/>
+        </w:rPr>
+      </w:pPr>
+      <w:proofErr w:type="spellStart"/>
+      <w:r>
+        <w:rPr>
+          <w:rFonts w:ascii="Consolas" w:eastAsia="Times New Roman" w:hAnsi="Consolas" w:cs="Times New Roman"/>
+          <w:color w:val="9CDCFE"/>
+          <w:sz w:val="18"/>
+          <w:szCs w:val="21"/>
+          <w:lang w:val="en-IN" w:eastAsia="it-IT"/>
+        </w:rPr>
+        <w:t>df_master</w:t>
+      </w:r>
+      <w:r>
+        <w:rPr>
+          <w:rFonts w:ascii="Consolas" w:eastAsia="Times New Roman" w:hAnsi="Consolas" w:cs="Times New Roman"/>
+          <w:color w:val="D4D4D4"/>
+          <w:sz w:val="18"/>
+          <w:szCs w:val="21"/>
+          <w:lang w:val="en-IN" w:eastAsia="it-IT"/>
+        </w:rPr>
+        <w:t>.</w:t>
+      </w:r>
+      <w:r>
+        <w:rPr>
+          <w:rFonts w:ascii="Consolas" w:eastAsia="Times New Roman" w:hAnsi="Consolas" w:cs="Times New Roman"/>
+          <w:color w:val="DCDCAA"/>
+          <w:sz w:val="18"/>
+          <w:szCs w:val="21"/>
+          <w:lang w:val="en-IN" w:eastAsia="it-IT"/>
+        </w:rPr>
+        <w:t>to_</w:t>
+      </w:r>
+      <w:proofErr w:type="gramStart"/>
+      <w:r>
+        <w:rPr>
+          <w:rFonts w:ascii="Consolas" w:eastAsia="Times New Roman" w:hAnsi="Consolas" w:cs="Times New Roman"/>
+          <w:color w:val="DCDCAA"/>
+          <w:sz w:val="18"/>
+          <w:szCs w:val="21"/>
+          <w:lang w:val="en-IN" w:eastAsia="it-IT"/>
+        </w:rPr>
+        <w:t>parquet</w:t>
+      </w:r>
+      <w:proofErr w:type="spellEnd"/>
+      <w:r>
+        <w:rPr>
+          <w:rFonts w:ascii="Consolas" w:eastAsia="Times New Roman" w:hAnsi="Consolas" w:cs="Times New Roman"/>
+          <w:color w:val="D4D4D4"/>
+          <w:sz w:val="18"/>
+          <w:szCs w:val="21"/>
+          <w:lang w:val="en-IN" w:eastAsia="it-IT"/>
+        </w:rPr>
+        <w:t>(</w:t>
+      </w:r>
+      <w:proofErr w:type="spellStart"/>
+      <w:proofErr w:type="gramEnd"/>
+      <w:r>
+        <w:rPr>
+          <w:rFonts w:ascii="Consolas" w:eastAsia="Times New Roman" w:hAnsi="Consolas" w:cs="Times New Roman"/>
+          <w:color w:val="9CDCFE"/>
+          <w:sz w:val="18"/>
+          <w:szCs w:val="21"/>
+          <w:lang w:val="en-IN" w:eastAsia="it-IT"/>
+        </w:rPr>
+        <w:t>output_path</w:t>
+      </w:r>
+      <w:proofErr w:type="spellEnd"/>
+      <w:r>
+        <w:rPr>
+          <w:rFonts w:ascii="Consolas" w:eastAsia="Times New Roman" w:hAnsi="Consolas" w:cs="Times New Roman"/>
+          <w:color w:val="D4D4D4"/>
+          <w:sz w:val="18"/>
+          <w:szCs w:val="21"/>
+          <w:lang w:val="en-IN" w:eastAsia="it-IT"/>
+        </w:rPr>
+        <w:t xml:space="preserve">, </w:t>
+      </w:r>
+      <w:r>
+        <w:rPr>
+          <w:rFonts w:ascii="Consolas" w:eastAsia="Times New Roman" w:hAnsi="Consolas" w:cs="Times New Roman"/>
+          <w:color w:val="9CDCFE"/>
+          <w:sz w:val="18"/>
+          <w:szCs w:val="21"/>
+          <w:lang w:val="en-IN" w:eastAsia="it-IT"/>
+        </w:rPr>
+        <w:t>index</w:t>
+      </w:r>
+      <w:r>
+        <w:rPr>
+          <w:rFonts w:ascii="Consolas" w:eastAsia="Times New Roman" w:hAnsi="Consolas" w:cs="Times New Roman"/>
+          <w:color w:val="D4D4D4"/>
+          <w:sz w:val="18"/>
+          <w:szCs w:val="21"/>
+          <w:lang w:val="en-IN" w:eastAsia="it-IT"/>
+        </w:rPr>
+        <w:t>=</w:t>
+      </w:r>
+      <w:r>
+        <w:rPr>
+          <w:rFonts w:ascii="Consolas" w:eastAsia="Times New Roman" w:hAnsi="Consolas" w:cs="Times New Roman"/>
+          <w:color w:val="569CD6"/>
+          <w:sz w:val="18"/>
+          <w:szCs w:val="21"/>
+          <w:lang w:val="en-IN" w:eastAsia="it-IT"/>
+        </w:rPr>
+        <w:t>False</w:t>
+      </w:r>
+      <w:r>
+        <w:rPr>
+          <w:rFonts w:ascii="Consolas" w:eastAsia="Times New Roman" w:hAnsi="Consolas" w:cs="Times New Roman"/>
+          <w:color w:val="D4D4D4"/>
+          <w:sz w:val="18"/>
+          <w:szCs w:val="21"/>
+          <w:lang w:val="en-IN" w:eastAsia="it-IT"/>
+        </w:rPr>
+        <w:t xml:space="preserve">, </w:t>
+      </w:r>
+      <w:r>
+        <w:rPr>
+          <w:rFonts w:ascii="Consolas" w:eastAsia="Times New Roman" w:hAnsi="Consolas" w:cs="Times New Roman"/>
+          <w:color w:val="9CDCFE"/>
+          <w:sz w:val="18"/>
+          <w:szCs w:val="21"/>
+          <w:lang w:val="en-IN" w:eastAsia="it-IT"/>
+        </w:rPr>
+        <w:t>engine</w:t>
+      </w:r>
+      <w:r>
+        <w:rPr>
+          <w:rFonts w:ascii="Consolas" w:eastAsia="Times New Roman" w:hAnsi="Consolas" w:cs="Times New Roman"/>
+          <w:color w:val="D4D4D4"/>
+          <w:sz w:val="18"/>
+          <w:szCs w:val="21"/>
+          <w:lang w:val="en-IN" w:eastAsia="it-IT"/>
+        </w:rPr>
+        <w:t>=</w:t>
+      </w:r>
+      <w:r>
+        <w:rPr>
+          <w:rFonts w:ascii="Consolas" w:eastAsia="Times New Roman" w:hAnsi="Consolas" w:cs="Times New Roman"/>
+          <w:color w:val="CE9178"/>
+          <w:sz w:val="18"/>
+          <w:szCs w:val="21"/>
+          <w:lang w:val="en-IN" w:eastAsia="it-IT"/>
+        </w:rPr>
+        <w:t>'</w:t>
+      </w:r>
+      <w:proofErr w:type="spellStart"/>
+      <w:r>
+        <w:rPr>
+          <w:rFonts w:ascii="Consolas" w:eastAsia="Times New Roman" w:hAnsi="Consolas" w:cs="Times New Roman"/>
+          <w:color w:val="CE9178"/>
+          <w:sz w:val="18"/>
+          <w:szCs w:val="21"/>
+          <w:lang w:val="en-IN" w:eastAsia="it-IT"/>
+        </w:rPr>
+        <w:t>pyarrow</w:t>
+      </w:r>
+      <w:proofErr w:type="spellEnd"/>
+      <w:r>
+        <w:rPr>
+          <w:rFonts w:ascii="Consolas" w:eastAsia="Times New Roman" w:hAnsi="Consolas" w:cs="Times New Roman"/>
+          <w:color w:val="CE9178"/>
+          <w:sz w:val="18"/>
+          <w:szCs w:val="21"/>
+          <w:lang w:val="en-IN" w:eastAsia="it-IT"/>
+        </w:rPr>
+        <w:t>'</w:t>
+      </w:r>
+      <w:r>
+        <w:rPr>
+          <w:rFonts w:ascii="Consolas" w:eastAsia="Times New Roman" w:hAnsi="Consolas" w:cs="Times New Roman"/>
+          <w:color w:val="D4D4D4"/>
+          <w:sz w:val="18"/>
+          <w:szCs w:val="21"/>
+          <w:lang w:val="en-IN" w:eastAsia="it-IT"/>
+        </w:rPr>
+        <w:t>)</w:t>
+      </w:r>
+    </w:p>
+    <w:p>
+      <w:pPr>
+        <w:shd w:val="clear" w:color="auto" w:fill="1E1E1E"/>
+        <w:spacing w:before="0" w:after="0" w:line="240" w:lineRule="auto"/>
+        <w:rPr>
+          <w:rFonts w:ascii="Consolas" w:eastAsia="Times New Roman" w:hAnsi="Consolas" w:cs="Times New Roman"/>
+          <w:color w:val="D4D4D4"/>
+          <w:sz w:val="18"/>
+          <w:szCs w:val="21"/>
+          <w:lang w:val="en-IN" w:eastAsia="it-IT"/>
+        </w:rPr>
+      </w:pPr>
+      <w:r>
+        <w:rPr>
+          <w:rFonts w:ascii="Consolas" w:eastAsia="Times New Roman" w:hAnsi="Consolas" w:cs="Times New Roman"/>
+          <w:color w:val="D4D4D4"/>
+          <w:sz w:val="18"/>
+          <w:szCs w:val="21"/>
+          <w:lang w:val="en-IN" w:eastAsia="it-IT"/>
+        </w:rPr>
+        <w:t>[root/notebooks/02_data_processing.ipynb]</w:t>
+      </w:r>
+    </w:p>
+    <w:p>
+      <w:pPr>
+        <w:pStyle w:val="Titolo1"/>
+        <w:rPr>
+          <w:b/>
+          <w:lang w:val="en-IN"/>
+        </w:rPr>
+      </w:pPr>
+      <w:bookmarkStart w:id="17" w:name="_Toc223365922"/>
+      <w:r>
+        <w:rPr>
+          <w:b/>
+          <w:lang w:val="en-IN"/>
+        </w:rPr>
+        <w:lastRenderedPageBreak/>
+        <w:t>4.0 The Conversion Funnel – From Sample to Sale</w:t>
       </w:r>
       <w:bookmarkEnd w:id="17"/>
     </w:p>
@@ -18915,668 +19340,66 @@
         <w:rPr>
           <w:lang w:val="en-IN"/>
         </w:rPr>
-        <w:t>T</w:t>
-      </w:r>
-      <w:r>
-        <w:rPr>
-          <w:lang w:val="en-IN"/>
-        </w:rPr>
-        <w:t>he Master Analytical File was converted from CSV to Parquet to handle nearly 2 million records with high performance. As a columnar format, Parquet enables superior compression and allows the recommendation engine to load specific features, such as motif, without reading the entire dataset. This transition reduces disk usage, preserves complex data types, and provides a scalable foundation</w:t>
-      </w:r>
-      <w:r>
-        <w:rPr>
-          <w:lang w:val="en-IN"/>
-        </w:rPr>
-        <w:t>.</w:t>
+        <w:t xml:space="preserve">This chapter quantifies the efficiency of the </w:t>
+      </w:r>
+      <w:r>
+        <w:rPr>
+          <w:b/>
+          <w:bCs/>
+          <w:lang w:val="en-IN"/>
+        </w:rPr>
+        <w:t>LuxeIntelligence</w:t>
+      </w:r>
+      <w:r>
+        <w:rPr>
+          <w:lang w:val="en-IN"/>
+        </w:rPr>
+        <w:t xml:space="preserve"> funnel, specifically examining the critical transition from "Sampling" to "Realized Revenue". By </w:t>
+      </w:r>
+      <w:proofErr w:type="spellStart"/>
+      <w:r>
+        <w:rPr>
+          <w:lang w:val="en-IN"/>
+        </w:rPr>
+        <w:t>analyzing</w:t>
+      </w:r>
+      <w:proofErr w:type="spellEnd"/>
+      <w:r>
+        <w:rPr>
+          <w:lang w:val="en-IN"/>
+        </w:rPr>
+        <w:t xml:space="preserve"> the 1,983,549 audited records, we can identify the specific aesthetic and </w:t>
+      </w:r>
+      <w:proofErr w:type="spellStart"/>
+      <w:r>
+        <w:rPr>
+          <w:lang w:val="en-IN"/>
+        </w:rPr>
+        <w:t>behavioral</w:t>
+      </w:r>
+      <w:proofErr w:type="spellEnd"/>
+      <w:r>
+        <w:rPr>
+          <w:lang w:val="en-IN"/>
+        </w:rPr>
+        <w:t xml:space="preserve"> triggers that convert a lead into a purchase.</w:t>
       </w:r>
     </w:p>
     <w:p>
       <w:pPr>
-        <w:shd w:val="clear" w:color="auto" w:fill="1E1E1E"/>
-        <w:spacing w:before="0" w:after="0" w:line="240" w:lineRule="auto"/>
-        <w:rPr>
-          <w:rFonts w:ascii="Consolas" w:eastAsia="Times New Roman" w:hAnsi="Consolas" w:cs="Times New Roman"/>
-          <w:color w:val="D4D4D4"/>
-          <w:sz w:val="18"/>
-          <w:szCs w:val="21"/>
-          <w:lang w:val="en-IN" w:eastAsia="it-IT"/>
-        </w:rPr>
-      </w:pPr>
-      <w:proofErr w:type="spellStart"/>
-      <w:r>
-        <w:rPr>
-          <w:rFonts w:ascii="Consolas" w:eastAsia="Times New Roman" w:hAnsi="Consolas" w:cs="Times New Roman"/>
-          <w:color w:val="9CDCFE"/>
-          <w:sz w:val="18"/>
-          <w:szCs w:val="21"/>
-          <w:lang w:val="en-IN" w:eastAsia="it-IT"/>
-        </w:rPr>
-        <w:t>processed_dir</w:t>
-      </w:r>
-      <w:proofErr w:type="spellEnd"/>
-      <w:r>
-        <w:rPr>
-          <w:rFonts w:ascii="Consolas" w:eastAsia="Times New Roman" w:hAnsi="Consolas" w:cs="Times New Roman"/>
-          <w:color w:val="D4D4D4"/>
-          <w:sz w:val="18"/>
-          <w:szCs w:val="21"/>
-          <w:lang w:val="en-IN" w:eastAsia="it-IT"/>
-        </w:rPr>
-        <w:t xml:space="preserve"> = </w:t>
-      </w:r>
-      <w:proofErr w:type="gramStart"/>
-      <w:r>
-        <w:rPr>
-          <w:rFonts w:ascii="Consolas" w:eastAsia="Times New Roman" w:hAnsi="Consolas" w:cs="Times New Roman"/>
-          <w:color w:val="CE9178"/>
-          <w:sz w:val="18"/>
-          <w:szCs w:val="21"/>
-          <w:lang w:val="en-IN" w:eastAsia="it-IT"/>
-        </w:rPr>
-        <w:t>'..</w:t>
-      </w:r>
-      <w:proofErr w:type="gramEnd"/>
-      <w:r>
-        <w:rPr>
-          <w:rFonts w:ascii="Consolas" w:eastAsia="Times New Roman" w:hAnsi="Consolas" w:cs="Times New Roman"/>
-          <w:color w:val="CE9178"/>
-          <w:sz w:val="18"/>
-          <w:szCs w:val="21"/>
-          <w:lang w:val="en-IN" w:eastAsia="it-IT"/>
-        </w:rPr>
-        <w:t>/data/processed/notebooks'</w:t>
-      </w:r>
-    </w:p>
-    <w:p>
-      <w:pPr>
-        <w:shd w:val="clear" w:color="auto" w:fill="1E1E1E"/>
-        <w:spacing w:before="0" w:after="0" w:line="240" w:lineRule="auto"/>
-        <w:rPr>
-          <w:rFonts w:ascii="Consolas" w:eastAsia="Times New Roman" w:hAnsi="Consolas" w:cs="Times New Roman"/>
-          <w:color w:val="D4D4D4"/>
-          <w:sz w:val="18"/>
-          <w:szCs w:val="21"/>
-          <w:lang w:val="en-IN" w:eastAsia="it-IT"/>
-        </w:rPr>
-      </w:pPr>
-      <w:proofErr w:type="spellStart"/>
-      <w:proofErr w:type="gramStart"/>
-      <w:r>
-        <w:rPr>
-          <w:rFonts w:ascii="Consolas" w:eastAsia="Times New Roman" w:hAnsi="Consolas" w:cs="Times New Roman"/>
-          <w:color w:val="4EC9B0"/>
-          <w:sz w:val="18"/>
-          <w:szCs w:val="21"/>
-          <w:lang w:val="en-IN" w:eastAsia="it-IT"/>
-        </w:rPr>
-        <w:t>os</w:t>
-      </w:r>
-      <w:r>
-        <w:rPr>
-          <w:rFonts w:ascii="Consolas" w:eastAsia="Times New Roman" w:hAnsi="Consolas" w:cs="Times New Roman"/>
-          <w:color w:val="D4D4D4"/>
-          <w:sz w:val="18"/>
-          <w:szCs w:val="21"/>
-          <w:lang w:val="en-IN" w:eastAsia="it-IT"/>
-        </w:rPr>
-        <w:t>.</w:t>
-      </w:r>
-      <w:r>
-        <w:rPr>
-          <w:rFonts w:ascii="Consolas" w:eastAsia="Times New Roman" w:hAnsi="Consolas" w:cs="Times New Roman"/>
-          <w:color w:val="DCDCAA"/>
-          <w:sz w:val="18"/>
-          <w:szCs w:val="21"/>
-          <w:lang w:val="en-IN" w:eastAsia="it-IT"/>
-        </w:rPr>
-        <w:t>makedirs</w:t>
-      </w:r>
-      <w:proofErr w:type="spellEnd"/>
-      <w:proofErr w:type="gramEnd"/>
-      <w:r>
-        <w:rPr>
-          <w:rFonts w:ascii="Consolas" w:eastAsia="Times New Roman" w:hAnsi="Consolas" w:cs="Times New Roman"/>
-          <w:color w:val="D4D4D4"/>
-          <w:sz w:val="18"/>
-          <w:szCs w:val="21"/>
-          <w:lang w:val="en-IN" w:eastAsia="it-IT"/>
-        </w:rPr>
-        <w:t>(</w:t>
-      </w:r>
-      <w:proofErr w:type="spellStart"/>
-      <w:r>
-        <w:rPr>
-          <w:rFonts w:ascii="Consolas" w:eastAsia="Times New Roman" w:hAnsi="Consolas" w:cs="Times New Roman"/>
-          <w:color w:val="9CDCFE"/>
-          <w:sz w:val="18"/>
-          <w:szCs w:val="21"/>
-          <w:lang w:val="en-IN" w:eastAsia="it-IT"/>
-        </w:rPr>
-        <w:t>processed_dir</w:t>
-      </w:r>
-      <w:proofErr w:type="spellEnd"/>
-      <w:r>
-        <w:rPr>
-          <w:rFonts w:ascii="Consolas" w:eastAsia="Times New Roman" w:hAnsi="Consolas" w:cs="Times New Roman"/>
-          <w:color w:val="D4D4D4"/>
-          <w:sz w:val="18"/>
-          <w:szCs w:val="21"/>
-          <w:lang w:val="en-IN" w:eastAsia="it-IT"/>
-        </w:rPr>
-        <w:t xml:space="preserve">, </w:t>
-      </w:r>
-      <w:proofErr w:type="spellStart"/>
-      <w:r>
-        <w:rPr>
-          <w:rFonts w:ascii="Consolas" w:eastAsia="Times New Roman" w:hAnsi="Consolas" w:cs="Times New Roman"/>
-          <w:color w:val="9CDCFE"/>
-          <w:sz w:val="18"/>
-          <w:szCs w:val="21"/>
-          <w:lang w:val="en-IN" w:eastAsia="it-IT"/>
-        </w:rPr>
-        <w:t>exist_ok</w:t>
-      </w:r>
-      <w:proofErr w:type="spellEnd"/>
-      <w:r>
-        <w:rPr>
-          <w:rFonts w:ascii="Consolas" w:eastAsia="Times New Roman" w:hAnsi="Consolas" w:cs="Times New Roman"/>
-          <w:color w:val="D4D4D4"/>
-          <w:sz w:val="18"/>
-          <w:szCs w:val="21"/>
-          <w:lang w:val="en-IN" w:eastAsia="it-IT"/>
-        </w:rPr>
-        <w:t>=</w:t>
-      </w:r>
-      <w:r>
-        <w:rPr>
-          <w:rFonts w:ascii="Consolas" w:eastAsia="Times New Roman" w:hAnsi="Consolas" w:cs="Times New Roman"/>
-          <w:color w:val="569CD6"/>
-          <w:sz w:val="18"/>
-          <w:szCs w:val="21"/>
-          <w:lang w:val="en-IN" w:eastAsia="it-IT"/>
-        </w:rPr>
-        <w:t>True</w:t>
-      </w:r>
-      <w:r>
-        <w:rPr>
-          <w:rFonts w:ascii="Consolas" w:eastAsia="Times New Roman" w:hAnsi="Consolas" w:cs="Times New Roman"/>
-          <w:color w:val="D4D4D4"/>
-          <w:sz w:val="18"/>
-          <w:szCs w:val="21"/>
-          <w:lang w:val="en-IN" w:eastAsia="it-IT"/>
-        </w:rPr>
-        <w:t>)</w:t>
-      </w:r>
-    </w:p>
-    <w:p>
-      <w:pPr>
-        <w:shd w:val="clear" w:color="auto" w:fill="1E1E1E"/>
-        <w:spacing w:before="0" w:after="0" w:line="240" w:lineRule="auto"/>
-        <w:rPr>
-          <w:rFonts w:ascii="Consolas" w:eastAsia="Times New Roman" w:hAnsi="Consolas" w:cs="Times New Roman"/>
-          <w:color w:val="D4D4D4"/>
-          <w:sz w:val="18"/>
-          <w:szCs w:val="21"/>
-          <w:lang w:val="en-IN" w:eastAsia="it-IT"/>
-        </w:rPr>
-      </w:pPr>
-      <w:proofErr w:type="spellStart"/>
-      <w:r>
-        <w:rPr>
-          <w:rFonts w:ascii="Consolas" w:eastAsia="Times New Roman" w:hAnsi="Consolas" w:cs="Times New Roman"/>
-          <w:color w:val="9CDCFE"/>
-          <w:sz w:val="18"/>
-          <w:szCs w:val="21"/>
-          <w:lang w:val="en-IN" w:eastAsia="it-IT"/>
-        </w:rPr>
-        <w:t>output_path</w:t>
-      </w:r>
-      <w:proofErr w:type="spellEnd"/>
-      <w:r>
-        <w:rPr>
-          <w:rFonts w:ascii="Consolas" w:eastAsia="Times New Roman" w:hAnsi="Consolas" w:cs="Times New Roman"/>
-          <w:color w:val="D4D4D4"/>
-          <w:sz w:val="18"/>
-          <w:szCs w:val="21"/>
-          <w:lang w:val="en-IN" w:eastAsia="it-IT"/>
-        </w:rPr>
-        <w:t xml:space="preserve"> = </w:t>
-      </w:r>
-      <w:proofErr w:type="spellStart"/>
-      <w:proofErr w:type="gramStart"/>
-      <w:r>
-        <w:rPr>
-          <w:rFonts w:ascii="Consolas" w:eastAsia="Times New Roman" w:hAnsi="Consolas" w:cs="Times New Roman"/>
-          <w:color w:val="4EC9B0"/>
-          <w:sz w:val="18"/>
-          <w:szCs w:val="21"/>
-          <w:lang w:val="en-IN" w:eastAsia="it-IT"/>
-        </w:rPr>
-        <w:t>os</w:t>
-      </w:r>
-      <w:r>
-        <w:rPr>
-          <w:rFonts w:ascii="Consolas" w:eastAsia="Times New Roman" w:hAnsi="Consolas" w:cs="Times New Roman"/>
-          <w:color w:val="D4D4D4"/>
-          <w:sz w:val="18"/>
-          <w:szCs w:val="21"/>
-          <w:lang w:val="en-IN" w:eastAsia="it-IT"/>
-        </w:rPr>
-        <w:t>.</w:t>
-      </w:r>
-      <w:r>
-        <w:rPr>
-          <w:rFonts w:ascii="Consolas" w:eastAsia="Times New Roman" w:hAnsi="Consolas" w:cs="Times New Roman"/>
-          <w:color w:val="4EC9B0"/>
-          <w:sz w:val="18"/>
-          <w:szCs w:val="21"/>
-          <w:lang w:val="en-IN" w:eastAsia="it-IT"/>
-        </w:rPr>
-        <w:t>path</w:t>
-      </w:r>
-      <w:proofErr w:type="gramEnd"/>
-      <w:r>
-        <w:rPr>
-          <w:rFonts w:ascii="Consolas" w:eastAsia="Times New Roman" w:hAnsi="Consolas" w:cs="Times New Roman"/>
-          <w:color w:val="D4D4D4"/>
-          <w:sz w:val="18"/>
-          <w:szCs w:val="21"/>
-          <w:lang w:val="en-IN" w:eastAsia="it-IT"/>
-        </w:rPr>
-        <w:t>.</w:t>
-      </w:r>
-      <w:r>
-        <w:rPr>
-          <w:rFonts w:ascii="Consolas" w:eastAsia="Times New Roman" w:hAnsi="Consolas" w:cs="Times New Roman"/>
-          <w:color w:val="DCDCAA"/>
-          <w:sz w:val="18"/>
-          <w:szCs w:val="21"/>
-          <w:lang w:val="en-IN" w:eastAsia="it-IT"/>
-        </w:rPr>
-        <w:t>join</w:t>
-      </w:r>
-      <w:proofErr w:type="spellEnd"/>
-      <w:r>
-        <w:rPr>
-          <w:rFonts w:ascii="Consolas" w:eastAsia="Times New Roman" w:hAnsi="Consolas" w:cs="Times New Roman"/>
-          <w:color w:val="D4D4D4"/>
-          <w:sz w:val="18"/>
-          <w:szCs w:val="21"/>
-          <w:lang w:val="en-IN" w:eastAsia="it-IT"/>
-        </w:rPr>
-        <w:t>(</w:t>
-      </w:r>
-      <w:proofErr w:type="spellStart"/>
-      <w:r>
-        <w:rPr>
-          <w:rFonts w:ascii="Consolas" w:eastAsia="Times New Roman" w:hAnsi="Consolas" w:cs="Times New Roman"/>
-          <w:color w:val="9CDCFE"/>
-          <w:sz w:val="18"/>
-          <w:szCs w:val="21"/>
-          <w:lang w:val="en-IN" w:eastAsia="it-IT"/>
-        </w:rPr>
-        <w:t>processed_dir</w:t>
-      </w:r>
-      <w:proofErr w:type="spellEnd"/>
-      <w:r>
-        <w:rPr>
-          <w:rFonts w:ascii="Consolas" w:eastAsia="Times New Roman" w:hAnsi="Consolas" w:cs="Times New Roman"/>
-          <w:color w:val="D4D4D4"/>
-          <w:sz w:val="18"/>
-          <w:szCs w:val="21"/>
-          <w:lang w:val="en-IN" w:eastAsia="it-IT"/>
-        </w:rPr>
-        <w:t xml:space="preserve">, </w:t>
-      </w:r>
-      <w:r>
-        <w:rPr>
-          <w:rFonts w:ascii="Consolas" w:eastAsia="Times New Roman" w:hAnsi="Consolas" w:cs="Times New Roman"/>
-          <w:color w:val="CE9178"/>
-          <w:sz w:val="18"/>
-          <w:szCs w:val="21"/>
-          <w:lang w:val="en-IN" w:eastAsia="it-IT"/>
-        </w:rPr>
-        <w:t>'</w:t>
-      </w:r>
-      <w:proofErr w:type="spellStart"/>
-      <w:r>
-        <w:rPr>
-          <w:rFonts w:ascii="Consolas" w:eastAsia="Times New Roman" w:hAnsi="Consolas" w:cs="Times New Roman"/>
-          <w:color w:val="CE9178"/>
-          <w:sz w:val="18"/>
-          <w:szCs w:val="21"/>
-          <w:lang w:val="en-IN" w:eastAsia="it-IT"/>
-        </w:rPr>
-        <w:t>master_analytical_file.parquet</w:t>
-      </w:r>
-      <w:proofErr w:type="spellEnd"/>
-      <w:r>
-        <w:rPr>
-          <w:rFonts w:ascii="Consolas" w:eastAsia="Times New Roman" w:hAnsi="Consolas" w:cs="Times New Roman"/>
-          <w:color w:val="CE9178"/>
-          <w:sz w:val="18"/>
-          <w:szCs w:val="21"/>
-          <w:lang w:val="en-IN" w:eastAsia="it-IT"/>
-        </w:rPr>
-        <w:t>'</w:t>
-      </w:r>
-      <w:r>
-        <w:rPr>
-          <w:rFonts w:ascii="Consolas" w:eastAsia="Times New Roman" w:hAnsi="Consolas" w:cs="Times New Roman"/>
-          <w:color w:val="D4D4D4"/>
-          <w:sz w:val="18"/>
-          <w:szCs w:val="21"/>
-          <w:lang w:val="en-IN" w:eastAsia="it-IT"/>
-        </w:rPr>
-        <w:t>)</w:t>
-      </w:r>
-    </w:p>
-    <w:p>
-      <w:pPr>
-        <w:shd w:val="clear" w:color="auto" w:fill="1E1E1E"/>
-        <w:spacing w:before="0" w:after="0" w:line="240" w:lineRule="auto"/>
-        <w:rPr>
-          <w:rFonts w:ascii="Consolas" w:eastAsia="Times New Roman" w:hAnsi="Consolas" w:cs="Times New Roman"/>
-          <w:color w:val="D4D4D4"/>
-          <w:sz w:val="18"/>
-          <w:szCs w:val="21"/>
-          <w:lang w:val="en-IN" w:eastAsia="it-IT"/>
-        </w:rPr>
-      </w:pPr>
-      <w:proofErr w:type="spellStart"/>
-      <w:r>
-        <w:rPr>
-          <w:rFonts w:ascii="Consolas" w:eastAsia="Times New Roman" w:hAnsi="Consolas" w:cs="Times New Roman"/>
-          <w:color w:val="9CDCFE"/>
-          <w:sz w:val="18"/>
-          <w:szCs w:val="21"/>
-          <w:lang w:val="en-IN" w:eastAsia="it-IT"/>
-        </w:rPr>
-        <w:t>df_master</w:t>
-      </w:r>
-      <w:r>
-        <w:rPr>
-          <w:rFonts w:ascii="Consolas" w:eastAsia="Times New Roman" w:hAnsi="Consolas" w:cs="Times New Roman"/>
-          <w:color w:val="D4D4D4"/>
-          <w:sz w:val="18"/>
-          <w:szCs w:val="21"/>
-          <w:lang w:val="en-IN" w:eastAsia="it-IT"/>
-        </w:rPr>
-        <w:t>.</w:t>
-      </w:r>
-      <w:r>
-        <w:rPr>
-          <w:rFonts w:ascii="Consolas" w:eastAsia="Times New Roman" w:hAnsi="Consolas" w:cs="Times New Roman"/>
-          <w:color w:val="DCDCAA"/>
-          <w:sz w:val="18"/>
-          <w:szCs w:val="21"/>
-          <w:lang w:val="en-IN" w:eastAsia="it-IT"/>
-        </w:rPr>
-        <w:t>to_</w:t>
-      </w:r>
-      <w:proofErr w:type="gramStart"/>
-      <w:r>
-        <w:rPr>
-          <w:rFonts w:ascii="Consolas" w:eastAsia="Times New Roman" w:hAnsi="Consolas" w:cs="Times New Roman"/>
-          <w:color w:val="DCDCAA"/>
-          <w:sz w:val="18"/>
-          <w:szCs w:val="21"/>
-          <w:lang w:val="en-IN" w:eastAsia="it-IT"/>
-        </w:rPr>
-        <w:t>parquet</w:t>
-      </w:r>
-      <w:proofErr w:type="spellEnd"/>
-      <w:r>
-        <w:rPr>
-          <w:rFonts w:ascii="Consolas" w:eastAsia="Times New Roman" w:hAnsi="Consolas" w:cs="Times New Roman"/>
-          <w:color w:val="D4D4D4"/>
-          <w:sz w:val="18"/>
-          <w:szCs w:val="21"/>
-          <w:lang w:val="en-IN" w:eastAsia="it-IT"/>
-        </w:rPr>
-        <w:t>(</w:t>
-      </w:r>
-      <w:proofErr w:type="spellStart"/>
-      <w:proofErr w:type="gramEnd"/>
-      <w:r>
-        <w:rPr>
-          <w:rFonts w:ascii="Consolas" w:eastAsia="Times New Roman" w:hAnsi="Consolas" w:cs="Times New Roman"/>
-          <w:color w:val="9CDCFE"/>
-          <w:sz w:val="18"/>
-          <w:szCs w:val="21"/>
-          <w:lang w:val="en-IN" w:eastAsia="it-IT"/>
-        </w:rPr>
-        <w:t>output_path</w:t>
-      </w:r>
-      <w:proofErr w:type="spellEnd"/>
-      <w:r>
-        <w:rPr>
-          <w:rFonts w:ascii="Consolas" w:eastAsia="Times New Roman" w:hAnsi="Consolas" w:cs="Times New Roman"/>
-          <w:color w:val="D4D4D4"/>
-          <w:sz w:val="18"/>
-          <w:szCs w:val="21"/>
-          <w:lang w:val="en-IN" w:eastAsia="it-IT"/>
-        </w:rPr>
-        <w:t xml:space="preserve">, </w:t>
-      </w:r>
-      <w:r>
-        <w:rPr>
-          <w:rFonts w:ascii="Consolas" w:eastAsia="Times New Roman" w:hAnsi="Consolas" w:cs="Times New Roman"/>
-          <w:color w:val="9CDCFE"/>
-          <w:sz w:val="18"/>
-          <w:szCs w:val="21"/>
-          <w:lang w:val="en-IN" w:eastAsia="it-IT"/>
-        </w:rPr>
-        <w:t>index</w:t>
-      </w:r>
-      <w:r>
-        <w:rPr>
-          <w:rFonts w:ascii="Consolas" w:eastAsia="Times New Roman" w:hAnsi="Consolas" w:cs="Times New Roman"/>
-          <w:color w:val="D4D4D4"/>
-          <w:sz w:val="18"/>
-          <w:szCs w:val="21"/>
-          <w:lang w:val="en-IN" w:eastAsia="it-IT"/>
-        </w:rPr>
-        <w:t>=</w:t>
-      </w:r>
-      <w:r>
-        <w:rPr>
-          <w:rFonts w:ascii="Consolas" w:eastAsia="Times New Roman" w:hAnsi="Consolas" w:cs="Times New Roman"/>
-          <w:color w:val="569CD6"/>
-          <w:sz w:val="18"/>
-          <w:szCs w:val="21"/>
-          <w:lang w:val="en-IN" w:eastAsia="it-IT"/>
-        </w:rPr>
-        <w:t>False</w:t>
-      </w:r>
-      <w:r>
-        <w:rPr>
-          <w:rFonts w:ascii="Consolas" w:eastAsia="Times New Roman" w:hAnsi="Consolas" w:cs="Times New Roman"/>
-          <w:color w:val="D4D4D4"/>
-          <w:sz w:val="18"/>
-          <w:szCs w:val="21"/>
-          <w:lang w:val="en-IN" w:eastAsia="it-IT"/>
-        </w:rPr>
-        <w:t xml:space="preserve">, </w:t>
-      </w:r>
-      <w:r>
-        <w:rPr>
-          <w:rFonts w:ascii="Consolas" w:eastAsia="Times New Roman" w:hAnsi="Consolas" w:cs="Times New Roman"/>
-          <w:color w:val="9CDCFE"/>
-          <w:sz w:val="18"/>
-          <w:szCs w:val="21"/>
-          <w:lang w:val="en-IN" w:eastAsia="it-IT"/>
-        </w:rPr>
-        <w:t>engine</w:t>
-      </w:r>
-      <w:r>
-        <w:rPr>
-          <w:rFonts w:ascii="Consolas" w:eastAsia="Times New Roman" w:hAnsi="Consolas" w:cs="Times New Roman"/>
-          <w:color w:val="D4D4D4"/>
-          <w:sz w:val="18"/>
-          <w:szCs w:val="21"/>
-          <w:lang w:val="en-IN" w:eastAsia="it-IT"/>
-        </w:rPr>
-        <w:t>=</w:t>
-      </w:r>
-      <w:r>
-        <w:rPr>
-          <w:rFonts w:ascii="Consolas" w:eastAsia="Times New Roman" w:hAnsi="Consolas" w:cs="Times New Roman"/>
-          <w:color w:val="CE9178"/>
-          <w:sz w:val="18"/>
-          <w:szCs w:val="21"/>
-          <w:lang w:val="en-IN" w:eastAsia="it-IT"/>
-        </w:rPr>
-        <w:t>'</w:t>
-      </w:r>
-      <w:proofErr w:type="spellStart"/>
-      <w:r>
-        <w:rPr>
-          <w:rFonts w:ascii="Consolas" w:eastAsia="Times New Roman" w:hAnsi="Consolas" w:cs="Times New Roman"/>
-          <w:color w:val="CE9178"/>
-          <w:sz w:val="18"/>
-          <w:szCs w:val="21"/>
-          <w:lang w:val="en-IN" w:eastAsia="it-IT"/>
-        </w:rPr>
-        <w:t>pyarrow</w:t>
-      </w:r>
-      <w:proofErr w:type="spellEnd"/>
-      <w:r>
-        <w:rPr>
-          <w:rFonts w:ascii="Consolas" w:eastAsia="Times New Roman" w:hAnsi="Consolas" w:cs="Times New Roman"/>
-          <w:color w:val="CE9178"/>
-          <w:sz w:val="18"/>
-          <w:szCs w:val="21"/>
-          <w:lang w:val="en-IN" w:eastAsia="it-IT"/>
-        </w:rPr>
-        <w:t>'</w:t>
-      </w:r>
-      <w:r>
-        <w:rPr>
-          <w:rFonts w:ascii="Consolas" w:eastAsia="Times New Roman" w:hAnsi="Consolas" w:cs="Times New Roman"/>
-          <w:color w:val="D4D4D4"/>
-          <w:sz w:val="18"/>
-          <w:szCs w:val="21"/>
-          <w:lang w:val="en-IN" w:eastAsia="it-IT"/>
-        </w:rPr>
-        <w:t>)</w:t>
-      </w:r>
-    </w:p>
-    <w:p>
-      <w:pPr>
-        <w:shd w:val="clear" w:color="auto" w:fill="1E1E1E"/>
-        <w:spacing w:before="0" w:after="0" w:line="240" w:lineRule="auto"/>
-        <w:rPr>
-          <w:rFonts w:ascii="Consolas" w:eastAsia="Times New Roman" w:hAnsi="Consolas" w:cs="Times New Roman"/>
-          <w:color w:val="D4D4D4"/>
-          <w:sz w:val="18"/>
-          <w:szCs w:val="21"/>
-          <w:lang w:val="en-IN" w:eastAsia="it-IT"/>
-        </w:rPr>
-      </w:pPr>
-      <w:r>
-        <w:rPr>
-          <w:rFonts w:ascii="Consolas" w:eastAsia="Times New Roman" w:hAnsi="Consolas" w:cs="Times New Roman"/>
-          <w:color w:val="D4D4D4"/>
-          <w:sz w:val="18"/>
-          <w:szCs w:val="21"/>
-          <w:lang w:val="en-IN" w:eastAsia="it-IT"/>
-        </w:rPr>
-        <w:t>[root/notebooks/02_data_processing.ipynb]</w:t>
-      </w:r>
-    </w:p>
-    <w:p>
-      <w:pPr>
-        <w:pStyle w:val="Titolo1"/>
-        <w:rPr>
-          <w:b/>
-          <w:lang w:val="en-IN"/>
-        </w:rPr>
-      </w:pPr>
-      <w:bookmarkStart w:id="18" w:name="_Toc223365922"/>
-      <w:r>
-        <w:rPr>
-          <w:b/>
-          <w:lang w:val="en-IN"/>
-        </w:rPr>
-        <w:lastRenderedPageBreak/>
-        <w:t>4.0 The Conversion Funnel – From Sample to Sale</w:t>
+        <w:pStyle w:val="Titolo2"/>
+        <w:rPr>
+          <w:lang w:val="en-IN"/>
+        </w:rPr>
+      </w:pPr>
+      <w:bookmarkStart w:id="18" w:name="_Toc223365923"/>
+      <w:r>
+        <w:rPr>
+          <w:lang w:val="en-IN"/>
+        </w:rPr>
+        <w:t>4.1 Strategic Conclusion: The "Halo Effect" of Sampling</w:t>
       </w:r>
       <w:bookmarkEnd w:id="18"/>
-    </w:p>
-    <w:p>
-      <w:pPr>
-        <w:pStyle w:val="NormaleWeb"/>
-        <w:spacing w:line="276" w:lineRule="auto"/>
-        <w:jc w:val="both"/>
-        <w:rPr>
-          <w:lang w:val="en-IN"/>
-        </w:rPr>
-      </w:pPr>
-      <w:r>
-        <w:rPr>
-          <w:lang w:val="en-IN"/>
-        </w:rPr>
-        <w:t xml:space="preserve">This chapter quantifies the efficiency of the </w:t>
-      </w:r>
-      <w:r>
-        <w:rPr>
-          <w:b/>
-          <w:bCs/>
-          <w:lang w:val="en-IN"/>
-        </w:rPr>
-        <w:t>LuxeIntelligence</w:t>
-      </w:r>
-      <w:r>
-        <w:rPr>
-          <w:lang w:val="en-IN"/>
-        </w:rPr>
-        <w:t xml:space="preserve"> funnel, specifically examining the critical transition from "Sampling" to "Realized Revenue". By </w:t>
-      </w:r>
-      <w:proofErr w:type="spellStart"/>
-      <w:r>
-        <w:rPr>
-          <w:lang w:val="en-IN"/>
-        </w:rPr>
-        <w:t>analyzing</w:t>
-      </w:r>
-      <w:proofErr w:type="spellEnd"/>
-      <w:r>
-        <w:rPr>
-          <w:lang w:val="en-IN"/>
-        </w:rPr>
-        <w:t xml:space="preserve"> the 1,983,549 audited records, we can identify the specific aesthetic and </w:t>
-      </w:r>
-      <w:proofErr w:type="spellStart"/>
-      <w:r>
-        <w:rPr>
-          <w:lang w:val="en-IN"/>
-        </w:rPr>
-        <w:t>behavioral</w:t>
-      </w:r>
-      <w:proofErr w:type="spellEnd"/>
-      <w:r>
-        <w:rPr>
-          <w:lang w:val="en-IN"/>
-        </w:rPr>
-        <w:t xml:space="preserve"> triggers that convert a lead into a purchase.</w:t>
-      </w:r>
-    </w:p>
-    <w:p>
-      <w:pPr>
-        <w:pStyle w:val="Titolo2"/>
-        <w:rPr>
-          <w:lang w:val="en-IN"/>
-        </w:rPr>
-      </w:pPr>
-      <w:bookmarkStart w:id="19" w:name="_Toc223365923"/>
-      <w:r>
-        <w:rPr>
-          <w:lang w:val="en-IN"/>
-        </w:rPr>
-        <w:t>4.1 Strategic Conclusion: The "Halo Effect" of Sampling</w:t>
-      </w:r>
-      <w:bookmarkEnd w:id="19"/>
     </w:p>
     <w:p>
       <w:pPr>
@@ -21441,7 +21264,7 @@
           <w:lang w:val="en-IN"/>
         </w:rPr>
       </w:pPr>
-      <w:bookmarkStart w:id="20" w:name="_Toc223365924"/>
+      <w:bookmarkStart w:id="19" w:name="_Toc223365924"/>
       <w:r>
         <w:rPr>
           <w:rFonts w:hAnsi="Symbol"/>
@@ -21509,7 +21332,7 @@
         </w:rPr>
         <w:t>4.2 SAMPLING INTENSITY</w:t>
       </w:r>
-      <w:bookmarkEnd w:id="20"/>
+      <w:bookmarkEnd w:id="19"/>
     </w:p>
     <w:p>
       <w:pPr>
@@ -21725,14 +21548,14 @@
           <w:lang w:val="en-IN"/>
         </w:rPr>
       </w:pPr>
-      <w:bookmarkStart w:id="21" w:name="_Toc223365925"/>
+      <w:bookmarkStart w:id="20" w:name="_Toc223365925"/>
       <w:r>
         <w:rPr>
           <w:lang w:val="en-IN"/>
         </w:rPr>
         <w:t>4.3 Performance Analysis: Conversion Velocity and Efficiency</w:t>
       </w:r>
-      <w:bookmarkEnd w:id="21"/>
+      <w:bookmarkEnd w:id="20"/>
     </w:p>
     <w:p>
       <w:pPr>
@@ -26215,14 +26038,14 @@
           <w:lang w:val="en-IN"/>
         </w:rPr>
       </w:pPr>
-      <w:bookmarkStart w:id="22" w:name="_Toc223365926"/>
+      <w:bookmarkStart w:id="21" w:name="_Toc223365926"/>
       <w:r>
         <w:rPr>
           <w:lang w:val="en-IN"/>
         </w:rPr>
         <w:t>4.4 ACCOUNT ENGAGEMENT</w:t>
       </w:r>
-      <w:bookmarkEnd w:id="22"/>
+      <w:bookmarkEnd w:id="21"/>
     </w:p>
     <w:p>
       <w:pPr>
@@ -27192,7 +27015,7 @@
           <w:lang w:val="en-IN"/>
         </w:rPr>
       </w:pPr>
-      <w:bookmarkStart w:id="23" w:name="_Toc223365927"/>
+      <w:bookmarkStart w:id="22" w:name="_Toc223365927"/>
       <w:r>
         <w:rPr>
           <w:b/>
@@ -27201,7 +27024,7 @@
         <w:lastRenderedPageBreak/>
         <w:t>5.0 Strategic Customer Segmentation via RFM Analysis</w:t>
       </w:r>
-      <w:bookmarkEnd w:id="23"/>
+      <w:bookmarkEnd w:id="22"/>
     </w:p>
     <w:p>
       <w:pPr>
@@ -27262,14 +27085,14 @@
           <w:lang w:val="en-IN"/>
         </w:rPr>
       </w:pPr>
-      <w:bookmarkStart w:id="24" w:name="_Toc223365928"/>
+      <w:bookmarkStart w:id="23" w:name="_Toc223365928"/>
       <w:r>
         <w:rPr>
           <w:lang w:val="en-IN"/>
         </w:rPr>
         <w:t>5.1 The RFM Framework</w:t>
       </w:r>
-      <w:bookmarkEnd w:id="24"/>
+      <w:bookmarkEnd w:id="23"/>
     </w:p>
     <w:p>
       <w:pPr>
@@ -27451,14 +27274,14 @@
           <w:lang w:val="en-IN"/>
         </w:rPr>
       </w:pPr>
-      <w:bookmarkStart w:id="25" w:name="_Toc223365929"/>
+      <w:bookmarkStart w:id="24" w:name="_Toc223365929"/>
       <w:r>
         <w:rPr>
           <w:lang w:val="en-IN"/>
         </w:rPr>
         <w:t>5.2 Customer Segment Definitions</w:t>
       </w:r>
-      <w:bookmarkEnd w:id="25"/>
+      <w:bookmarkEnd w:id="24"/>
     </w:p>
     <w:p>
       <w:pPr>
@@ -27483,36 +27306,19 @@
     </w:p>
     <w:tbl>
       <w:tblPr>
+        <w:tblStyle w:val="Grigliatabella"/>
         <w:tblW w:w="0" w:type="auto"/>
-        <w:tblCellSpacing w:w="15" w:type="dxa"/>
-        <w:tblCellMar>
-          <w:top w:w="15" w:type="dxa"/>
-          <w:left w:w="15" w:type="dxa"/>
-          <w:bottom w:w="15" w:type="dxa"/>
-          <w:right w:w="15" w:type="dxa"/>
-        </w:tblCellMar>
         <w:tblLook w:val="04A0" w:firstRow="1" w:lastRow="0" w:firstColumn="1" w:lastColumn="0" w:noHBand="0" w:noVBand="1"/>
       </w:tblPr>
       <w:tblGrid>
-        <w:gridCol w:w="2005"/>
-        <w:gridCol w:w="2310"/>
-        <w:gridCol w:w="5151"/>
+        <w:gridCol w:w="2093"/>
+        <w:gridCol w:w="2391"/>
+        <w:gridCol w:w="5144"/>
       </w:tblGrid>
       <w:tr>
-        <w:trPr>
-          <w:tblHeader/>
-          <w:tblCellSpacing w:w="15" w:type="dxa"/>
-        </w:trPr>
         <w:tc>
           <w:tcPr>
             <w:tcW w:w="0" w:type="auto"/>
-            <w:tcBorders>
-              <w:top w:val="single" w:sz="6" w:space="0" w:color="auto"/>
-              <w:left w:val="single" w:sz="6" w:space="0" w:color="auto"/>
-              <w:bottom w:val="single" w:sz="6" w:space="0" w:color="auto"/>
-              <w:right w:val="single" w:sz="6" w:space="0" w:color="auto"/>
-            </w:tcBorders>
-            <w:vAlign w:val="center"/>
             <w:hideMark/>
           </w:tcPr>
           <w:p>
@@ -27533,13 +27339,6 @@
         <w:tc>
           <w:tcPr>
             <w:tcW w:w="0" w:type="auto"/>
-            <w:tcBorders>
-              <w:top w:val="single" w:sz="6" w:space="0" w:color="auto"/>
-              <w:left w:val="single" w:sz="6" w:space="0" w:color="auto"/>
-              <w:bottom w:val="single" w:sz="6" w:space="0" w:color="auto"/>
-              <w:right w:val="single" w:sz="6" w:space="0" w:color="auto"/>
-            </w:tcBorders>
-            <w:vAlign w:val="center"/>
             <w:hideMark/>
           </w:tcPr>
           <w:p>
@@ -27580,13 +27379,6 @@
         <w:tc>
           <w:tcPr>
             <w:tcW w:w="0" w:type="auto"/>
-            <w:tcBorders>
-              <w:top w:val="single" w:sz="6" w:space="0" w:color="auto"/>
-              <w:left w:val="single" w:sz="6" w:space="0" w:color="auto"/>
-              <w:bottom w:val="single" w:sz="6" w:space="0" w:color="auto"/>
-              <w:right w:val="single" w:sz="6" w:space="0" w:color="auto"/>
-            </w:tcBorders>
-            <w:vAlign w:val="center"/>
             <w:hideMark/>
           </w:tcPr>
           <w:p>
@@ -27604,19 +27396,9 @@
         </w:tc>
       </w:tr>
       <w:tr>
-        <w:trPr>
-          <w:tblCellSpacing w:w="15" w:type="dxa"/>
-        </w:trPr>
         <w:tc>
           <w:tcPr>
             <w:tcW w:w="0" w:type="auto"/>
-            <w:tcBorders>
-              <w:top w:val="single" w:sz="6" w:space="0" w:color="auto"/>
-              <w:left w:val="single" w:sz="6" w:space="0" w:color="auto"/>
-              <w:bottom w:val="single" w:sz="6" w:space="0" w:color="auto"/>
-              <w:right w:val="single" w:sz="6" w:space="0" w:color="auto"/>
-            </w:tcBorders>
-            <w:vAlign w:val="center"/>
             <w:hideMark/>
           </w:tcPr>
           <w:p>
@@ -27636,13 +27418,6 @@
         <w:tc>
           <w:tcPr>
             <w:tcW w:w="0" w:type="auto"/>
-            <w:tcBorders>
-              <w:top w:val="single" w:sz="6" w:space="0" w:color="auto"/>
-              <w:left w:val="single" w:sz="6" w:space="0" w:color="auto"/>
-              <w:bottom w:val="single" w:sz="6" w:space="0" w:color="auto"/>
-              <w:right w:val="single" w:sz="6" w:space="0" w:color="auto"/>
-            </w:tcBorders>
-            <w:vAlign w:val="center"/>
             <w:hideMark/>
           </w:tcPr>
           <w:p>
@@ -27658,13 +27433,6 @@
         <w:tc>
           <w:tcPr>
             <w:tcW w:w="0" w:type="auto"/>
-            <w:tcBorders>
-              <w:top w:val="single" w:sz="6" w:space="0" w:color="auto"/>
-              <w:left w:val="single" w:sz="6" w:space="0" w:color="auto"/>
-              <w:bottom w:val="single" w:sz="6" w:space="0" w:color="auto"/>
-              <w:right w:val="single" w:sz="6" w:space="0" w:color="auto"/>
-            </w:tcBorders>
-            <w:vAlign w:val="center"/>
             <w:hideMark/>
           </w:tcPr>
           <w:p>
@@ -27692,19 +27460,9 @@
         </w:tc>
       </w:tr>
       <w:tr>
-        <w:trPr>
-          <w:tblCellSpacing w:w="15" w:type="dxa"/>
-        </w:trPr>
         <w:tc>
           <w:tcPr>
             <w:tcW w:w="0" w:type="auto"/>
-            <w:tcBorders>
-              <w:top w:val="single" w:sz="6" w:space="0" w:color="auto"/>
-              <w:left w:val="single" w:sz="6" w:space="0" w:color="auto"/>
-              <w:bottom w:val="single" w:sz="6" w:space="0" w:color="auto"/>
-              <w:right w:val="single" w:sz="6" w:space="0" w:color="auto"/>
-            </w:tcBorders>
-            <w:vAlign w:val="center"/>
             <w:hideMark/>
           </w:tcPr>
           <w:p>
@@ -27741,13 +27499,6 @@
         <w:tc>
           <w:tcPr>
             <w:tcW w:w="0" w:type="auto"/>
-            <w:tcBorders>
-              <w:top w:val="single" w:sz="6" w:space="0" w:color="auto"/>
-              <w:left w:val="single" w:sz="6" w:space="0" w:color="auto"/>
-              <w:bottom w:val="single" w:sz="6" w:space="0" w:color="auto"/>
-              <w:right w:val="single" w:sz="6" w:space="0" w:color="auto"/>
-            </w:tcBorders>
-            <w:vAlign w:val="center"/>
             <w:hideMark/>
           </w:tcPr>
           <w:p>
@@ -27762,13 +27513,6 @@
         <w:tc>
           <w:tcPr>
             <w:tcW w:w="0" w:type="auto"/>
-            <w:tcBorders>
-              <w:top w:val="single" w:sz="6" w:space="0" w:color="auto"/>
-              <w:left w:val="single" w:sz="6" w:space="0" w:color="auto"/>
-              <w:bottom w:val="single" w:sz="6" w:space="0" w:color="auto"/>
-              <w:right w:val="single" w:sz="6" w:space="0" w:color="auto"/>
-            </w:tcBorders>
-            <w:vAlign w:val="center"/>
             <w:hideMark/>
           </w:tcPr>
           <w:p>
@@ -27796,19 +27540,9 @@
         </w:tc>
       </w:tr>
       <w:tr>
-        <w:trPr>
-          <w:tblCellSpacing w:w="15" w:type="dxa"/>
-        </w:trPr>
         <w:tc>
           <w:tcPr>
             <w:tcW w:w="0" w:type="auto"/>
-            <w:tcBorders>
-              <w:top w:val="single" w:sz="6" w:space="0" w:color="auto"/>
-              <w:left w:val="single" w:sz="6" w:space="0" w:color="auto"/>
-              <w:bottom w:val="single" w:sz="6" w:space="0" w:color="auto"/>
-              <w:right w:val="single" w:sz="6" w:space="0" w:color="auto"/>
-            </w:tcBorders>
-            <w:vAlign w:val="center"/>
             <w:hideMark/>
           </w:tcPr>
           <w:p>
@@ -27836,13 +27570,6 @@
         <w:tc>
           <w:tcPr>
             <w:tcW w:w="0" w:type="auto"/>
-            <w:tcBorders>
-              <w:top w:val="single" w:sz="6" w:space="0" w:color="auto"/>
-              <w:left w:val="single" w:sz="6" w:space="0" w:color="auto"/>
-              <w:bottom w:val="single" w:sz="6" w:space="0" w:color="auto"/>
-              <w:right w:val="single" w:sz="6" w:space="0" w:color="auto"/>
-            </w:tcBorders>
-            <w:vAlign w:val="center"/>
             <w:hideMark/>
           </w:tcPr>
           <w:p>
@@ -27866,13 +27593,6 @@
         <w:tc>
           <w:tcPr>
             <w:tcW w:w="0" w:type="auto"/>
-            <w:tcBorders>
-              <w:top w:val="single" w:sz="6" w:space="0" w:color="auto"/>
-              <w:left w:val="single" w:sz="6" w:space="0" w:color="auto"/>
-              <w:bottom w:val="single" w:sz="6" w:space="0" w:color="auto"/>
-              <w:right w:val="single" w:sz="6" w:space="0" w:color="auto"/>
-            </w:tcBorders>
-            <w:vAlign w:val="center"/>
             <w:hideMark/>
           </w:tcPr>
           <w:p>
@@ -27900,19 +27620,9 @@
         </w:tc>
       </w:tr>
       <w:tr>
-        <w:trPr>
-          <w:tblCellSpacing w:w="15" w:type="dxa"/>
-        </w:trPr>
         <w:tc>
           <w:tcPr>
             <w:tcW w:w="0" w:type="auto"/>
-            <w:tcBorders>
-              <w:top w:val="single" w:sz="6" w:space="0" w:color="auto"/>
-              <w:left w:val="single" w:sz="6" w:space="0" w:color="auto"/>
-              <w:bottom w:val="single" w:sz="6" w:space="0" w:color="auto"/>
-              <w:right w:val="single" w:sz="6" w:space="0" w:color="auto"/>
-            </w:tcBorders>
-            <w:vAlign w:val="center"/>
             <w:hideMark/>
           </w:tcPr>
           <w:p>
@@ -27931,13 +27641,6 @@
         <w:tc>
           <w:tcPr>
             <w:tcW w:w="0" w:type="auto"/>
-            <w:tcBorders>
-              <w:top w:val="single" w:sz="6" w:space="0" w:color="auto"/>
-              <w:left w:val="single" w:sz="6" w:space="0" w:color="auto"/>
-              <w:bottom w:val="single" w:sz="6" w:space="0" w:color="auto"/>
-              <w:right w:val="single" w:sz="6" w:space="0" w:color="auto"/>
-            </w:tcBorders>
-            <w:vAlign w:val="center"/>
             <w:hideMark/>
           </w:tcPr>
           <w:p>
@@ -27952,13 +27655,6 @@
         <w:tc>
           <w:tcPr>
             <w:tcW w:w="0" w:type="auto"/>
-            <w:tcBorders>
-              <w:top w:val="single" w:sz="6" w:space="0" w:color="auto"/>
-              <w:left w:val="single" w:sz="6" w:space="0" w:color="auto"/>
-              <w:bottom w:val="single" w:sz="6" w:space="0" w:color="auto"/>
-              <w:right w:val="single" w:sz="6" w:space="0" w:color="auto"/>
-            </w:tcBorders>
-            <w:vAlign w:val="center"/>
             <w:hideMark/>
           </w:tcPr>
           <w:p>
@@ -27986,19 +27682,9 @@
         </w:tc>
       </w:tr>
       <w:tr>
-        <w:trPr>
-          <w:tblCellSpacing w:w="15" w:type="dxa"/>
-        </w:trPr>
         <w:tc>
           <w:tcPr>
             <w:tcW w:w="0" w:type="auto"/>
-            <w:tcBorders>
-              <w:top w:val="single" w:sz="6" w:space="0" w:color="auto"/>
-              <w:left w:val="single" w:sz="6" w:space="0" w:color="auto"/>
-              <w:bottom w:val="single" w:sz="6" w:space="0" w:color="auto"/>
-              <w:right w:val="single" w:sz="6" w:space="0" w:color="auto"/>
-            </w:tcBorders>
-            <w:vAlign w:val="center"/>
             <w:hideMark/>
           </w:tcPr>
           <w:p>
@@ -28019,13 +27705,6 @@
         <w:tc>
           <w:tcPr>
             <w:tcW w:w="0" w:type="auto"/>
-            <w:tcBorders>
-              <w:top w:val="single" w:sz="6" w:space="0" w:color="auto"/>
-              <w:left w:val="single" w:sz="6" w:space="0" w:color="auto"/>
-              <w:bottom w:val="single" w:sz="6" w:space="0" w:color="auto"/>
-              <w:right w:val="single" w:sz="6" w:space="0" w:color="auto"/>
-            </w:tcBorders>
-            <w:vAlign w:val="center"/>
             <w:hideMark/>
           </w:tcPr>
           <w:p>
@@ -28040,13 +27719,6 @@
         <w:tc>
           <w:tcPr>
             <w:tcW w:w="0" w:type="auto"/>
-            <w:tcBorders>
-              <w:top w:val="single" w:sz="6" w:space="0" w:color="auto"/>
-              <w:left w:val="single" w:sz="6" w:space="0" w:color="auto"/>
-              <w:bottom w:val="single" w:sz="6" w:space="0" w:color="auto"/>
-              <w:right w:val="single" w:sz="6" w:space="0" w:color="auto"/>
-            </w:tcBorders>
-            <w:vAlign w:val="center"/>
             <w:hideMark/>
           </w:tcPr>
           <w:p>
@@ -28074,19 +27746,9 @@
         </w:tc>
       </w:tr>
       <w:tr>
-        <w:trPr>
-          <w:tblCellSpacing w:w="15" w:type="dxa"/>
-        </w:trPr>
         <w:tc>
           <w:tcPr>
             <w:tcW w:w="0" w:type="auto"/>
-            <w:tcBorders>
-              <w:top w:val="single" w:sz="6" w:space="0" w:color="auto"/>
-              <w:left w:val="single" w:sz="6" w:space="0" w:color="auto"/>
-              <w:bottom w:val="single" w:sz="6" w:space="0" w:color="auto"/>
-              <w:right w:val="single" w:sz="6" w:space="0" w:color="auto"/>
-            </w:tcBorders>
-            <w:vAlign w:val="center"/>
             <w:hideMark/>
           </w:tcPr>
           <w:p>
@@ -28105,13 +27767,6 @@
         <w:tc>
           <w:tcPr>
             <w:tcW w:w="0" w:type="auto"/>
-            <w:tcBorders>
-              <w:top w:val="single" w:sz="6" w:space="0" w:color="auto"/>
-              <w:left w:val="single" w:sz="6" w:space="0" w:color="auto"/>
-              <w:bottom w:val="single" w:sz="6" w:space="0" w:color="auto"/>
-              <w:right w:val="single" w:sz="6" w:space="0" w:color="auto"/>
-            </w:tcBorders>
-            <w:vAlign w:val="center"/>
             <w:hideMark/>
           </w:tcPr>
           <w:p>
@@ -28131,13 +27786,6 @@
         <w:tc>
           <w:tcPr>
             <w:tcW w:w="0" w:type="auto"/>
-            <w:tcBorders>
-              <w:top w:val="single" w:sz="6" w:space="0" w:color="auto"/>
-              <w:left w:val="single" w:sz="6" w:space="0" w:color="auto"/>
-              <w:bottom w:val="single" w:sz="6" w:space="0" w:color="auto"/>
-              <w:right w:val="single" w:sz="6" w:space="0" w:color="auto"/>
-            </w:tcBorders>
-            <w:vAlign w:val="center"/>
             <w:hideMark/>
           </w:tcPr>
           <w:p>
@@ -29751,7 +29399,6 @@
           <w:szCs w:val="24"/>
           <w:lang w:val="en-IN"/>
         </w:rPr>
-        <w:lastRenderedPageBreak/>
         <w:t xml:space="preserve">The segmentation logic was developed by applying a </w:t>
       </w:r>
       <w:r>
@@ -29792,7 +29439,17 @@
           <w:szCs w:val="24"/>
           <w:lang w:val="en-IN"/>
         </w:rPr>
-        <w:t xml:space="preserve"> for each metric; for example, a Recency score of 5 represents the top 20% of customers who purchased most recently, while a Monetary score of 5 represents the highest spenders. These individual scores were then concatenated or averaged to create an overall </w:t>
+        <w:t xml:space="preserve"> for each metric; for example, a Recency score of 5 represents the top 20% of customers who purchased most recently, while a Monetary score of 5 represents the highest spenders. These individual scores were then concatenated </w:t>
+      </w:r>
+      <w:r>
+        <w:rPr>
+          <w:rFonts w:ascii="Times New Roman" w:hAnsi="Times New Roman" w:cs="Times New Roman"/>
+          <w:sz w:val="24"/>
+          <w:szCs w:val="24"/>
+          <w:lang w:val="en-IN"/>
+        </w:rPr>
+        <w:lastRenderedPageBreak/>
+        <w:t xml:space="preserve">or averaged to create an overall </w:t>
       </w:r>
       <w:r>
         <w:rPr>
@@ -31699,14 +31356,14 @@
           <w:lang w:val="en-IN"/>
         </w:rPr>
       </w:pPr>
-      <w:bookmarkStart w:id="26" w:name="_Toc223365930"/>
+      <w:bookmarkStart w:id="25" w:name="_Toc223365930"/>
       <w:r>
         <w:rPr>
           <w:lang w:val="en-IN"/>
         </w:rPr>
         <w:t>5.3 Analysis of Customer Segmentation &amp; Behavior</w:t>
       </w:r>
-      <w:bookmarkEnd w:id="26"/>
+      <w:bookmarkEnd w:id="25"/>
     </w:p>
     <w:p>
       <w:pPr>
@@ -31715,14 +31372,14 @@
           <w:lang w:val="en-IN"/>
         </w:rPr>
       </w:pPr>
-      <w:bookmarkStart w:id="27" w:name="_Toc223365931"/>
+      <w:bookmarkStart w:id="26" w:name="_Toc223365931"/>
       <w:r>
         <w:rPr>
           <w:lang w:val="en-IN"/>
         </w:rPr>
         <w:t>Customer Segment Distribution (The Volume View)</w:t>
       </w:r>
-      <w:bookmarkEnd w:id="27"/>
+      <w:bookmarkEnd w:id="26"/>
     </w:p>
     <w:p>
       <w:pPr>
@@ -31891,68 +31548,21 @@
       </w:pPr>
       <w:r>
         <w:rPr>
-          <w:b/>
-          <w:bCs/>
-          <w:lang w:val="en-IN"/>
-        </w:rPr>
-        <w:t>"New/Recent Prospects"</w:t>
-      </w:r>
-      <w:r>
-        <w:rPr>
-          <w:lang w:val="en-IN"/>
-        </w:rPr>
-        <w:t xml:space="preserve"> represent the future pipeline; their transition into "Loyal" status is a key KPI for the sales team.</w:t>
-      </w:r>
-    </w:p>
-    <w:p>
-      <w:pPr>
-        <w:pStyle w:val="NormaleWeb"/>
-        <w:spacing w:line="276" w:lineRule="auto"/>
-        <w:jc w:val="both"/>
-        <w:rPr>
-          <w:lang w:val="en-IN"/>
-        </w:rPr>
-      </w:pPr>
-    </w:p>
-    <w:p>
-      <w:pPr>
-        <w:pStyle w:val="NormaleWeb"/>
-        <w:spacing w:line="276" w:lineRule="auto"/>
-        <w:jc w:val="both"/>
-        <w:rPr>
-          <w:lang w:val="en-IN"/>
-        </w:rPr>
-      </w:pPr>
-    </w:p>
-    <w:p>
-      <w:pPr>
-        <w:pStyle w:val="NormaleWeb"/>
-        <w:spacing w:line="276" w:lineRule="auto"/>
-        <w:jc w:val="both"/>
-        <w:rPr>
-          <w:lang w:val="en-IN"/>
-        </w:rPr>
-      </w:pPr>
-    </w:p>
-    <w:p>
-      <w:pPr>
-        <w:pStyle w:val="NormaleWeb"/>
-        <w:spacing w:line="276" w:lineRule="auto"/>
-        <w:jc w:val="both"/>
-        <w:rPr>
-          <w:lang w:val="en-IN"/>
-        </w:rPr>
-      </w:pPr>
-      <w:r>
-        <w:rPr>
           <w:noProof/>
           <w:lang w:val="en-IN"/>
         </w:rPr>
-        <w:lastRenderedPageBreak/>
         <w:drawing>
-          <wp:inline distT="0" distB="0" distL="0" distR="0" wp14:anchorId="682C7CF4" wp14:editId="2B0B6AAF">
-            <wp:extent cx="6120130" cy="2954655"/>
-            <wp:effectExtent l="0" t="0" r="0" b="0"/>
+          <wp:anchor distT="0" distB="0" distL="114300" distR="114300" simplePos="0" relativeHeight="251673600" behindDoc="0" locked="0" layoutInCell="1" allowOverlap="1" wp14:anchorId="3D63EB0C" wp14:editId="224E7131">
+            <wp:simplePos x="0" y="0"/>
+            <wp:positionH relativeFrom="column">
+              <wp:posOffset>1038860</wp:posOffset>
+            </wp:positionH>
+            <wp:positionV relativeFrom="paragraph">
+              <wp:posOffset>504825</wp:posOffset>
+            </wp:positionV>
+            <wp:extent cx="4210050" cy="2032000"/>
+            <wp:effectExtent l="0" t="0" r="0" b="6350"/>
+            <wp:wrapTopAndBottom/>
             <wp:docPr id="42" name="Immagine 42"/>
             <wp:cNvGraphicFramePr>
               <a:graphicFrameLocks xmlns:a="http://schemas.openxmlformats.org/drawingml/2006/main" noChangeAspect="1"/>
@@ -31965,7 +31575,7 @@
                     <pic:cNvPicPr/>
                   </pic:nvPicPr>
                   <pic:blipFill>
-                    <a:blip r:embed="rId18">
+                    <a:blip r:embed="rId18" cstate="print">
                       <a:extLst>
                         <a:ext uri="{28A0092B-C50C-407E-A947-70E740481C1C}">
                           <a14:useLocalDpi xmlns:a14="http://schemas.microsoft.com/office/drawing/2010/main" val="0"/>
@@ -31979,7 +31589,7 @@
                   <pic:spPr>
                     <a:xfrm>
                       <a:off x="0" y="0"/>
-                      <a:ext cx="6120130" cy="2954655"/>
+                      <a:ext cx="4210050" cy="2032000"/>
                     </a:xfrm>
                     <a:prstGeom prst="rect">
                       <a:avLst/>
@@ -31988,35 +31598,46 @@
                 </pic:pic>
               </a:graphicData>
             </a:graphic>
-          </wp:inline>
+            <wp14:sizeRelH relativeFrom="margin">
+              <wp14:pctWidth>0</wp14:pctWidth>
+            </wp14:sizeRelH>
+            <wp14:sizeRelV relativeFrom="margin">
+              <wp14:pctHeight>0</wp14:pctHeight>
+            </wp14:sizeRelV>
+          </wp:anchor>
         </w:drawing>
+      </w:r>
+      <w:r>
+        <w:rPr>
+          <w:b/>
+          <w:bCs/>
+          <w:lang w:val="en-IN"/>
+        </w:rPr>
+        <w:t>"New/Recent Prospects"</w:t>
+      </w:r>
+      <w:r>
+        <w:rPr>
+          <w:lang w:val="en-IN"/>
+        </w:rPr>
+        <w:t xml:space="preserve"> represent the future pipeline; their transition into "Loyal" status is a key KPI for the sales team.</w:t>
       </w:r>
     </w:p>
     <w:p>
       <w:pPr>
-        <w:pStyle w:val="NormaleWeb"/>
-        <w:spacing w:line="276" w:lineRule="auto"/>
-        <w:jc w:val="both"/>
-        <w:rPr>
-          <w:lang w:val="en-IN"/>
-        </w:rPr>
-      </w:pPr>
-    </w:p>
-    <w:p>
-      <w:pPr>
         <w:pStyle w:val="Titolo3"/>
         <w:rPr>
           <w:lang w:val="en-IN"/>
         </w:rPr>
       </w:pPr>
-      <w:bookmarkStart w:id="28" w:name="_Toc223365932"/>
-      <w:r>
-        <w:rPr>
-          <w:lang w:val="en-IN"/>
-        </w:rPr>
+      <w:bookmarkStart w:id="27" w:name="_Toc223365932"/>
+      <w:r>
+        <w:rPr>
+          <w:lang w:val="en-IN"/>
+        </w:rPr>
+        <w:lastRenderedPageBreak/>
         <w:t>RFM Distribution Analysis</w:t>
       </w:r>
-      <w:bookmarkEnd w:id="28"/>
+      <w:bookmarkEnd w:id="27"/>
     </w:p>
     <w:p>
       <w:pPr>
@@ -32267,14 +31888,14 @@
           <w:lang w:val="en-IN"/>
         </w:rPr>
       </w:pPr>
-      <w:bookmarkStart w:id="29" w:name="_Toc223365933"/>
+      <w:bookmarkStart w:id="28" w:name="_Toc223365933"/>
       <w:r>
         <w:rPr>
           <w:lang w:val="en-IN"/>
         </w:rPr>
         <w:t>5.4 KNN IMPLEMENTATION FOR SEGMENTATION</w:t>
       </w:r>
-      <w:bookmarkEnd w:id="29"/>
+      <w:bookmarkEnd w:id="28"/>
     </w:p>
     <w:p>
       <w:pPr>
@@ -32381,6 +32002,7 @@
           <w:sz w:val="24"/>
           <w:lang w:val="en-IN"/>
         </w:rPr>
+        <w:lastRenderedPageBreak/>
         <w:t xml:space="preserve">allowing for a much more </w:t>
       </w:r>
       <w:r>
@@ -33927,7 +33549,7 @@
           <w:lang w:val="en-IN"/>
         </w:rPr>
       </w:pPr>
-      <w:bookmarkStart w:id="30" w:name="_Toc223365934"/>
+      <w:bookmarkStart w:id="29" w:name="_Toc223365934"/>
       <w:r>
         <w:rPr>
           <w:noProof/>
@@ -33996,7 +33618,7 @@
         </w:rPr>
         <w:t>5.5 Statistical Validation of Segment Granularity via the Elbow Method</w:t>
       </w:r>
-      <w:bookmarkEnd w:id="30"/>
+      <w:bookmarkEnd w:id="29"/>
     </w:p>
     <w:p>
       <w:pPr>
@@ -34010,7 +33632,6 @@
         <w:rPr>
           <w:lang w:val="en-IN"/>
         </w:rPr>
-        <w:lastRenderedPageBreak/>
         <w:t xml:space="preserve">To transition from heuristic rules to data-driven intelligence, we utilized the </w:t>
       </w:r>
       <w:r>
@@ -34146,14 +33767,14 @@
           <w:lang w:val="en-IN"/>
         </w:rPr>
       </w:pPr>
-      <w:bookmarkStart w:id="31" w:name="_Toc223365935"/>
+      <w:bookmarkStart w:id="30" w:name="_Toc223365935"/>
       <w:r>
         <w:rPr>
           <w:lang w:val="en-IN"/>
         </w:rPr>
         <w:t>5.6 Cluster Profiling &amp; Behavioral Persona Mapping</w:t>
       </w:r>
-      <w:bookmarkEnd w:id="31"/>
+      <w:bookmarkEnd w:id="30"/>
     </w:p>
     <w:p>
       <w:pPr>
@@ -34182,7 +33803,14 @@
         <w:rPr>
           <w:lang w:val="en-IN"/>
         </w:rPr>
-        <w:t xml:space="preserve"> to translate abstract numerical clusters into strategic business personas. By aggregating the mean Recency, Frequency, and Monetary (RFM) metrics for each of the four identified clusters, we established a clear value hierarchy. This 'Bottom-Up' approach allows F. Schumacher &amp; Co. to identify exactly which account behaviours drive the most significant revenue.</w:t>
+        <w:t xml:space="preserve"> to translate abstract numerical clusters into strategic business personas. By aggregating the mean Recency, Frequency, and Monetary (RFM) metrics for each of the four identified clusters, we </w:t>
+      </w:r>
+      <w:r>
+        <w:rPr>
+          <w:lang w:val="en-IN"/>
+        </w:rPr>
+        <w:lastRenderedPageBreak/>
+        <w:t>established a clear value hierarchy. This 'Bottom-Up' approach allows F. Schumacher &amp; Co. to identify exactly which account behaviours drive the most significant revenue.</w:t>
       </w:r>
     </w:p>
     <w:p>
@@ -35469,11 +35097,10 @@
           <w:noProof/>
           <w:lang w:val="en-IN"/>
         </w:rPr>
-        <w:lastRenderedPageBreak/>
         <w:drawing>
-          <wp:inline distT="0" distB="0" distL="0" distR="0" wp14:anchorId="6039EBC5" wp14:editId="116E6FC4">
-            <wp:extent cx="6120130" cy="3478530"/>
-            <wp:effectExtent l="0" t="0" r="0" b="7620"/>
+          <wp:inline distT="0" distB="0" distL="0" distR="0" wp14:anchorId="6039EBC5" wp14:editId="54696D6E">
+            <wp:extent cx="6076950" cy="3054350"/>
+            <wp:effectExtent l="0" t="0" r="0" b="0"/>
             <wp:docPr id="45" name="Immagine 45"/>
             <wp:cNvGraphicFramePr>
               <a:graphicFrameLocks xmlns:a="http://schemas.openxmlformats.org/drawingml/2006/main" noChangeAspect="1"/>
@@ -35500,7 +35127,7 @@
                   <pic:spPr>
                     <a:xfrm>
                       <a:off x="0" y="0"/>
-                      <a:ext cx="6120130" cy="3478530"/>
+                      <a:ext cx="6078128" cy="3054942"/>
                     </a:xfrm>
                     <a:prstGeom prst="rect">
                       <a:avLst/>
@@ -35533,6 +35160,7 @@
           <w:szCs w:val="24"/>
           <w:lang w:val="en-IN" w:eastAsia="it-IT"/>
         </w:rPr>
+        <w:lastRenderedPageBreak/>
         <w:t>Statistical Observations:</w:t>
       </w:r>
       <w:r>
@@ -35727,14 +35355,14 @@
           <w:lang w:val="en-IN"/>
         </w:rPr>
       </w:pPr>
-      <w:bookmarkStart w:id="32" w:name="_Toc223365936"/>
+      <w:bookmarkStart w:id="31" w:name="_Toc223365936"/>
       <w:r>
         <w:rPr>
           <w:lang w:val="en-IN"/>
         </w:rPr>
         <w:t>5.7 Multi-Dimensional Cluster Separation (Pairplot)</w:t>
       </w:r>
-      <w:bookmarkEnd w:id="32"/>
+      <w:bookmarkEnd w:id="31"/>
     </w:p>
     <w:p>
       <w:pPr>
@@ -35908,17 +35536,7 @@
           <w:szCs w:val="24"/>
           <w:lang w:val="en-IN" w:eastAsia="it-IT"/>
         </w:rPr>
-        <w:t xml:space="preserve"> The scatter plots reveal a strong positive correlation between Frequency and Monetary value, validating that customer loyalty (repeat </w:t>
-      </w:r>
-      <w:r>
-        <w:rPr>
-          <w:rFonts w:ascii="Times New Roman" w:eastAsia="Times New Roman" w:hAnsi="Times New Roman" w:cs="Times New Roman"/>
-          <w:sz w:val="24"/>
-          <w:szCs w:val="24"/>
-          <w:lang w:val="en-IN" w:eastAsia="it-IT"/>
-        </w:rPr>
-        <w:lastRenderedPageBreak/>
-        <w:t>purchases) is the primary driver of Lifetime Value (LTV). The visual separation of the "</w:t>
+        <w:t xml:space="preserve"> The scatter plots reveal a strong positive correlation between Frequency and Monetary value, validating that customer loyalty (repeat purchases) is the primary driver of Lifetime Value (LTV). The visual separation of the "</w:t>
       </w:r>
       <w:proofErr w:type="spellStart"/>
       <w:r>
@@ -35998,79 +35616,21 @@
       </w:pPr>
       <w:r>
         <w:rPr>
-          <w:rFonts w:ascii="Times New Roman" w:eastAsia="Times New Roman" w:hAnsi="Times New Roman" w:cs="Times New Roman"/>
-          <w:b/>
-          <w:bCs/>
-          <w:sz w:val="24"/>
-          <w:szCs w:val="24"/>
-          <w:lang w:val="en-IN" w:eastAsia="it-IT"/>
-        </w:rPr>
-        <w:t>Implementation Note:</w:t>
-      </w:r>
-      <w:r>
-        <w:rPr>
-          <w:rFonts w:ascii="Times New Roman" w:eastAsia="Times New Roman" w:hAnsi="Times New Roman" w:cs="Times New Roman"/>
-          <w:sz w:val="24"/>
-          <w:szCs w:val="24"/>
-          <w:lang w:val="en-IN" w:eastAsia="it-IT"/>
-        </w:rPr>
-        <w:t xml:space="preserve"> The use of </w:t>
-      </w:r>
-      <w:r>
-        <w:rPr>
-          <w:rFonts w:ascii="Courier New" w:eastAsia="Times New Roman" w:hAnsi="Courier New" w:cs="Courier New"/>
-          <w:lang w:val="en-IN" w:eastAsia="it-IT"/>
-        </w:rPr>
-        <w:t>alpha=0.5</w:t>
-      </w:r>
-      <w:r>
-        <w:rPr>
-          <w:rFonts w:ascii="Times New Roman" w:eastAsia="Times New Roman" w:hAnsi="Times New Roman" w:cs="Times New Roman"/>
-          <w:sz w:val="24"/>
-          <w:szCs w:val="24"/>
-          <w:lang w:val="en-IN" w:eastAsia="it-IT"/>
-        </w:rPr>
-        <w:t xml:space="preserve"> transparency in the scatter plots was intentional to mitigate </w:t>
-      </w:r>
-      <w:proofErr w:type="spellStart"/>
-      <w:r>
-        <w:rPr>
-          <w:rFonts w:ascii="Times New Roman" w:eastAsia="Times New Roman" w:hAnsi="Times New Roman" w:cs="Times New Roman"/>
-          <w:sz w:val="24"/>
-          <w:szCs w:val="24"/>
-          <w:lang w:val="en-IN" w:eastAsia="it-IT"/>
-        </w:rPr>
-        <w:t>overplotting</w:t>
-      </w:r>
-      <w:proofErr w:type="spellEnd"/>
-      <w:r>
-        <w:rPr>
-          <w:rFonts w:ascii="Times New Roman" w:eastAsia="Times New Roman" w:hAnsi="Times New Roman" w:cs="Times New Roman"/>
-          <w:sz w:val="24"/>
-          <w:szCs w:val="24"/>
-          <w:lang w:val="en-IN" w:eastAsia="it-IT"/>
-        </w:rPr>
-        <w:t>, allowing for the identification of high-density "clusters within clusters" that may warrant further micro-segmentation.</w:t>
-      </w:r>
-    </w:p>
-    <w:p>
-      <w:pPr>
-        <w:pStyle w:val="NormaleWeb"/>
-        <w:spacing w:line="276" w:lineRule="auto"/>
-        <w:jc w:val="both"/>
-        <w:rPr>
-          <w:lang w:val="en-IN"/>
-        </w:rPr>
-      </w:pPr>
-      <w:r>
-        <w:rPr>
           <w:noProof/>
           <w:lang w:val="en-IN"/>
         </w:rPr>
         <w:drawing>
-          <wp:inline distT="0" distB="0" distL="0" distR="0" wp14:anchorId="37189C3B" wp14:editId="12A8E553">
-            <wp:extent cx="6382745" cy="6082747"/>
+          <wp:anchor distT="0" distB="0" distL="114300" distR="114300" simplePos="0" relativeHeight="251674624" behindDoc="0" locked="0" layoutInCell="1" allowOverlap="1" wp14:anchorId="37189C3B" wp14:editId="0BE1FD73">
+            <wp:simplePos x="0" y="0"/>
+            <wp:positionH relativeFrom="column">
+              <wp:posOffset>1756410</wp:posOffset>
+            </wp:positionH>
+            <wp:positionV relativeFrom="paragraph">
+              <wp:posOffset>598805</wp:posOffset>
+            </wp:positionV>
+            <wp:extent cx="2686050" cy="2559801"/>
             <wp:effectExtent l="0" t="0" r="0" b="0"/>
+            <wp:wrapTopAndBottom/>
             <wp:docPr id="46" name="Immagine 46"/>
             <wp:cNvGraphicFramePr>
               <a:graphicFrameLocks xmlns:a="http://schemas.openxmlformats.org/drawingml/2006/main" noChangeAspect="1"/>
@@ -36083,7 +35643,7 @@
                     <pic:cNvPicPr/>
                   </pic:nvPicPr>
                   <pic:blipFill>
-                    <a:blip r:embed="rId22">
+                    <a:blip r:embed="rId22" cstate="print">
                       <a:extLst>
                         <a:ext uri="{28A0092B-C50C-407E-A947-70E740481C1C}">
                           <a14:useLocalDpi xmlns:a14="http://schemas.microsoft.com/office/drawing/2010/main" val="0"/>
@@ -36097,7 +35657,7 @@
                   <pic:spPr>
                     <a:xfrm>
                       <a:off x="0" y="0"/>
-                      <a:ext cx="6382745" cy="6082747"/>
+                      <a:ext cx="2686050" cy="2559801"/>
                     </a:xfrm>
                     <a:prstGeom prst="rect">
                       <a:avLst/>
@@ -36106,53 +35666,73 @@
                 </pic:pic>
               </a:graphicData>
             </a:graphic>
-          </wp:inline>
+            <wp14:sizeRelH relativeFrom="margin">
+              <wp14:pctWidth>0</wp14:pctWidth>
+            </wp14:sizeRelH>
+            <wp14:sizeRelV relativeFrom="margin">
+              <wp14:pctHeight>0</wp14:pctHeight>
+            </wp14:sizeRelV>
+          </wp:anchor>
         </w:drawing>
       </w:r>
-    </w:p>
-    <w:p>
-      <w:pPr>
-        <w:spacing w:beforeAutospacing="1" w:after="100" w:afterAutospacing="1"/>
+      <w:r>
+        <w:rPr>
+          <w:rFonts w:ascii="Times New Roman" w:eastAsia="Times New Roman" w:hAnsi="Times New Roman" w:cs="Times New Roman"/>
+          <w:b/>
+          <w:bCs/>
+          <w:sz w:val="24"/>
+          <w:szCs w:val="24"/>
+          <w:lang w:val="en-IN" w:eastAsia="it-IT"/>
+        </w:rPr>
+        <w:t>Implementation Note:</w:t>
+      </w:r>
+      <w:r>
         <w:rPr>
           <w:rFonts w:ascii="Times New Roman" w:eastAsia="Times New Roman" w:hAnsi="Times New Roman" w:cs="Times New Roman"/>
           <w:sz w:val="24"/>
           <w:szCs w:val="24"/>
           <w:lang w:val="en-IN" w:eastAsia="it-IT"/>
         </w:rPr>
-      </w:pPr>
-    </w:p>
-    <w:p>
-      <w:pPr>
-        <w:spacing w:beforeAutospacing="1" w:after="100" w:afterAutospacing="1"/>
+        <w:t xml:space="preserve"> The use of </w:t>
+      </w:r>
+      <w:r>
+        <w:rPr>
+          <w:rFonts w:ascii="Courier New" w:eastAsia="Times New Roman" w:hAnsi="Courier New" w:cs="Courier New"/>
+          <w:lang w:val="en-IN" w:eastAsia="it-IT"/>
+        </w:rPr>
+        <w:t>alpha=0.5</w:t>
+      </w:r>
+      <w:r>
         <w:rPr>
           <w:rFonts w:ascii="Times New Roman" w:eastAsia="Times New Roman" w:hAnsi="Times New Roman" w:cs="Times New Roman"/>
           <w:sz w:val="24"/>
           <w:szCs w:val="24"/>
           <w:lang w:val="en-IN" w:eastAsia="it-IT"/>
         </w:rPr>
-      </w:pPr>
-    </w:p>
-    <w:p>
-      <w:pPr>
-        <w:spacing w:beforeAutospacing="1" w:after="100" w:afterAutospacing="1"/>
+        <w:t xml:space="preserve"> transparency in the scatter plots was intentional to mitigate </w:t>
+      </w:r>
+      <w:proofErr w:type="spellStart"/>
+      <w:r>
         <w:rPr>
           <w:rFonts w:ascii="Times New Roman" w:eastAsia="Times New Roman" w:hAnsi="Times New Roman" w:cs="Times New Roman"/>
           <w:sz w:val="24"/>
           <w:szCs w:val="24"/>
           <w:lang w:val="en-IN" w:eastAsia="it-IT"/>
         </w:rPr>
-      </w:pPr>
-    </w:p>
-    <w:p>
-      <w:pPr>
-        <w:spacing w:beforeAutospacing="1" w:after="100" w:afterAutospacing="1"/>
+        <w:t>overplotting</w:t>
+      </w:r>
+      <w:proofErr w:type="spellEnd"/>
+      <w:r>
         <w:rPr>
           <w:rFonts w:ascii="Times New Roman" w:eastAsia="Times New Roman" w:hAnsi="Times New Roman" w:cs="Times New Roman"/>
           <w:sz w:val="24"/>
           <w:szCs w:val="24"/>
           <w:lang w:val="en-IN" w:eastAsia="it-IT"/>
         </w:rPr>
-      </w:pPr>
+        <w:t>, allowing for the identification of high-density "clusters within clusters" that may warrant further micro-segmentation.</w:t>
+      </w:r>
+      <w:bookmarkStart w:id="32" w:name="_GoBack"/>
+      <w:bookmarkEnd w:id="32"/>
     </w:p>
     <w:p>
       <w:pPr>
@@ -38597,7 +38177,7 @@
           <w:color w:val="D4D4D4"/>
           <w:sz w:val="18"/>
           <w:szCs w:val="21"/>
-          <w:lang w:eastAsia="it-IT"/>
+          <w:lang w:val="en-IN" w:eastAsia="it-IT"/>
         </w:rPr>
       </w:pPr>
       <w:proofErr w:type="spellStart"/>
@@ -38607,7 +38187,7 @@
           <w:color w:val="9CDCFE"/>
           <w:sz w:val="18"/>
           <w:szCs w:val="21"/>
-          <w:lang w:eastAsia="it-IT"/>
+          <w:lang w:val="en-IN" w:eastAsia="it-IT"/>
         </w:rPr>
         <w:t>item_affinity</w:t>
       </w:r>
@@ -38618,7 +38198,7 @@
           <w:color w:val="D4D4D4"/>
           <w:sz w:val="18"/>
           <w:szCs w:val="21"/>
-          <w:lang w:eastAsia="it-IT"/>
+          <w:lang w:val="en-IN" w:eastAsia="it-IT"/>
         </w:rPr>
         <w:t xml:space="preserve"> = </w:t>
       </w:r>
@@ -38630,7 +38210,7 @@
           <w:color w:val="9CDCFE"/>
           <w:sz w:val="18"/>
           <w:szCs w:val="21"/>
-          <w:lang w:eastAsia="it-IT"/>
+          <w:lang w:val="en-IN" w:eastAsia="it-IT"/>
         </w:rPr>
         <w:t>basket</w:t>
       </w:r>
@@ -38640,7 +38220,7 @@
           <w:color w:val="D4D4D4"/>
           <w:sz w:val="18"/>
           <w:szCs w:val="21"/>
-          <w:lang w:eastAsia="it-IT"/>
+          <w:lang w:val="en-IN" w:eastAsia="it-IT"/>
         </w:rPr>
         <w:t>.corr</w:t>
       </w:r>
@@ -38652,7 +38232,7 @@
           <w:color w:val="D4D4D4"/>
           <w:sz w:val="18"/>
           <w:szCs w:val="21"/>
-          <w:lang w:eastAsia="it-IT"/>
+          <w:lang w:val="en-IN" w:eastAsia="it-IT"/>
         </w:rPr>
         <w:t>()</w:t>
       </w:r>
@@ -40135,7 +39715,7 @@
           <w:color w:val="D4D4D4"/>
           <w:sz w:val="18"/>
           <w:szCs w:val="21"/>
-          <w:lang w:eastAsia="it-IT"/>
+          <w:lang w:val="en-IN" w:eastAsia="it-IT"/>
         </w:rPr>
       </w:pPr>
       <w:r>
@@ -40148,25 +39728,23 @@
         </w:rPr>
         <w:t xml:space="preserve">        </w:t>
       </w:r>
-      <w:proofErr w:type="spellStart"/>
       <w:r>
         <w:rPr>
           <w:rFonts w:ascii="Consolas" w:eastAsia="Times New Roman" w:hAnsi="Consolas" w:cs="Times New Roman"/>
           <w:color w:val="C586C0"/>
           <w:sz w:val="18"/>
           <w:szCs w:val="21"/>
-          <w:lang w:eastAsia="it-IT"/>
+          <w:lang w:val="en-IN" w:eastAsia="it-IT"/>
         </w:rPr>
         <w:t>if</w:t>
       </w:r>
-      <w:proofErr w:type="spellEnd"/>
-      <w:r>
-        <w:rPr>
-          <w:rFonts w:ascii="Consolas" w:eastAsia="Times New Roman" w:hAnsi="Consolas" w:cs="Times New Roman"/>
-          <w:color w:val="D4D4D4"/>
-          <w:sz w:val="18"/>
-          <w:szCs w:val="21"/>
-          <w:lang w:eastAsia="it-IT"/>
+      <w:r>
+        <w:rPr>
+          <w:rFonts w:ascii="Consolas" w:eastAsia="Times New Roman" w:hAnsi="Consolas" w:cs="Times New Roman"/>
+          <w:color w:val="D4D4D4"/>
+          <w:sz w:val="18"/>
+          <w:szCs w:val="21"/>
+          <w:lang w:val="en-IN" w:eastAsia="it-IT"/>
         </w:rPr>
         <w:t xml:space="preserve"> </w:t>
       </w:r>
@@ -40177,7 +39755,7 @@
           <w:color w:val="9CDCFE"/>
           <w:sz w:val="18"/>
           <w:szCs w:val="21"/>
-          <w:lang w:eastAsia="it-IT"/>
+          <w:lang w:val="en-IN" w:eastAsia="it-IT"/>
         </w:rPr>
         <w:t>account_</w:t>
       </w:r>
@@ -40188,7 +39766,7 @@
           <w:color w:val="9CDCFE"/>
           <w:sz w:val="18"/>
           <w:szCs w:val="21"/>
-          <w:lang w:eastAsia="it-IT"/>
+          <w:lang w:val="en-IN" w:eastAsia="it-IT"/>
         </w:rPr>
         <w:t>data</w:t>
       </w:r>
@@ -40198,7 +39776,7 @@
           <w:color w:val="D4D4D4"/>
           <w:sz w:val="18"/>
           <w:szCs w:val="21"/>
-          <w:lang w:eastAsia="it-IT"/>
+          <w:lang w:val="en-IN" w:eastAsia="it-IT"/>
         </w:rPr>
         <w:t>.empty</w:t>
       </w:r>
@@ -40210,7 +39788,7 @@
           <w:color w:val="D4D4D4"/>
           <w:sz w:val="18"/>
           <w:szCs w:val="21"/>
-          <w:lang w:eastAsia="it-IT"/>
+          <w:lang w:val="en-IN" w:eastAsia="it-IT"/>
         </w:rPr>
         <w:t>:</w:t>
       </w:r>
@@ -40225,16 +39803,16 @@
           <w:color w:val="D4D4D4"/>
           <w:sz w:val="18"/>
           <w:szCs w:val="21"/>
-          <w:lang w:eastAsia="it-IT"/>
-        </w:rPr>
-      </w:pPr>
-      <w:r>
-        <w:rPr>
-          <w:rFonts w:ascii="Consolas" w:eastAsia="Times New Roman" w:hAnsi="Consolas" w:cs="Times New Roman"/>
-          <w:color w:val="D4D4D4"/>
-          <w:sz w:val="18"/>
-          <w:szCs w:val="21"/>
-          <w:lang w:eastAsia="it-IT"/>
+          <w:lang w:val="en-IN" w:eastAsia="it-IT"/>
+        </w:rPr>
+      </w:pPr>
+      <w:r>
+        <w:rPr>
+          <w:rFonts w:ascii="Consolas" w:eastAsia="Times New Roman" w:hAnsi="Consolas" w:cs="Times New Roman"/>
+          <w:color w:val="D4D4D4"/>
+          <w:sz w:val="18"/>
+          <w:szCs w:val="21"/>
+          <w:lang w:val="en-IN" w:eastAsia="it-IT"/>
         </w:rPr>
         <w:t xml:space="preserve">            </w:t>
       </w:r>
@@ -40244,7 +39822,7 @@
           <w:color w:val="C586C0"/>
           <w:sz w:val="18"/>
           <w:szCs w:val="21"/>
-          <w:lang w:eastAsia="it-IT"/>
+          <w:lang w:val="en-IN" w:eastAsia="it-IT"/>
         </w:rPr>
         <w:t>return</w:t>
       </w:r>
@@ -40254,7 +39832,7 @@
           <w:color w:val="D4D4D4"/>
           <w:sz w:val="18"/>
           <w:szCs w:val="21"/>
-          <w:lang w:eastAsia="it-IT"/>
+          <w:lang w:val="en-IN" w:eastAsia="it-IT"/>
         </w:rPr>
         <w:t xml:space="preserve"> </w:t>
       </w:r>
@@ -40264,7 +39842,7 @@
           <w:color w:val="569CD6"/>
           <w:sz w:val="18"/>
           <w:szCs w:val="21"/>
-          <w:lang w:eastAsia="it-IT"/>
+          <w:lang w:val="en-IN" w:eastAsia="it-IT"/>
         </w:rPr>
         <w:t>None</w:t>
       </w:r>
@@ -40279,16 +39857,16 @@
           <w:color w:val="D4D4D4"/>
           <w:sz w:val="18"/>
           <w:szCs w:val="21"/>
-          <w:lang w:eastAsia="it-IT"/>
-        </w:rPr>
-      </w:pPr>
-      <w:r>
-        <w:rPr>
-          <w:rFonts w:ascii="Consolas" w:eastAsia="Times New Roman" w:hAnsi="Consolas" w:cs="Times New Roman"/>
-          <w:color w:val="D4D4D4"/>
-          <w:sz w:val="18"/>
-          <w:szCs w:val="21"/>
-          <w:lang w:eastAsia="it-IT"/>
+          <w:lang w:val="en-IN" w:eastAsia="it-IT"/>
+        </w:rPr>
+      </w:pPr>
+      <w:r>
+        <w:rPr>
+          <w:rFonts w:ascii="Consolas" w:eastAsia="Times New Roman" w:hAnsi="Consolas" w:cs="Times New Roman"/>
+          <w:color w:val="D4D4D4"/>
+          <w:sz w:val="18"/>
+          <w:szCs w:val="21"/>
+          <w:lang w:val="en-IN" w:eastAsia="it-IT"/>
         </w:rPr>
         <w:t xml:space="preserve">        </w:t>
       </w:r>
@@ -40298,7 +39876,7 @@
           <w:color w:val="9CDCFE"/>
           <w:sz w:val="18"/>
           <w:szCs w:val="21"/>
-          <w:lang w:eastAsia="it-IT"/>
+          <w:lang w:val="en-IN" w:eastAsia="it-IT"/>
         </w:rPr>
         <w:t>info</w:t>
       </w:r>
@@ -40308,7 +39886,7 @@
           <w:color w:val="D4D4D4"/>
           <w:sz w:val="18"/>
           <w:szCs w:val="21"/>
-          <w:lang w:eastAsia="it-IT"/>
+          <w:lang w:val="en-IN" w:eastAsia="it-IT"/>
         </w:rPr>
         <w:t xml:space="preserve"> = </w:t>
       </w:r>
@@ -40319,7 +39897,7 @@
           <w:color w:val="9CDCFE"/>
           <w:sz w:val="18"/>
           <w:szCs w:val="21"/>
-          <w:lang w:eastAsia="it-IT"/>
+          <w:lang w:val="en-IN" w:eastAsia="it-IT"/>
         </w:rPr>
         <w:t>account_</w:t>
       </w:r>
@@ -40330,7 +39908,7 @@
           <w:color w:val="9CDCFE"/>
           <w:sz w:val="18"/>
           <w:szCs w:val="21"/>
-          <w:lang w:eastAsia="it-IT"/>
+          <w:lang w:val="en-IN" w:eastAsia="it-IT"/>
         </w:rPr>
         <w:t>data</w:t>
       </w:r>
@@ -40340,29 +39918,29 @@
           <w:color w:val="D4D4D4"/>
           <w:sz w:val="18"/>
           <w:szCs w:val="21"/>
-          <w:lang w:eastAsia="it-IT"/>
+          <w:lang w:val="en-IN" w:eastAsia="it-IT"/>
         </w:rPr>
         <w:t>.iloc</w:t>
       </w:r>
       <w:proofErr w:type="spellEnd"/>
-      <w:r>
-        <w:rPr>
-          <w:rFonts w:ascii="Consolas" w:eastAsia="Times New Roman" w:hAnsi="Consolas" w:cs="Times New Roman"/>
-          <w:color w:val="D4D4D4"/>
-          <w:sz w:val="18"/>
-          <w:szCs w:val="21"/>
-          <w:lang w:eastAsia="it-IT"/>
+      <w:proofErr w:type="gramEnd"/>
+      <w:r>
+        <w:rPr>
+          <w:rFonts w:ascii="Consolas" w:eastAsia="Times New Roman" w:hAnsi="Consolas" w:cs="Times New Roman"/>
+          <w:color w:val="D4D4D4"/>
+          <w:sz w:val="18"/>
+          <w:szCs w:val="21"/>
+          <w:lang w:val="en-IN" w:eastAsia="it-IT"/>
         </w:rPr>
         <w:t>[</w:t>
       </w:r>
-      <w:proofErr w:type="gramEnd"/>
       <w:r>
         <w:rPr>
           <w:rFonts w:ascii="Consolas" w:eastAsia="Times New Roman" w:hAnsi="Consolas" w:cs="Times New Roman"/>
           <w:color w:val="B5CEA8"/>
           <w:sz w:val="18"/>
           <w:szCs w:val="21"/>
-          <w:lang w:eastAsia="it-IT"/>
+          <w:lang w:val="en-IN" w:eastAsia="it-IT"/>
         </w:rPr>
         <w:t>0</w:t>
       </w:r>
@@ -40372,7 +39950,7 @@
           <w:color w:val="D4D4D4"/>
           <w:sz w:val="18"/>
           <w:szCs w:val="21"/>
-          <w:lang w:eastAsia="it-IT"/>
+          <w:lang w:val="en-IN" w:eastAsia="it-IT"/>
         </w:rPr>
         <w:t>]</w:t>
       </w:r>
@@ -40387,38 +39965,36 @@
           <w:color w:val="D4D4D4"/>
           <w:sz w:val="18"/>
           <w:szCs w:val="21"/>
-          <w:lang w:eastAsia="it-IT"/>
-        </w:rPr>
-      </w:pPr>
-      <w:r>
-        <w:rPr>
-          <w:rFonts w:ascii="Consolas" w:eastAsia="Times New Roman" w:hAnsi="Consolas" w:cs="Times New Roman"/>
-          <w:color w:val="D4D4D4"/>
-          <w:sz w:val="18"/>
-          <w:szCs w:val="21"/>
-          <w:lang w:eastAsia="it-IT"/>
+          <w:lang w:val="en-IN" w:eastAsia="it-IT"/>
+        </w:rPr>
+      </w:pPr>
+      <w:r>
+        <w:rPr>
+          <w:rFonts w:ascii="Consolas" w:eastAsia="Times New Roman" w:hAnsi="Consolas" w:cs="Times New Roman"/>
+          <w:color w:val="D4D4D4"/>
+          <w:sz w:val="18"/>
+          <w:szCs w:val="21"/>
+          <w:lang w:val="en-IN" w:eastAsia="it-IT"/>
         </w:rPr>
         <w:t xml:space="preserve">        </w:t>
       </w:r>
-      <w:proofErr w:type="spellStart"/>
       <w:r>
         <w:rPr>
           <w:rFonts w:ascii="Consolas" w:eastAsia="Times New Roman" w:hAnsi="Consolas" w:cs="Times New Roman"/>
           <w:color w:val="9CDCFE"/>
           <w:sz w:val="18"/>
           <w:szCs w:val="21"/>
-          <w:lang w:eastAsia="it-IT"/>
+          <w:lang w:val="en-IN" w:eastAsia="it-IT"/>
         </w:rPr>
         <w:t>summary</w:t>
       </w:r>
-      <w:proofErr w:type="spellEnd"/>
-      <w:r>
-        <w:rPr>
-          <w:rFonts w:ascii="Consolas" w:eastAsia="Times New Roman" w:hAnsi="Consolas" w:cs="Times New Roman"/>
-          <w:color w:val="D4D4D4"/>
-          <w:sz w:val="18"/>
-          <w:szCs w:val="21"/>
-          <w:lang w:eastAsia="it-IT"/>
+      <w:r>
+        <w:rPr>
+          <w:rFonts w:ascii="Consolas" w:eastAsia="Times New Roman" w:hAnsi="Consolas" w:cs="Times New Roman"/>
+          <w:color w:val="D4D4D4"/>
+          <w:sz w:val="18"/>
+          <w:szCs w:val="21"/>
+          <w:lang w:val="en-IN" w:eastAsia="it-IT"/>
         </w:rPr>
         <w:t xml:space="preserve"> = {</w:t>
       </w:r>
@@ -41261,7 +40837,7 @@
           <w:color w:val="D4D4D4"/>
           <w:sz w:val="18"/>
           <w:szCs w:val="21"/>
-          <w:lang w:eastAsia="it-IT"/>
+          <w:lang w:val="en-IN" w:eastAsia="it-IT"/>
         </w:rPr>
       </w:pPr>
       <w:r>
@@ -41280,7 +40856,7 @@
           <w:color w:val="D4D4D4"/>
           <w:sz w:val="18"/>
           <w:szCs w:val="21"/>
-          <w:lang w:eastAsia="it-IT"/>
+          <w:lang w:val="en-IN" w:eastAsia="it-IT"/>
         </w:rPr>
         <w:t>}</w:t>
       </w:r>
@@ -41295,16 +40871,16 @@
           <w:color w:val="9CDCFE"/>
           <w:sz w:val="18"/>
           <w:szCs w:val="21"/>
-          <w:lang w:eastAsia="it-IT"/>
-        </w:rPr>
-      </w:pPr>
-      <w:r>
-        <w:rPr>
-          <w:rFonts w:ascii="Consolas" w:eastAsia="Times New Roman" w:hAnsi="Consolas" w:cs="Times New Roman"/>
-          <w:color w:val="D4D4D4"/>
-          <w:sz w:val="18"/>
-          <w:szCs w:val="21"/>
-          <w:lang w:eastAsia="it-IT"/>
+          <w:lang w:val="en-IN" w:eastAsia="it-IT"/>
+        </w:rPr>
+      </w:pPr>
+      <w:r>
+        <w:rPr>
+          <w:rFonts w:ascii="Consolas" w:eastAsia="Times New Roman" w:hAnsi="Consolas" w:cs="Times New Roman"/>
+          <w:color w:val="D4D4D4"/>
+          <w:sz w:val="18"/>
+          <w:szCs w:val="21"/>
+          <w:lang w:val="en-IN" w:eastAsia="it-IT"/>
         </w:rPr>
         <w:t xml:space="preserve">        </w:t>
       </w:r>
@@ -41314,7 +40890,7 @@
           <w:color w:val="C586C0"/>
           <w:sz w:val="18"/>
           <w:szCs w:val="21"/>
-          <w:lang w:eastAsia="it-IT"/>
+          <w:lang w:val="en-IN" w:eastAsia="it-IT"/>
         </w:rPr>
         <w:t>return</w:t>
       </w:r>
@@ -41324,22 +40900,20 @@
           <w:color w:val="D4D4D4"/>
           <w:sz w:val="18"/>
           <w:szCs w:val="21"/>
-          <w:lang w:eastAsia="it-IT"/>
+          <w:lang w:val="en-IN" w:eastAsia="it-IT"/>
         </w:rPr>
         <w:t xml:space="preserve"> </w:t>
       </w:r>
-      <w:proofErr w:type="spellStart"/>
       <w:r>
         <w:rPr>
           <w:rFonts w:ascii="Consolas" w:eastAsia="Times New Roman" w:hAnsi="Consolas" w:cs="Times New Roman"/>
           <w:color w:val="9CDCFE"/>
           <w:sz w:val="18"/>
           <w:szCs w:val="21"/>
-          <w:lang w:eastAsia="it-IT"/>
+          <w:lang w:val="en-IN" w:eastAsia="it-IT"/>
         </w:rPr>
         <w:t>summary</w:t>
       </w:r>
-      <w:proofErr w:type="spellEnd"/>
     </w:p>
     <w:p>
       <w:pPr>
@@ -41351,16 +40925,16 @@
           <w:color w:val="D4D4D4"/>
           <w:sz w:val="18"/>
           <w:szCs w:val="21"/>
-          <w:lang w:eastAsia="it-IT"/>
-        </w:rPr>
-      </w:pPr>
-      <w:r>
-        <w:rPr>
-          <w:rFonts w:ascii="Consolas" w:eastAsia="Times New Roman" w:hAnsi="Consolas" w:cs="Times New Roman"/>
-          <w:color w:val="D4D4D4"/>
-          <w:sz w:val="18"/>
-          <w:szCs w:val="21"/>
-          <w:lang w:eastAsia="it-IT"/>
+          <w:lang w:val="en-IN" w:eastAsia="it-IT"/>
+        </w:rPr>
+      </w:pPr>
+      <w:r>
+        <w:rPr>
+          <w:rFonts w:ascii="Consolas" w:eastAsia="Times New Roman" w:hAnsi="Consolas" w:cs="Times New Roman"/>
+          <w:color w:val="D4D4D4"/>
+          <w:sz w:val="18"/>
+          <w:szCs w:val="21"/>
+          <w:lang w:val="en-IN" w:eastAsia="it-IT"/>
         </w:rPr>
         <w:t>[root/</w:t>
       </w:r>
@@ -41371,7 +40945,7 @@
           <w:color w:val="D4D4D4"/>
           <w:sz w:val="18"/>
           <w:szCs w:val="21"/>
-          <w:lang w:eastAsia="it-IT"/>
+          <w:lang w:val="en-IN" w:eastAsia="it-IT"/>
         </w:rPr>
         <w:t>src</w:t>
       </w:r>
@@ -41382,7 +40956,7 @@
           <w:color w:val="D4D4D4"/>
           <w:sz w:val="18"/>
           <w:szCs w:val="21"/>
-          <w:lang w:eastAsia="it-IT"/>
+          <w:lang w:val="en-IN" w:eastAsia="it-IT"/>
         </w:rPr>
         <w:t>/recommender.py]</w:t>
       </w:r>
@@ -41811,7 +41385,7 @@
           <w:color w:val="D4D4D4"/>
           <w:sz w:val="18"/>
           <w:szCs w:val="21"/>
-          <w:lang w:eastAsia="it-IT"/>
+          <w:lang w:val="en-IN" w:eastAsia="it-IT"/>
         </w:rPr>
       </w:pPr>
       <w:r>
@@ -41824,25 +41398,23 @@
         </w:rPr>
         <w:t xml:space="preserve">        </w:t>
       </w:r>
-      <w:proofErr w:type="spellStart"/>
       <w:r>
         <w:rPr>
           <w:rFonts w:ascii="Consolas" w:eastAsia="Times New Roman" w:hAnsi="Consolas" w:cs="Times New Roman"/>
           <w:color w:val="C586C0"/>
           <w:sz w:val="18"/>
           <w:szCs w:val="21"/>
-          <w:lang w:eastAsia="it-IT"/>
+          <w:lang w:val="en-IN" w:eastAsia="it-IT"/>
         </w:rPr>
         <w:t>if</w:t>
       </w:r>
-      <w:proofErr w:type="spellEnd"/>
-      <w:r>
-        <w:rPr>
-          <w:rFonts w:ascii="Consolas" w:eastAsia="Times New Roman" w:hAnsi="Consolas" w:cs="Times New Roman"/>
-          <w:color w:val="D4D4D4"/>
-          <w:sz w:val="18"/>
-          <w:szCs w:val="21"/>
-          <w:lang w:eastAsia="it-IT"/>
+      <w:r>
+        <w:rPr>
+          <w:rFonts w:ascii="Consolas" w:eastAsia="Times New Roman" w:hAnsi="Consolas" w:cs="Times New Roman"/>
+          <w:color w:val="D4D4D4"/>
+          <w:sz w:val="18"/>
+          <w:szCs w:val="21"/>
+          <w:lang w:val="en-IN" w:eastAsia="it-IT"/>
         </w:rPr>
         <w:t xml:space="preserve"> </w:t>
       </w:r>
@@ -41853,7 +41425,7 @@
           <w:color w:val="9CDCFE"/>
           <w:sz w:val="18"/>
           <w:szCs w:val="21"/>
-          <w:lang w:eastAsia="it-IT"/>
+          <w:lang w:val="en-IN" w:eastAsia="it-IT"/>
         </w:rPr>
         <w:t>account_</w:t>
       </w:r>
@@ -41864,7 +41436,7 @@
           <w:color w:val="9CDCFE"/>
           <w:sz w:val="18"/>
           <w:szCs w:val="21"/>
-          <w:lang w:eastAsia="it-IT"/>
+          <w:lang w:val="en-IN" w:eastAsia="it-IT"/>
         </w:rPr>
         <w:t>data</w:t>
       </w:r>
@@ -41874,7 +41446,7 @@
           <w:color w:val="D4D4D4"/>
           <w:sz w:val="18"/>
           <w:szCs w:val="21"/>
-          <w:lang w:eastAsia="it-IT"/>
+          <w:lang w:val="en-IN" w:eastAsia="it-IT"/>
         </w:rPr>
         <w:t>.empty</w:t>
       </w:r>
@@ -41886,7 +41458,7 @@
           <w:color w:val="D4D4D4"/>
           <w:sz w:val="18"/>
           <w:szCs w:val="21"/>
-          <w:lang w:eastAsia="it-IT"/>
+          <w:lang w:val="en-IN" w:eastAsia="it-IT"/>
         </w:rPr>
         <w:t>:</w:t>
       </w:r>
@@ -41901,16 +41473,16 @@
           <w:color w:val="D4D4D4"/>
           <w:sz w:val="18"/>
           <w:szCs w:val="21"/>
-          <w:lang w:eastAsia="it-IT"/>
-        </w:rPr>
-      </w:pPr>
-      <w:r>
-        <w:rPr>
-          <w:rFonts w:ascii="Consolas" w:eastAsia="Times New Roman" w:hAnsi="Consolas" w:cs="Times New Roman"/>
-          <w:color w:val="D4D4D4"/>
-          <w:sz w:val="18"/>
-          <w:szCs w:val="21"/>
-          <w:lang w:eastAsia="it-IT"/>
+          <w:lang w:val="en-IN" w:eastAsia="it-IT"/>
+        </w:rPr>
+      </w:pPr>
+      <w:r>
+        <w:rPr>
+          <w:rFonts w:ascii="Consolas" w:eastAsia="Times New Roman" w:hAnsi="Consolas" w:cs="Times New Roman"/>
+          <w:color w:val="D4D4D4"/>
+          <w:sz w:val="18"/>
+          <w:szCs w:val="21"/>
+          <w:lang w:val="en-IN" w:eastAsia="it-IT"/>
         </w:rPr>
         <w:t xml:space="preserve">            </w:t>
       </w:r>
@@ -41920,7 +41492,7 @@
           <w:color w:val="C586C0"/>
           <w:sz w:val="18"/>
           <w:szCs w:val="21"/>
-          <w:lang w:eastAsia="it-IT"/>
+          <w:lang w:val="en-IN" w:eastAsia="it-IT"/>
         </w:rPr>
         <w:t>return</w:t>
       </w:r>
@@ -41930,7 +41502,7 @@
           <w:color w:val="D4D4D4"/>
           <w:sz w:val="18"/>
           <w:szCs w:val="21"/>
-          <w:lang w:eastAsia="it-IT"/>
+          <w:lang w:val="en-IN" w:eastAsia="it-IT"/>
         </w:rPr>
         <w:t xml:space="preserve"> </w:t>
       </w:r>
@@ -41940,7 +41512,7 @@
           <w:color w:val="569CD6"/>
           <w:sz w:val="18"/>
           <w:szCs w:val="21"/>
-          <w:lang w:eastAsia="it-IT"/>
+          <w:lang w:val="en-IN" w:eastAsia="it-IT"/>
         </w:rPr>
         <w:t>None</w:t>
       </w:r>
@@ -41955,16 +41527,16 @@
           <w:color w:val="D4D4D4"/>
           <w:sz w:val="18"/>
           <w:szCs w:val="21"/>
-          <w:lang w:eastAsia="it-IT"/>
-        </w:rPr>
-      </w:pPr>
-      <w:r>
-        <w:rPr>
-          <w:rFonts w:ascii="Consolas" w:eastAsia="Times New Roman" w:hAnsi="Consolas" w:cs="Times New Roman"/>
-          <w:color w:val="D4D4D4"/>
-          <w:sz w:val="18"/>
-          <w:szCs w:val="21"/>
-          <w:lang w:eastAsia="it-IT"/>
+          <w:lang w:val="en-IN" w:eastAsia="it-IT"/>
+        </w:rPr>
+      </w:pPr>
+      <w:r>
+        <w:rPr>
+          <w:rFonts w:ascii="Consolas" w:eastAsia="Times New Roman" w:hAnsi="Consolas" w:cs="Times New Roman"/>
+          <w:color w:val="D4D4D4"/>
+          <w:sz w:val="18"/>
+          <w:szCs w:val="21"/>
+          <w:lang w:val="en-IN" w:eastAsia="it-IT"/>
         </w:rPr>
         <w:t xml:space="preserve">        </w:t>
       </w:r>
@@ -41974,7 +41546,7 @@
           <w:color w:val="9CDCFE"/>
           <w:sz w:val="18"/>
           <w:szCs w:val="21"/>
-          <w:lang w:eastAsia="it-IT"/>
+          <w:lang w:val="en-IN" w:eastAsia="it-IT"/>
         </w:rPr>
         <w:t>info</w:t>
       </w:r>
@@ -41984,7 +41556,7 @@
           <w:color w:val="D4D4D4"/>
           <w:sz w:val="18"/>
           <w:szCs w:val="21"/>
-          <w:lang w:eastAsia="it-IT"/>
+          <w:lang w:val="en-IN" w:eastAsia="it-IT"/>
         </w:rPr>
         <w:t xml:space="preserve"> = </w:t>
       </w:r>
@@ -41995,7 +41567,7 @@
           <w:color w:val="9CDCFE"/>
           <w:sz w:val="18"/>
           <w:szCs w:val="21"/>
-          <w:lang w:eastAsia="it-IT"/>
+          <w:lang w:val="en-IN" w:eastAsia="it-IT"/>
         </w:rPr>
         <w:t>account_</w:t>
       </w:r>
@@ -42006,7 +41578,7 @@
           <w:color w:val="9CDCFE"/>
           <w:sz w:val="18"/>
           <w:szCs w:val="21"/>
-          <w:lang w:eastAsia="it-IT"/>
+          <w:lang w:val="en-IN" w:eastAsia="it-IT"/>
         </w:rPr>
         <w:t>data</w:t>
       </w:r>
@@ -42016,29 +41588,29 @@
           <w:color w:val="D4D4D4"/>
           <w:sz w:val="18"/>
           <w:szCs w:val="21"/>
-          <w:lang w:eastAsia="it-IT"/>
+          <w:lang w:val="en-IN" w:eastAsia="it-IT"/>
         </w:rPr>
         <w:t>.iloc</w:t>
       </w:r>
       <w:proofErr w:type="spellEnd"/>
-      <w:r>
-        <w:rPr>
-          <w:rFonts w:ascii="Consolas" w:eastAsia="Times New Roman" w:hAnsi="Consolas" w:cs="Times New Roman"/>
-          <w:color w:val="D4D4D4"/>
-          <w:sz w:val="18"/>
-          <w:szCs w:val="21"/>
-          <w:lang w:eastAsia="it-IT"/>
+      <w:proofErr w:type="gramEnd"/>
+      <w:r>
+        <w:rPr>
+          <w:rFonts w:ascii="Consolas" w:eastAsia="Times New Roman" w:hAnsi="Consolas" w:cs="Times New Roman"/>
+          <w:color w:val="D4D4D4"/>
+          <w:sz w:val="18"/>
+          <w:szCs w:val="21"/>
+          <w:lang w:val="en-IN" w:eastAsia="it-IT"/>
         </w:rPr>
         <w:t>[</w:t>
       </w:r>
-      <w:proofErr w:type="gramEnd"/>
       <w:r>
         <w:rPr>
           <w:rFonts w:ascii="Consolas" w:eastAsia="Times New Roman" w:hAnsi="Consolas" w:cs="Times New Roman"/>
           <w:color w:val="B5CEA8"/>
           <w:sz w:val="18"/>
           <w:szCs w:val="21"/>
-          <w:lang w:eastAsia="it-IT"/>
+          <w:lang w:val="en-IN" w:eastAsia="it-IT"/>
         </w:rPr>
         <w:t>0</w:t>
       </w:r>
@@ -42048,7 +41620,7 @@
           <w:color w:val="D4D4D4"/>
           <w:sz w:val="18"/>
           <w:szCs w:val="21"/>
-          <w:lang w:eastAsia="it-IT"/>
+          <w:lang w:val="en-IN" w:eastAsia="it-IT"/>
         </w:rPr>
         <w:t>]</w:t>
       </w:r>
@@ -42063,38 +41635,36 @@
           <w:color w:val="D4D4D4"/>
           <w:sz w:val="18"/>
           <w:szCs w:val="21"/>
-          <w:lang w:eastAsia="it-IT"/>
-        </w:rPr>
-      </w:pPr>
-      <w:r>
-        <w:rPr>
-          <w:rFonts w:ascii="Consolas" w:eastAsia="Times New Roman" w:hAnsi="Consolas" w:cs="Times New Roman"/>
-          <w:color w:val="D4D4D4"/>
-          <w:sz w:val="18"/>
-          <w:szCs w:val="21"/>
-          <w:lang w:eastAsia="it-IT"/>
+          <w:lang w:val="en-IN" w:eastAsia="it-IT"/>
+        </w:rPr>
+      </w:pPr>
+      <w:r>
+        <w:rPr>
+          <w:rFonts w:ascii="Consolas" w:eastAsia="Times New Roman" w:hAnsi="Consolas" w:cs="Times New Roman"/>
+          <w:color w:val="D4D4D4"/>
+          <w:sz w:val="18"/>
+          <w:szCs w:val="21"/>
+          <w:lang w:val="en-IN" w:eastAsia="it-IT"/>
         </w:rPr>
         <w:t xml:space="preserve">        </w:t>
       </w:r>
-      <w:proofErr w:type="spellStart"/>
       <w:r>
         <w:rPr>
           <w:rFonts w:ascii="Consolas" w:eastAsia="Times New Roman" w:hAnsi="Consolas" w:cs="Times New Roman"/>
           <w:color w:val="9CDCFE"/>
           <w:sz w:val="18"/>
           <w:szCs w:val="21"/>
-          <w:lang w:eastAsia="it-IT"/>
+          <w:lang w:val="en-IN" w:eastAsia="it-IT"/>
         </w:rPr>
         <w:t>summary</w:t>
       </w:r>
-      <w:proofErr w:type="spellEnd"/>
-      <w:r>
-        <w:rPr>
-          <w:rFonts w:ascii="Consolas" w:eastAsia="Times New Roman" w:hAnsi="Consolas" w:cs="Times New Roman"/>
-          <w:color w:val="D4D4D4"/>
-          <w:sz w:val="18"/>
-          <w:szCs w:val="21"/>
-          <w:lang w:eastAsia="it-IT"/>
+      <w:r>
+        <w:rPr>
+          <w:rFonts w:ascii="Consolas" w:eastAsia="Times New Roman" w:hAnsi="Consolas" w:cs="Times New Roman"/>
+          <w:color w:val="D4D4D4"/>
+          <w:sz w:val="18"/>
+          <w:szCs w:val="21"/>
+          <w:lang w:val="en-IN" w:eastAsia="it-IT"/>
         </w:rPr>
         <w:t xml:space="preserve"> = {</w:t>
       </w:r>
@@ -42937,7 +42507,7 @@
           <w:color w:val="D4D4D4"/>
           <w:sz w:val="18"/>
           <w:szCs w:val="21"/>
-          <w:lang w:eastAsia="it-IT"/>
+          <w:lang w:val="en-IN" w:eastAsia="it-IT"/>
         </w:rPr>
       </w:pPr>
       <w:r>
@@ -42956,7 +42526,7 @@
           <w:color w:val="D4D4D4"/>
           <w:sz w:val="18"/>
           <w:szCs w:val="21"/>
-          <w:lang w:eastAsia="it-IT"/>
+          <w:lang w:val="en-IN" w:eastAsia="it-IT"/>
         </w:rPr>
         <w:t>}</w:t>
       </w:r>
@@ -42971,16 +42541,16 @@
           <w:color w:val="D4D4D4"/>
           <w:sz w:val="18"/>
           <w:szCs w:val="21"/>
-          <w:lang w:eastAsia="it-IT"/>
-        </w:rPr>
-      </w:pPr>
-      <w:r>
-        <w:rPr>
-          <w:rFonts w:ascii="Consolas" w:eastAsia="Times New Roman" w:hAnsi="Consolas" w:cs="Times New Roman"/>
-          <w:color w:val="D4D4D4"/>
-          <w:sz w:val="18"/>
-          <w:szCs w:val="21"/>
-          <w:lang w:eastAsia="it-IT"/>
+          <w:lang w:val="en-IN" w:eastAsia="it-IT"/>
+        </w:rPr>
+      </w:pPr>
+      <w:r>
+        <w:rPr>
+          <w:rFonts w:ascii="Consolas" w:eastAsia="Times New Roman" w:hAnsi="Consolas" w:cs="Times New Roman"/>
+          <w:color w:val="D4D4D4"/>
+          <w:sz w:val="18"/>
+          <w:szCs w:val="21"/>
+          <w:lang w:val="en-IN" w:eastAsia="it-IT"/>
         </w:rPr>
         <w:t xml:space="preserve">        </w:t>
       </w:r>
@@ -42990,7 +42560,7 @@
           <w:color w:val="C586C0"/>
           <w:sz w:val="18"/>
           <w:szCs w:val="21"/>
-          <w:lang w:eastAsia="it-IT"/>
+          <w:lang w:val="en-IN" w:eastAsia="it-IT"/>
         </w:rPr>
         <w:t>return</w:t>
       </w:r>
@@ -43000,22 +42570,20 @@
           <w:color w:val="D4D4D4"/>
           <w:sz w:val="18"/>
           <w:szCs w:val="21"/>
-          <w:lang w:eastAsia="it-IT"/>
+          <w:lang w:val="en-IN" w:eastAsia="it-IT"/>
         </w:rPr>
         <w:t xml:space="preserve"> </w:t>
       </w:r>
-      <w:proofErr w:type="spellStart"/>
       <w:r>
         <w:rPr>
           <w:rFonts w:ascii="Consolas" w:eastAsia="Times New Roman" w:hAnsi="Consolas" w:cs="Times New Roman"/>
           <w:color w:val="9CDCFE"/>
           <w:sz w:val="18"/>
           <w:szCs w:val="21"/>
-          <w:lang w:eastAsia="it-IT"/>
+          <w:lang w:val="en-IN" w:eastAsia="it-IT"/>
         </w:rPr>
         <w:t>summary</w:t>
       </w:r>
-      <w:proofErr w:type="spellEnd"/>
     </w:p>
     <w:p>
       <w:pPr>
@@ -43027,16 +42595,16 @@
           <w:color w:val="D4D4D4"/>
           <w:sz w:val="18"/>
           <w:szCs w:val="21"/>
-          <w:lang w:eastAsia="it-IT"/>
-        </w:rPr>
-      </w:pPr>
-      <w:r>
-        <w:rPr>
-          <w:rFonts w:ascii="Consolas" w:eastAsia="Times New Roman" w:hAnsi="Consolas" w:cs="Times New Roman"/>
-          <w:color w:val="D4D4D4"/>
-          <w:sz w:val="18"/>
-          <w:szCs w:val="21"/>
-          <w:lang w:eastAsia="it-IT"/>
+          <w:lang w:val="en-IN" w:eastAsia="it-IT"/>
+        </w:rPr>
+      </w:pPr>
+      <w:r>
+        <w:rPr>
+          <w:rFonts w:ascii="Consolas" w:eastAsia="Times New Roman" w:hAnsi="Consolas" w:cs="Times New Roman"/>
+          <w:color w:val="D4D4D4"/>
+          <w:sz w:val="18"/>
+          <w:szCs w:val="21"/>
+          <w:lang w:val="en-IN" w:eastAsia="it-IT"/>
         </w:rPr>
         <w:t>[root/</w:t>
       </w:r>
@@ -43047,7 +42615,7 @@
           <w:color w:val="D4D4D4"/>
           <w:sz w:val="18"/>
           <w:szCs w:val="21"/>
-          <w:lang w:eastAsia="it-IT"/>
+          <w:lang w:val="en-IN" w:eastAsia="it-IT"/>
         </w:rPr>
         <w:t>src</w:t>
       </w:r>
@@ -43058,7 +42626,7 @@
           <w:color w:val="D4D4D4"/>
           <w:sz w:val="18"/>
           <w:szCs w:val="21"/>
-          <w:lang w:eastAsia="it-IT"/>
+          <w:lang w:val="en-IN" w:eastAsia="it-IT"/>
         </w:rPr>
         <w:t>/recommender.py]</w:t>
       </w:r>
@@ -43790,7 +43358,7 @@
           <w:color w:val="D4D4D4"/>
           <w:sz w:val="18"/>
           <w:szCs w:val="21"/>
-          <w:lang w:eastAsia="it-IT"/>
+          <w:lang w:val="en-IN" w:eastAsia="it-IT"/>
         </w:rPr>
       </w:pPr>
       <w:r>
@@ -43809,49 +43377,27 @@
           <w:color w:val="CE9178"/>
           <w:sz w:val="18"/>
           <w:szCs w:val="21"/>
-          <w:lang w:eastAsia="it-IT"/>
-        </w:rPr>
-        <w:t>'</w:t>
-      </w:r>
-      <w:proofErr w:type="spellStart"/>
+          <w:lang w:val="en-IN" w:eastAsia="it-IT"/>
+        </w:rPr>
+        <w:t>'quantity'</w:t>
+      </w:r>
+      <w:r>
+        <w:rPr>
+          <w:rFonts w:ascii="Consolas" w:eastAsia="Times New Roman" w:hAnsi="Consolas" w:cs="Times New Roman"/>
+          <w:color w:val="D4D4D4"/>
+          <w:sz w:val="18"/>
+          <w:szCs w:val="21"/>
+          <w:lang w:val="en-IN" w:eastAsia="it-IT"/>
+        </w:rPr>
+        <w:t xml:space="preserve">: </w:t>
+      </w:r>
       <w:r>
         <w:rPr>
           <w:rFonts w:ascii="Consolas" w:eastAsia="Times New Roman" w:hAnsi="Consolas" w:cs="Times New Roman"/>
           <w:color w:val="CE9178"/>
           <w:sz w:val="18"/>
           <w:szCs w:val="21"/>
-          <w:lang w:eastAsia="it-IT"/>
-        </w:rPr>
-        <w:t>quantity</w:t>
-      </w:r>
-      <w:proofErr w:type="spellEnd"/>
-      <w:r>
-        <w:rPr>
-          <w:rFonts w:ascii="Consolas" w:eastAsia="Times New Roman" w:hAnsi="Consolas" w:cs="Times New Roman"/>
-          <w:color w:val="CE9178"/>
-          <w:sz w:val="18"/>
-          <w:szCs w:val="21"/>
-          <w:lang w:eastAsia="it-IT"/>
-        </w:rPr>
-        <w:t>'</w:t>
-      </w:r>
-      <w:r>
-        <w:rPr>
-          <w:rFonts w:ascii="Consolas" w:eastAsia="Times New Roman" w:hAnsi="Consolas" w:cs="Times New Roman"/>
-          <w:color w:val="D4D4D4"/>
-          <w:sz w:val="18"/>
-          <w:szCs w:val="21"/>
-          <w:lang w:eastAsia="it-IT"/>
-        </w:rPr>
-        <w:t xml:space="preserve">: </w:t>
-      </w:r>
-      <w:r>
-        <w:rPr>
-          <w:rFonts w:ascii="Consolas" w:eastAsia="Times New Roman" w:hAnsi="Consolas" w:cs="Times New Roman"/>
-          <w:color w:val="CE9178"/>
-          <w:sz w:val="18"/>
-          <w:szCs w:val="21"/>
-          <w:lang w:eastAsia="it-IT"/>
+          <w:lang w:val="en-IN" w:eastAsia="it-IT"/>
         </w:rPr>
         <w:t>'sum'</w:t>
       </w:r>
@@ -43861,7 +43407,7 @@
           <w:color w:val="D4D4D4"/>
           <w:sz w:val="18"/>
           <w:szCs w:val="21"/>
-          <w:lang w:eastAsia="it-IT"/>
+          <w:lang w:val="en-IN" w:eastAsia="it-IT"/>
         </w:rPr>
         <w:t>,</w:t>
       </w:r>
@@ -43876,16 +43422,16 @@
           <w:color w:val="D4D4D4"/>
           <w:sz w:val="18"/>
           <w:szCs w:val="21"/>
-          <w:lang w:eastAsia="it-IT"/>
-        </w:rPr>
-      </w:pPr>
-      <w:r>
-        <w:rPr>
-          <w:rFonts w:ascii="Consolas" w:eastAsia="Times New Roman" w:hAnsi="Consolas" w:cs="Times New Roman"/>
-          <w:color w:val="D4D4D4"/>
-          <w:sz w:val="18"/>
-          <w:szCs w:val="21"/>
-          <w:lang w:eastAsia="it-IT"/>
+          <w:lang w:val="en-IN" w:eastAsia="it-IT"/>
+        </w:rPr>
+      </w:pPr>
+      <w:r>
+        <w:rPr>
+          <w:rFonts w:ascii="Consolas" w:eastAsia="Times New Roman" w:hAnsi="Consolas" w:cs="Times New Roman"/>
+          <w:color w:val="D4D4D4"/>
+          <w:sz w:val="18"/>
+          <w:szCs w:val="21"/>
+          <w:lang w:val="en-IN" w:eastAsia="it-IT"/>
         </w:rPr>
         <w:t xml:space="preserve">            </w:t>
       </w:r>
@@ -43895,7 +43441,7 @@
           <w:color w:val="CE9178"/>
           <w:sz w:val="18"/>
           <w:szCs w:val="21"/>
-          <w:lang w:eastAsia="it-IT"/>
+          <w:lang w:val="en-IN" w:eastAsia="it-IT"/>
         </w:rPr>
         <w:t>'</w:t>
       </w:r>
@@ -43906,7 +43452,7 @@
           <w:color w:val="CE9178"/>
           <w:sz w:val="18"/>
           <w:szCs w:val="21"/>
-          <w:lang w:eastAsia="it-IT"/>
+          <w:lang w:val="en-IN" w:eastAsia="it-IT"/>
         </w:rPr>
         <w:t>trade_account_id</w:t>
       </w:r>
@@ -43917,7 +43463,7 @@
           <w:color w:val="CE9178"/>
           <w:sz w:val="18"/>
           <w:szCs w:val="21"/>
-          <w:lang w:eastAsia="it-IT"/>
+          <w:lang w:val="en-IN" w:eastAsia="it-IT"/>
         </w:rPr>
         <w:t>'</w:t>
       </w:r>
@@ -43927,7 +43473,7 @@
           <w:color w:val="D4D4D4"/>
           <w:sz w:val="18"/>
           <w:szCs w:val="21"/>
-          <w:lang w:eastAsia="it-IT"/>
+          <w:lang w:val="en-IN" w:eastAsia="it-IT"/>
         </w:rPr>
         <w:t xml:space="preserve">: </w:t>
       </w:r>
@@ -43937,7 +43483,7 @@
           <w:color w:val="CE9178"/>
           <w:sz w:val="18"/>
           <w:szCs w:val="21"/>
-          <w:lang w:eastAsia="it-IT"/>
+          <w:lang w:val="en-IN" w:eastAsia="it-IT"/>
         </w:rPr>
         <w:t>'</w:t>
       </w:r>
@@ -43948,7 +43494,7 @@
           <w:color w:val="CE9178"/>
           <w:sz w:val="18"/>
           <w:szCs w:val="21"/>
-          <w:lang w:eastAsia="it-IT"/>
+          <w:lang w:val="en-IN" w:eastAsia="it-IT"/>
         </w:rPr>
         <w:t>nunique</w:t>
       </w:r>
@@ -43959,7 +43505,7 @@
           <w:color w:val="CE9178"/>
           <w:sz w:val="18"/>
           <w:szCs w:val="21"/>
-          <w:lang w:eastAsia="it-IT"/>
+          <w:lang w:val="en-IN" w:eastAsia="it-IT"/>
         </w:rPr>
         <w:t>'</w:t>
       </w:r>
@@ -44638,7 +44184,7 @@
           <w:color w:val="D4D4D4"/>
           <w:sz w:val="18"/>
           <w:szCs w:val="21"/>
-          <w:lang w:eastAsia="it-IT"/>
+          <w:lang w:val="en-IN" w:eastAsia="it-IT"/>
         </w:rPr>
       </w:pPr>
       <w:r>
@@ -44657,7 +44203,7 @@
           <w:color w:val="CE9178"/>
           <w:sz w:val="18"/>
           <w:szCs w:val="21"/>
-          <w:lang w:eastAsia="it-IT"/>
+          <w:lang w:val="en-IN" w:eastAsia="it-IT"/>
         </w:rPr>
         <w:t>"""</w:t>
       </w:r>
@@ -44696,7 +44242,7 @@
           <w:color w:val="D4D4D4"/>
           <w:sz w:val="18"/>
           <w:szCs w:val="21"/>
-          <w:lang w:eastAsia="it-IT"/>
+          <w:lang w:val="en-IN" w:eastAsia="it-IT"/>
         </w:rPr>
       </w:pPr>
       <w:r>
@@ -44715,7 +44261,7 @@
           <w:color w:val="CE9178"/>
           <w:sz w:val="18"/>
           <w:szCs w:val="21"/>
-          <w:lang w:eastAsia="it-IT"/>
+          <w:lang w:val="en-IN" w:eastAsia="it-IT"/>
         </w:rPr>
         <w:t>"""</w:t>
       </w:r>
@@ -44944,7 +44490,7 @@
           <w:color w:val="D4D4D4"/>
           <w:sz w:val="18"/>
           <w:szCs w:val="21"/>
-          <w:lang w:eastAsia="it-IT"/>
+          <w:lang w:val="en-IN" w:eastAsia="it-IT"/>
         </w:rPr>
       </w:pPr>
       <w:r>
@@ -44957,25 +44503,23 @@
         </w:rPr>
         <w:t xml:space="preserve">        </w:t>
       </w:r>
-      <w:proofErr w:type="spellStart"/>
       <w:r>
         <w:rPr>
           <w:rFonts w:ascii="Consolas" w:eastAsia="Times New Roman" w:hAnsi="Consolas" w:cs="Times New Roman"/>
           <w:color w:val="C586C0"/>
           <w:sz w:val="18"/>
           <w:szCs w:val="21"/>
-          <w:lang w:eastAsia="it-IT"/>
+          <w:lang w:val="en-IN" w:eastAsia="it-IT"/>
         </w:rPr>
         <w:t>if</w:t>
       </w:r>
-      <w:proofErr w:type="spellEnd"/>
-      <w:r>
-        <w:rPr>
-          <w:rFonts w:ascii="Consolas" w:eastAsia="Times New Roman" w:hAnsi="Consolas" w:cs="Times New Roman"/>
-          <w:color w:val="D4D4D4"/>
-          <w:sz w:val="18"/>
-          <w:szCs w:val="21"/>
-          <w:lang w:eastAsia="it-IT"/>
+      <w:r>
+        <w:rPr>
+          <w:rFonts w:ascii="Consolas" w:eastAsia="Times New Roman" w:hAnsi="Consolas" w:cs="Times New Roman"/>
+          <w:color w:val="D4D4D4"/>
+          <w:sz w:val="18"/>
+          <w:szCs w:val="21"/>
+          <w:lang w:val="en-IN" w:eastAsia="it-IT"/>
         </w:rPr>
         <w:t xml:space="preserve"> </w:t>
       </w:r>
@@ -44986,7 +44530,7 @@
           <w:color w:val="9CDCFE"/>
           <w:sz w:val="18"/>
           <w:szCs w:val="21"/>
-          <w:lang w:eastAsia="it-IT"/>
+          <w:lang w:val="en-IN" w:eastAsia="it-IT"/>
         </w:rPr>
         <w:t>account_</w:t>
       </w:r>
@@ -44997,7 +44541,7 @@
           <w:color w:val="9CDCFE"/>
           <w:sz w:val="18"/>
           <w:szCs w:val="21"/>
-          <w:lang w:eastAsia="it-IT"/>
+          <w:lang w:val="en-IN" w:eastAsia="it-IT"/>
         </w:rPr>
         <w:t>info</w:t>
       </w:r>
@@ -45007,7 +44551,7 @@
           <w:color w:val="D4D4D4"/>
           <w:sz w:val="18"/>
           <w:szCs w:val="21"/>
-          <w:lang w:eastAsia="it-IT"/>
+          <w:lang w:val="en-IN" w:eastAsia="it-IT"/>
         </w:rPr>
         <w:t>.empty</w:t>
       </w:r>
@@ -45019,7 +44563,7 @@
           <w:color w:val="D4D4D4"/>
           <w:sz w:val="18"/>
           <w:szCs w:val="21"/>
-          <w:lang w:eastAsia="it-IT"/>
+          <w:lang w:val="en-IN" w:eastAsia="it-IT"/>
         </w:rPr>
         <w:t>:</w:t>
       </w:r>
@@ -46105,13 +45649,7 @@
         <w:rPr>
           <w:lang w:val="en-IN"/>
         </w:rPr>
-        <w:t>8.1</w:t>
-      </w:r>
-      <w:r>
-        <w:rPr>
-          <w:lang w:val="en-IN"/>
-        </w:rPr>
-        <w:t xml:space="preserve"> Executive Summary</w:t>
+        <w:t>8.1 Executive Summary</w:t>
       </w:r>
       <w:bookmarkEnd w:id="41"/>
     </w:p>
@@ -46315,13 +45853,7 @@
         <w:rPr>
           <w:lang w:val="en-IN"/>
         </w:rPr>
-        <w:t>8.3</w:t>
-      </w:r>
-      <w:r>
-        <w:rPr>
-          <w:lang w:val="en-IN"/>
-        </w:rPr>
-        <w:t xml:space="preserve"> Optimization Recommendation: Dynamic Customer Lifecycle Management</w:t>
+        <w:t>8.3 Optimization Recommendation: Dynamic Customer Lifecycle Management</w:t>
       </w:r>
       <w:bookmarkEnd w:id="43"/>
     </w:p>
@@ -46408,19 +45940,7 @@
         <w:rPr>
           <w:lang w:val="en-IN"/>
         </w:rPr>
-        <w:t xml:space="preserve">. When an account moves from "Loyal" to "At-Risk" (due to a </w:t>
-      </w:r>
-      <w:r>
-        <w:rPr>
-          <w:lang w:val="en-IN"/>
-        </w:rPr>
-        <w:t>drop-in</w:t>
-      </w:r>
-      <w:r>
-        <w:rPr>
-          <w:lang w:val="en-IN"/>
-        </w:rPr>
-        <w:t xml:space="preserve"> frequency or recency), it triggers a specific API call to the marketing automation platform.</w:t>
+        <w:t>. When an account moves from "Loyal" to "At-Risk" (due to a drop-in frequency or recency), it triggers a specific API call to the marketing automation platform.</w:t>
       </w:r>
     </w:p>
     <w:p>
@@ -46577,13 +46097,7 @@
         <w:rPr>
           <w:lang w:val="en-IN"/>
         </w:rPr>
-        <w:t>8.</w:t>
-      </w:r>
-      <w:r>
-        <w:rPr>
-          <w:lang w:val="en-IN"/>
-        </w:rPr>
-        <w:t>4 Optimization Recommendation: Affinity-Based Merchandising</w:t>
+        <w:t>8.4 Optimization Recommendation: Affinity-Based Merchandising</w:t>
       </w:r>
       <w:bookmarkEnd w:id="44"/>
     </w:p>
@@ -46818,13 +46332,7 @@
         <w:rPr>
           <w:lang w:val="en-IN"/>
         </w:rPr>
-        <w:t>8.</w:t>
-      </w:r>
-      <w:r>
-        <w:rPr>
-          <w:lang w:val="en-IN"/>
-        </w:rPr>
-        <w:t>5 Optimization Recommendation: Regional Resource Allocation</w:t>
+        <w:t>8.5 Optimization Recommendation: Regional Resource Allocation</w:t>
       </w:r>
       <w:bookmarkEnd w:id="45"/>
     </w:p>
@@ -46976,13 +46484,7 @@
         <w:rPr>
           <w:lang w:val="en-IN"/>
         </w:rPr>
-        <w:t>8.</w:t>
-      </w:r>
-      <w:r>
-        <w:rPr>
-          <w:lang w:val="en-IN"/>
-        </w:rPr>
-        <w:t>6 Future-State Roadmap (AI Evolution)</w:t>
+        <w:t>8.6 Future-State Roadmap (AI Evolution)</w:t>
       </w:r>
       <w:bookmarkEnd w:id="46"/>
     </w:p>
@@ -52758,6 +52260,25 @@
       <w:u w:val="single"/>
     </w:rPr>
   </w:style>
+  <w:style w:type="table" w:styleId="Grigliatabella">
+    <w:name w:val="Table Grid"/>
+    <w:basedOn w:val="Tabellanormale"/>
+    <w:uiPriority w:val="39"/>
+    <w:rsid w:val="00211520"/>
+    <w:pPr>
+      <w:spacing w:before="0" w:after="0" w:line="240" w:lineRule="auto"/>
+    </w:pPr>
+    <w:tblPr>
+      <w:tblBorders>
+        <w:top w:val="single" w:sz="4" w:space="0" w:color="auto"/>
+        <w:left w:val="single" w:sz="4" w:space="0" w:color="auto"/>
+        <w:bottom w:val="single" w:sz="4" w:space="0" w:color="auto"/>
+        <w:right w:val="single" w:sz="4" w:space="0" w:color="auto"/>
+        <w:insideH w:val="single" w:sz="4" w:space="0" w:color="auto"/>
+        <w:insideV w:val="single" w:sz="4" w:space="0" w:color="auto"/>
+      </w:tblBorders>
+    </w:tblPr>
+  </w:style>
 </w:styles>
 </file>
 
@@ -53059,7 +52580,7 @@
 </file>
 
 <file path=customXml/itemProps2.xml><?xml version="1.0" encoding="utf-8"?>
-<ds:datastoreItem xmlns:ds="http://schemas.openxmlformats.org/officeDocument/2006/customXml" ds:itemID="{78CF0BF2-C1C7-43E6-90BC-0322D737A4FB}">
+<ds:datastoreItem xmlns:ds="http://schemas.openxmlformats.org/officeDocument/2006/customXml" ds:itemID="{3B174A9B-C59A-4539-85DB-1D1DC8DB1EB3}">
   <ds:schemaRefs>
     <ds:schemaRef ds:uri="http://schemas.openxmlformats.org/officeDocument/2006/bibliography"/>
   </ds:schemaRefs>

</xml_diff>